<commit_message>
Remove client-side SID certificate validation
Rely on CA-issued SID mapping and domain-controller enforcement while retaining directory UPN validation. Update implementation, tests, documentation, and generated diagrams accordingly.
</commit_message>
<xml_diff>
--- a/docs/01-CRAFT-Process-Overview.docx
+++ b/docs/01-CRAFT-Process-Overview.docx
@@ -230,7 +230,7 @@
                 <w:color w:val="000000"/>
                 <w:sz w:val="19"/>
               </w:rPr>
-              <w:t>The service account queries Active Directory for the matching username, user principal name (UPN), and security identifier (SID). Missing or ambiguous accounts are rejected.</w:t>
+              <w:t>The service account queries Active Directory for the matching username and user principal name (UPN). Missing or ambiguous accounts are rejected.</w:t>
             </w:r>
           </w:p>
         </w:tc>
@@ -342,7 +342,7 @@
                 <w:color w:val="000000"/>
                 <w:sz w:val="19"/>
               </w:rPr>
-              <w:t>The CA issues the user certificate. CRAFT checks the key, UPN, SID, template, permitted uses, lifetime, trust chain, and revocation information.</w:t>
+              <w:t>The CA issues the user certificate. CRAFT checks the key, UPN, template, permitted uses, lifetime, trust chain, and revocation information.</w:t>
             </w:r>
           </w:p>
         </w:tc>
@@ -492,7 +492,7 @@
     </w:p>
     <w:p>
       <w:r>
-        <w:t>The CA-issued SID and UPN must match the directory lookup. Changing the requested common name (CN) does not change the approved identity. Directory and CES credentials belong to the service account; the published ticket belongs to the user. CA-side restrictions must limit enrollment to the intended template and recipient group. [1, 2]</w:t>
+        <w:t>CRAFT checks the certificate UPN against the directory lookup. The CA supplies the SID for domain-controller mapping. Changing the requested common name (CN) does not change the approved identity. Directory and CES credentials belong to the service account; the published ticket belongs to the user. CA-side restrictions must limit enrollment to the intended template and recipient group. [1, 2]</w:t>
       </w:r>
     </w:p>
     <w:p>

</xml_diff>

<commit_message>
Add unprivileged home certificate workflow
Support caller-owned PEM certificate and key pairs with validation, KDC-mapped PKINIT, cache publication, maintenance integration, and enrollment fallback only when both files are absent. Update tests, security guidance, installation documentation, diagrams, and generated documentation assets.
</commit_message>
<xml_diff>
--- a/docs/01-CRAFT-Process-Overview.docx
+++ b/docs/01-CRAFT-Process-Overview.docx
@@ -5,44 +5,106 @@
     <w:p>
       <w:pPr>
         <w:pStyle w:val="Title"/>
+        <w:pageBreakBefore w:val="0"/>
       </w:pPr>
       <w:r>
-        <w:t>CRAFT Certificate Enrollment and Tickets</w:t>
+        <w:rPr>
+          <w:color w:val="000000"/>
+        </w:rPr>
+        <w:t>CRAFT Certificate Workflows and Tickets</w:t>
       </w:r>
     </w:p>
     <w:p>
       <w:pPr>
         <w:pStyle w:val="Subtitle"/>
+        <w:pageBreakBefore w:val="0"/>
       </w:pPr>
       <w:r>
         <w:t>Certificate Request Agent for Tickets  |  Process Overview</w:t>
       </w:r>
     </w:p>
     <w:p>
+      <w:pPr>
+        <w:keepLines/>
+        <w:pageBreakBefore w:val="0"/>
+      </w:pPr>
       <w:r>
-        <w:t>CRAFT lets an approved user obtain Kerberos credentials noninteractively from a trusted, administrator-managed Linux endpoint, including a host that is not domain-joined. Unattended scripts and applications can then access Active Directory resources as that user without collecting, storing, or replaying the user's AD password. CRAFT authenticates through a short-lived certificate and saves a ticket-granting ticket (TGT); the user certificate and key are temporary, while the ticket cache remains after CRAFT exits.</w:t>
+        <w:t>CRAFT lets a user obtain Kerberos credentials noninteractively from a trusted Linux endpoint, including a host that is not domain-joined. It first checks for a user-supplied certificate and key in the actual home directory and can run this workflow entirely unprivileged. If the pair is absent, an authorized enrollment deployment obtains a short-lived certificate on the user's behalf. Both paths save a ticket-granting ticket (TGT) for unattended applications without retaining the user's AD password.</w:t>
       </w:r>
     </w:p>
     <w:p>
       <w:pPr>
         <w:pStyle w:val="Heading2"/>
+        <w:pageBreakBefore w:val="0"/>
       </w:pPr>
       <w:r>
-        <w:t>Enrollment and Authentication</w:t>
+        <w:rPr>
+          <w:color w:val="000000"/>
+        </w:rPr>
+        <w:t>Unprivileged Home Certificate Workflow</w:t>
       </w:r>
     </w:p>
     <w:p>
+      <w:pPr>
+        <w:keepLines/>
+        <w:pageBreakBefore w:val="0"/>
+      </w:pPr>
       <w:r>
-        <w:t xml:space="preserve">An administrator first configures directory access, the certificate authority (CA), the Certificate Enrollment Web Service (CES), trust settings, and the users permitted to enroll. Configuration ships disabled. Once enabled, a user invokes </w:t>
+        <w:t>Install craft and craft-worker as ordinary mode-0755 executables and provide readable, root-controlled /etc/craft policy, trust anchors and CRLs. No service account, enrollment keytab, LDAP, agent, CES or /run/craft is required. Place an existing unencrypted PEM pair at the fixed NSS-home paths:</w:t>
       </w:r>
+    </w:p>
+    <w:p>
+      <w:pPr>
+        <w:pStyle w:val="CodeBlock"/>
+        <w:pageBreakBefore w:val="0"/>
+      </w:pPr>
+      <w:r>
+        <w:t>mkdir -p ~/.config/craft</w:t>
+        <w:br/>
+        <w:t>chmod 0700 ~/.config/craft</w:t>
+        <w:br/>
+        <w:t>install -m 0600 /path/to/certificate.pem ~/.config/craft/user.pem</w:t>
+        <w:br/>
+        <w:t>install -m 0600 /path/to/private-key.pem ~/.config/craft/user.key</w:t>
+      </w:r>
+    </w:p>
+    <w:p>
+      <w:pPr>
+        <w:keepLines/>
+        <w:pageBreakBefore w:val="0"/>
+      </w:pPr>
+      <w:r>
+        <w:t>Both files must be caller-owned regular files with one hard link, without symlinks, nonempty and at most 1 MiB each. The key must be private; the home and certificate directories must not be group/world-writable. CRAFT ignores HOME and XDG overrides when locating the pair.</w:t>
+      </w:r>
+    </w:p>
+    <w:p>
+      <w:pPr>
+        <w:keepLines/>
+        <w:pageBreakBefore w:val="0"/>
+      </w:pPr>
+      <w:r>
+        <w:t>A complete pair takes priority, including on an enrollment-enabled host. Partial, unsafe, encrypted or invalid inputs fail and retain the cache. Enrollment is selected only when both files are absent; it requires the setuid installation. A home-only installation reports the enrollment requirement if no pair exists.</w:t>
+      </w:r>
+    </w:p>
+    <w:p>
+      <w:pPr>
+        <w:pStyle w:val="Heading2"/>
+        <w:pageBreakBefore w:val="0"/>
+      </w:pPr>
       <w:r>
         <w:rPr>
-          <w:rFonts w:ascii="Consolas" w:hAnsi="Consolas"/>
+          <w:color w:val="000000"/>
         </w:rPr>
-        <w:t>craft</w:t>
+        <w:t>Certificate Selection and Authentication</w:t>
       </w:r>
+    </w:p>
+    <w:p>
+      <w:pPr>
+        <w:keepLines/>
+        <w:pageBreakBefore w:val="0"/>
+      </w:pPr>
       <w:r>
-        <w:t xml:space="preserve"> with no arguments; the following steps run for that user.</w:t>
+        <w:t>Administrators configure public Kerberos policy, trusted certificate authorities and current revocation lists. Configuration ships disabled. Enrollment additionally requires directory access, CES, an agent and CA recipient restrictions. The user invokes craft with no arguments; the selected certificate workflow proceeds as follows.</w:t>
       </w:r>
     </w:p>
     <w:tbl>
@@ -84,6 +146,7 @@
           </w:tcPr>
           <w:p>
             <w:pPr>
+              <w:keepNext w:val="0"/>
               <w:spacing w:after="0"/>
             </w:pPr>
             <w:r>
@@ -110,6 +173,7 @@
           </w:tcPr>
           <w:p>
             <w:pPr>
+              <w:keepNext w:val="0"/>
               <w:spacing w:after="0"/>
             </w:pPr>
             <w:r>
@@ -142,6 +206,7 @@
           </w:tcPr>
           <w:p>
             <w:pPr>
+              <w:keepNext w:val="0"/>
               <w:spacing w:after="0"/>
             </w:pPr>
             <w:r>
@@ -167,6 +232,7 @@
           </w:tcPr>
           <w:p>
             <w:pPr>
+              <w:keepNext w:val="0"/>
               <w:spacing w:after="0"/>
             </w:pPr>
             <w:r>
@@ -174,7 +240,7 @@
                 <w:color w:val="000000"/>
                 <w:sz w:val="19"/>
               </w:rPr>
-              <w:t>CRAFT checks the actual Linux account and home directory. Only approved craft-users members may launch it; users cannot name another person to enroll.</w:t>
+              <w:t>CRAFT checks the real UID, NSS username and home. Root invocation is refused. Enrollment-enabled execution is controlled by craft-users; an ordinary home-only installation needs no special group.</w:t>
             </w:r>
           </w:p>
         </w:tc>
@@ -198,6 +264,7 @@
           </w:tcPr>
           <w:p>
             <w:pPr>
+              <w:keepNext w:val="0"/>
               <w:spacing w:after="0"/>
             </w:pPr>
             <w:r>
@@ -205,7 +272,7 @@
                 <w:color w:val="000000"/>
                 <w:sz w:val="19"/>
               </w:rPr>
-              <w:t>2  Resolve AD identity</w:t>
+              <w:t>2  Select the source</w:t>
             </w:r>
           </w:p>
         </w:tc>
@@ -223,6 +290,7 @@
           </w:tcPr>
           <w:p>
             <w:pPr>
+              <w:keepNext w:val="0"/>
               <w:spacing w:after="0"/>
             </w:pPr>
             <w:r>
@@ -230,7 +298,7 @@
                 <w:color w:val="000000"/>
                 <w:sz w:val="19"/>
               </w:rPr>
-              <w:t>The service account queries Active Directory for the matching username and user principal name (UPN). Missing or ambiguous accounts are rejected.</w:t>
+              <w:t>Open the home pair as the caller. A complete pair takes priority. An absent pair selects enrollment; partial or unsafe files fail without fallback.</w:t>
             </w:r>
           </w:p>
         </w:tc>
@@ -254,6 +322,7 @@
           </w:tcPr>
           <w:p>
             <w:pPr>
+              <w:keepNext w:val="0"/>
               <w:spacing w:after="0"/>
             </w:pPr>
             <w:r>
@@ -261,7 +330,7 @@
                 <w:color w:val="000000"/>
                 <w:sz w:val="19"/>
               </w:rPr>
-              <w:t>3  Request a certificate</w:t>
+              <w:t>3  Prepare the certificate</w:t>
             </w:r>
           </w:p>
         </w:tc>
@@ -279,6 +348,7 @@
           </w:tcPr>
           <w:p>
             <w:pPr>
+              <w:keepNext w:val="0"/>
               <w:spacing w:after="0"/>
             </w:pPr>
             <w:r>
@@ -286,7 +356,7 @@
                 <w:color w:val="000000"/>
                 <w:sz w:val="19"/>
               </w:rPr>
-              <w:t>CRAFT generates a new private key and an enrollment request. The enrollment agent signs the request on behalf of the identified user; CES submits it to the CA.</w:t>
+              <w:t>Home mode loads the supplied PEM pair as the caller. Enrollment uses the craft account to resolve the AD UPN, generate a key/CSR and submit an agent-signed request through CES.</w:t>
             </w:r>
           </w:p>
         </w:tc>
@@ -310,6 +380,7 @@
           </w:tcPr>
           <w:p>
             <w:pPr>
+              <w:keepNext w:val="0"/>
               <w:spacing w:after="0"/>
             </w:pPr>
             <w:r>
@@ -317,7 +388,7 @@
                 <w:color w:val="000000"/>
                 <w:sz w:val="19"/>
               </w:rPr>
-              <w:t>4  Validate the result</w:t>
+              <w:t>4  Validate the certificate</w:t>
             </w:r>
           </w:p>
         </w:tc>
@@ -335,6 +406,7 @@
           </w:tcPr>
           <w:p>
             <w:pPr>
+              <w:keepNext w:val="0"/>
               <w:spacing w:after="0"/>
             </w:pPr>
             <w:r>
@@ -342,7 +414,7 @@
                 <w:color w:val="000000"/>
                 <w:sz w:val="19"/>
               </w:rPr>
-              <w:t>The CA issues the user certificate. CRAFT checks the key, UPN, template, permitted uses, lifetime, trust chain, and revocation information.</w:t>
+              <w:t>Both paths check key, logon usage, validity, CA trust and CRLs. Enrollment additionally pins directory UPN, template, three EKUs and short validity; home mode accepts ordinary templates and lifetimes.</w:t>
             </w:r>
           </w:p>
         </w:tc>
@@ -366,6 +438,7 @@
           </w:tcPr>
           <w:p>
             <w:pPr>
+              <w:keepNext w:val="0"/>
               <w:spacing w:after="0"/>
             </w:pPr>
             <w:r>
@@ -391,6 +464,7 @@
           </w:tcPr>
           <w:p>
             <w:pPr>
+              <w:keepNext w:val="0"/>
               <w:spacing w:after="0"/>
             </w:pPr>
             <w:r>
@@ -398,7 +472,7 @@
                 <w:color w:val="000000"/>
                 <w:sz w:val="19"/>
               </w:rPr>
-              <w:t>CRAFT authenticates with the certificate and private key using PKINIT. The domain controller decides the ticket lifetime; CRAFT checks the returned identity, flags, times, and encryption.</w:t>
+              <w:t>PKINIT requests the fixed Linux-name principal. The KDC maps the certificate and decides the grant; CRAFT checks returned identity, flags, encryption and lifetimes.</w:t>
             </w:r>
           </w:p>
         </w:tc>
@@ -422,6 +496,7 @@
           </w:tcPr>
           <w:p>
             <w:pPr>
+              <w:keepNext w:val="0"/>
               <w:spacing w:after="0"/>
             </w:pPr>
             <w:r>
@@ -447,6 +522,7 @@
           </w:tcPr>
           <w:p>
             <w:pPr>
+              <w:keepNext w:val="0"/>
               <w:spacing w:after="0"/>
             </w:pPr>
             <w:r>
@@ -454,7 +530,7 @@
                 <w:color w:val="000000"/>
                 <w:sz w:val="19"/>
               </w:rPr>
-              <w:t>After validation succeeds, CRAFT replaces .krb5cc_craft in the caller's home and prints its FILE cache name. The cache is accessible only to its owner under normal file permissions.</w:t>
+              <w:t>After validation, the caller atomically replaces .krb5cc_craft, mode 0600, and prints its FILE cache name. Failures retain the existing cache.</w:t>
             </w:r>
           </w:p>
         </w:tc>
@@ -463,53 +539,70 @@
     <w:p>
       <w:pPr>
         <w:pStyle w:val="Heading2"/>
+        <w:pageBreakBefore w:val="0"/>
       </w:pPr>
       <w:r>
+        <w:rPr>
+          <w:color w:val="000000"/>
+        </w:rPr>
         <w:t>Use the Cache to Access AD Resources</w:t>
       </w:r>
     </w:p>
     <w:p>
+      <w:pPr>
+        <w:keepLines/>
+        <w:pageBreakBefore w:val="0"/>
+      </w:pPr>
       <w:r>
-        <w:t xml:space="preserve">After enrollment and authentication, the user selects the resulting credential cache for an application, typically through </w:t>
-      </w:r>
-      <w:r>
-        <w:rPr>
-          <w:rFonts w:ascii="Consolas" w:hAnsi="Consolas"/>
-        </w:rPr>
-        <w:t>KRB5CCNAME</w:t>
-      </w:r>
-      <w:r>
-        <w:t>. The Kerberos library uses the cached ticket-granting ticket (TGT) to request service tickets from the domain controller for the target services. Those tickets let the application authenticate as the user to resources such as SMB file shares, LDAP directories, and Kerberos-enabled web services, where supported and configured. Access remains subject to the user's permissions and the service's policy; obtaining a ticket does not grant additional access rights.</w:t>
+        <w:t>After authentication, the user selects the resulting credential cache for an application, typically through KRB5CCNAME. The Kerberos library uses the cached ticket-granting ticket (TGT) to request service tickets from the domain controller for the target services. Those tickets let the application authenticate as the user to resources such as SMB file shares, LDAP directories, and Kerberos-enabled web services, where supported and configured. Access remains subject to the user's permissions and the service's policy; obtaining a ticket does not grant additional access rights.</w:t>
       </w:r>
     </w:p>
     <w:p>
       <w:pPr>
         <w:pStyle w:val="Heading2"/>
+        <w:pageBreakBefore w:val="0"/>
       </w:pPr>
       <w:r>
+        <w:rPr>
+          <w:color w:val="000000"/>
+        </w:rPr>
         <w:t>Identity and Trust</w:t>
       </w:r>
     </w:p>
     <w:p>
+      <w:pPr>
+        <w:keepLines/>
+        <w:pageBreakBefore w:val="0"/>
+      </w:pPr>
       <w:r>
-        <w:t>CRAFT checks the certificate UPN against the directory lookup. The CA supplies the SID for domain-controller mapping. Changing the requested common name (CN) does not change the approved identity. Directory and CES credentials belong to the service account; the published ticket belongs to the user. CA-side restrictions must limit enrollment to the intended template and recipient group. [1, 2]</w:t>
+        <w:t>Both workflows request &lt;Linux username&gt;@&lt;configured realm&gt; and check the returned TGT principal. The KDC enforces certificate-to-account mapping. Enrollment checks the issued UPN against the directory lookup and pins the configured template; a requested CN cannot change that identity. Home mode makes no LDAP lookup and relies on KDC mapping. Enrollment-agent and recipient restrictions govern new issuance, while a supplied certificate remains subject to its issuer's policy and KDC acceptance. [1, 2]</w:t>
       </w:r>
     </w:p>
     <w:p>
+      <w:pPr>
+        <w:keepLines/>
+        <w:pageBreakBefore w:val="0"/>
+      </w:pPr>
       <w:r>
-        <w:t>This administrator-authorized certificate path supports automation without retaining a user's password alongside an MFA-protected interactive sign-in. CRAFT does not perform an MFA challenge or prove that the user completed one. Its trust rests on the managed host, enrollment credentials, and CA restrictions.</w:t>
+        <w:t>CRAFT supports automation alongside MFA-protected interactive sign-in, but does not perform an MFA challenge or prove one was completed. Home mode depends on the supplied certificate/private key and KDC mapping. Enrollment also depends on the managed host, agent credentials and CA restrictions.</w:t>
       </w:r>
     </w:p>
     <w:p>
-      <w:r>
-        <w:br w:type="page"/>
-      </w:r>
+      <w:pPr>
+        <w:keepLines/>
+        <w:pageBreakBefore w:val="0"/>
+      </w:pPr>
+      <w:r/>
     </w:p>
     <w:p>
       <w:pPr>
         <w:pStyle w:val="Heading1"/>
+        <w:pageBreakBefore w:val="0"/>
       </w:pPr>
       <w:r>
+        <w:rPr>
+          <w:color w:val="000000"/>
+        </w:rPr>
         <w:lastRenderedPageBreak/>
         <w:t>Certificate Storage and Cleanup</w:t>
       </w:r>
@@ -517,93 +610,80 @@
     <w:p>
       <w:pPr>
         <w:pStyle w:val="Heading2"/>
+        <w:pageBreakBefore w:val="0"/>
       </w:pPr>
       <w:r>
-        <w:t>The Issued User Certificate and Private Key</w:t>
+        <w:rPr>
+          <w:color w:val="000000"/>
+        </w:rPr>
+        <w:t>Certificate Files in Each Workflow</w:t>
       </w:r>
     </w:p>
     <w:p>
+      <w:pPr>
+        <w:keepLines/>
+        <w:pageBreakBefore w:val="0"/>
+      </w:pPr>
       <w:r>
-        <w:t xml:space="preserve">Each enrollment attempt generates a fresh user private key. The issued certificate and key are held in process memory. For the Kerberos authentication step, CRAFT exposes temporary, memory-backed files to the Kerberos library. These have no persistent pathname in the user's home, </w:t>
-      </w:r>
-      <w:r>
-        <w:rPr>
-          <w:rFonts w:ascii="Consolas" w:hAnsi="Consolas"/>
-        </w:rPr>
-        <w:t>/etc/craft</w:t>
-      </w:r>
-      <w:r>
-        <w:t xml:space="preserve">, </w:t>
-      </w:r>
-      <w:r>
-        <w:rPr>
-          <w:rFonts w:ascii="Consolas" w:hAnsi="Consolas"/>
-        </w:rPr>
-        <w:t>/run/craft</w:t>
-      </w:r>
-      <w:r>
-        <w:t>, or a temporary directory.</w:t>
+        <w:t>Home mode reads ~/.config/craft/user.pem and user.key as the caller. Those source files persist until the user replaces or removes them; CRAFT does not renew, overwrite or delete them. It releases its parsed identity and sealed memory-file copies when authentication ends. Protect the supplied private key as a reusable credential and replace the pair before certificate expiry.</w:t>
       </w:r>
     </w:p>
     <w:p>
+      <w:pPr>
+        <w:keepLines/>
+        <w:pageBreakBefore w:val="0"/>
+      </w:pPr>
       <w:r>
-        <w:t>The temporary memory files close when the authentication operation ends, and the worker releases its certificate and key when it exits, on success or failure. CRAFT does not install the issued certificate in a certificate store, export a PEM or PFX file for the user, or keep the key for a later run. The private key is generated locally and is not submitted to the CA.</w:t>
+        <w:t>Enrollment generates a fresh user private key. Its issued certificate and key remain in process memory and temporary memory files for PKINIT and are released on success or failure. CRAFT does not export a user PEM/PFX or install a certificate-store entry. The generated private key is not submitted to the CA.</w:t>
       </w:r>
     </w:p>
     <w:p>
       <w:pPr>
         <w:pStyle w:val="Heading2"/>
+        <w:pageBreakBefore w:val="0"/>
       </w:pPr>
       <w:r>
+        <w:rPr>
+          <w:color w:val="000000"/>
+        </w:rPr>
         <w:t>What Remains on the Linux Host</w:t>
       </w:r>
     </w:p>
     <w:p>
+      <w:pPr>
+        <w:keepLines/>
+        <w:pageBreakBefore w:val="0"/>
+      </w:pPr>
       <w:r>
-        <w:t xml:space="preserve">The persistent user credential is </w:t>
-      </w:r>
-      <w:r>
-        <w:rPr>
-          <w:rFonts w:ascii="Consolas" w:hAnsi="Consolas"/>
-        </w:rPr>
-        <w:t>.krb5cc_craft</w:t>
-      </w:r>
-      <w:r>
-        <w:t xml:space="preserve"> in the caller's actual home directory. This file contains the Kerberos TGT and session key, not the issued certificate or its private key. Applications use this cache to request service tickets. It is owned by the caller with mode 0600 and remains until replaced or removed; CRAFT does not delete it automatically when its tickets expire.</w:t>
+        <w:t>Both workflows publish .krb5cc_craft in the caller's actual home. This persistent cache contains the TGT and session key, without the user certificate/private key. It is caller-owned with mode 0600 and remains until replaced or removed; expiry does not delete it automatically. Home mode also leaves the supplied PEM files in place.</w:t>
       </w:r>
     </w:p>
     <w:p>
+      <w:pPr>
+        <w:keepLines/>
+        <w:pageBreakBefore w:val="0"/>
+      </w:pPr>
       <w:r>
-        <w:t xml:space="preserve">Administrator-provisioned enrollment-agent and transport credentials remain in </w:t>
-      </w:r>
-      <w:r>
-        <w:rPr>
-          <w:rFonts w:ascii="Consolas" w:hAnsi="Consolas"/>
-        </w:rPr>
-        <w:t>/etc/craft</w:t>
-      </w:r>
-      <w:r>
-        <w:t xml:space="preserve">, along with configuration, trust anchors, and revocation lists. These are distinct from the temporary user certificate. </w:t>
-      </w:r>
-      <w:r>
-        <w:rPr>
-          <w:rFonts w:ascii="Consolas" w:hAnsi="Consolas"/>
-        </w:rPr>
-        <w:t>/run/craft</w:t>
-      </w:r>
-      <w:r>
-        <w:t xml:space="preserve"> holds per-user lock and timing information for enrollment attempts, not a retained user certificate or key.</w:t>
+        <w:t>Public configuration, trust anchors and CRLs under /etc/craft remain root-controlled and readable by callers. Enrollment additionally retains private agent/keytab/transport credentials and uses /run/craft for per-user issuance locks and timestamps. A home-only installation needs neither the service account nor those private files and runtime directory.</w:t>
       </w:r>
     </w:p>
     <w:p>
       <w:pPr>
         <w:pStyle w:val="Heading2"/>
+        <w:pageBreakBefore w:val="0"/>
       </w:pPr>
       <w:r>
+        <w:rPr>
+          <w:color w:val="000000"/>
+        </w:rPr>
         <w:t>What the Certificate Authority Retains</w:t>
       </w:r>
     </w:p>
     <w:p>
+      <w:pPr>
+        <w:keepLines/>
+        <w:pageBreakBefore w:val="0"/>
+      </w:pPr>
       <w:r>
         <w:t>Client cleanup does not erase the CA's copy of an issued certificate or its enrollment and audit records. A failed or interrupted run can still leave an issued certificate recorded at the CA. CRAFT does not automatically revoke that certificate or cancel the request. Administrators manage CA retention, audit review, and any required revocation.</w:t>
       </w:r>
@@ -611,26 +691,40 @@
     <w:p>
       <w:pPr>
         <w:pStyle w:val="Heading2"/>
+        <w:pageBreakBefore w:val="0"/>
       </w:pPr>
       <w:r>
+        <w:rPr>
+          <w:color w:val="000000"/>
+        </w:rPr>
         <w:t>What Ephemeral Means Here</w:t>
       </w:r>
     </w:p>
     <w:p>
+      <w:pPr>
+        <w:keepLines/>
+        <w:pageBreakBefore w:val="0"/>
+      </w:pPr>
       <w:r>
-        <w:t>The user certificate and key are ephemeral client credentials, but this is not a guarantee that no trace can reach storage. Operating-system swap and host memory capture may expose memory contents, and a privileged host administrator can inspect credentials. Protect the host and its swap policy accordingly. Losing the temporary key does not invalidate an already-issued Kerberos ticket; protect the persistent ticket cache separately.</w:t>
+        <w:t>Enrollment's user certificate and key are ephemeral on the client; supplied home files are persistent. In either mode, memory and memory files can reach swap or privileged host capture. Protect the host, its private key files and ticket cache. Certificate expiry, key deletion or process exit does not revoke an already-issued Kerberos ticket.</w:t>
       </w:r>
     </w:p>
     <w:p>
-      <w:r>
-        <w:br w:type="page"/>
-      </w:r>
+      <w:pPr>
+        <w:keepLines/>
+        <w:pageBreakBefore w:val="0"/>
+      </w:pPr>
+      <w:r/>
     </w:p>
     <w:p>
       <w:pPr>
         <w:pStyle w:val="Heading1"/>
+        <w:pageBreakBefore w:val="0"/>
       </w:pPr>
       <w:r>
+        <w:rPr>
+          <w:color w:val="000000"/>
+        </w:rPr>
         <w:lastRenderedPageBreak/>
         <w:t>Ticket Lifetimes and Everyday Use</w:t>
       </w:r>
@@ -638,22 +732,38 @@
     <w:p>
       <w:pPr>
         <w:pStyle w:val="Heading2"/>
+        <w:pageBreakBefore w:val="0"/>
       </w:pPr>
       <w:r>
-        <w:t>Three Separate Lifetime Limits</w:t>
+        <w:rPr>
+          <w:color w:val="000000"/>
+        </w:rPr>
+        <w:t>Certificate and Ticket Lifetimes</w:t>
       </w:r>
     </w:p>
     <w:p>
+      <w:pPr>
+        <w:keepLines/>
+        <w:pageBreakBefore w:val="0"/>
+      </w:pPr>
       <w:r>
-        <w:t>The default certificate acceptance cap is 36,000 seconds (10 hours) of total validity, including any CA backdating. The CA must issue that profile; CRAFT does not set or shorten certificate dates. The certificate must also be currently valid and pass the configured trust and revocation checks.</w:t>
+        <w:t>Enrollment's default certificate acceptance cap is 36,000 seconds (10 hours) of total validity including backdating. Home mode accepts ordinary certificate validity and other templates. Both require current validity, matching keys, supported logon usage, trusted chains and current CRLs. A supplied certificate does not have to use CRAFT's enrollment template.</w:t>
       </w:r>
     </w:p>
     <w:p>
+      <w:pPr>
+        <w:keepLines/>
+        <w:pageBreakBefore w:val="0"/>
+      </w:pPr>
       <w:r>
         <w:t>CRAFT requests a 10-hour initial TGT and a 7-day renewal window. A renewal window is the period during which an eligible ticket can be renewed, not seven days of uninterrupted ticket validity. The domain controller controls the actual grant, and PKINIT can constrain the initial ticket by the certificate/key lifetime. [3, 4]</w:t>
       </w:r>
     </w:p>
     <w:p>
+      <w:pPr>
+        <w:keepLines/>
+        <w:pageBreakBefore w:val="0"/>
+      </w:pPr>
       <w:r>
         <w:t xml:space="preserve">By default, </w:t>
       </w:r>
@@ -679,12 +789,20 @@
     <w:p>
       <w:pPr>
         <w:pStyle w:val="Heading2"/>
+        <w:pageBreakBefore w:val="0"/>
       </w:pPr>
       <w:r>
+        <w:rPr>
+          <w:color w:val="000000"/>
+        </w:rPr>
         <w:t>Select the Cache and Use Applications</w:t>
       </w:r>
     </w:p>
     <w:p>
+      <w:pPr>
+        <w:keepLines/>
+        <w:pageBreakBefore w:val="0"/>
+      </w:pPr>
       <w:r>
         <w:t>Run CRAFT as the intended user, without sudo. Select its returned cache in the current shell, then inspect the ticket:</w:t>
       </w:r>
@@ -692,6 +810,7 @@
     <w:p>
       <w:pPr>
         <w:pStyle w:val="CodeBlock"/>
+        <w:pageBreakBefore w:val="0"/>
       </w:pPr>
       <w:r>
         <w:t>cache=$(/usr/local/bin/craft) &amp;&amp; export KRB5CCNAME="$cache" &amp;&amp; \</w:t>
@@ -702,6 +821,10 @@
       </w:r>
     </w:p>
     <w:p>
+      <w:pPr>
+        <w:keepLines/>
+        <w:pageBreakBefore w:val="0"/>
+      </w:pPr>
       <w:r>
         <w:t xml:space="preserve">Kerberos-aware applications launched from that shell can use the cache. CRAFT cannot change its parent shell's environment. The optional </w:t>
       </w:r>
@@ -718,32 +841,51 @@
     <w:p>
       <w:pPr>
         <w:pStyle w:val="Heading2"/>
+        <w:pageBreakBefore w:val="0"/>
       </w:pPr>
       <w:r>
+        <w:rPr>
+          <w:color w:val="000000"/>
+        </w:rPr>
         <w:t>Renewal and Failed Attempts</w:t>
       </w:r>
     </w:p>
     <w:p>
+      <w:pPr>
+        <w:keepLines/>
+        <w:pageBreakBefore w:val="0"/>
+      </w:pPr>
       <w:r>
-        <w:t>Use kinit -R -c "$KRB5CCNAME" for manual renewal or craft-maintain for automatic maintenance. Renewals need only the cache; fresh authentication requires a new certificate.</w:t>
+        <w:t>Renew manually with kinit -R -c "$KRB5CCNAME" or use craft-maintain. Renewal needs only the cache. Fresh authentication reuses a valid home pair; when both files are absent, enrollment supplies a new certificate.</w:t>
       </w:r>
     </w:p>
     <w:p>
+      <w:pPr>
+        <w:keepLines/>
+        <w:pageBreakBefore w:val="0"/>
+      </w:pPr>
       <w:r>
-        <w:t>Enrollment, validation, or authentication failures leave the existing cache in place. Only a successful run replaces it. Review errors and CA/domain-controller logs before retrying; attempts are rate-limited per user. Validate the installed deployment in a lab and follow the configuration guide for acceptance checks.</w:t>
+        <w:t>Partial, unsafe or invalid home inputs fail without enrollment fallback or cache replacement. Only success replaces the cache. Enrollment attempts have a per-user interval; home mode does not. Review AUTHPRIV/KDC logs and CA/CES logs for enrollment, and follow the lab acceptance checks.</w:t>
       </w:r>
     </w:p>
     <w:p>
       <w:pPr>
         <w:pStyle w:val="Heading1"/>
-        <w:pageBreakBefore/>
+        <w:pageBreakBefore w:val="0"/>
       </w:pPr>
       <w:r>
+        <w:rPr>
+          <w:color w:val="000000"/>
+        </w:rPr>
         <w:lastRenderedPageBreak/>
         <w:t>Long Running Jobs</w:t>
       </w:r>
     </w:p>
     <w:p>
+      <w:pPr>
+        <w:keepLines/>
+        <w:pageBreakBefore w:val="0"/>
+      </w:pPr>
       <w:r>
         <w:t>Start once as the approved batch user; it returns when credentials and detached maintenance are ready. No job wrapper or cron is needed.</w:t>
       </w:r>
@@ -751,6 +893,7 @@
     <w:p>
       <w:pPr>
         <w:pStyle w:val="CodeBlock"/>
+        <w:pageBreakBefore w:val="0"/>
       </w:pPr>
       <w:r>
         <w:t>job_pid=$$</w:t>
@@ -765,11 +908,19 @@
       </w:r>
     </w:p>
     <w:p>
+      <w:pPr>
+        <w:keepLines/>
+        <w:pageBreakBefore w:val="0"/>
+      </w:pPr>
       <w:r>
-        <w:t>craft-maintain renews TGTs without certificates and reenrolls near the absolute renewal deadline. Ten-hour/seven-day grants normally renew at eight hours and reenroll around day six; actual grants set the schedule.</w:t>
+        <w:t>craft-maintain renews TGTs from the cache and obtains fresh credentials near the absolute renewal deadline. Ten-hour/seven-day grants normally renew at eight hours and authenticate afresh around day six. Fresh acquisition uses the same home-pair priority; it does not renew a supplied certificate. Actual grants set the schedule.</w:t>
       </w:r>
     </w:p>
     <w:p>
+      <w:pPr>
+        <w:keepLines/>
+        <w:pageBreakBefore w:val="0"/>
+      </w:pPr>
       <w:r>
         <w:t>Use --max-duration 21d to add a cutoff. Maintenance stops with the watched PID; keep the shell alive, exec the job, or watch its controller. Jobs for one user share cache updates; stopping maintenance leaves the cache intact.</w:t>
       </w:r>
@@ -777,6 +928,7 @@
     <w:p>
       <w:pPr>
         <w:pStyle w:val="CodeBlock"/>
+        <w:pageBreakBefore w:val="0"/>
       </w:pPr>
       <w:r>
         <w:t>/usr/local/bin/craft-maintain --status --watch-pid "$job_pid"</w:t>
@@ -787,29 +939,39 @@
       </w:r>
     </w:p>
     <w:p>
+      <w:pPr>
+        <w:keepLines/>
+        <w:pageBreakBefore w:val="0"/>
+      </w:pPr>
       <w:r>
-        <w:t>Refresh failures preserve the cache and retry; failed enrollments share a cooldown from one minute to one hour. Check status and AUTHPRIV logs for errors. Later failures do not stop the job; applications must reload refreshed credentials when authenticating again.</w:t>
+        <w:t>Refresh failures preserve the cache and retry. Failed fresh acquisitions share a one-minute to one-hour cooldown in either mode. Check status and AUTHPRIV logs; later failures leave the job running. Keep the supplied pair and CRLs current, and have applications reload refreshed credentials.</w:t>
       </w:r>
     </w:p>
     <w:p>
       <w:pPr>
         <w:pStyle w:val="SmallNote"/>
+        <w:pageBreakBefore w:val="0"/>
       </w:pPr>
       <w:r>
-        <w:t>Install craft-maintain without setuid/setgid. Renewal requires Linux 5.3+, /proc and system /etc/krb5.conf matching the enrollment realm/KDC. The scheduler must retain background processes and allow later setuid craft calls. See source/README.md for setup and status.</w:t>
+        <w:t>Install craft-maintain without setuid/setgid. Renewal requires Linux 5.3+, /proc and system /etc/krb5.conf matching the configured realm/KDC. Home-only refresh works under no_new_privs. Enrollment fallback additionally requires later setuid craft calls. The scheduler must retain background processes; see source/README.md for setup and status.</w:t>
       </w:r>
     </w:p>
     <w:p>
       <w:pPr>
         <w:pStyle w:val="Heading2"/>
+        <w:pageBreakBefore w:val="0"/>
       </w:pPr>
       <w:r>
+        <w:rPr>
+          <w:color w:val="000000"/>
+        </w:rPr>
         <w:t>Primary References</w:t>
       </w:r>
     </w:p>
     <w:p>
       <w:pPr>
         <w:pStyle w:val="SmallNote"/>
+        <w:pageBreakBefore w:val="0"/>
       </w:pPr>
       <w:r>
         <w:t xml:space="preserve">[1] </w:t>
@@ -826,6 +988,7 @@
     <w:p>
       <w:pPr>
         <w:pStyle w:val="SmallNote"/>
+        <w:pageBreakBefore w:val="0"/>
       </w:pPr>
       <w:r>
         <w:t xml:space="preserve">[2] </w:t>
@@ -842,6 +1005,7 @@
     <w:p>
       <w:pPr>
         <w:pStyle w:val="SmallNote"/>
+        <w:pageBreakBefore w:val="0"/>
       </w:pPr>
       <w:r>
         <w:t xml:space="preserve">[3] </w:t>
@@ -858,6 +1022,7 @@
     <w:p>
       <w:pPr>
         <w:pStyle w:val="SmallNote"/>
+        <w:pageBreakBefore w:val="0"/>
       </w:pPr>
       <w:r>
         <w:t xml:space="preserve">[4] </w:t>
@@ -874,14 +1039,19 @@
     <w:p>
       <w:pPr>
         <w:pStyle w:val="Heading2"/>
+        <w:pageBreakBefore w:val="0"/>
       </w:pPr>
       <w:r>
+        <w:rPr>
+          <w:color w:val="000000"/>
+        </w:rPr>
         <w:t>License</w:t>
       </w:r>
     </w:p>
     <w:p>
       <w:pPr>
         <w:pStyle w:val="SmallNote"/>
+        <w:pageBreakBefore w:val="0"/>
       </w:pPr>
       <w:r>
         <w:t>CRAFT source code, scripts, configuration examples, and documentation are licensed under the GNU General Public License, version 3 (SPDX: GPL-3.0-only). See the repository LICENSE file or https://www.gnu.org/licenses/gpl-3.0.html for the full terms. This material is provided without warranty, as described in the license.</w:t>
@@ -1661,7 +1831,7 @@
       <w:rFonts w:asciiTheme="majorHAnsi" w:eastAsiaTheme="majorEastAsia" w:hAnsiTheme="majorHAnsi" w:cstheme="majorBidi"/>
       <w:b/>
       <w:bCs/>
-      <w:color w:val="4F81BD" w:themeColor="accent1"/>
+      <w:color w:val="000000"/>
     </w:rPr>
   </w:style>
   <w:style w:type="paragraph" w:styleId="Heading4">
@@ -1686,7 +1856,7 @@
       <w:bCs/>
       <w:i/>
       <w:iCs/>
-      <w:color w:val="4F81BD" w:themeColor="accent1"/>
+      <w:color w:val="000000"/>
     </w:rPr>
   </w:style>
   <w:style w:type="paragraph" w:styleId="Heading5">
@@ -1707,7 +1877,7 @@
     </w:pPr>
     <w:rPr>
       <w:rFonts w:asciiTheme="majorHAnsi" w:eastAsiaTheme="majorEastAsia" w:hAnsiTheme="majorHAnsi" w:cstheme="majorBidi"/>
-      <w:color w:val="243F60" w:themeColor="accent1" w:themeShade="7F"/>
+      <w:color w:val="000000"/>
     </w:rPr>
   </w:style>
   <w:style w:type="paragraph" w:styleId="Heading6">
@@ -1730,7 +1900,7 @@
       <w:rFonts w:asciiTheme="majorHAnsi" w:eastAsiaTheme="majorEastAsia" w:hAnsiTheme="majorHAnsi" w:cstheme="majorBidi"/>
       <w:i/>
       <w:iCs/>
-      <w:color w:val="243F60" w:themeColor="accent1" w:themeShade="7F"/>
+      <w:color w:val="000000"/>
     </w:rPr>
   </w:style>
   <w:style w:type="paragraph" w:styleId="Heading7">
@@ -1753,7 +1923,7 @@
       <w:rFonts w:asciiTheme="majorHAnsi" w:eastAsiaTheme="majorEastAsia" w:hAnsiTheme="majorHAnsi" w:cstheme="majorBidi"/>
       <w:i/>
       <w:iCs/>
-      <w:color w:val="404040" w:themeColor="text1" w:themeTint="BF"/>
+      <w:color w:val="000000"/>
     </w:rPr>
   </w:style>
   <w:style w:type="paragraph" w:styleId="Heading8">
@@ -1774,7 +1944,7 @@
     </w:pPr>
     <w:rPr>
       <w:rFonts w:asciiTheme="majorHAnsi" w:eastAsiaTheme="majorEastAsia" w:hAnsiTheme="majorHAnsi" w:cstheme="majorBidi"/>
-      <w:color w:val="4F81BD" w:themeColor="accent1"/>
+      <w:color w:val="000000"/>
       <w:sz w:val="20"/>
       <w:szCs w:val="20"/>
     </w:rPr>
@@ -1799,7 +1969,7 @@
       <w:rFonts w:asciiTheme="majorHAnsi" w:eastAsiaTheme="majorEastAsia" w:hAnsiTheme="majorHAnsi" w:cstheme="majorBidi"/>
       <w:i/>
       <w:iCs/>
-      <w:color w:val="404040" w:themeColor="text1" w:themeTint="BF"/>
+      <w:color w:val="000000"/>
       <w:sz w:val="20"/>
       <w:szCs w:val="20"/>
     </w:rPr>
@@ -1897,7 +2067,7 @@
       <w:rFonts w:asciiTheme="majorHAnsi" w:eastAsiaTheme="majorEastAsia" w:hAnsiTheme="majorHAnsi" w:cstheme="majorBidi"/>
       <w:b/>
       <w:bCs/>
-      <w:color w:val="365F91" w:themeColor="accent1" w:themeShade="BF"/>
+      <w:color w:val="000000"/>
       <w:sz w:val="28"/>
       <w:szCs w:val="28"/>
     </w:rPr>
@@ -1912,7 +2082,7 @@
       <w:rFonts w:asciiTheme="majorHAnsi" w:eastAsiaTheme="majorEastAsia" w:hAnsiTheme="majorHAnsi" w:cstheme="majorBidi"/>
       <w:b/>
       <w:bCs/>
-      <w:color w:val="4F81BD" w:themeColor="accent1"/>
+      <w:color w:val="000000"/>
       <w:sz w:val="26"/>
       <w:szCs w:val="26"/>
     </w:rPr>
@@ -1927,7 +2097,7 @@
       <w:rFonts w:asciiTheme="majorHAnsi" w:eastAsiaTheme="majorEastAsia" w:hAnsiTheme="majorHAnsi" w:cstheme="majorBidi"/>
       <w:b/>
       <w:bCs/>
-      <w:color w:val="4F81BD" w:themeColor="accent1"/>
+      <w:color w:val="000000"/>
     </w:rPr>
   </w:style>
   <w:style w:type="paragraph" w:styleId="Title">
@@ -2291,7 +2461,7 @@
       <w:bCs/>
       <w:i/>
       <w:iCs/>
-      <w:color w:val="4F81BD" w:themeColor="accent1"/>
+      <w:color w:val="000000"/>
     </w:rPr>
   </w:style>
   <w:style w:type="character" w:customStyle="1" w:styleId="Heading5Char">
@@ -2303,7 +2473,7 @@
     <w:rsid w:val="00FC693F"/>
     <w:rPr>
       <w:rFonts w:asciiTheme="majorHAnsi" w:eastAsiaTheme="majorEastAsia" w:hAnsiTheme="majorHAnsi" w:cstheme="majorBidi"/>
-      <w:color w:val="243F60" w:themeColor="accent1" w:themeShade="7F"/>
+      <w:color w:val="000000"/>
     </w:rPr>
   </w:style>
   <w:style w:type="character" w:customStyle="1" w:styleId="Heading6Char">
@@ -2317,7 +2487,7 @@
       <w:rFonts w:asciiTheme="majorHAnsi" w:eastAsiaTheme="majorEastAsia" w:hAnsiTheme="majorHAnsi" w:cstheme="majorBidi"/>
       <w:i/>
       <w:iCs/>
-      <w:color w:val="243F60" w:themeColor="accent1" w:themeShade="7F"/>
+      <w:color w:val="000000"/>
     </w:rPr>
   </w:style>
   <w:style w:type="character" w:customStyle="1" w:styleId="Heading7Char">
@@ -2331,7 +2501,7 @@
       <w:rFonts w:asciiTheme="majorHAnsi" w:eastAsiaTheme="majorEastAsia" w:hAnsiTheme="majorHAnsi" w:cstheme="majorBidi"/>
       <w:i/>
       <w:iCs/>
-      <w:color w:val="404040" w:themeColor="text1" w:themeTint="BF"/>
+      <w:color w:val="000000"/>
     </w:rPr>
   </w:style>
   <w:style w:type="character" w:customStyle="1" w:styleId="Heading8Char">
@@ -2343,7 +2513,7 @@
     <w:rsid w:val="00FC693F"/>
     <w:rPr>
       <w:rFonts w:asciiTheme="majorHAnsi" w:eastAsiaTheme="majorEastAsia" w:hAnsiTheme="majorHAnsi" w:cstheme="majorBidi"/>
-      <w:color w:val="4F81BD" w:themeColor="accent1"/>
+      <w:color w:val="000000"/>
       <w:sz w:val="20"/>
       <w:szCs w:val="20"/>
     </w:rPr>
@@ -2359,7 +2529,7 @@
       <w:rFonts w:asciiTheme="majorHAnsi" w:eastAsiaTheme="majorEastAsia" w:hAnsiTheme="majorHAnsi" w:cstheme="majorBidi"/>
       <w:i/>
       <w:iCs/>
-      <w:color w:val="404040" w:themeColor="text1" w:themeTint="BF"/>
+      <w:color w:val="000000"/>
       <w:sz w:val="20"/>
       <w:szCs w:val="20"/>
     </w:rPr>

</xml_diff>

<commit_message>
Document three CRAFT operating modes
Rework README and setup documentation around privileged enrollment, credential linking, and Windows-exported certificates. Add updated process guides, diagrams, validation guidance, and supporting configuration references.
</commit_message>
<xml_diff>
--- a/docs/01-CRAFT-Process-Overview.docx
+++ b/docs/01-CRAFT-Process-Overview.docx
@@ -5,184 +5,131 @@
     <w:p>
       <w:pPr>
         <w:pStyle w:val="Title"/>
-        <w:pageBreakBefore w:val="0"/>
       </w:pPr>
       <w:r>
-        <w:rPr>
-          <w:color w:val="000000"/>
-        </w:rPr>
-        <w:t>CRAFT Certificate Workflows and Tickets</w:t>
+        <w:t>CRAFT Linux Operating Modes and Tickets</w:t>
       </w:r>
     </w:p>
     <w:p>
       <w:pPr>
         <w:pStyle w:val="Subtitle"/>
-        <w:pageBreakBefore w:val="0"/>
       </w:pPr>
       <w:r>
-        <w:t>Certificate Request Agent for Tickets  |  Process Overview</w:t>
+        <w:t>Certificate Request Agent for Tickets  |  Process overview</w:t>
+      </w:r>
+    </w:p>
+    <w:p>
+      <w:r>
+        <w:t>CRAFT obtains a user's Kerberos ticket-granting ticket (TGT) through PKINIT from Linux, including hosts that are not domain-joined. It supports three operating modes. Linux can orchestrate privileged certificate enrollment, orchestrate privileged credential linking, or use a certificate exported from Windows with unprivileged acquisition. All three publish the user's cache for unattended applications without storing the user's AD password.</w:t>
       </w:r>
     </w:p>
     <w:p>
       <w:pPr>
-        <w:keepLines/>
-        <w:pageBreakBefore w:val="0"/>
+        <w:pStyle w:val="Heading1"/>
       </w:pPr>
       <w:r>
-        <w:t>CRAFT lets a user obtain Kerberos credentials noninteractively from a trusted Linux endpoint, including a host that is not domain-joined. It first checks for a user-supplied certificate and key in the actual home directory and can run this workflow entirely unprivileged. If the pair is absent, an authorized enrollment deployment obtains a short-lived certificate on the user's behalf. Both paths save a ticket-granting ticket (TGT) for unattended applications without retaining the user's AD password.</w:t>
-      </w:r>
-    </w:p>
-    <w:p>
-      <w:pPr>
-        <w:pStyle w:val="Heading2"/>
-        <w:pageBreakBefore w:val="0"/>
-      </w:pPr>
-      <w:r>
-        <w:rPr>
-          <w:color w:val="000000"/>
-        </w:rPr>
-        <w:t>Unprivileged Home Certificate Workflow</w:t>
-      </w:r>
-    </w:p>
-    <w:p>
-      <w:pPr>
-        <w:keepLines/>
-        <w:pageBreakBefore w:val="0"/>
-      </w:pPr>
-      <w:r>
-        <w:t>Install craft and craft-worker as ordinary mode-0755 executables and provide readable, root-controlled /etc/craft policy, trust anchors and CRLs. No service account, enrollment keytab, LDAP, agent, CES or /run/craft is required. Place an existing unencrypted PEM pair at the fixed NSS-home paths:</w:t>
-      </w:r>
-    </w:p>
-    <w:p>
-      <w:pPr>
-        <w:pStyle w:val="CodeBlock"/>
-        <w:pageBreakBefore w:val="0"/>
-      </w:pPr>
-      <w:r>
-        <w:t>mkdir -p ~/.config/craft</w:t>
-        <w:br/>
-        <w:t>chmod 0700 ~/.config/craft</w:t>
-        <w:br/>
-        <w:t>install -m 0600 /path/to/certificate.pem ~/.config/craft/user.pem</w:t>
-        <w:br/>
-        <w:t>install -m 0600 /path/to/private-key.pem ~/.config/craft/user.key</w:t>
-      </w:r>
-    </w:p>
-    <w:p>
-      <w:pPr>
-        <w:keepLines/>
-        <w:pageBreakBefore w:val="0"/>
-      </w:pPr>
-      <w:r>
-        <w:t>Both files must be caller-owned regular files with one hard link, without symlinks, nonempty and at most 1 MiB each. The key must be private; the home and certificate directories must not be group/world-writable. CRAFT ignores HOME and XDG overrides when locating the pair.</w:t>
-      </w:r>
-    </w:p>
-    <w:p>
-      <w:pPr>
-        <w:keepLines/>
-        <w:pageBreakBefore w:val="0"/>
-      </w:pPr>
-      <w:r>
-        <w:t>A complete pair takes priority, including on an enrollment-enabled host. Partial, unsafe, encrypted or invalid inputs fail and retain the cache. Enrollment is selected only when both files are absent; it requires the setuid installation. A home-only installation reports the enrollment requirement if no pair exists.</w:t>
-      </w:r>
-    </w:p>
-    <w:p>
-      <w:pPr>
-        <w:pStyle w:val="Heading2"/>
-        <w:pageBreakBefore w:val="0"/>
-      </w:pPr>
-      <w:r>
-        <w:rPr>
-          <w:color w:val="000000"/>
-        </w:rPr>
-        <w:t>Certificate Selection and Authentication</w:t>
-      </w:r>
-    </w:p>
-    <w:p>
-      <w:pPr>
-        <w:keepLines/>
-        <w:pageBreakBefore w:val="0"/>
-      </w:pPr>
-      <w:r>
-        <w:t>Administrators configure public Kerberos policy, trusted certificate authorities and current revocation lists. Configuration ships disabled. Enrollment additionally requires directory access, CES, an agent and CA recipient restrictions. The user invokes craft with no arguments; the selected certificate workflow proceeds as follows.</w:t>
+        <w:t>Choose an operating mode</w:t>
       </w:r>
     </w:p>
     <w:tbl>
       <w:tblPr>
-        <w:tblW w:w="10282" w:type="dxa"/>
-        <w:jc w:val="center"/>
+        <w:tblW w:type="auto" w:w="0"/>
+        <w:tblLayout w:type="fixed"/>
+        <w:tblLook w:firstColumn="1" w:firstRow="1" w:lastColumn="0" w:lastRow="0" w:noHBand="0" w:noVBand="1" w:val="04A0"/>
         <w:tblBorders>
-          <w:top w:val="single" w:sz="4" w:space="0" w:color="D9D9D9"/>
-          <w:left w:val="single" w:sz="4" w:space="0" w:color="D9D9D9"/>
-          <w:bottom w:val="single" w:sz="4" w:space="0" w:color="D9D9D9"/>
-          <w:right w:val="single" w:sz="4" w:space="0" w:color="D9D9D9"/>
-          <w:insideH w:val="single" w:sz="4" w:space="0" w:color="D9D9D9"/>
-          <w:insideV w:val="single" w:sz="4" w:space="0" w:color="D9D9D9"/>
+          <w:top w:val="single" w:sz="4" w:color="D9D9D9"/>
+          <w:left w:val="single" w:sz="4" w:color="D9D9D9"/>
+          <w:bottom w:val="single" w:sz="4" w:color="D9D9D9"/>
+          <w:right w:val="single" w:sz="4" w:color="D9D9D9"/>
+          <w:insideH w:val="single" w:sz="4" w:color="D9D9D9"/>
+          <w:insideV w:val="single" w:sz="4" w:color="D9D9D9"/>
         </w:tblBorders>
-        <w:tblLayout w:type="fixed"/>
-        <w:tblLook w:val="04A0" w:firstRow="1" w:lastRow="0" w:firstColumn="1" w:lastColumn="0" w:noHBand="0" w:noVBand="1"/>
       </w:tblPr>
       <w:tblGrid>
-        <w:gridCol w:w="1944"/>
-        <w:gridCol w:w="8338"/>
+        <w:gridCol w:w="2376"/>
+        <w:gridCol w:w="5976"/>
+        <w:gridCol w:w="1930"/>
       </w:tblGrid>
       <w:tr>
         <w:trPr>
+          <w:tblHeader/>
           <w:cantSplit/>
-          <w:tblHeader/>
-          <w:jc w:val="center"/>
         </w:trPr>
         <w:tc>
           <w:tcPr>
-            <w:tcW w:w="1944" w:type="dxa"/>
-            <w:shd w:val="clear" w:color="auto" w:fill="193747"/>
+            <w:tcW w:type="dxa" w:w="2376"/>
+            <w:vAlign w:val="center"/>
             <w:tcMar>
-              <w:top w:w="70" w:type="dxa"/>
-              <w:left w:w="90" w:type="dxa"/>
-              <w:bottom w:w="70" w:type="dxa"/>
-              <w:right w:w="90" w:type="dxa"/>
+              <w:top w:w="100" w:type="dxa"/>
+              <w:left w:w="100" w:type="dxa"/>
+              <w:bottom w:w="100" w:type="dxa"/>
+              <w:right w:w="100" w:type="dxa"/>
             </w:tcMar>
-            <w:vAlign w:val="center"/>
+            <w:shd w:fill="18334A"/>
           </w:tcPr>
           <w:p>
             <w:pPr>
-              <w:keepNext w:val="0"/>
-              <w:spacing w:after="0"/>
+              <w:spacing w:after="40" w:before="40" w:line="252" w:lineRule="auto"/>
             </w:pPr>
             <w:r>
               <w:rPr>
                 <w:b/>
                 <w:color w:val="FFFFFF"/>
-                <w:sz w:val="19"/>
+                <w:sz w:val="20"/>
               </w:rPr>
-              <w:t>Stage</w:t>
+              <w:t>Mode</w:t>
             </w:r>
           </w:p>
         </w:tc>
         <w:tc>
           <w:tcPr>
-            <w:tcW w:w="8338" w:type="dxa"/>
-            <w:shd w:val="clear" w:color="auto" w:fill="193747"/>
+            <w:tcW w:type="dxa" w:w="5976"/>
+            <w:vAlign w:val="center"/>
             <w:tcMar>
-              <w:top w:w="70" w:type="dxa"/>
-              <w:left w:w="90" w:type="dxa"/>
-              <w:bottom w:w="70" w:type="dxa"/>
-              <w:right w:w="90" w:type="dxa"/>
+              <w:top w:w="100" w:type="dxa"/>
+              <w:left w:w="100" w:type="dxa"/>
+              <w:bottom w:w="100" w:type="dxa"/>
+              <w:right w:w="100" w:type="dxa"/>
             </w:tcMar>
-            <w:vAlign w:val="center"/>
+            <w:shd w:fill="18334A"/>
           </w:tcPr>
           <w:p>
             <w:pPr>
-              <w:keepNext w:val="0"/>
-              <w:spacing w:after="0"/>
+              <w:spacing w:after="40" w:before="40" w:line="252" w:lineRule="auto"/>
             </w:pPr>
             <w:r>
               <w:rPr>
                 <w:b/>
                 <w:color w:val="FFFFFF"/>
-                <w:sz w:val="19"/>
+                <w:sz w:val="20"/>
               </w:rPr>
-              <w:t>What Happens</w:t>
+              <w:t>Credential source and authority</w:t>
+            </w:r>
+          </w:p>
+        </w:tc>
+        <w:tc>
+          <w:tcPr>
+            <w:tcW w:type="dxa" w:w="1930"/>
+            <w:vAlign w:val="center"/>
+            <w:tcMar>
+              <w:top w:w="100" w:type="dxa"/>
+              <w:left w:w="100" w:type="dxa"/>
+              <w:bottom w:w="100" w:type="dxa"/>
+              <w:right w:w="100" w:type="dxa"/>
+            </w:tcMar>
+            <w:shd w:fill="18334A"/>
+          </w:tcPr>
+          <w:p>
+            <w:pPr>
+              <w:spacing w:after="40" w:before="40" w:line="252" w:lineRule="auto"/>
+            </w:pPr>
+            <w:r>
+              <w:rPr>
+                <w:b/>
+                <w:color w:val="FFFFFF"/>
+                <w:sz w:val="20"/>
+              </w:rPr>
+              <w:t>Setup</w:t>
             </w:r>
           </w:p>
         </w:tc>
@@ -190,57 +137,692 @@
       <w:tr>
         <w:trPr>
           <w:cantSplit/>
-          <w:jc w:val="center"/>
         </w:trPr>
         <w:tc>
           <w:tcPr>
-            <w:tcW w:w="1944" w:type="dxa"/>
-            <w:shd w:val="clear" w:color="auto" w:fill="F1F4F6"/>
+            <w:tcW w:type="dxa" w:w="2376"/>
+            <w:vAlign w:val="center"/>
             <w:tcMar>
-              <w:top w:w="70" w:type="dxa"/>
-              <w:left w:w="90" w:type="dxa"/>
-              <w:bottom w:w="70" w:type="dxa"/>
-              <w:right w:w="90" w:type="dxa"/>
+              <w:top w:w="100" w:type="dxa"/>
+              <w:left w:w="100" w:type="dxa"/>
+              <w:bottom w:w="100" w:type="dxa"/>
+              <w:right w:w="100" w:type="dxa"/>
             </w:tcMar>
-            <w:vAlign w:val="center"/>
+            <w:shd w:fill="F3F6FA"/>
           </w:tcPr>
           <w:p>
             <w:pPr>
-              <w:keepNext w:val="0"/>
-              <w:spacing w:after="0"/>
+              <w:spacing w:after="40" w:before="40" w:line="252" w:lineRule="auto"/>
             </w:pPr>
             <w:r>
               <w:rPr>
-                <w:color w:val="000000"/>
-                <w:sz w:val="19"/>
+                <w:sz w:val="20"/>
               </w:rPr>
-              <w:t>1  Identify the caller</w:t>
+              <w:t>1  Privileged enrollment</w:t>
             </w:r>
           </w:p>
         </w:tc>
         <w:tc>
           <w:tcPr>
-            <w:tcW w:w="8338" w:type="dxa"/>
-            <w:shd w:val="clear" w:color="auto" w:fill="F1F4F6"/>
+            <w:tcW w:type="dxa" w:w="5976"/>
+            <w:vAlign w:val="center"/>
             <w:tcMar>
-              <w:top w:w="70" w:type="dxa"/>
-              <w:left w:w="90" w:type="dxa"/>
-              <w:bottom w:w="70" w:type="dxa"/>
-              <w:right w:w="90" w:type="dxa"/>
+              <w:top w:w="100" w:type="dxa"/>
+              <w:left w:w="100" w:type="dxa"/>
+              <w:bottom w:w="100" w:type="dxa"/>
+              <w:right w:w="100" w:type="dxa"/>
             </w:tcMar>
-            <w:vAlign w:val="center"/>
+            <w:shd w:fill="F3F6FA"/>
           </w:tcPr>
           <w:p>
             <w:pPr>
-              <w:keepNext w:val="0"/>
-              <w:spacing w:after="0"/>
+              <w:spacing w:after="40" w:before="40" w:line="252" w:lineRule="auto"/>
             </w:pPr>
             <w:r>
               <w:rPr>
-                <w:color w:val="000000"/>
-                <w:sz w:val="19"/>
+                <w:sz w:val="20"/>
               </w:rPr>
-              <w:t>CRAFT checks the real UID, NSS username and home. Root invocation is refused. Enrollment-enabled execution is controlled by craft-users; an ordinary home-only installation needs no special group.</w:t>
+              <w:t>Linux generates a user key and enrolls a certificate through CES and AD CS with an enrollment-agent signature. The CA restricts the agent, template and recipients.</w:t>
+            </w:r>
+          </w:p>
+        </w:tc>
+        <w:tc>
+          <w:tcPr>
+            <w:tcW w:type="dxa" w:w="1930"/>
+            <w:vAlign w:val="center"/>
+            <w:tcMar>
+              <w:top w:w="100" w:type="dxa"/>
+              <w:left w:w="100" w:type="dxa"/>
+              <w:bottom w:w="100" w:type="dxa"/>
+              <w:right w:w="100" w:type="dxa"/>
+            </w:tcMar>
+            <w:shd w:fill="F3F6FA"/>
+          </w:tcPr>
+          <w:p>
+            <w:pPr>
+              <w:spacing w:after="40" w:before="40" w:line="252" w:lineRule="auto"/>
+            </w:pPr>
+            <w:hyperlink r:id="rId16">
+              <w:r>
+                <w:rPr>
+                  <w:color w:val="315DC0"/>
+                  <w:u w:val="single"/>
+                </w:rPr>
+                <w:t>Mode 1 setup</w:t>
+              </w:r>
+            </w:hyperlink>
+          </w:p>
+        </w:tc>
+      </w:tr>
+      <w:tr>
+        <w:trPr>
+          <w:cantSplit/>
+        </w:trPr>
+        <w:tc>
+          <w:tcPr>
+            <w:tcW w:type="dxa" w:w="2376"/>
+            <w:vAlign w:val="center"/>
+            <w:tcMar>
+              <w:top w:w="100" w:type="dxa"/>
+              <w:left w:w="100" w:type="dxa"/>
+              <w:bottom w:w="100" w:type="dxa"/>
+              <w:right w:w="100" w:type="dxa"/>
+            </w:tcMar>
+            <w:shd w:fill="FFFFFF"/>
+          </w:tcPr>
+          <w:p>
+            <w:pPr>
+              <w:spacing w:after="40" w:before="40" w:line="252" w:lineRule="auto"/>
+            </w:pPr>
+            <w:r>
+              <w:rPr>
+                <w:sz w:val="20"/>
+              </w:rPr>
+              <w:t>2  Privileged credential linking</w:t>
+            </w:r>
+          </w:p>
+        </w:tc>
+        <w:tc>
+          <w:tcPr>
+            <w:tcW w:type="dxa" w:w="5976"/>
+            <w:vAlign w:val="center"/>
+            <w:tcMar>
+              <w:top w:w="100" w:type="dxa"/>
+              <w:left w:w="100" w:type="dxa"/>
+              <w:bottom w:w="100" w:type="dxa"/>
+              <w:right w:w="100" w:type="dxa"/>
+            </w:tcMar>
+            <w:shd w:fill="FFFFFF"/>
+          </w:tcPr>
+          <w:p>
+            <w:pPr>
+              <w:spacing w:after="40" w:before="40" w:line="252" w:lineRule="auto"/>
+            </w:pPr>
+            <w:r>
+              <w:rPr>
+                <w:sz w:val="20"/>
+              </w:rPr>
+              <w:t>Linux adds a temporary public key to the user's msDS-KeyCredentialLink and uses Key Trust PKINIT. AD attribute delegation defines the target scope.</w:t>
+            </w:r>
+          </w:p>
+        </w:tc>
+        <w:tc>
+          <w:tcPr>
+            <w:tcW w:type="dxa" w:w="1930"/>
+            <w:vAlign w:val="center"/>
+            <w:tcMar>
+              <w:top w:w="100" w:type="dxa"/>
+              <w:left w:w="100" w:type="dxa"/>
+              <w:bottom w:w="100" w:type="dxa"/>
+              <w:right w:w="100" w:type="dxa"/>
+            </w:tcMar>
+            <w:shd w:fill="FFFFFF"/>
+          </w:tcPr>
+          <w:p>
+            <w:pPr>
+              <w:spacing w:after="40" w:before="40" w:line="252" w:lineRule="auto"/>
+            </w:pPr>
+            <w:hyperlink r:id="rId17">
+              <w:r>
+                <w:rPr>
+                  <w:color w:val="315DC0"/>
+                  <w:u w:val="single"/>
+                </w:rPr>
+                <w:t>Mode 2 setup</w:t>
+              </w:r>
+            </w:hyperlink>
+          </w:p>
+        </w:tc>
+      </w:tr>
+      <w:tr>
+        <w:trPr>
+          <w:cantSplit/>
+        </w:trPr>
+        <w:tc>
+          <w:tcPr>
+            <w:tcW w:type="dxa" w:w="2376"/>
+            <w:vAlign w:val="center"/>
+            <w:tcMar>
+              <w:top w:w="100" w:type="dxa"/>
+              <w:left w:w="100" w:type="dxa"/>
+              <w:bottom w:w="100" w:type="dxa"/>
+              <w:right w:w="100" w:type="dxa"/>
+            </w:tcMar>
+            <w:shd w:fill="F3F6FA"/>
+          </w:tcPr>
+          <w:p>
+            <w:pPr>
+              <w:spacing w:after="40" w:before="40" w:line="252" w:lineRule="auto"/>
+            </w:pPr>
+            <w:r>
+              <w:rPr>
+                <w:sz w:val="20"/>
+              </w:rPr>
+              <w:t>3  Unprivileged Windows export</w:t>
+            </w:r>
+          </w:p>
+        </w:tc>
+        <w:tc>
+          <w:tcPr>
+            <w:tcW w:type="dxa" w:w="5976"/>
+            <w:vAlign w:val="center"/>
+            <w:tcMar>
+              <w:top w:w="100" w:type="dxa"/>
+              <w:left w:w="100" w:type="dxa"/>
+              <w:bottom w:w="100" w:type="dxa"/>
+              <w:right w:w="100" w:type="dxa"/>
+            </w:tcMar>
+            <w:shd w:fill="F3F6FA"/>
+          </w:tcPr>
+          <w:p>
+            <w:pPr>
+              <w:spacing w:after="40" w:before="40" w:line="252" w:lineRule="auto"/>
+            </w:pPr>
+            <w:r>
+              <w:rPr>
+                <w:sz w:val="20"/>
+              </w:rPr>
+              <w:t>Windows enrolls and exports a certificate and matching private key. Linux uses the securely transferred PEM pair under the caller's UID.</w:t>
+            </w:r>
+          </w:p>
+        </w:tc>
+        <w:tc>
+          <w:tcPr>
+            <w:tcW w:type="dxa" w:w="1930"/>
+            <w:vAlign w:val="center"/>
+            <w:tcMar>
+              <w:top w:w="100" w:type="dxa"/>
+              <w:left w:w="100" w:type="dxa"/>
+              <w:bottom w:w="100" w:type="dxa"/>
+              <w:right w:w="100" w:type="dxa"/>
+            </w:tcMar>
+            <w:shd w:fill="F3F6FA"/>
+          </w:tcPr>
+          <w:p>
+            <w:pPr>
+              <w:spacing w:after="40" w:before="40" w:line="252" w:lineRule="auto"/>
+            </w:pPr>
+            <w:hyperlink r:id="rId18">
+              <w:r>
+                <w:rPr>
+                  <w:color w:val="315DC0"/>
+                  <w:u w:val="single"/>
+                </w:rPr>
+                <w:t>Mode 3 setup</w:t>
+              </w:r>
+            </w:hyperlink>
+          </w:p>
+        </w:tc>
+      </w:tr>
+    </w:tbl>
+    <w:p>
+      <w:pPr>
+        <w:spacing w:after="0"/>
+      </w:pPr>
+    </w:p>
+    <w:p>
+      <w:pPr>
+        <w:pStyle w:val="Heading1"/>
+      </w:pPr>
+      <w:r>
+        <w:t>How CRAFT selects the mode</w:t>
+      </w:r>
+    </w:p>
+    <w:p>
+      <w:r>
+        <w:t>A complete pair at the real caller's NSS-home ~/.config/craft/user.pem and user.key takes priority on every installation. Partial, unsafe, expired, revoked or invalid inputs fail and preserve the cache. Only when both files are absent does mechanism=enrollment select mode 1 or mechanism=key_trust select mode 2. A failed privileged mechanism never switches to the other one.</w:t>
+      </w:r>
+    </w:p>
+    <w:p>
+      <w:r>
+        <w:t>Mode 3 uses ordinary executables. Modes 1 and 2 require the installed setuid launcher, dedicated craft service account, craft-users caller group and private /run/craft runtime directory. Users invoke craft directly as themselves, without sudo. Certificate and network processing run outside root, and cache publication runs as the caller.</w:t>
+      </w:r>
+    </w:p>
+    <w:p>
+      <w:hyperlink r:id="rId19">
+        <w:r>
+          <w:rPr>
+            <w:color w:val="315DC0"/>
+            <w:u w:val="single"/>
+          </w:rPr>
+          <w:t>Three-mode selection diagram</w:t>
+        </w:r>
+      </w:hyperlink>
+      <w:r>
+        <w:t xml:space="preserve">  |  </w:t>
+      </w:r>
+      <w:hyperlink r:id="rId20">
+        <w:r>
+          <w:rPr>
+            <w:color w:val="315DC0"/>
+            <w:u w:val="single"/>
+          </w:rPr>
+          <w:t>Build and install</w:t>
+        </w:r>
+      </w:hyperlink>
+    </w:p>
+    <w:p>
+      <w:r>
+        <w:t>CRAFT supports automation alongside MFA-protected sign-in, but does not perform an MFA challenge or establish that one was completed. The next pages show each acquisition flow; the final pages explain identity, storage and the shared ticket lifecycle.</w:t>
+      </w:r>
+    </w:p>
+    <w:p>
+      <w:pPr>
+        <w:sectPr>
+          <w:headerReference w:type="default" r:id="rId37"/>
+          <w:footerReference w:type="default" r:id="rId38"/>
+          <w:pgSz w:w="12240" w:h="15840"/>
+          <w:pgMar w:top="893" w:right="979" w:bottom="893" w:left="979" w:header="360" w:footer="360" w:gutter="0"/>
+          <w:cols w:space="720"/>
+          <w:docGrid w:linePitch="360"/>
+        </w:sectPr>
+      </w:pPr>
+    </w:p>
+    <w:p>
+      <w:pPr>
+        <w:pStyle w:val="Heading1"/>
+      </w:pPr>
+      <w:r>
+        <w:t>Mode 1 privileged certificate enrollment</w:t>
+      </w:r>
+    </w:p>
+    <w:p>
+      <w:hyperlink r:id="rId16">
+        <w:r>
+          <w:rPr>
+            <w:color w:val="315DC0"/>
+            <w:u w:val="single"/>
+          </w:rPr>
+          <w:t>Complete setup instructions</w:t>
+        </w:r>
+      </w:hyperlink>
+      <w:r>
+        <w:t xml:space="preserve">  |  </w:t>
+      </w:r>
+      <w:hyperlink r:id="rId21">
+        <w:r>
+          <w:rPr>
+            <w:color w:val="315DC0"/>
+            <w:u w:val="single"/>
+          </w:rPr>
+          <w:t>Editable flow diagram</w:t>
+        </w:r>
+      </w:hyperlink>
+    </w:p>
+    <w:p>
+      <w:pPr>
+        <w:keepNext/>
+        <w:spacing w:after="40"/>
+        <w:jc w:val="center"/>
+      </w:pPr>
+      <w:r>
+        <w:drawing>
+          <wp:inline xmlns:a="http://schemas.openxmlformats.org/drawingml/2006/main" xmlns:pic="http://schemas.openxmlformats.org/drawingml/2006/picture">
+            <wp:extent cx="8686800" cy="5429250"/>
+            <wp:docPr id="1" name="Picture 1" descr="Linux resolves the user, enrolls a restricted certificate through CES and AD CS, then obtains the user's TGT through PKINIT. The generated user pair is temporary; CA records remain."/>
+            <wp:cNvGraphicFramePr>
+              <a:graphicFrameLocks noChangeAspect="1"/>
+            </wp:cNvGraphicFramePr>
+            <a:graphic>
+              <a:graphicData uri="http://schemas.openxmlformats.org/drawingml/2006/picture">
+                <pic:pic>
+                  <pic:nvPicPr>
+                    <pic:cNvPr id="0" name="image.png"/>
+                    <pic:cNvPicPr/>
+                  </pic:nvPicPr>
+                  <pic:blipFill>
+                    <a:blip r:embed="rId22"/>
+                    <a:stretch>
+                      <a:fillRect/>
+                    </a:stretch>
+                  </pic:blipFill>
+                  <pic:spPr>
+                    <a:xfrm>
+                      <a:off x="0" y="0"/>
+                      <a:ext cx="8686800" cy="5429250"/>
+                    </a:xfrm>
+                    <a:prstGeom prst="rect"/>
+                  </pic:spPr>
+                </pic:pic>
+              </a:graphicData>
+            </a:graphic>
+          </wp:inline>
+        </w:drawing>
+      </w:r>
+    </w:p>
+    <w:p>
+      <w:pPr>
+        <w:pStyle w:val="Caption"/>
+        <w:spacing w:after="0"/>
+      </w:pPr>
+      <w:r>
+        <w:t>Linux resolves the user, enrolls a restricted certificate through CES and AD CS, then obtains the user's TGT through PKINIT. The generated user pair is temporary; CA records remain.</w:t>
+      </w:r>
+    </w:p>
+    <w:p>
+      <w:pPr>
+        <w:sectPr>
+          <w:pgSz w:w="15840" w:h="12240" w:orient="landscape"/>
+          <w:pgMar w:top="720" w:right="720" w:bottom="720" w:left="720" w:header="360" w:footer="360" w:gutter="0"/>
+          <w:cols w:space="720"/>
+          <w:docGrid w:linePitch="360"/>
+        </w:sectPr>
+      </w:pPr>
+    </w:p>
+    <w:p>
+      <w:pPr>
+        <w:pStyle w:val="Heading1"/>
+      </w:pPr>
+      <w:r>
+        <w:t>Mode 2 privileged credential linking</w:t>
+      </w:r>
+    </w:p>
+    <w:p>
+      <w:hyperlink r:id="rId17">
+        <w:r>
+          <w:rPr>
+            <w:color w:val="315DC0"/>
+            <w:u w:val="single"/>
+          </w:rPr>
+          <w:t>Complete setup instructions</w:t>
+        </w:r>
+      </w:hyperlink>
+      <w:r>
+        <w:t xml:space="preserve">  |  </w:t>
+      </w:r>
+      <w:hyperlink r:id="rId23">
+        <w:r>
+          <w:rPr>
+            <w:color w:val="315DC0"/>
+            <w:u w:val="single"/>
+          </w:rPr>
+          <w:t>Editable flow diagram</w:t>
+        </w:r>
+      </w:hyperlink>
+    </w:p>
+    <w:p>
+      <w:pPr>
+        <w:keepNext/>
+        <w:spacing w:after="40"/>
+        <w:jc w:val="center"/>
+      </w:pPr>
+      <w:r>
+        <w:drawing>
+          <wp:inline xmlns:a="http://schemas.openxmlformats.org/drawingml/2006/main" xmlns:pic="http://schemas.openxmlformats.org/drawingml/2006/picture">
+            <wp:extent cx="8686800" cy="5429250"/>
+            <wp:docPr id="2" name="Picture 2" descr="Linux uses a delegated directory write and Key Trust PKINIT against the same writable DC. Cleanup must succeed before cache publication. A residual key after an outage needs administrator removal."/>
+            <wp:cNvGraphicFramePr>
+              <a:graphicFrameLocks noChangeAspect="1"/>
+            </wp:cNvGraphicFramePr>
+            <a:graphic>
+              <a:graphicData uri="http://schemas.openxmlformats.org/drawingml/2006/picture">
+                <pic:pic>
+                  <pic:nvPicPr>
+                    <pic:cNvPr id="0" name="image.png"/>
+                    <pic:cNvPicPr/>
+                  </pic:nvPicPr>
+                  <pic:blipFill>
+                    <a:blip r:embed="rId24"/>
+                    <a:stretch>
+                      <a:fillRect/>
+                    </a:stretch>
+                  </pic:blipFill>
+                  <pic:spPr>
+                    <a:xfrm>
+                      <a:off x="0" y="0"/>
+                      <a:ext cx="8686800" cy="5429250"/>
+                    </a:xfrm>
+                    <a:prstGeom prst="rect"/>
+                  </pic:spPr>
+                </pic:pic>
+              </a:graphicData>
+            </a:graphic>
+          </wp:inline>
+        </w:drawing>
+      </w:r>
+    </w:p>
+    <w:p>
+      <w:pPr>
+        <w:pStyle w:val="Caption"/>
+        <w:spacing w:after="0"/>
+      </w:pPr>
+      <w:r>
+        <w:t>Linux uses a delegated directory write and Key Trust PKINIT against the same writable DC. Cleanup must succeed before cache publication. A residual key after an outage needs administrator removal.</w:t>
+      </w:r>
+    </w:p>
+    <w:p>
+      <w:pPr>
+        <w:sectPr>
+          <w:pgSz w:w="15840" w:h="12240" w:orient="landscape"/>
+          <w:pgMar w:top="720" w:right="720" w:bottom="720" w:left="720" w:header="360" w:footer="360" w:gutter="0"/>
+          <w:cols w:space="720"/>
+          <w:docGrid w:linePitch="360"/>
+        </w:sectPr>
+      </w:pPr>
+    </w:p>
+    <w:p>
+      <w:pPr>
+        <w:pStyle w:val="Heading1"/>
+      </w:pPr>
+      <w:r>
+        <w:t>Mode 3 unprivileged Windows exported certificate</w:t>
+      </w:r>
+    </w:p>
+    <w:p>
+      <w:hyperlink r:id="rId18">
+        <w:r>
+          <w:rPr>
+            <w:color w:val="315DC0"/>
+            <w:u w:val="single"/>
+          </w:rPr>
+          <w:t>Complete setup instructions</w:t>
+        </w:r>
+      </w:hyperlink>
+      <w:r>
+        <w:t xml:space="preserve">  |  </w:t>
+      </w:r>
+      <w:hyperlink r:id="rId25">
+        <w:r>
+          <w:rPr>
+            <w:color w:val="315DC0"/>
+            <w:u w:val="single"/>
+          </w:rPr>
+          <w:t>Editable flow diagram</w:t>
+        </w:r>
+      </w:hyperlink>
+    </w:p>
+    <w:p>
+      <w:pPr>
+        <w:keepNext/>
+        <w:spacing w:after="40"/>
+        <w:jc w:val="center"/>
+      </w:pPr>
+      <w:r>
+        <w:drawing>
+          <wp:inline xmlns:a="http://schemas.openxmlformats.org/drawingml/2006/main" xmlns:pic="http://schemas.openxmlformats.org/drawingml/2006/picture">
+            <wp:extent cx="8686800" cy="5429250"/>
+            <wp:docPr id="3" name="Picture 3" descr="Windows enrollment and export precede secure PEM transfer. Linux validates the supplied pair and obtains the user's TGT as the caller. The PEM pair remains and must be replaced before expiry."/>
+            <wp:cNvGraphicFramePr>
+              <a:graphicFrameLocks noChangeAspect="1"/>
+            </wp:cNvGraphicFramePr>
+            <a:graphic>
+              <a:graphicData uri="http://schemas.openxmlformats.org/drawingml/2006/picture">
+                <pic:pic>
+                  <pic:nvPicPr>
+                    <pic:cNvPr id="0" name="image.png"/>
+                    <pic:cNvPicPr/>
+                  </pic:nvPicPr>
+                  <pic:blipFill>
+                    <a:blip r:embed="rId26"/>
+                    <a:stretch>
+                      <a:fillRect/>
+                    </a:stretch>
+                  </pic:blipFill>
+                  <pic:spPr>
+                    <a:xfrm>
+                      <a:off x="0" y="0"/>
+                      <a:ext cx="8686800" cy="5429250"/>
+                    </a:xfrm>
+                    <a:prstGeom prst="rect"/>
+                  </pic:spPr>
+                </pic:pic>
+              </a:graphicData>
+            </a:graphic>
+          </wp:inline>
+        </w:drawing>
+      </w:r>
+    </w:p>
+    <w:p>
+      <w:pPr>
+        <w:pStyle w:val="Caption"/>
+        <w:spacing w:after="0"/>
+      </w:pPr>
+      <w:r>
+        <w:t>Windows enrollment and export precede secure PEM transfer. Linux validates the supplied pair and obtains the user's TGT as the caller. The PEM pair remains and must be replaced before expiry.</w:t>
+      </w:r>
+    </w:p>
+    <w:p>
+      <w:pPr>
+        <w:sectPr>
+          <w:pgSz w:w="15840" w:h="12240" w:orient="landscape"/>
+          <w:pgMar w:top="720" w:right="720" w:bottom="720" w:left="720" w:header="360" w:footer="360" w:gutter="0"/>
+          <w:cols w:space="720"/>
+          <w:docGrid w:linePitch="360"/>
+        </w:sectPr>
+      </w:pPr>
+    </w:p>
+    <w:p>
+      <w:pPr>
+        <w:pStyle w:val="Heading1"/>
+      </w:pPr>
+      <w:r>
+        <w:t>Identity trust and credential storage</w:t>
+      </w:r>
+    </w:p>
+    <w:p>
+      <w:r>
+        <w:t>All modes request &lt;Linux username&gt;@&lt;configured realm&gt; and verify the returned TGT principal, flags, AES encryption and lifetimes. Linux names must match the intended AD sAMAccountName. Enrollment and credential linking resolve and check the directory UPN. The supplied-certificate path performs no LDAP lookup; the KDC must map that certificate to the fixed caller principal. The certificate CN cannot select another account.</w:t>
+      </w:r>
+    </w:p>
+    <w:tbl>
+      <w:tblPr>
+        <w:tblW w:type="auto" w:w="0"/>
+        <w:tblLayout w:type="fixed"/>
+        <w:tblLook w:firstColumn="1" w:firstRow="1" w:lastColumn="0" w:lastRow="0" w:noHBand="0" w:noVBand="1" w:val="04A0"/>
+        <w:tblBorders>
+          <w:top w:val="single" w:sz="4" w:color="D9D9D9"/>
+          <w:left w:val="single" w:sz="4" w:color="D9D9D9"/>
+          <w:bottom w:val="single" w:sz="4" w:color="D9D9D9"/>
+          <w:right w:val="single" w:sz="4" w:color="D9D9D9"/>
+          <w:insideH w:val="single" w:sz="4" w:color="D9D9D9"/>
+          <w:insideV w:val="single" w:sz="4" w:color="D9D9D9"/>
+        </w:tblBorders>
+      </w:tblPr>
+      <w:tblGrid>
+        <w:gridCol w:w="1584"/>
+        <w:gridCol w:w="4464"/>
+        <w:gridCol w:w="4234"/>
+      </w:tblGrid>
+      <w:tr>
+        <w:trPr>
+          <w:tblHeader/>
+          <w:cantSplit/>
+        </w:trPr>
+        <w:tc>
+          <w:tcPr>
+            <w:tcW w:type="dxa" w:w="1584"/>
+            <w:vAlign w:val="center"/>
+            <w:tcMar>
+              <w:top w:w="100" w:type="dxa"/>
+              <w:left w:w="100" w:type="dxa"/>
+              <w:bottom w:w="100" w:type="dxa"/>
+              <w:right w:w="100" w:type="dxa"/>
+            </w:tcMar>
+            <w:shd w:fill="18334A"/>
+          </w:tcPr>
+          <w:p>
+            <w:pPr>
+              <w:spacing w:after="40" w:before="40" w:line="252" w:lineRule="auto"/>
+            </w:pPr>
+            <w:r>
+              <w:rPr>
+                <w:b/>
+                <w:color w:val="FFFFFF"/>
+                <w:sz w:val="20"/>
+              </w:rPr>
+              <w:t>Mode</w:t>
+            </w:r>
+          </w:p>
+        </w:tc>
+        <w:tc>
+          <w:tcPr>
+            <w:tcW w:type="dxa" w:w="4464"/>
+            <w:vAlign w:val="center"/>
+            <w:tcMar>
+              <w:top w:w="100" w:type="dxa"/>
+              <w:left w:w="100" w:type="dxa"/>
+              <w:bottom w:w="100" w:type="dxa"/>
+              <w:right w:w="100" w:type="dxa"/>
+            </w:tcMar>
+            <w:shd w:fill="18334A"/>
+          </w:tcPr>
+          <w:p>
+            <w:pPr>
+              <w:spacing w:after="40" w:before="40" w:line="252" w:lineRule="auto"/>
+            </w:pPr>
+            <w:r>
+              <w:rPr>
+                <w:b/>
+                <w:color w:val="FFFFFF"/>
+                <w:sz w:val="20"/>
+              </w:rPr>
+              <w:t>Client credential and authorization</w:t>
+            </w:r>
+          </w:p>
+        </w:tc>
+        <w:tc>
+          <w:tcPr>
+            <w:tcW w:type="dxa" w:w="4234"/>
+            <w:vAlign w:val="center"/>
+            <w:tcMar>
+              <w:top w:w="100" w:type="dxa"/>
+              <w:left w:w="100" w:type="dxa"/>
+              <w:bottom w:w="100" w:type="dxa"/>
+              <w:right w:w="100" w:type="dxa"/>
+            </w:tcMar>
+            <w:shd w:fill="18334A"/>
+          </w:tcPr>
+          <w:p>
+            <w:pPr>
+              <w:spacing w:after="40" w:before="40" w:line="252" w:lineRule="auto"/>
+            </w:pPr>
+            <w:r>
+              <w:rPr>
+                <w:b/>
+                <w:color w:val="FFFFFF"/>
+                <w:sz w:val="20"/>
+              </w:rPr>
+              <w:t>What persists</w:t>
             </w:r>
           </w:p>
         </w:tc>
@@ -248,57 +830,76 @@
       <w:tr>
         <w:trPr>
           <w:cantSplit/>
-          <w:jc w:val="center"/>
         </w:trPr>
         <w:tc>
           <w:tcPr>
-            <w:tcW w:w="1944" w:type="dxa"/>
-            <w:shd w:val="clear" w:color="auto" w:fill="FFFFFF"/>
+            <w:tcW w:type="dxa" w:w="1584"/>
+            <w:vAlign w:val="center"/>
             <w:tcMar>
-              <w:top w:w="70" w:type="dxa"/>
-              <w:left w:w="90" w:type="dxa"/>
-              <w:bottom w:w="70" w:type="dxa"/>
-              <w:right w:w="90" w:type="dxa"/>
+              <w:top w:w="100" w:type="dxa"/>
+              <w:left w:w="100" w:type="dxa"/>
+              <w:bottom w:w="100" w:type="dxa"/>
+              <w:right w:w="100" w:type="dxa"/>
             </w:tcMar>
-            <w:vAlign w:val="center"/>
+            <w:shd w:fill="F3F6FA"/>
           </w:tcPr>
           <w:p>
             <w:pPr>
-              <w:keepNext w:val="0"/>
-              <w:spacing w:after="0"/>
+              <w:spacing w:after="40" w:before="40" w:line="252" w:lineRule="auto"/>
             </w:pPr>
             <w:r>
               <w:rPr>
-                <w:color w:val="000000"/>
-                <w:sz w:val="19"/>
+                <w:sz w:val="20"/>
               </w:rPr>
-              <w:t>2  Select the source</w:t>
+              <w:t>1  Enrollment</w:t>
             </w:r>
           </w:p>
         </w:tc>
         <w:tc>
           <w:tcPr>
-            <w:tcW w:w="8338" w:type="dxa"/>
-            <w:shd w:val="clear" w:color="auto" w:fill="FFFFFF"/>
+            <w:tcW w:type="dxa" w:w="4464"/>
+            <w:vAlign w:val="center"/>
             <w:tcMar>
-              <w:top w:w="70" w:type="dxa"/>
-              <w:left w:w="90" w:type="dxa"/>
-              <w:bottom w:w="70" w:type="dxa"/>
-              <w:right w:w="90" w:type="dxa"/>
+              <w:top w:w="100" w:type="dxa"/>
+              <w:left w:w="100" w:type="dxa"/>
+              <w:bottom w:w="100" w:type="dxa"/>
+              <w:right w:w="100" w:type="dxa"/>
             </w:tcMar>
-            <w:vAlign w:val="center"/>
+            <w:shd w:fill="F3F6FA"/>
           </w:tcPr>
           <w:p>
             <w:pPr>
-              <w:keepNext w:val="0"/>
-              <w:spacing w:after="0"/>
+              <w:spacing w:after="40" w:before="40" w:line="252" w:lineRule="auto"/>
             </w:pPr>
             <w:r>
               <w:rPr>
-                <w:color w:val="000000"/>
-                <w:sz w:val="19"/>
+                <w:sz w:val="20"/>
               </w:rPr>
-              <w:t>Open the home pair as the caller. A complete pair takes priority. An absent pair selects enrollment; partial or unsafe files fail without fallback.</w:t>
+              <w:t>CA-issued user certificate; matching key, UPN, template, three client EKUs, short validity, CA chain and CRLs. CA recipient restrictions authorize issuance.</w:t>
+            </w:r>
+          </w:p>
+        </w:tc>
+        <w:tc>
+          <w:tcPr>
+            <w:tcW w:type="dxa" w:w="4234"/>
+            <w:vAlign w:val="center"/>
+            <w:tcMar>
+              <w:top w:w="100" w:type="dxa"/>
+              <w:left w:w="100" w:type="dxa"/>
+              <w:bottom w:w="100" w:type="dxa"/>
+              <w:right w:w="100" w:type="dxa"/>
+            </w:tcMar>
+            <w:shd w:fill="F3F6FA"/>
+          </w:tcPr>
+          <w:p>
+            <w:pPr>
+              <w:spacing w:after="40" w:before="40" w:line="252" w:lineRule="auto"/>
+            </w:pPr>
+            <w:r>
+              <w:rPr>
+                <w:sz w:val="20"/>
+              </w:rPr>
+              <w:t>Private agent/keytab/transport credentials stay under /etc/craft. CA issuance and audit records remain. Generated user key and certificate are released.</w:t>
             </w:r>
           </w:p>
         </w:tc>
@@ -306,57 +907,76 @@
       <w:tr>
         <w:trPr>
           <w:cantSplit/>
-          <w:jc w:val="center"/>
         </w:trPr>
         <w:tc>
           <w:tcPr>
-            <w:tcW w:w="1944" w:type="dxa"/>
-            <w:shd w:val="clear" w:color="auto" w:fill="F1F4F6"/>
+            <w:tcW w:type="dxa" w:w="1584"/>
+            <w:vAlign w:val="center"/>
             <w:tcMar>
-              <w:top w:w="70" w:type="dxa"/>
-              <w:left w:w="90" w:type="dxa"/>
-              <w:bottom w:w="70" w:type="dxa"/>
-              <w:right w:w="90" w:type="dxa"/>
+              <w:top w:w="100" w:type="dxa"/>
+              <w:left w:w="100" w:type="dxa"/>
+              <w:bottom w:w="100" w:type="dxa"/>
+              <w:right w:w="100" w:type="dxa"/>
             </w:tcMar>
-            <w:vAlign w:val="center"/>
+            <w:shd w:fill="FFFFFF"/>
           </w:tcPr>
           <w:p>
             <w:pPr>
-              <w:keepNext w:val="0"/>
-              <w:spacing w:after="0"/>
+              <w:spacing w:after="40" w:before="40" w:line="252" w:lineRule="auto"/>
             </w:pPr>
             <w:r>
               <w:rPr>
-                <w:color w:val="000000"/>
-                <w:sz w:val="19"/>
+                <w:sz w:val="20"/>
               </w:rPr>
-              <w:t>3  Prepare the certificate</w:t>
+              <w:t>2  Credential linking</w:t>
             </w:r>
           </w:p>
         </w:tc>
         <w:tc>
           <w:tcPr>
-            <w:tcW w:w="8338" w:type="dxa"/>
-            <w:shd w:val="clear" w:color="auto" w:fill="F1F4F6"/>
+            <w:tcW w:type="dxa" w:w="4464"/>
+            <w:vAlign w:val="center"/>
             <w:tcMar>
-              <w:top w:w="70" w:type="dxa"/>
-              <w:left w:w="90" w:type="dxa"/>
-              <w:bottom w:w="70" w:type="dxa"/>
-              <w:right w:w="90" w:type="dxa"/>
+              <w:top w:w="100" w:type="dxa"/>
+              <w:left w:w="100" w:type="dxa"/>
+              <w:bottom w:w="100" w:type="dxa"/>
+              <w:right w:w="100" w:type="dxa"/>
             </w:tcMar>
-            <w:vAlign w:val="center"/>
+            <w:shd w:fill="FFFFFF"/>
           </w:tcPr>
           <w:p>
             <w:pPr>
-              <w:keepNext w:val="0"/>
-              <w:spacing w:after="0"/>
+              <w:spacing w:after="40" w:before="40" w:line="252" w:lineRule="auto"/>
             </w:pPr>
             <w:r>
               <w:rPr>
-                <w:color w:val="000000"/>
-                <w:sz w:val="19"/>
+                <w:sz w:val="20"/>
               </w:rPr>
-              <w:t>Home mode loads the supplied PEM pair as the caller. Enrollment uses the craft account to resolve the AD UPN, generate a key/CSR and submit an agent-signed request through CES.</w:t>
+              <w:t>Locally issued certificate carrying a fresh RSA-2048 public key. The KDC matches the linked key; a trusted user-certificate CA chain is unnecessary. KDC trust is still required.</w:t>
+            </w:r>
+          </w:p>
+        </w:tc>
+        <w:tc>
+          <w:tcPr>
+            <w:tcW w:type="dxa" w:w="4234"/>
+            <w:vAlign w:val="center"/>
+            <w:tcMar>
+              <w:top w:w="100" w:type="dxa"/>
+              <w:left w:w="100" w:type="dxa"/>
+              <w:bottom w:w="100" w:type="dxa"/>
+              <w:right w:w="100" w:type="dxa"/>
+            </w:tcMar>
+            <w:shd w:fill="FFFFFF"/>
+          </w:tcPr>
+          <w:p>
+            <w:pPr>
+              <w:spacing w:after="40" w:before="40" w:line="252" w:lineRule="auto"/>
+            </w:pPr>
+            <w:r>
+              <w:rPr>
+                <w:sz w:val="20"/>
+              </w:rPr>
+              <w:t>Service keytab and delegated AD rights remain. CRAFT removes its exact directory entry and releases the generated identity. Failed cleanup can leave a standing credential.</w:t>
             </w:r>
           </w:p>
         </w:tc>
@@ -364,173 +984,76 @@
       <w:tr>
         <w:trPr>
           <w:cantSplit/>
-          <w:jc w:val="center"/>
         </w:trPr>
         <w:tc>
           <w:tcPr>
-            <w:tcW w:w="1944" w:type="dxa"/>
-            <w:shd w:val="clear" w:color="auto" w:fill="FFFFFF"/>
+            <w:tcW w:type="dxa" w:w="1584"/>
+            <w:vAlign w:val="center"/>
             <w:tcMar>
-              <w:top w:w="70" w:type="dxa"/>
-              <w:left w:w="90" w:type="dxa"/>
-              <w:bottom w:w="70" w:type="dxa"/>
-              <w:right w:w="90" w:type="dxa"/>
+              <w:top w:w="100" w:type="dxa"/>
+              <w:left w:w="100" w:type="dxa"/>
+              <w:bottom w:w="100" w:type="dxa"/>
+              <w:right w:w="100" w:type="dxa"/>
             </w:tcMar>
-            <w:vAlign w:val="center"/>
+            <w:shd w:fill="F3F6FA"/>
           </w:tcPr>
           <w:p>
             <w:pPr>
-              <w:keepNext w:val="0"/>
-              <w:spacing w:after="0"/>
+              <w:spacing w:after="40" w:before="40" w:line="252" w:lineRule="auto"/>
             </w:pPr>
             <w:r>
               <w:rPr>
-                <w:color w:val="000000"/>
-                <w:sz w:val="19"/>
+                <w:sz w:val="20"/>
               </w:rPr>
-              <w:t>4  Validate the certificate</w:t>
+              <w:t>3  Supplied certificate</w:t>
             </w:r>
           </w:p>
         </w:tc>
         <w:tc>
           <w:tcPr>
-            <w:tcW w:w="8338" w:type="dxa"/>
-            <w:shd w:val="clear" w:color="auto" w:fill="FFFFFF"/>
+            <w:tcW w:type="dxa" w:w="4464"/>
+            <w:vAlign w:val="center"/>
             <w:tcMar>
-              <w:top w:w="70" w:type="dxa"/>
-              <w:left w:w="90" w:type="dxa"/>
-              <w:bottom w:w="70" w:type="dxa"/>
-              <w:right w:w="90" w:type="dxa"/>
+              <w:top w:w="100" w:type="dxa"/>
+              <w:left w:w="100" w:type="dxa"/>
+              <w:bottom w:w="100" w:type="dxa"/>
+              <w:right w:w="100" w:type="dxa"/>
             </w:tcMar>
-            <w:vAlign w:val="center"/>
+            <w:shd w:fill="F3F6FA"/>
           </w:tcPr>
           <w:p>
             <w:pPr>
-              <w:keepNext w:val="0"/>
-              <w:spacing w:after="0"/>
+              <w:spacing w:after="40" w:before="40" w:line="252" w:lineRule="auto"/>
             </w:pPr>
             <w:r>
               <w:rPr>
-                <w:color w:val="000000"/>
-                <w:sz w:val="19"/>
+                <w:sz w:val="20"/>
               </w:rPr>
-              <w:t>Both paths check key, logon usage, validity, CA trust and CRLs. Enrollment additionally pins directory UPN, template, three EKUs and short validity; home mode accepts ordinary templates and lifetimes.</w:t>
-            </w:r>
-          </w:p>
-        </w:tc>
-      </w:tr>
-      <w:tr>
-        <w:trPr>
-          <w:cantSplit/>
-          <w:jc w:val="center"/>
-        </w:trPr>
-        <w:tc>
-          <w:tcPr>
-            <w:tcW w:w="1944" w:type="dxa"/>
-            <w:shd w:val="clear" w:color="auto" w:fill="F1F4F6"/>
-            <w:tcMar>
-              <w:top w:w="70" w:type="dxa"/>
-              <w:left w:w="90" w:type="dxa"/>
-              <w:bottom w:w="70" w:type="dxa"/>
-              <w:right w:w="90" w:type="dxa"/>
-            </w:tcMar>
-            <w:vAlign w:val="center"/>
-          </w:tcPr>
-          <w:p>
-            <w:pPr>
-              <w:keepNext w:val="0"/>
-              <w:spacing w:after="0"/>
-            </w:pPr>
-            <w:r>
-              <w:rPr>
-                <w:color w:val="000000"/>
-                <w:sz w:val="19"/>
-              </w:rPr>
-              <w:t>5  Obtain a ticket</w:t>
+              <w:t>Windows-exported PEM pair; matching key, logon usage, UPN SAN, validity, CA trust and CRLs. KDC account mapping authorizes authentication.</w:t>
             </w:r>
           </w:p>
         </w:tc>
         <w:tc>
           <w:tcPr>
-            <w:tcW w:w="8338" w:type="dxa"/>
-            <w:shd w:val="clear" w:color="auto" w:fill="F1F4F6"/>
+            <w:tcW w:type="dxa" w:w="4234"/>
+            <w:vAlign w:val="center"/>
             <w:tcMar>
-              <w:top w:w="70" w:type="dxa"/>
-              <w:left w:w="90" w:type="dxa"/>
-              <w:bottom w:w="70" w:type="dxa"/>
-              <w:right w:w="90" w:type="dxa"/>
+              <w:top w:w="100" w:type="dxa"/>
+              <w:left w:w="100" w:type="dxa"/>
+              <w:bottom w:w="100" w:type="dxa"/>
+              <w:right w:w="100" w:type="dxa"/>
             </w:tcMar>
-            <w:vAlign w:val="center"/>
+            <w:shd w:fill="F3F6FA"/>
           </w:tcPr>
           <w:p>
             <w:pPr>
-              <w:keepNext w:val="0"/>
-              <w:spacing w:after="0"/>
+              <w:spacing w:after="40" w:before="40" w:line="252" w:lineRule="auto"/>
             </w:pPr>
             <w:r>
               <w:rPr>
-                <w:color w:val="000000"/>
-                <w:sz w:val="19"/>
+                <w:sz w:val="20"/>
               </w:rPr>
-              <w:t>PKINIT requests the fixed Linux-name principal. The KDC maps the certificate and decides the grant; CRAFT checks returned identity, flags, encryption and lifetimes.</w:t>
-            </w:r>
-          </w:p>
-        </w:tc>
-      </w:tr>
-      <w:tr>
-        <w:trPr>
-          <w:cantSplit/>
-          <w:jc w:val="center"/>
-        </w:trPr>
-        <w:tc>
-          <w:tcPr>
-            <w:tcW w:w="1944" w:type="dxa"/>
-            <w:shd w:val="clear" w:color="auto" w:fill="FFFFFF"/>
-            <w:tcMar>
-              <w:top w:w="70" w:type="dxa"/>
-              <w:left w:w="90" w:type="dxa"/>
-              <w:bottom w:w="70" w:type="dxa"/>
-              <w:right w:w="90" w:type="dxa"/>
-            </w:tcMar>
-            <w:vAlign w:val="center"/>
-          </w:tcPr>
-          <w:p>
-            <w:pPr>
-              <w:keepNext w:val="0"/>
-              <w:spacing w:after="0"/>
-            </w:pPr>
-            <w:r>
-              <w:rPr>
-                <w:color w:val="000000"/>
-                <w:sz w:val="19"/>
-              </w:rPr>
-              <w:t>6  Publish the cache</w:t>
-            </w:r>
-          </w:p>
-        </w:tc>
-        <w:tc>
-          <w:tcPr>
-            <w:tcW w:w="8338" w:type="dxa"/>
-            <w:shd w:val="clear" w:color="auto" w:fill="FFFFFF"/>
-            <w:tcMar>
-              <w:top w:w="70" w:type="dxa"/>
-              <w:left w:w="90" w:type="dxa"/>
-              <w:bottom w:w="70" w:type="dxa"/>
-              <w:right w:w="90" w:type="dxa"/>
-            </w:tcMar>
-            <w:vAlign w:val="center"/>
-          </w:tcPr>
-          <w:p>
-            <w:pPr>
-              <w:keepNext w:val="0"/>
-              <w:spacing w:after="0"/>
-            </w:pPr>
-            <w:r>
-              <w:rPr>
-                <w:color w:val="000000"/>
-                <w:sz w:val="19"/>
-              </w:rPr>
-              <w:t>After validation, the caller atomically replaces .krb5cc_craft, mode 0600, and prints its FILE cache name. Failures retain the existing cache.</w:t>
+              <w:t>user.pem and user.key stay in the caller's home. CRAFT does not renew, overwrite or delete them. Replace them before expiry.</w:t>
             </w:r>
           </w:p>
         </w:tc>
@@ -538,530 +1061,250 @@
     </w:tbl>
     <w:p>
       <w:pPr>
-        <w:pStyle w:val="Heading2"/>
-        <w:pageBreakBefore w:val="0"/>
+        <w:spacing w:after="0"/>
       </w:pPr>
+    </w:p>
+    <w:p>
       <w:r>
-        <w:rPr>
-          <w:color w:val="000000"/>
-        </w:rPr>
-        <w:t>Use the Cache to Access AD Resources</w:t>
+        <w:t>Every mode atomically publishes a caller-owned mode-0600 .krb5cc_craft in the NSS home. This persistent cache contains the TGT and session key, without the user's certificate or private key. Applications use it to request service tickets. Success replaces the cache; acquisition failure preserves it, and expiration does not delete it automatically.</w:t>
+      </w:r>
+    </w:p>
+    <w:p>
+      <w:r>
+        <w:t>Generated credentials and sealed PKINIT memory files are released after the operation. Memory can reach swap or privileged host capture. Deleting keys, removing a linked credential, ending a process or removing a cache does not revoke an already-issued ticket. Host and service-account compromise expose the authority granted to that installation.</w:t>
+      </w:r>
+    </w:p>
+    <w:p>
+      <w:hyperlink r:id="rId27">
+        <w:r>
+          <w:rPr>
+            <w:color w:val="315DC0"/>
+            <w:u w:val="single"/>
+          </w:rPr>
+          <w:t>Enrollment-agent restrictions</w:t>
+        </w:r>
+      </w:hyperlink>
+      <w:r>
+        <w:t xml:space="preserve">  |  </w:t>
+      </w:r>
+      <w:hyperlink r:id="rId28">
+        <w:r>
+          <w:rPr>
+            <w:color w:val="315DC0"/>
+            <w:u w:val="single"/>
+          </w:rPr>
+          <w:t>Key Trust delegation</w:t>
+        </w:r>
+      </w:hyperlink>
+    </w:p>
+    <w:p>
+      <w:r>
+        <w:br w:type="page"/>
       </w:r>
     </w:p>
     <w:p>
       <w:pPr>
-        <w:keepLines/>
-        <w:pageBreakBefore w:val="0"/>
+        <w:pStyle w:val="Heading1"/>
       </w:pPr>
       <w:r>
-        <w:t>After authentication, the user selects the resulting credential cache for an application, typically through KRB5CCNAME. The Kerberos library uses the cached ticket-granting ticket (TGT) to request service tickets from the domain controller for the target services. Those tickets let the application authenticate as the user to resources such as SMB file shares, LDAP directories, and Kerberos-enabled web services, where supported and configured. Access remains subject to the user's permissions and the service's policy; obtaining a ticket does not grant additional access rights.</w:t>
+        <w:t>Ticket lifetimes and everyday use</w:t>
+      </w:r>
+    </w:p>
+    <w:p>
+      <w:r>
+        <w:t>CRAFT requests a ten-hour initial TGT and a seven-day renewal window with AES256/AES128. The KDC controls the grant; certificate/key lifetime can constrain initial validity. A renewal window is the period during which an eligible TGT can be renewed. It does not make one ticket valid for seven days.</w:t>
+      </w:r>
+    </w:p>
+    <w:p>
+      <w:r>
+        <w:t>require_full_tgt_lifetime=yes rejects shortened initial or renewal grants without replacing the cache. Administrators can set no to accept shorter grants with a warning. Returned ticket times are never rewritten. Enrollment certificate caps default to ten hours total, including backdating; they do not cap mode 3's supplied certificate or mode 2's local identity.</w:t>
       </w:r>
     </w:p>
     <w:p>
       <w:pPr>
         <w:pStyle w:val="Heading2"/>
-        <w:pageBreakBefore w:val="0"/>
       </w:pPr>
       <w:r>
-        <w:rPr>
-          <w:color w:val="000000"/>
-        </w:rPr>
-        <w:t>Identity and Trust</w:t>
+        <w:t>Select the user cache</w:t>
       </w:r>
     </w:p>
     <w:p>
       <w:pPr>
+        <w:pStyle w:val="CodeBlock"/>
         <w:keepLines/>
-        <w:pageBreakBefore w:val="0"/>
       </w:pPr>
       <w:r>
-        <w:t>Both workflows request &lt;Linux username&gt;@&lt;configured realm&gt; and check the returned TGT principal. The KDC enforces certificate-to-account mapping. Enrollment checks the issued UPN against the directory lookup and pins the configured template; a requested CN cannot change that identity. Home mode makes no LDAP lookup and relies on KDC mapping. Enrollment-agent and recipient restrictions govern new issuance, while a supplied certificate remains subject to its issuer's policy and KDC acceptance. [1, 2]</w:t>
+        <w:t>cache=$(/usr/local/bin/craft) || exit "$?"</w:t>
+        <w:br/>
+        <w:t>export KRB5CCNAME="$cache"</w:t>
+        <w:br/>
+        <w:t>klist -ef -c "$KRB5CCNAME"</w:t>
       </w:r>
     </w:p>
     <w:p>
-      <w:pPr>
-        <w:keepLines/>
-        <w:pageBreakBefore w:val="0"/>
-      </w:pPr>
       <w:r>
-        <w:t>CRAFT supports automation alongside MFA-protected interactive sign-in, but does not perform an MFA challenge or prove one was completed. Home mode depends on the supplied certificate/private key and KDC mapping. Enrollment also depends on the managed host, agent credentials and CA restrictions.</w:t>
-      </w:r>
-    </w:p>
-    <w:p>
-      <w:pPr>
-        <w:keepLines/>
-        <w:pageBreakBefore w:val="0"/>
-      </w:pPr>
-      <w:r/>
-    </w:p>
-    <w:p>
-      <w:pPr>
-        <w:pStyle w:val="Heading1"/>
-        <w:pageBreakBefore w:val="0"/>
-      </w:pPr>
-      <w:r>
-        <w:rPr>
-          <w:color w:val="000000"/>
-        </w:rPr>
-        <w:lastRenderedPageBreak/>
-        <w:t>Certificate Storage and Cleanup</w:t>
+        <w:t>Kerberos-aware applications launched from this shell use the selected cache for SMB, LDAP and Kerberos-enabled web services. The service still enforces the user's permissions. CRAFT cannot change its parent shell's environment; the optional with-craft wrapper runs a command with its cache selected.</w:t>
       </w:r>
     </w:p>
     <w:p>
       <w:pPr>
         <w:pStyle w:val="Heading2"/>
-        <w:pageBreakBefore w:val="0"/>
       </w:pPr>
       <w:r>
-        <w:rPr>
-          <w:color w:val="000000"/>
-        </w:rPr>
-        <w:t>Certificate Files in Each Workflow</w:t>
-      </w:r>
-    </w:p>
-    <w:p>
-      <w:pPr>
-        <w:keepLines/>
-        <w:pageBreakBefore w:val="0"/>
-      </w:pPr>
-      <w:r>
-        <w:t>Home mode reads ~/.config/craft/user.pem and user.key as the caller. Those source files persist until the user replaces or removes them; CRAFT does not renew, overwrite or delete them. It releases its parsed identity and sealed memory-file copies when authentication ends. Protect the supplied private key as a reusable credential and replace the pair before certificate expiry.</w:t>
-      </w:r>
-    </w:p>
-    <w:p>
-      <w:pPr>
-        <w:keepLines/>
-        <w:pageBreakBefore w:val="0"/>
-      </w:pPr>
-      <w:r>
-        <w:t>Enrollment generates a fresh user private key. Its issued certificate and key remain in process memory and temporary memory files for PKINIT and are released on success or failure. CRAFT does not export a user PEM/PFX or install a certificate-store entry. The generated private key is not submitted to the CA.</w:t>
-      </w:r>
-    </w:p>
-    <w:p>
-      <w:pPr>
-        <w:pStyle w:val="Heading2"/>
-        <w:pageBreakBefore w:val="0"/>
-      </w:pPr>
-      <w:r>
-        <w:rPr>
-          <w:color w:val="000000"/>
-        </w:rPr>
-        <w:t>What Remains on the Linux Host</w:t>
-      </w:r>
-    </w:p>
-    <w:p>
-      <w:pPr>
-        <w:keepLines/>
-        <w:pageBreakBefore w:val="0"/>
-      </w:pPr>
-      <w:r>
-        <w:t>Both workflows publish .krb5cc_craft in the caller's actual home. This persistent cache contains the TGT and session key, without the user certificate/private key. It is caller-owned with mode 0600 and remains until replaced or removed; expiry does not delete it automatically. Home mode also leaves the supplied PEM files in place.</w:t>
-      </w:r>
-    </w:p>
-    <w:p>
-      <w:pPr>
-        <w:keepLines/>
-        <w:pageBreakBefore w:val="0"/>
-      </w:pPr>
-      <w:r>
-        <w:t>Public configuration, trust anchors and CRLs under /etc/craft remain root-controlled and readable by callers. Enrollment additionally retains private agent/keytab/transport credentials and uses /run/craft for per-user issuance locks and timestamps. A home-only installation needs neither the service account nor those private files and runtime directory.</w:t>
-      </w:r>
-    </w:p>
-    <w:p>
-      <w:pPr>
-        <w:pStyle w:val="Heading2"/>
-        <w:pageBreakBefore w:val="0"/>
-      </w:pPr>
-      <w:r>
-        <w:rPr>
-          <w:color w:val="000000"/>
-        </w:rPr>
-        <w:t>What the Certificate Authority Retains</w:t>
-      </w:r>
-    </w:p>
-    <w:p>
-      <w:pPr>
-        <w:keepLines/>
-        <w:pageBreakBefore w:val="0"/>
-      </w:pPr>
-      <w:r>
-        <w:t>Client cleanup does not erase the CA's copy of an issued certificate or its enrollment and audit records. A failed or interrupted run can still leave an issued certificate recorded at the CA. CRAFT does not automatically revoke that certificate or cancel the request. Administrators manage CA retention, audit review, and any required revocation.</w:t>
-      </w:r>
-    </w:p>
-    <w:p>
-      <w:pPr>
-        <w:pStyle w:val="Heading2"/>
-        <w:pageBreakBefore w:val="0"/>
-      </w:pPr>
-      <w:r>
-        <w:rPr>
-          <w:color w:val="000000"/>
-        </w:rPr>
-        <w:t>What Ephemeral Means Here</w:t>
-      </w:r>
-    </w:p>
-    <w:p>
-      <w:pPr>
-        <w:keepLines/>
-        <w:pageBreakBefore w:val="0"/>
-      </w:pPr>
-      <w:r>
-        <w:t>Enrollment's user certificate and key are ephemeral on the client; supplied home files are persistent. In either mode, memory and memory files can reach swap or privileged host capture. Protect the host, its private key files and ticket cache. Certificate expiry, key deletion or process exit does not revoke an already-issued Kerberos ticket.</w:t>
-      </w:r>
-    </w:p>
-    <w:p>
-      <w:pPr>
-        <w:keepLines/>
-        <w:pageBreakBefore w:val="0"/>
-      </w:pPr>
-      <w:r/>
-    </w:p>
-    <w:p>
-      <w:pPr>
-        <w:pStyle w:val="Heading1"/>
-        <w:pageBreakBefore w:val="0"/>
-      </w:pPr>
-      <w:r>
-        <w:rPr>
-          <w:color w:val="000000"/>
-        </w:rPr>
-        <w:lastRenderedPageBreak/>
-        <w:t>Ticket Lifetimes and Everyday Use</w:t>
-      </w:r>
-    </w:p>
-    <w:p>
-      <w:pPr>
-        <w:pStyle w:val="Heading2"/>
-        <w:pageBreakBefore w:val="0"/>
-      </w:pPr>
-      <w:r>
-        <w:rPr>
-          <w:color w:val="000000"/>
-        </w:rPr>
-        <w:t>Certificate and Ticket Lifetimes</w:t>
-      </w:r>
-    </w:p>
-    <w:p>
-      <w:pPr>
-        <w:keepLines/>
-        <w:pageBreakBefore w:val="0"/>
-      </w:pPr>
-      <w:r>
-        <w:t>Enrollment's default certificate acceptance cap is 36,000 seconds (10 hours) of total validity including backdating. Home mode accepts ordinary certificate validity and other templates. Both require current validity, matching keys, supported logon usage, trusted chains and current CRLs. A supplied certificate does not have to use CRAFT's enrollment template.</w:t>
-      </w:r>
-    </w:p>
-    <w:p>
-      <w:pPr>
-        <w:keepLines/>
-        <w:pageBreakBefore w:val="0"/>
-      </w:pPr>
-      <w:r>
-        <w:t>CRAFT requests a 10-hour initial TGT and a 7-day renewal window. A renewal window is the period during which an eligible ticket can be renewed, not seven days of uninterrupted ticket validity. The domain controller controls the actual grant, and PKINIT can constrain the initial ticket by the certificate/key lifetime. [3, 4]</w:t>
-      </w:r>
-    </w:p>
-    <w:p>
-      <w:pPr>
-        <w:keepLines/>
-        <w:pageBreakBefore w:val="0"/>
-      </w:pPr>
-      <w:r>
-        <w:t xml:space="preserve">By default, </w:t>
-      </w:r>
-      <w:r>
-        <w:rPr>
-          <w:rFonts w:ascii="Consolas" w:hAnsi="Consolas"/>
-        </w:rPr>
-        <w:t>require_full_tgt_lifetime=yes</w:t>
-      </w:r>
-      <w:r>
-        <w:t xml:space="preserve"> rejects a shortened initial grant or renewal window without replacing the existing cache. An administrator may set </w:t>
-      </w:r>
-      <w:r>
-        <w:rPr>
-          <w:rFonts w:ascii="Consolas" w:hAnsi="Consolas"/>
-        </w:rPr>
-        <w:t>require_full_tgt_lifetime=no</w:t>
-      </w:r>
-      <w:r>
-        <w:t xml:space="preserve"> to accept shorter grants with a warning. CRAFT never rewrites the domain controller's ticket times.</w:t>
-      </w:r>
-    </w:p>
-    <w:p>
-      <w:pPr>
-        <w:pStyle w:val="Heading2"/>
-        <w:pageBreakBefore w:val="0"/>
-      </w:pPr>
-      <w:r>
-        <w:rPr>
-          <w:color w:val="000000"/>
-        </w:rPr>
-        <w:t>Select the Cache and Use Applications</w:t>
-      </w:r>
-    </w:p>
-    <w:p>
-      <w:pPr>
-        <w:keepLines/>
-        <w:pageBreakBefore w:val="0"/>
-      </w:pPr>
-      <w:r>
-        <w:t>Run CRAFT as the intended user, without sudo. Select its returned cache in the current shell, then inspect the ticket:</w:t>
+        <w:t>Maintain a long running job</w:t>
       </w:r>
     </w:p>
     <w:p>
       <w:pPr>
         <w:pStyle w:val="CodeBlock"/>
-        <w:pageBreakBefore w:val="0"/>
+        <w:keepLines/>
       </w:pPr>
       <w:r>
-        <w:t>cache=$(/usr/local/bin/craft) &amp;&amp; export KRB5CCNAME="$cache" &amp;&amp; \</w:t>
-      </w:r>
-      <w:r>
+        <w:t>job_pid=$$</w:t>
         <w:br/>
-        <w:t xml:space="preserve">    klist -ef -c "$KRB5CCNAME"</w:t>
+        <w:t>cache=$(/usr/local/bin/craft-maintain --watch-pid "$job_pid") || exit "$?"</w:t>
+        <w:br/>
+        <w:t>export KRB5CCNAME="$cache"</w:t>
       </w:r>
     </w:p>
     <w:p>
-      <w:pPr>
-        <w:keepLines/>
-        <w:pageBreakBefore w:val="0"/>
-      </w:pPr>
       <w:r>
-        <w:t xml:space="preserve">Kerberos-aware applications launched from that shell can use the cache. CRAFT cannot change its parent shell's environment. The optional </w:t>
-      </w:r>
-      <w:r>
-        <w:rPr>
-          <w:rFonts w:ascii="Consolas" w:hAnsi="Consolas"/>
-        </w:rPr>
-        <w:t>with-craft</w:t>
-      </w:r>
-      <w:r>
-        <w:t xml:space="preserve"> wrapper can run a command with a newly obtained cache already selected.</w:t>
+        <w:t>craft-maintain returns when credentials and detached maintenance are ready. Renewal uses the cached ticket and session key alone. Fresh authentication near the absolute renewal deadline invokes craft: reuse the supplied pair, or use the configured enrollment or credential-linking mode when both files are absent. Full ten-hour/seven-day grants normally renew near hour eight and authenticate afresh near day six; actual grants set the schedule.</w:t>
       </w:r>
     </w:p>
     <w:p>
-      <w:pPr>
-        <w:pStyle w:val="Heading2"/>
-        <w:pageBreakBefore w:val="0"/>
-      </w:pPr>
       <w:r>
-        <w:rPr>
-          <w:color w:val="000000"/>
-        </w:rPr>
-        <w:t>Renewal and Failed Attempts</w:t>
-      </w:r>
-    </w:p>
-    <w:p>
-      <w:pPr>
-        <w:keepLines/>
-        <w:pageBreakBefore w:val="0"/>
-      </w:pPr>
-      <w:r>
-        <w:t>Renew manually with kinit -R -c "$KRB5CCNAME" or use craft-maintain. Renewal needs only the cache. Fresh authentication reuses a valid home pair; when both files are absent, enrollment supplies a new certificate.</w:t>
-      </w:r>
-    </w:p>
-    <w:p>
-      <w:pPr>
-        <w:keepLines/>
-        <w:pageBreakBefore w:val="0"/>
-      </w:pPr>
-      <w:r>
-        <w:t>Partial, unsafe or invalid home inputs fail without enrollment fallback or cache replacement. Only success replaces the cache. Enrollment attempts have a per-user interval; home mode does not. Review AUTHPRIV/KDC logs and CA/CES logs for enrollment, and follow the lab acceptance checks.</w:t>
-      </w:r>
-    </w:p>
-    <w:p>
-      <w:pPr>
-        <w:pStyle w:val="Heading1"/>
-        <w:pageBreakBefore w:val="0"/>
-      </w:pPr>
-      <w:r>
-        <w:rPr>
-          <w:color w:val="000000"/>
-        </w:rPr>
-        <w:lastRenderedPageBreak/>
-        <w:t>Long Running Jobs</w:t>
-      </w:r>
-    </w:p>
-    <w:p>
-      <w:pPr>
-        <w:keepLines/>
-        <w:pageBreakBefore w:val="0"/>
-      </w:pPr>
-      <w:r>
-        <w:t>Start once as the approved batch user; it returns when credentials and detached maintenance are ready. No job wrapper or cron is needed.</w:t>
+        <w:t>Install the maintainer without setuid/setgid on Linux 5.3+ with /proc and system Kerberos configuration matching the pinned realm/KDC and AES policy. Home refresh works under no_new_privs; modes 1 and 2 require later setuid calls. The scheduler must retain background processes. Watch a shell or job controller that lasts for the job; optional --max-duration 21d adds a cutoff. Concurrent jobs for one UID share the cache and fresh-acquisition cooldown.</w:t>
       </w:r>
     </w:p>
     <w:p>
       <w:pPr>
         <w:pStyle w:val="CodeBlock"/>
-        <w:pageBreakBefore w:val="0"/>
-      </w:pPr>
-      <w:r>
-        <w:t>job_pid=$$</w:t>
-      </w:r>
-      <w:r>
-        <w:br/>
-        <w:t>cache=$(/usr/local/bin/craft-maintain --watch-pid "$job_pid") || exit "$?"</w:t>
-      </w:r>
-      <w:r>
-        <w:br/>
-        <w:t>export KRB5CCNAME="$cache"</w:t>
-      </w:r>
-    </w:p>
-    <w:p>
-      <w:pPr>
         <w:keepLines/>
-        <w:pageBreakBefore w:val="0"/>
-      </w:pPr>
-      <w:r>
-        <w:t>craft-maintain renews TGTs from the cache and obtains fresh credentials near the absolute renewal deadline. Ten-hour/seven-day grants normally renew at eight hours and authenticate afresh around day six. Fresh acquisition uses the same home-pair priority; it does not renew a supplied certificate. Actual grants set the schedule.</w:t>
-      </w:r>
-    </w:p>
-    <w:p>
-      <w:pPr>
-        <w:keepLines/>
-        <w:pageBreakBefore w:val="0"/>
-      </w:pPr>
-      <w:r>
-        <w:t>Use --max-duration 21d to add a cutoff. Maintenance stops with the watched PID; keep the shell alive, exec the job, or watch its controller. Jobs for one user share cache updates; stopping maintenance leaves the cache intact.</w:t>
-      </w:r>
-    </w:p>
-    <w:p>
-      <w:pPr>
-        <w:pStyle w:val="CodeBlock"/>
-        <w:pageBreakBefore w:val="0"/>
       </w:pPr>
       <w:r>
         <w:t>/usr/local/bin/craft-maintain --status --watch-pid "$job_pid"</w:t>
-      </w:r>
-      <w:r>
         <w:br/>
         <w:t>klist -ef -c "$KRB5CCNAME"</w:t>
       </w:r>
     </w:p>
     <w:p>
-      <w:pPr>
-        <w:keepLines/>
-        <w:pageBreakBefore w:val="0"/>
-      </w:pPr>
       <w:r>
-        <w:t>Refresh failures preserve the cache and retry. Failed fresh acquisitions share a one-minute to one-hour cooldown in either mode. Check status and AUTHPRIV logs; later failures leave the job running. Keep the supplied pair and CRLs current, and have applications reload refreshed credentials.</w:t>
+        <w:t>Failures preserve credentials and retry; later failures do not stop the job. Status and AUTHPRIV logs report failures. Maintenance stops with the watched PID and leaves the cache. Applications must reload refreshed credentials. Keep CRLs current and replace the supplied certificate before expiry; TGT maintenance does not renew it.</w:t>
       </w:r>
     </w:p>
     <w:p>
-      <w:pPr>
-        <w:pStyle w:val="SmallNote"/>
-        <w:pageBreakBefore w:val="0"/>
-      </w:pPr>
+      <w:hyperlink r:id="rId29">
+        <w:r>
+          <w:rPr>
+            <w:color w:val="315DC0"/>
+            <w:u w:val="single"/>
+          </w:rPr>
+          <w:t>Maintenance setup and status</w:t>
+        </w:r>
+      </w:hyperlink>
       <w:r>
-        <w:t>Install craft-maintain without setuid/setgid. Renewal requires Linux 5.3+, /proc and system /etc/krb5.conf matching the configured realm/KDC. Home-only refresh works under no_new_privs. Enrollment fallback additionally requires later setuid craft calls. The scheduler must retain background processes; see source/README.md for setup and status.</w:t>
+        <w:t xml:space="preserve">  |  </w:t>
       </w:r>
+      <w:hyperlink r:id="rId30">
+        <w:r>
+          <w:rPr>
+            <w:color w:val="315DC0"/>
+            <w:u w:val="single"/>
+          </w:rPr>
+          <w:t>Credential timing diagram</w:t>
+        </w:r>
+      </w:hyperlink>
     </w:p>
     <w:p>
       <w:pPr>
         <w:pStyle w:val="Heading2"/>
-        <w:pageBreakBefore w:val="0"/>
       </w:pPr>
       <w:r>
-        <w:rPr>
-          <w:color w:val="000000"/>
-        </w:rPr>
-        <w:t>Primary References</w:t>
+        <w:t>References and license</w:t>
       </w:r>
     </w:p>
     <w:p>
-      <w:pPr>
-        <w:pStyle w:val="SmallNote"/>
-        <w:pageBreakBefore w:val="0"/>
-      </w:pPr>
-      <w:r>
-        <w:t xml:space="preserve">[1] </w:t>
-      </w:r>
-      <w:hyperlink r:id="rId8">
+      <w:hyperlink r:id="rId31">
         <w:r>
           <w:rPr>
-            <w:color w:val="087E8B"/>
+            <w:color w:val="315DC0"/>
+            <w:u w:val="single"/>
           </w:rPr>
-          <w:t>Microsoft MS-WCCE: enrollment-on-behalf-of CMS requests</w:t>
+          <w:t>Source and setup</w:t>
+        </w:r>
+      </w:hyperlink>
+      <w:r>
+        <w:t xml:space="preserve">  |  </w:t>
+      </w:r>
+      <w:hyperlink r:id="rId32">
+        <w:r>
+          <w:rPr>
+            <w:color w:val="315DC0"/>
+            <w:u w:val="single"/>
+          </w:rPr>
+          <w:t>Security review</w:t>
+        </w:r>
+      </w:hyperlink>
+      <w:r>
+        <w:t xml:space="preserve">  |  </w:t>
+      </w:r>
+      <w:hyperlink r:id="rId33">
+        <w:r>
+          <w:rPr>
+            <w:color w:val="315DC0"/>
+            <w:u w:val="single"/>
+          </w:rPr>
+          <w:t>Acceptance checks</w:t>
+        </w:r>
+      </w:hyperlink>
+    </w:p>
+    <w:p>
+      <w:hyperlink r:id="rId34">
+        <w:r>
+          <w:rPr>
+            <w:color w:val="315DC0"/>
+            <w:u w:val="single"/>
+          </w:rPr>
+          <w:t>PKINIT specification</w:t>
+        </w:r>
+      </w:hyperlink>
+      <w:r>
+        <w:t xml:space="preserve">  |  </w:t>
+      </w:r>
+      <w:hyperlink r:id="rId35">
+        <w:r>
+          <w:rPr>
+            <w:color w:val="315DC0"/>
+            <w:u w:val="single"/>
+          </w:rPr>
+          <w:t>MIT PKINIT configuration</w:t>
         </w:r>
       </w:hyperlink>
     </w:p>
     <w:p>
       <w:pPr>
         <w:pStyle w:val="SmallNote"/>
-        <w:pageBreakBefore w:val="0"/>
       </w:pPr>
       <w:r>
-        <w:t xml:space="preserve">[2] </w:t>
+        <w:t xml:space="preserve">Source code, scripts, configuration examples and documentation are licensed under GNU GPL version 3 only (GPL-3.0-only). See </w:t>
       </w:r>
-      <w:hyperlink r:id="rId9">
+      <w:hyperlink r:id="rId36">
         <w:r>
           <w:rPr>
-            <w:color w:val="087E8B"/>
+            <w:color w:val="315DC0"/>
+            <w:u w:val="single"/>
           </w:rPr>
-          <w:t>Microsoft MS-WCCE: CA certificate SID security extension</w:t>
+          <w:t>LICENSE</w:t>
         </w:r>
       </w:hyperlink>
-    </w:p>
-    <w:p>
-      <w:pPr>
-        <w:pStyle w:val="SmallNote"/>
-        <w:pageBreakBefore w:val="0"/>
-      </w:pPr>
       <w:r>
-        <w:t xml:space="preserve">[3] </w:t>
-      </w:r>
-      <w:hyperlink r:id="rId10" w:anchor="section-3.2.3">
-        <w:r>
-          <w:rPr>
-            <w:color w:val="087E8B"/>
-          </w:rPr>
-          <w:t>RFC 4556, sections 3.2.2–3.2.3: client certificate usage and ticket/key lifetime</w:t>
-        </w:r>
-      </w:hyperlink>
-    </w:p>
-    <w:p>
-      <w:pPr>
-        <w:pStyle w:val="SmallNote"/>
-        <w:pageBreakBefore w:val="0"/>
-      </w:pPr>
-      <w:r>
-        <w:t xml:space="preserve">[4] </w:t>
-      </w:r>
-      <w:hyperlink r:id="rId11">
-        <w:r>
-          <w:rPr>
-            <w:color w:val="087E8B"/>
-          </w:rPr>
-          <w:t>Microsoft: Maximum lifetime for user ticket (hours)</w:t>
-        </w:r>
-      </w:hyperlink>
-    </w:p>
-    <w:p>
-      <w:pPr>
-        <w:pStyle w:val="Heading2"/>
-        <w:pageBreakBefore w:val="0"/>
-      </w:pPr>
-      <w:r>
-        <w:rPr>
-          <w:color w:val="000000"/>
-        </w:rPr>
-        <w:t>License</w:t>
-      </w:r>
-    </w:p>
-    <w:p>
-      <w:pPr>
-        <w:pStyle w:val="SmallNote"/>
-        <w:pageBreakBefore w:val="0"/>
-      </w:pPr>
-      <w:r>
-        <w:t>CRAFT source code, scripts, configuration examples, and documentation are licensed under the GNU General Public License, version 3 (SPDX: GPL-3.0-only). See the repository LICENSE file or https://www.gnu.org/licenses/gpl-3.0.html for the full terms. This material is provided without warranty, as described in the license.</w:t>
+        <w:t xml:space="preserve"> for the terms and warranty disclaimer.</w:t>
       </w:r>
     </w:p>
     <w:sectPr>
-      <w:headerReference w:type="default" r:id="rId12"/>
-      <w:footerReference w:type="default" r:id="rId13"/>
       <w:pgSz w:w="12240" w:h="15840"/>
-      <w:pgMar w:top="893" w:right="979" w:bottom="864" w:left="979" w:header="360" w:footer="389" w:gutter="0"/>
+      <w:pgMar w:top="893" w:right="979" w:bottom="893" w:left="979" w:header="360" w:footer="360" w:gutter="0"/>
       <w:cols w:space="720"/>
       <w:docGrid w:linePitch="360"/>
     </w:sectPr>
@@ -1123,6 +1366,17 @@
 </w:ftr>
 </file>
 
+<file path=word/footer2.xml><?xml version="1.0" encoding="utf-8"?>
+<w:ftr xmlns:m="http://schemas.openxmlformats.org/officeDocument/2006/math" xmlns:mc="http://schemas.openxmlformats.org/markup-compatibility/2006" xmlns:mo="http://schemas.microsoft.com/office/mac/office/2008/main" xmlns:mv="urn:schemas-microsoft-com:mac:vml" xmlns:o="urn:schemas-microsoft-com:office:office" xmlns:r="http://schemas.openxmlformats.org/officeDocument/2006/relationships" xmlns:v="urn:schemas-microsoft-com:vml" xmlns:w10="urn:schemas-microsoft-com:office:word" xmlns:w14="http://schemas.microsoft.com/office/word/2010/wordml" xmlns:w="http://schemas.openxmlformats.org/wordprocessingml/2006/main" xmlns:wne="http://schemas.microsoft.com/office/word/2006/wordml" xmlns:wp14="http://schemas.microsoft.com/office/word/2010/wordprocessingDrawing" xmlns:wp="http://schemas.openxmlformats.org/drawingml/2006/wordprocessingDrawing" xmlns:wpc="http://schemas.microsoft.com/office/word/2010/wordprocessingCanvas" xmlns:wpg="http://schemas.microsoft.com/office/word/2010/wordprocessingGroup" xmlns:wpi="http://schemas.microsoft.com/office/word/2010/wordprocessingInk" xmlns:wps="http://schemas.microsoft.com/office/word/2010/wordprocessingShape" mc:Ignorable="w14 wp14">
+  <w:p>
+    <w:pPr>
+      <w:jc w:val="right"/>
+    </w:pPr>
+    <w:fldSimple w:instr="PAGE"/>
+  </w:p>
+</w:ftr>
+</file>
+
 <file path=word/footnotes.xml><?xml version="1.0" encoding="utf-8"?>
 <w:footnotes xmlns:wpc="http://schemas.microsoft.com/office/word/2010/wordprocessingCanvas" xmlns:cx="http://schemas.microsoft.com/office/drawing/2014/chartex" xmlns:cx1="http://schemas.microsoft.com/office/drawing/2015/9/8/chartex" xmlns:cx2="http://schemas.microsoft.com/office/drawing/2015/10/21/chartex" xmlns:cx3="http://schemas.microsoft.com/office/drawing/2016/5/9/chartex" xmlns:cx4="http://schemas.microsoft.com/office/drawing/2016/5/10/chartex" xmlns:cx5="http://schemas.microsoft.com/office/drawing/2016/5/11/chartex" xmlns:cx6="http://schemas.microsoft.com/office/drawing/2016/5/12/chartex" xmlns:cx7="http://schemas.microsoft.com/office/drawing/2016/5/13/chartex" xmlns:cx8="http://schemas.microsoft.com/office/drawing/2016/5/14/chartex" xmlns:mc="http://schemas.openxmlformats.org/markup-compatibility/2006" xmlns:aink="http://schemas.microsoft.com/office/drawing/2016/ink" xmlns:am3d="http://schemas.microsoft.com/office/drawing/2017/model3d" xmlns:o="urn:schemas-microsoft-com:office:office" xmlns:oel="http://schemas.microsoft.com/office/2019/extlst" xmlns:r="http://schemas.openxmlformats.org/officeDocument/2006/relationships" xmlns:m="http://schemas.openxmlformats.org/officeDocument/2006/math" xmlns:v="urn:schemas-microsoft-com:vml" xmlns:wp14="http://schemas.microsoft.com/office/word/2010/wordprocessingDrawing" xmlns:wp="http://schemas.openxmlformats.org/drawingml/2006/wordprocessingDrawing" xmlns:w10="urn:schemas-microsoft-com:office:word" xmlns:w="http://schemas.openxmlformats.org/wordprocessingml/2006/main" xmlns:w14="http://schemas.microsoft.com/office/word/2010/wordml" xmlns:w15="http://schemas.microsoft.com/office/word/2012/wordml" xmlns:w16cex="http://schemas.microsoft.com/office/word/2018/wordml/cex" xmlns:w16cid="http://schemas.microsoft.com/office/word/2016/wordml/cid" xmlns:w16="http://schemas.microsoft.com/office/word/2018/wordml" xmlns:w16du="http://schemas.microsoft.com/office/word/2023/wordml/word16du" xmlns:w16sdtdh="http://schemas.microsoft.com/office/word/2020/wordml/sdtdatahash" xmlns:w16sdtfl="http://schemas.microsoft.com/office/word/2024/wordml/sdtformatlock" xmlns:w16se="http://schemas.microsoft.com/office/word/2015/wordml/symex" xmlns:wpg="http://schemas.microsoft.com/office/word/2010/wordprocessingGroup" xmlns:wpi="http://schemas.microsoft.com/office/word/2010/wordprocessingInk" xmlns:wne="http://schemas.microsoft.com/office/word/2006/wordml" xmlns:wps="http://schemas.microsoft.com/office/word/2010/wordprocessingShape" mc:Ignorable="w14 w15 w16se w16cid w16 w16cex w16sdtdh w16sdtfl w16du wp14">
   <w:footnote w:type="separator" w:id="-1">
@@ -1159,6 +1413,23 @@
         <w:color w:val="5B6770"/>
       </w:rPr>
       <w:t>CRAFT     •     01  /  Process Overview</w:t>
+    </w:r>
+  </w:p>
+</w:hdr>
+</file>
+
+<file path=word/header2.xml><?xml version="1.0" encoding="utf-8"?>
+<w:hdr xmlns:m="http://schemas.openxmlformats.org/officeDocument/2006/math" xmlns:mc="http://schemas.openxmlformats.org/markup-compatibility/2006" xmlns:mo="http://schemas.microsoft.com/office/mac/office/2008/main" xmlns:mv="urn:schemas-microsoft-com:mac:vml" xmlns:o="urn:schemas-microsoft-com:office:office" xmlns:r="http://schemas.openxmlformats.org/officeDocument/2006/relationships" xmlns:v="urn:schemas-microsoft-com:vml" xmlns:w10="urn:schemas-microsoft-com:office:word" xmlns:w14="http://schemas.microsoft.com/office/word/2010/wordml" xmlns:w="http://schemas.openxmlformats.org/wordprocessingml/2006/main" xmlns:wne="http://schemas.microsoft.com/office/word/2006/wordml" xmlns:wp14="http://schemas.microsoft.com/office/word/2010/wordprocessingDrawing" xmlns:wp="http://schemas.openxmlformats.org/drawingml/2006/wordprocessingDrawing" xmlns:wpc="http://schemas.microsoft.com/office/word/2010/wordprocessingCanvas" xmlns:wpg="http://schemas.microsoft.com/office/word/2010/wordprocessingGroup" xmlns:wpi="http://schemas.microsoft.com/office/word/2010/wordprocessingInk" xmlns:wps="http://schemas.microsoft.com/office/word/2010/wordprocessingShape" mc:Ignorable="w14 wp14">
+  <w:p>
+    <w:pPr>
+      <w:pStyle w:val="SmallNote"/>
+    </w:pPr>
+    <w:r>
+      <w:rPr>
+        <w:color w:val="000000"/>
+        <w:sz w:val="18"/>
+      </w:rPr>
+      <w:t>CRAFT | CRAFT Linux Operating Modes and Tickets</w:t>
     </w:r>
   </w:p>
 </w:hdr>
@@ -1758,10 +2029,11 @@
     <w:qFormat/>
     <w:rsid w:val="00FC693F"/>
     <w:pPr>
-      <w:spacing w:after="120" w:line="252" w:lineRule="auto"/>
+      <w:spacing w:after="140" w:line="259" w:lineRule="auto"/>
     </w:pPr>
     <w:rPr>
       <w:rFonts w:ascii="Calibri" w:hAnsi="Calibri"/>
+      <w:color w:val="000000"/>
       <w:sz w:val="21"/>
     </w:rPr>
   </w:style>
@@ -1776,11 +2048,11 @@
     <w:pPr>
       <w:keepNext/>
       <w:keepLines/>
-      <w:spacing w:before="180"/>
+      <w:spacing w:before="200" w:after="100"/>
       <w:outlineLvl w:val="0"/>
     </w:pPr>
     <w:rPr>
-      <w:rFonts w:asciiTheme="majorHAnsi" w:eastAsiaTheme="majorEastAsia" w:hAnsiTheme="majorHAnsi" w:cstheme="majorBidi"/>
+      <w:rFonts w:asciiTheme="majorHAnsi" w:eastAsiaTheme="majorEastAsia" w:hAnsiTheme="majorHAnsi" w:cstheme="majorBidi" w:ascii="Calibri" w:hAnsi="Calibri"/>
       <w:b/>
       <w:bCs/>
       <w:color w:val="000000"/>
@@ -1800,11 +2072,11 @@
     <w:pPr>
       <w:keepNext/>
       <w:keepLines/>
-      <w:spacing w:before="180"/>
+      <w:spacing w:before="200" w:after="100"/>
       <w:outlineLvl w:val="1"/>
     </w:pPr>
     <w:rPr>
-      <w:rFonts w:asciiTheme="majorHAnsi" w:eastAsiaTheme="majorEastAsia" w:hAnsiTheme="majorHAnsi" w:cstheme="majorBidi"/>
+      <w:rFonts w:asciiTheme="majorHAnsi" w:eastAsiaTheme="majorEastAsia" w:hAnsiTheme="majorHAnsi" w:cstheme="majorBidi" w:ascii="Calibri" w:hAnsi="Calibri"/>
       <w:b/>
       <w:bCs/>
       <w:color w:val="000000"/>
@@ -2110,11 +2382,11 @@
     <w:rsid w:val="00FC693F"/>
     <w:pPr>
       <w:keepNext/>
-      <w:spacing w:line="240" w:lineRule="auto"/>
+      <w:spacing w:line="240" w:lineRule="auto" w:after="140"/>
       <w:contextualSpacing/>
     </w:pPr>
     <w:rPr>
-      <w:rFonts w:asciiTheme="majorHAnsi" w:eastAsiaTheme="majorEastAsia" w:hAnsiTheme="majorHAnsi" w:cstheme="majorBidi"/>
+      <w:rFonts w:asciiTheme="majorHAnsi" w:eastAsiaTheme="majorEastAsia" w:hAnsiTheme="majorHAnsi" w:cstheme="majorBidi" w:ascii="Calibri" w:hAnsi="Calibri"/>
       <w:color w:val="000000"/>
       <w:spacing w:val="5"/>
       <w:kern w:val="28"/>
@@ -2151,7 +2423,7 @@
       </w:numPr>
     </w:pPr>
     <w:rPr>
-      <w:rFonts w:asciiTheme="majorHAnsi" w:eastAsiaTheme="majorEastAsia" w:hAnsiTheme="majorHAnsi" w:cstheme="majorBidi"/>
+      <w:rFonts w:asciiTheme="majorHAnsi" w:eastAsiaTheme="majorEastAsia" w:hAnsiTheme="majorHAnsi" w:cstheme="majorBidi" w:ascii="Calibri" w:hAnsi="Calibri"/>
       <w:i/>
       <w:iCs/>
       <w:color w:val="000000"/>
@@ -2547,9 +2819,10 @@
       <w:spacing w:line="240" w:lineRule="auto"/>
     </w:pPr>
     <w:rPr>
+      <w:rFonts w:ascii="Calibri" w:hAnsi="Calibri"/>
       <w:b/>
       <w:bCs/>
-      <w:color w:val="5B6770"/>
+      <w:color w:val="000000"/>
       <w:sz w:val="17"/>
       <w:szCs w:val="18"/>
     </w:rPr>
@@ -12749,10 +13022,11 @@
   <w:style w:type="paragraph" w:customStyle="1" w:styleId="CodeBlock">
     <w:name w:val="Code Block"/>
     <w:pPr>
-      <w:spacing w:after="100" w:line="240" w:lineRule="auto"/>
+      <w:spacing w:after="160" w:line="259" w:lineRule="auto"/>
     </w:pPr>
     <w:rPr>
       <w:rFonts w:ascii="Consolas" w:eastAsia="Consolas" w:hAnsi="Consolas" w:cs="Consolas"/>
+      <w:color w:val="000000"/>
       <w:sz w:val="18"/>
     </w:rPr>
   </w:style>
@@ -12763,6 +13037,7 @@
     </w:pPr>
     <w:rPr>
       <w:rFonts w:ascii="Calibri" w:hAnsi="Calibri"/>
+      <w:color w:val="000000"/>
       <w:sz w:val="17"/>
     </w:rPr>
   </w:style>

</xml_diff>

<commit_message>
Relocate and streamline CRAFT documentation assets
Move diagrams and generators under docs, update all references, remove generated PNGs, and generate guide figures directly from the diagrams PDF.
</commit_message>
<xml_diff>
--- a/docs/01-CRAFT-Process-Overview.docx
+++ b/docs/01-CRAFT-Process-Overview.docx
@@ -429,8 +429,8 @@
     <w:p>
       <w:pPr>
         <w:sectPr>
-          <w:headerReference w:type="default" r:id="rId37"/>
-          <w:footerReference w:type="default" r:id="rId38"/>
+          <w:headerReference w:type="default" r:id="rId10"/>
+          <w:footerReference w:type="default" r:id="rId11"/>
           <w:pgSz w:w="12240" w:h="15840"/>
           <w:pgMar w:top="893" w:right="979" w:bottom="893" w:left="979" w:header="360" w:footer="360" w:gutter="0"/>
           <w:cols w:space="720"/>
@@ -1377,6 +1377,39 @@
 </w:ftr>
 </file>
 
+<file path=word/footer3.xml><?xml version="1.0" encoding="utf-8"?>
+<w:ftr xmlns:m="http://schemas.openxmlformats.org/officeDocument/2006/math" xmlns:mc="http://schemas.openxmlformats.org/markup-compatibility/2006" xmlns:mo="http://schemas.microsoft.com/office/mac/office/2008/main" xmlns:mv="urn:schemas-microsoft-com:mac:vml" xmlns:o="urn:schemas-microsoft-com:office:office" xmlns:r="http://schemas.openxmlformats.org/officeDocument/2006/relationships" xmlns:v="urn:schemas-microsoft-com:vml" xmlns:w10="urn:schemas-microsoft-com:office:word" xmlns:w14="http://schemas.microsoft.com/office/word/2010/wordml" xmlns:w="http://schemas.openxmlformats.org/wordprocessingml/2006/main" xmlns:wne="http://schemas.microsoft.com/office/word/2006/wordml" xmlns:wp14="http://schemas.microsoft.com/office/word/2010/wordprocessingDrawing" xmlns:wp="http://schemas.openxmlformats.org/drawingml/2006/wordprocessingDrawing" xmlns:wpc="http://schemas.microsoft.com/office/word/2010/wordprocessingCanvas" xmlns:wpg="http://schemas.microsoft.com/office/word/2010/wordprocessingGroup" xmlns:wpi="http://schemas.microsoft.com/office/word/2010/wordprocessingInk" xmlns:wps="http://schemas.microsoft.com/office/word/2010/wordprocessingShape" mc:Ignorable="w14 wp14">
+  <w:p>
+    <w:pPr>
+      <w:jc w:val="right"/>
+    </w:pPr>
+    <w:fldSimple w:instr="PAGE"/>
+  </w:p>
+</w:ftr>
+</file>
+
+<file path=word/footer4.xml><?xml version="1.0" encoding="utf-8"?>
+<w:ftr xmlns:m="http://schemas.openxmlformats.org/officeDocument/2006/math" xmlns:mc="http://schemas.openxmlformats.org/markup-compatibility/2006" xmlns:mo="http://schemas.microsoft.com/office/mac/office/2008/main" xmlns:mv="urn:schemas-microsoft-com:mac:vml" xmlns:o="urn:schemas-microsoft-com:office:office" xmlns:r="http://schemas.openxmlformats.org/officeDocument/2006/relationships" xmlns:v="urn:schemas-microsoft-com:vml" xmlns:w10="urn:schemas-microsoft-com:office:word" xmlns:w14="http://schemas.microsoft.com/office/word/2010/wordml" xmlns:w="http://schemas.openxmlformats.org/wordprocessingml/2006/main" xmlns:wne="http://schemas.microsoft.com/office/word/2006/wordml" xmlns:wp14="http://schemas.microsoft.com/office/word/2010/wordprocessingDrawing" xmlns:wp="http://schemas.openxmlformats.org/drawingml/2006/wordprocessingDrawing" xmlns:wpc="http://schemas.microsoft.com/office/word/2010/wordprocessingCanvas" xmlns:wpg="http://schemas.microsoft.com/office/word/2010/wordprocessingGroup" xmlns:wpi="http://schemas.microsoft.com/office/word/2010/wordprocessingInk" xmlns:wps="http://schemas.microsoft.com/office/word/2010/wordprocessingShape" mc:Ignorable="w14 wp14">
+  <w:p>
+    <w:pPr>
+      <w:jc w:val="right"/>
+    </w:pPr>
+    <w:fldSimple w:instr="PAGE"/>
+  </w:p>
+</w:ftr>
+</file>
+
+<file path=word/footer5.xml><?xml version="1.0" encoding="utf-8"?>
+<w:ftr xmlns:m="http://schemas.openxmlformats.org/officeDocument/2006/math" xmlns:mc="http://schemas.openxmlformats.org/markup-compatibility/2006" xmlns:mo="http://schemas.microsoft.com/office/mac/office/2008/main" xmlns:mv="urn:schemas-microsoft-com:mac:vml" xmlns:o="urn:schemas-microsoft-com:office:office" xmlns:r="http://schemas.openxmlformats.org/officeDocument/2006/relationships" xmlns:v="urn:schemas-microsoft-com:vml" xmlns:w10="urn:schemas-microsoft-com:office:word" xmlns:w14="http://schemas.microsoft.com/office/word/2010/wordml" xmlns:w="http://schemas.openxmlformats.org/wordprocessingml/2006/main" xmlns:wne="http://schemas.microsoft.com/office/word/2006/wordml" xmlns:wp14="http://schemas.microsoft.com/office/word/2010/wordprocessingDrawing" xmlns:wp="http://schemas.openxmlformats.org/drawingml/2006/wordprocessingDrawing" xmlns:wpc="http://schemas.microsoft.com/office/word/2010/wordprocessingCanvas" xmlns:wpg="http://schemas.microsoft.com/office/word/2010/wordprocessingGroup" xmlns:wpi="http://schemas.microsoft.com/office/word/2010/wordprocessingInk" xmlns:wps="http://schemas.microsoft.com/office/word/2010/wordprocessingShape" mc:Ignorable="w14 wp14">
+  <w:p>
+    <w:pPr>
+      <w:jc w:val="right"/>
+    </w:pPr>
+    <w:fldSimple w:instr="PAGE"/>
+  </w:p>
+</w:ftr>
+</file>
+
 <file path=word/footnotes.xml><?xml version="1.0" encoding="utf-8"?>
 <w:footnotes xmlns:wpc="http://schemas.microsoft.com/office/word/2010/wordprocessingCanvas" xmlns:cx="http://schemas.microsoft.com/office/drawing/2014/chartex" xmlns:cx1="http://schemas.microsoft.com/office/drawing/2015/9/8/chartex" xmlns:cx2="http://schemas.microsoft.com/office/drawing/2015/10/21/chartex" xmlns:cx3="http://schemas.microsoft.com/office/drawing/2016/5/9/chartex" xmlns:cx4="http://schemas.microsoft.com/office/drawing/2016/5/10/chartex" xmlns:cx5="http://schemas.microsoft.com/office/drawing/2016/5/11/chartex" xmlns:cx6="http://schemas.microsoft.com/office/drawing/2016/5/12/chartex" xmlns:cx7="http://schemas.microsoft.com/office/drawing/2016/5/13/chartex" xmlns:cx8="http://schemas.microsoft.com/office/drawing/2016/5/14/chartex" xmlns:mc="http://schemas.openxmlformats.org/markup-compatibility/2006" xmlns:aink="http://schemas.microsoft.com/office/drawing/2016/ink" xmlns:am3d="http://schemas.microsoft.com/office/drawing/2017/model3d" xmlns:o="urn:schemas-microsoft-com:office:office" xmlns:oel="http://schemas.microsoft.com/office/2019/extlst" xmlns:r="http://schemas.openxmlformats.org/officeDocument/2006/relationships" xmlns:m="http://schemas.openxmlformats.org/officeDocument/2006/math" xmlns:v="urn:schemas-microsoft-com:vml" xmlns:wp14="http://schemas.microsoft.com/office/word/2010/wordprocessingDrawing" xmlns:wp="http://schemas.openxmlformats.org/drawingml/2006/wordprocessingDrawing" xmlns:w10="urn:schemas-microsoft-com:office:word" xmlns:w="http://schemas.openxmlformats.org/wordprocessingml/2006/main" xmlns:w14="http://schemas.microsoft.com/office/word/2010/wordml" xmlns:w15="http://schemas.microsoft.com/office/word/2012/wordml" xmlns:w16cex="http://schemas.microsoft.com/office/word/2018/wordml/cex" xmlns:w16cid="http://schemas.microsoft.com/office/word/2016/wordml/cid" xmlns:w16="http://schemas.microsoft.com/office/word/2018/wordml" xmlns:w16du="http://schemas.microsoft.com/office/word/2023/wordml/word16du" xmlns:w16sdtdh="http://schemas.microsoft.com/office/word/2020/wordml/sdtdatahash" xmlns:w16sdtfl="http://schemas.microsoft.com/office/word/2024/wordml/sdtformatlock" xmlns:w16se="http://schemas.microsoft.com/office/word/2015/wordml/symex" xmlns:wpg="http://schemas.microsoft.com/office/word/2010/wordprocessingGroup" xmlns:wpi="http://schemas.microsoft.com/office/word/2010/wordprocessingInk" xmlns:wne="http://schemas.microsoft.com/office/word/2006/wordml" xmlns:wps="http://schemas.microsoft.com/office/word/2010/wordprocessingShape" mc:Ignorable="w14 w15 w16se w16cid w16 w16cex w16sdtdh w16sdtfl w16du wp14">
   <w:footnote w:type="separator" w:id="-1">
@@ -1419,6 +1452,57 @@
 </file>
 
 <file path=word/header2.xml><?xml version="1.0" encoding="utf-8"?>
+<w:hdr xmlns:m="http://schemas.openxmlformats.org/officeDocument/2006/math" xmlns:mc="http://schemas.openxmlformats.org/markup-compatibility/2006" xmlns:mo="http://schemas.microsoft.com/office/mac/office/2008/main" xmlns:mv="urn:schemas-microsoft-com:mac:vml" xmlns:o="urn:schemas-microsoft-com:office:office" xmlns:r="http://schemas.openxmlformats.org/officeDocument/2006/relationships" xmlns:v="urn:schemas-microsoft-com:vml" xmlns:w10="urn:schemas-microsoft-com:office:word" xmlns:w14="http://schemas.microsoft.com/office/word/2010/wordml" xmlns:w="http://schemas.openxmlformats.org/wordprocessingml/2006/main" xmlns:wne="http://schemas.microsoft.com/office/word/2006/wordml" xmlns:wp14="http://schemas.microsoft.com/office/word/2010/wordprocessingDrawing" xmlns:wp="http://schemas.openxmlformats.org/drawingml/2006/wordprocessingDrawing" xmlns:wpc="http://schemas.microsoft.com/office/word/2010/wordprocessingCanvas" xmlns:wpg="http://schemas.microsoft.com/office/word/2010/wordprocessingGroup" xmlns:wpi="http://schemas.microsoft.com/office/word/2010/wordprocessingInk" xmlns:wps="http://schemas.microsoft.com/office/word/2010/wordprocessingShape" mc:Ignorable="w14 wp14">
+  <w:p>
+    <w:pPr>
+      <w:pStyle w:val="SmallNote"/>
+    </w:pPr>
+    <w:r>
+      <w:rPr>
+        <w:color w:val="000000"/>
+        <w:sz w:val="18"/>
+      </w:rPr>
+      <w:t>CRAFT | CRAFT Linux Operating Modes and Tickets</w:t>
+    </w:r>
+  </w:p>
+</w:hdr>
+</file>
+
+<file path=word/header3.xml><?xml version="1.0" encoding="utf-8"?>
+<w:hdr xmlns:m="http://schemas.openxmlformats.org/officeDocument/2006/math" xmlns:mc="http://schemas.openxmlformats.org/markup-compatibility/2006" xmlns:mo="http://schemas.microsoft.com/office/mac/office/2008/main" xmlns:mv="urn:schemas-microsoft-com:mac:vml" xmlns:o="urn:schemas-microsoft-com:office:office" xmlns:r="http://schemas.openxmlformats.org/officeDocument/2006/relationships" xmlns:v="urn:schemas-microsoft-com:vml" xmlns:w10="urn:schemas-microsoft-com:office:word" xmlns:w14="http://schemas.microsoft.com/office/word/2010/wordml" xmlns:w="http://schemas.openxmlformats.org/wordprocessingml/2006/main" xmlns:wne="http://schemas.microsoft.com/office/word/2006/wordml" xmlns:wp14="http://schemas.microsoft.com/office/word/2010/wordprocessingDrawing" xmlns:wp="http://schemas.openxmlformats.org/drawingml/2006/wordprocessingDrawing" xmlns:wpc="http://schemas.microsoft.com/office/word/2010/wordprocessingCanvas" xmlns:wpg="http://schemas.microsoft.com/office/word/2010/wordprocessingGroup" xmlns:wpi="http://schemas.microsoft.com/office/word/2010/wordprocessingInk" xmlns:wps="http://schemas.microsoft.com/office/word/2010/wordprocessingShape" mc:Ignorable="w14 wp14">
+  <w:p>
+    <w:pPr>
+      <w:pStyle w:val="SmallNote"/>
+    </w:pPr>
+    <w:r>
+      <w:rPr>
+        <w:color w:val="000000"/>
+        <w:sz w:val="18"/>
+      </w:rPr>
+      <w:t>CRAFT | CRAFT Linux Operating Modes and Tickets</w:t>
+    </w:r>
+  </w:p>
+</w:hdr>
+</file>
+
+<file path=word/header4.xml><?xml version="1.0" encoding="utf-8"?>
+<w:hdr xmlns:m="http://schemas.openxmlformats.org/officeDocument/2006/math" xmlns:mc="http://schemas.openxmlformats.org/markup-compatibility/2006" xmlns:mo="http://schemas.microsoft.com/office/mac/office/2008/main" xmlns:mv="urn:schemas-microsoft-com:mac:vml" xmlns:o="urn:schemas-microsoft-com:office:office" xmlns:r="http://schemas.openxmlformats.org/officeDocument/2006/relationships" xmlns:v="urn:schemas-microsoft-com:vml" xmlns:w10="urn:schemas-microsoft-com:office:word" xmlns:w14="http://schemas.microsoft.com/office/word/2010/wordml" xmlns:w="http://schemas.openxmlformats.org/wordprocessingml/2006/main" xmlns:wne="http://schemas.microsoft.com/office/word/2006/wordml" xmlns:wp14="http://schemas.microsoft.com/office/word/2010/wordprocessingDrawing" xmlns:wp="http://schemas.openxmlformats.org/drawingml/2006/wordprocessingDrawing" xmlns:wpc="http://schemas.microsoft.com/office/word/2010/wordprocessingCanvas" xmlns:wpg="http://schemas.microsoft.com/office/word/2010/wordprocessingGroup" xmlns:wpi="http://schemas.microsoft.com/office/word/2010/wordprocessingInk" xmlns:wps="http://schemas.microsoft.com/office/word/2010/wordprocessingShape" mc:Ignorable="w14 wp14">
+  <w:p>
+    <w:pPr>
+      <w:pStyle w:val="SmallNote"/>
+    </w:pPr>
+    <w:r>
+      <w:rPr>
+        <w:color w:val="000000"/>
+        <w:sz w:val="18"/>
+      </w:rPr>
+      <w:t>CRAFT | CRAFT Linux Operating Modes and Tickets</w:t>
+    </w:r>
+  </w:p>
+</w:hdr>
+</file>
+
+<file path=word/header5.xml><?xml version="1.0" encoding="utf-8"?>
 <w:hdr xmlns:m="http://schemas.openxmlformats.org/officeDocument/2006/math" xmlns:mc="http://schemas.openxmlformats.org/markup-compatibility/2006" xmlns:mo="http://schemas.microsoft.com/office/mac/office/2008/main" xmlns:mv="urn:schemas-microsoft-com:mac:vml" xmlns:o="urn:schemas-microsoft-com:office:office" xmlns:r="http://schemas.openxmlformats.org/officeDocument/2006/relationships" xmlns:v="urn:schemas-microsoft-com:vml" xmlns:w10="urn:schemas-microsoft-com:office:word" xmlns:w14="http://schemas.microsoft.com/office/word/2010/wordml" xmlns:w="http://schemas.openxmlformats.org/wordprocessingml/2006/main" xmlns:wne="http://schemas.microsoft.com/office/word/2006/wordml" xmlns:wp14="http://schemas.microsoft.com/office/word/2010/wordprocessingDrawing" xmlns:wp="http://schemas.openxmlformats.org/drawingml/2006/wordprocessingDrawing" xmlns:wpc="http://schemas.microsoft.com/office/word/2010/wordprocessingCanvas" xmlns:wpg="http://schemas.microsoft.com/office/word/2010/wordprocessingGroup" xmlns:wpi="http://schemas.microsoft.com/office/word/2010/wordprocessingInk" xmlns:wps="http://schemas.microsoft.com/office/word/2010/wordprocessingShape" mc:Ignorable="w14 wp14">
   <w:p>
     <w:pPr>

</xml_diff>

<commit_message>
Harden LDAP and lifetime validation
Require encrypted GSSAPI LDAP binds with SASL SSF 128, enforce renewal periods to exceed TGT lifetimes unless disabled, and update configuration, documentation, tests, and generated guides accordingly.
</commit_message>
<xml_diff>
--- a/docs/01-CRAFT-Process-Overview.docx
+++ b/docs/01-CRAFT-Process-Overview.docx
@@ -202,7 +202,7 @@
             <w:pPr>
               <w:spacing w:after="40" w:before="40" w:line="252" w:lineRule="auto"/>
             </w:pPr>
-            <w:hyperlink r:id="rId16">
+            <w:hyperlink r:id="rId20">
               <w:r>
                 <w:rPr>
                   <w:color w:val="315DC0"/>
@@ -282,7 +282,7 @@
             <w:pPr>
               <w:spacing w:after="40" w:before="40" w:line="252" w:lineRule="auto"/>
             </w:pPr>
-            <w:hyperlink r:id="rId17">
+            <w:hyperlink r:id="rId21">
               <w:r>
                 <w:rPr>
                   <w:color w:val="315DC0"/>
@@ -362,7 +362,7 @@
             <w:pPr>
               <w:spacing w:after="40" w:before="40" w:line="252" w:lineRule="auto"/>
             </w:pPr>
-            <w:hyperlink r:id="rId18">
+            <w:hyperlink r:id="rId23">
               <w:r>
                 <w:rPr>
                   <w:color w:val="315DC0"/>
@@ -399,7 +399,7 @@
       </w:r>
     </w:p>
     <w:p>
-      <w:hyperlink r:id="rId19">
+      <w:hyperlink r:id="rId25">
         <w:r>
           <w:rPr>
             <w:color w:val="315DC0"/>
@@ -411,7 +411,7 @@
       <w:r>
         <w:t xml:space="preserve">  |  </w:t>
       </w:r>
-      <w:hyperlink r:id="rId20">
+      <w:hyperlink r:id="rId27">
         <w:r>
           <w:rPr>
             <w:color w:val="315DC0"/>
@@ -429,8 +429,8 @@
     <w:p>
       <w:pPr>
         <w:sectPr>
-          <w:headerReference w:type="default" r:id="rId10"/>
-          <w:footerReference w:type="default" r:id="rId11"/>
+          <w:headerReference w:type="default" r:id="rId18"/>
+          <w:footerReference w:type="default" r:id="rId19"/>
           <w:pgSz w:w="12240" w:h="15840"/>
           <w:pgMar w:top="893" w:right="979" w:bottom="893" w:left="979" w:header="360" w:footer="360" w:gutter="0"/>
           <w:cols w:space="720"/>
@@ -447,7 +447,7 @@
       </w:r>
     </w:p>
     <w:p>
-      <w:hyperlink r:id="rId16">
+      <w:hyperlink r:id="rId20">
         <w:r>
           <w:rPr>
             <w:color w:val="315DC0"/>
@@ -459,7 +459,7 @@
       <w:r>
         <w:t xml:space="preserve">  |  </w:t>
       </w:r>
-      <w:hyperlink r:id="rId21">
+      <w:hyperlink r:id="rId29">
         <w:r>
           <w:rPr>
             <w:color w:val="315DC0"/>
@@ -538,7 +538,7 @@
       </w:r>
     </w:p>
     <w:p>
-      <w:hyperlink r:id="rId17">
+      <w:hyperlink r:id="rId21">
         <w:r>
           <w:rPr>
             <w:color w:val="315DC0"/>
@@ -550,7 +550,7 @@
       <w:r>
         <w:t xml:space="preserve">  |  </w:t>
       </w:r>
-      <w:hyperlink r:id="rId23">
+      <w:hyperlink r:id="rId30">
         <w:r>
           <w:rPr>
             <w:color w:val="315DC0"/>
@@ -582,7 +582,7 @@
                     <pic:cNvPicPr/>
                   </pic:nvPicPr>
                   <pic:blipFill>
-                    <a:blip r:embed="rId24"/>
+                    <a:blip r:embed="rId28"/>
                     <a:stretch>
                       <a:fillRect/>
                     </a:stretch>
@@ -629,7 +629,7 @@
       </w:r>
     </w:p>
     <w:p>
-      <w:hyperlink r:id="rId18">
+      <w:hyperlink r:id="rId23">
         <w:r>
           <w:rPr>
             <w:color w:val="315DC0"/>
@@ -641,7 +641,7 @@
       <w:r>
         <w:t xml:space="preserve">  |  </w:t>
       </w:r>
-      <w:hyperlink r:id="rId25">
+      <w:hyperlink r:id="rId31">
         <w:r>
           <w:rPr>
             <w:color w:val="315DC0"/>
@@ -952,7 +952,7 @@
               <w:rPr>
                 <w:sz w:val="20"/>
               </w:rPr>
-              <w:t>Locally issued certificate carrying a fresh RSA-2048 public key. The KDC matches the linked key; a trusted user-certificate CA chain is unnecessary. KDC trust is still required.</w:t>
+              <w:t>Locally issued certificate carrying a fresh RSA-3072 public key. The KDC matches the linked key; a trusted user-certificate CA chain is unnecessary. KDC trust is still required.</w:t>
             </w:r>
           </w:p>
         </w:tc>
@@ -1075,7 +1075,7 @@
       </w:r>
     </w:p>
     <w:p>
-      <w:hyperlink r:id="rId27">
+      <w:hyperlink r:id="rId32">
         <w:r>
           <w:rPr>
             <w:color w:val="315DC0"/>
@@ -1087,7 +1087,7 @@
       <w:r>
         <w:t xml:space="preserve">  |  </w:t>
       </w:r>
-      <w:hyperlink r:id="rId28">
+      <w:hyperlink r:id="rId33">
         <w:r>
           <w:rPr>
             <w:color w:val="315DC0"/>
@@ -1174,7 +1174,7 @@
     </w:p>
     <w:p>
       <w:r>
-        <w:t>Install the maintainer without setuid/setgid on Linux 5.3+ with /proc and system Kerberos configuration matching the pinned realm/KDC and AES policy. Home refresh works under no_new_privs; modes 1 and 2 require later setuid calls. The scheduler must retain background processes. Watch a shell or job controller that lasts for the job; optional --max-duration 21d adds a cutoff. Concurrent jobs for one UID share the cache and fresh-acquisition cooldown.</w:t>
+        <w:t>Install the maintainer without setuid/setgid on Linux with /proc and system Kerberos configuration matching the pinned realm/KDC and AES policy. Monitoring uses pidfds when available and /proc elsewhere. Home refresh works under no_new_privs; modes 1 and 2 require later setuid calls. The scheduler must retain background processes. Watch a shell or job controller that lasts for the job; optional --max-duration 21d adds a cutoff. Concurrent jobs for one UID share the cache and fresh-acquisition cooldown.</w:t>
       </w:r>
     </w:p>
     <w:p>
@@ -1194,7 +1194,7 @@
       </w:r>
     </w:p>
     <w:p>
-      <w:hyperlink r:id="rId29">
+      <w:hyperlink r:id="rId34">
         <w:r>
           <w:rPr>
             <w:color w:val="315DC0"/>
@@ -1206,7 +1206,7 @@
       <w:r>
         <w:t xml:space="preserve">  |  </w:t>
       </w:r>
-      <w:hyperlink r:id="rId30">
+      <w:hyperlink r:id="rId35">
         <w:r>
           <w:rPr>
             <w:color w:val="315DC0"/>
@@ -1225,7 +1225,7 @@
       </w:r>
     </w:p>
     <w:p>
-      <w:hyperlink r:id="rId31">
+      <w:hyperlink r:id="rId36">
         <w:r>
           <w:rPr>
             <w:color w:val="315DC0"/>
@@ -1237,7 +1237,7 @@
       <w:r>
         <w:t xml:space="preserve">  |  </w:t>
       </w:r>
-      <w:hyperlink r:id="rId32">
+      <w:hyperlink r:id="rId41">
         <w:r>
           <w:rPr>
             <w:color w:val="315DC0"/>
@@ -1249,7 +1249,7 @@
       <w:r>
         <w:t xml:space="preserve">  |  </w:t>
       </w:r>
-      <w:hyperlink r:id="rId33">
+      <w:hyperlink r:id="rId42">
         <w:r>
           <w:rPr>
             <w:color w:val="315DC0"/>
@@ -1260,7 +1260,7 @@
       </w:hyperlink>
     </w:p>
     <w:p>
-      <w:hyperlink r:id="rId34">
+      <w:hyperlink r:id="rId43">
         <w:r>
           <w:rPr>
             <w:color w:val="315DC0"/>
@@ -1272,7 +1272,7 @@
       <w:r>
         <w:t xml:space="preserve">  |  </w:t>
       </w:r>
-      <w:hyperlink r:id="rId35">
+      <w:hyperlink r:id="rId44">
         <w:r>
           <w:rPr>
             <w:color w:val="315DC0"/>
@@ -1289,7 +1289,7 @@
       <w:r>
         <w:t xml:space="preserve">Source code, scripts, configuration examples and documentation are licensed under GNU GPL version 3 only (GPL-3.0-only). See </w:t>
       </w:r>
-      <w:hyperlink r:id="rId36">
+      <w:hyperlink r:id="rId45">
         <w:r>
           <w:rPr>
             <w:color w:val="315DC0"/>
@@ -1410,6 +1410,28 @@
 </w:ftr>
 </file>
 
+<file path=word/footer6.xml><?xml version="1.0" encoding="utf-8"?>
+<w:ftr xmlns:m="http://schemas.openxmlformats.org/officeDocument/2006/math" xmlns:mc="http://schemas.openxmlformats.org/markup-compatibility/2006" xmlns:mo="http://schemas.microsoft.com/office/mac/office/2008/main" xmlns:mv="urn:schemas-microsoft-com:mac:vml" xmlns:o="urn:schemas-microsoft-com:office:office" xmlns:r="http://schemas.openxmlformats.org/officeDocument/2006/relationships" xmlns:v="urn:schemas-microsoft-com:vml" xmlns:w10="urn:schemas-microsoft-com:office:word" xmlns:w14="http://schemas.microsoft.com/office/word/2010/wordml" xmlns:w="http://schemas.openxmlformats.org/wordprocessingml/2006/main" xmlns:wne="http://schemas.microsoft.com/office/word/2006/wordml" xmlns:wp14="http://schemas.microsoft.com/office/word/2010/wordprocessingDrawing" xmlns:wp="http://schemas.openxmlformats.org/drawingml/2006/wordprocessingDrawing" xmlns:wpc="http://schemas.microsoft.com/office/word/2010/wordprocessingCanvas" xmlns:wpg="http://schemas.microsoft.com/office/word/2010/wordprocessingGroup" xmlns:wpi="http://schemas.microsoft.com/office/word/2010/wordprocessingInk" xmlns:wps="http://schemas.microsoft.com/office/word/2010/wordprocessingShape" mc:Ignorable="w14 wp14">
+  <w:p>
+    <w:pPr>
+      <w:jc w:val="right"/>
+    </w:pPr>
+    <w:fldSimple w:instr="PAGE"/>
+  </w:p>
+</w:ftr>
+</file>
+
+<file path=word/footer7.xml><?xml version="1.0" encoding="utf-8"?>
+<w:ftr xmlns:m="http://schemas.openxmlformats.org/officeDocument/2006/math" xmlns:mc="http://schemas.openxmlformats.org/markup-compatibility/2006" xmlns:mo="http://schemas.microsoft.com/office/mac/office/2008/main" xmlns:mv="urn:schemas-microsoft-com:mac:vml" xmlns:o="urn:schemas-microsoft-com:office:office" xmlns:r="http://schemas.openxmlformats.org/officeDocument/2006/relationships" xmlns:v="urn:schemas-microsoft-com:vml" xmlns:w10="urn:schemas-microsoft-com:office:word" xmlns:w14="http://schemas.microsoft.com/office/word/2010/wordml" xmlns:w="http://schemas.openxmlformats.org/wordprocessingml/2006/main" xmlns:wne="http://schemas.microsoft.com/office/word/2006/wordml" xmlns:wp14="http://schemas.microsoft.com/office/word/2010/wordprocessingDrawing" xmlns:wp="http://schemas.openxmlformats.org/drawingml/2006/wordprocessingDrawing" xmlns:wpc="http://schemas.microsoft.com/office/word/2010/wordprocessingCanvas" xmlns:wpg="http://schemas.microsoft.com/office/word/2010/wordprocessingGroup" xmlns:wpi="http://schemas.microsoft.com/office/word/2010/wordprocessingInk" xmlns:wps="http://schemas.microsoft.com/office/word/2010/wordprocessingShape" mc:Ignorable="w14 wp14">
+  <w:p>
+    <w:pPr>
+      <w:jc w:val="right"/>
+    </w:pPr>
+    <w:fldSimple w:instr="PAGE"/>
+  </w:p>
+</w:ftr>
+</file>
+
 <file path=word/footnotes.xml><?xml version="1.0" encoding="utf-8"?>
 <w:footnotes xmlns:wpc="http://schemas.microsoft.com/office/word/2010/wordprocessingCanvas" xmlns:cx="http://schemas.microsoft.com/office/drawing/2014/chartex" xmlns:cx1="http://schemas.microsoft.com/office/drawing/2015/9/8/chartex" xmlns:cx2="http://schemas.microsoft.com/office/drawing/2015/10/21/chartex" xmlns:cx3="http://schemas.microsoft.com/office/drawing/2016/5/9/chartex" xmlns:cx4="http://schemas.microsoft.com/office/drawing/2016/5/10/chartex" xmlns:cx5="http://schemas.microsoft.com/office/drawing/2016/5/11/chartex" xmlns:cx6="http://schemas.microsoft.com/office/drawing/2016/5/12/chartex" xmlns:cx7="http://schemas.microsoft.com/office/drawing/2016/5/13/chartex" xmlns:cx8="http://schemas.microsoft.com/office/drawing/2016/5/14/chartex" xmlns:mc="http://schemas.openxmlformats.org/markup-compatibility/2006" xmlns:aink="http://schemas.microsoft.com/office/drawing/2016/ink" xmlns:am3d="http://schemas.microsoft.com/office/drawing/2017/model3d" xmlns:o="urn:schemas-microsoft-com:office:office" xmlns:oel="http://schemas.microsoft.com/office/2019/extlst" xmlns:r="http://schemas.openxmlformats.org/officeDocument/2006/relationships" xmlns:m="http://schemas.openxmlformats.org/officeDocument/2006/math" xmlns:v="urn:schemas-microsoft-com:vml" xmlns:wp14="http://schemas.microsoft.com/office/word/2010/wordprocessingDrawing" xmlns:wp="http://schemas.openxmlformats.org/drawingml/2006/wordprocessingDrawing" xmlns:w10="urn:schemas-microsoft-com:office:word" xmlns:w="http://schemas.openxmlformats.org/wordprocessingml/2006/main" xmlns:w14="http://schemas.microsoft.com/office/word/2010/wordml" xmlns:w15="http://schemas.microsoft.com/office/word/2012/wordml" xmlns:w16cex="http://schemas.microsoft.com/office/word/2018/wordml/cex" xmlns:w16cid="http://schemas.microsoft.com/office/word/2016/wordml/cid" xmlns:w16="http://schemas.microsoft.com/office/word/2018/wordml" xmlns:w16du="http://schemas.microsoft.com/office/word/2023/wordml/word16du" xmlns:w16sdtdh="http://schemas.microsoft.com/office/word/2020/wordml/sdtdatahash" xmlns:w16sdtfl="http://schemas.microsoft.com/office/word/2024/wordml/sdtformatlock" xmlns:w16se="http://schemas.microsoft.com/office/word/2015/wordml/symex" xmlns:wpg="http://schemas.microsoft.com/office/word/2010/wordprocessingGroup" xmlns:wpi="http://schemas.microsoft.com/office/word/2010/wordprocessingInk" xmlns:wne="http://schemas.microsoft.com/office/word/2006/wordml" xmlns:wps="http://schemas.microsoft.com/office/word/2010/wordprocessingShape" mc:Ignorable="w14 w15 w16se w16cid w16 w16cex w16sdtdh w16sdtfl w16du wp14">
   <w:footnote w:type="separator" w:id="-1">
@@ -1503,6 +1525,40 @@
 </file>
 
 <file path=word/header5.xml><?xml version="1.0" encoding="utf-8"?>
+<w:hdr xmlns:m="http://schemas.openxmlformats.org/officeDocument/2006/math" xmlns:mc="http://schemas.openxmlformats.org/markup-compatibility/2006" xmlns:mo="http://schemas.microsoft.com/office/mac/office/2008/main" xmlns:mv="urn:schemas-microsoft-com:mac:vml" xmlns:o="urn:schemas-microsoft-com:office:office" xmlns:r="http://schemas.openxmlformats.org/officeDocument/2006/relationships" xmlns:v="urn:schemas-microsoft-com:vml" xmlns:w10="urn:schemas-microsoft-com:office:word" xmlns:w14="http://schemas.microsoft.com/office/word/2010/wordml" xmlns:w="http://schemas.openxmlformats.org/wordprocessingml/2006/main" xmlns:wne="http://schemas.microsoft.com/office/word/2006/wordml" xmlns:wp14="http://schemas.microsoft.com/office/word/2010/wordprocessingDrawing" xmlns:wp="http://schemas.openxmlformats.org/drawingml/2006/wordprocessingDrawing" xmlns:wpc="http://schemas.microsoft.com/office/word/2010/wordprocessingCanvas" xmlns:wpg="http://schemas.microsoft.com/office/word/2010/wordprocessingGroup" xmlns:wpi="http://schemas.microsoft.com/office/word/2010/wordprocessingInk" xmlns:wps="http://schemas.microsoft.com/office/word/2010/wordprocessingShape" mc:Ignorable="w14 wp14">
+  <w:p>
+    <w:pPr>
+      <w:pStyle w:val="SmallNote"/>
+    </w:pPr>
+    <w:r>
+      <w:rPr>
+        <w:color w:val="000000"/>
+        <w:sz w:val="18"/>
+      </w:rPr>
+      <w:t>CRAFT | CRAFT Linux Operating Modes and Tickets</w:t>
+    </w:r>
+  </w:p>
+</w:hdr>
+</file>
+
+<file path=word/header6.xml><?xml version="1.0" encoding="utf-8"?>
+<w:hdr xmlns:m="http://schemas.openxmlformats.org/officeDocument/2006/math" xmlns:mc="http://schemas.openxmlformats.org/markup-compatibility/2006" xmlns:mo="http://schemas.microsoft.com/office/mac/office/2008/main" xmlns:mv="urn:schemas-microsoft-com:mac:vml" xmlns:o="urn:schemas-microsoft-com:office:office" xmlns:r="http://schemas.openxmlformats.org/officeDocument/2006/relationships" xmlns:v="urn:schemas-microsoft-com:vml" xmlns:w10="urn:schemas-microsoft-com:office:word" xmlns:w14="http://schemas.microsoft.com/office/word/2010/wordml" xmlns:w="http://schemas.openxmlformats.org/wordprocessingml/2006/main" xmlns:wne="http://schemas.microsoft.com/office/word/2006/wordml" xmlns:wp14="http://schemas.microsoft.com/office/word/2010/wordprocessingDrawing" xmlns:wp="http://schemas.openxmlformats.org/drawingml/2006/wordprocessingDrawing" xmlns:wpc="http://schemas.microsoft.com/office/word/2010/wordprocessingCanvas" xmlns:wpg="http://schemas.microsoft.com/office/word/2010/wordprocessingGroup" xmlns:wpi="http://schemas.microsoft.com/office/word/2010/wordprocessingInk" xmlns:wps="http://schemas.microsoft.com/office/word/2010/wordprocessingShape" mc:Ignorable="w14 wp14">
+  <w:p>
+    <w:pPr>
+      <w:pStyle w:val="SmallNote"/>
+    </w:pPr>
+    <w:r>
+      <w:rPr>
+        <w:color w:val="000000"/>
+        <w:sz w:val="18"/>
+      </w:rPr>
+      <w:t>CRAFT | CRAFT Linux Operating Modes and Tickets</w:t>
+    </w:r>
+  </w:p>
+</w:hdr>
+</file>
+
+<file path=word/header7.xml><?xml version="1.0" encoding="utf-8"?>
 <w:hdr xmlns:m="http://schemas.openxmlformats.org/officeDocument/2006/math" xmlns:mc="http://schemas.openxmlformats.org/markup-compatibility/2006" xmlns:mo="http://schemas.microsoft.com/office/mac/office/2008/main" xmlns:mv="urn:schemas-microsoft-com:mac:vml" xmlns:o="urn:schemas-microsoft-com:office:office" xmlns:r="http://schemas.openxmlformats.org/officeDocument/2006/relationships" xmlns:v="urn:schemas-microsoft-com:vml" xmlns:w10="urn:schemas-microsoft-com:office:word" xmlns:w14="http://schemas.microsoft.com/office/word/2010/wordml" xmlns:w="http://schemas.openxmlformats.org/wordprocessingml/2006/main" xmlns:wne="http://schemas.microsoft.com/office/word/2006/wordml" xmlns:wp14="http://schemas.microsoft.com/office/word/2010/wordprocessingDrawing" xmlns:wp="http://schemas.openxmlformats.org/drawingml/2006/wordprocessingDrawing" xmlns:wpc="http://schemas.microsoft.com/office/word/2010/wordprocessingCanvas" xmlns:wpg="http://schemas.microsoft.com/office/word/2010/wordprocessingGroup" xmlns:wpi="http://schemas.microsoft.com/office/word/2010/wordprocessingInk" xmlns:wps="http://schemas.microsoft.com/office/word/2010/wordprocessingShape" mc:Ignorable="w14 wp14">
   <w:p>
     <w:pPr>

</xml_diff>

<commit_message>
Refresh CRAFT documentation and deployment guidance
Reorganize installation, mode selection, security boundaries, validation procedures, operational disable guidance, and administrator documentation. Update generated guides, diagrams, and CA helper messaging to match current behavior.
</commit_message>
<xml_diff>
--- a/docs/01-CRAFT-Process-Overview.docx
+++ b/docs/01-CRAFT-Process-Overview.docx
@@ -20,7 +20,7 @@
     </w:p>
     <w:p>
       <w:r>
-        <w:t>CRAFT obtains a user's Kerberos ticket-granting ticket (TGT) through PKINIT from Linux, including hosts that are not domain-joined. It supports three operating modes. Linux can orchestrate privileged certificate enrollment, orchestrate privileged credential linking, or use a certificate exported from Windows with unprivileged acquisition. All three publish the user's cache for unattended applications without storing the user's AD password.</w:t>
+        <w:t>CRAFT obtains a user's Kerberos ticket-granting ticket (TGT) through PKINIT from Linux, including hosts that are not domain-joined. It supports privileged enrollment through AD CS, privileged Key Trust credential linking, and unprivileged authentication with a supplied certificate exported from Windows. All three publish the user's cache for unattended applications without storing the user's AD password.</w:t>
       </w:r>
     </w:p>
     <w:p>
@@ -202,7 +202,7 @@
             <w:pPr>
               <w:spacing w:after="40" w:before="40" w:line="252" w:lineRule="auto"/>
             </w:pPr>
-            <w:hyperlink r:id="rId20">
+            <w:hyperlink r:id="rId24">
               <w:r>
                 <w:rPr>
                   <w:color w:val="315DC0"/>
@@ -282,7 +282,7 @@
             <w:pPr>
               <w:spacing w:after="40" w:before="40" w:line="252" w:lineRule="auto"/>
             </w:pPr>
-            <w:hyperlink r:id="rId21">
+            <w:hyperlink r:id="rId25">
               <w:r>
                 <w:rPr>
                   <w:color w:val="315DC0"/>
@@ -362,7 +362,7 @@
             <w:pPr>
               <w:spacing w:after="40" w:before="40" w:line="252" w:lineRule="auto"/>
             </w:pPr>
-            <w:hyperlink r:id="rId23">
+            <w:hyperlink r:id="rId26">
               <w:r>
                 <w:rPr>
                   <w:color w:val="315DC0"/>
@@ -399,7 +399,7 @@
       </w:r>
     </w:p>
     <w:p>
-      <w:hyperlink r:id="rId25">
+      <w:hyperlink r:id="rId27">
         <w:r>
           <w:rPr>
             <w:color w:val="315DC0"/>
@@ -411,7 +411,7 @@
       <w:r>
         <w:t xml:space="preserve">  |  </w:t>
       </w:r>
-      <w:hyperlink r:id="rId27">
+      <w:hyperlink r:id="rId28">
         <w:r>
           <w:rPr>
             <w:color w:val="315DC0"/>
@@ -429,8 +429,8 @@
     <w:p>
       <w:pPr>
         <w:sectPr>
-          <w:headerReference w:type="default" r:id="rId18"/>
-          <w:footerReference w:type="default" r:id="rId19"/>
+          <w:headerReference w:type="default" r:id="rId22"/>
+          <w:footerReference w:type="default" r:id="rId23"/>
           <w:pgSz w:w="12240" w:h="15840"/>
           <w:pgMar w:top="893" w:right="979" w:bottom="893" w:left="979" w:header="360" w:footer="360" w:gutter="0"/>
           <w:cols w:space="720"/>
@@ -447,7 +447,7 @@
       </w:r>
     </w:p>
     <w:p>
-      <w:hyperlink r:id="rId20">
+      <w:hyperlink r:id="rId24">
         <w:r>
           <w:rPr>
             <w:color w:val="315DC0"/>
@@ -491,7 +491,7 @@
                     <pic:cNvPicPr/>
                   </pic:nvPicPr>
                   <pic:blipFill>
-                    <a:blip r:embed="rId22"/>
+                    <a:blip r:embed="rId30"/>
                     <a:stretch>
                       <a:fillRect/>
                     </a:stretch>
@@ -538,7 +538,7 @@
       </w:r>
     </w:p>
     <w:p>
-      <w:hyperlink r:id="rId21">
+      <w:hyperlink r:id="rId25">
         <w:r>
           <w:rPr>
             <w:color w:val="315DC0"/>
@@ -550,7 +550,7 @@
       <w:r>
         <w:t xml:space="preserve">  |  </w:t>
       </w:r>
-      <w:hyperlink r:id="rId30">
+      <w:hyperlink r:id="rId31">
         <w:r>
           <w:rPr>
             <w:color w:val="315DC0"/>
@@ -582,7 +582,7 @@
                     <pic:cNvPicPr/>
                   </pic:nvPicPr>
                   <pic:blipFill>
-                    <a:blip r:embed="rId28"/>
+                    <a:blip r:embed="rId32"/>
                     <a:stretch>
                       <a:fillRect/>
                     </a:stretch>
@@ -629,7 +629,7 @@
       </w:r>
     </w:p>
     <w:p>
-      <w:hyperlink r:id="rId23">
+      <w:hyperlink r:id="rId26">
         <w:r>
           <w:rPr>
             <w:color w:val="315DC0"/>
@@ -641,7 +641,7 @@
       <w:r>
         <w:t xml:space="preserve">  |  </w:t>
       </w:r>
-      <w:hyperlink r:id="rId31">
+      <w:hyperlink r:id="rId33">
         <w:r>
           <w:rPr>
             <w:color w:val="315DC0"/>
@@ -673,7 +673,7 @@
                     <pic:cNvPicPr/>
                   </pic:nvPicPr>
                   <pic:blipFill>
-                    <a:blip r:embed="rId26"/>
+                    <a:blip r:embed="rId34"/>
                     <a:stretch>
                       <a:fillRect/>
                     </a:stretch>
@@ -952,7 +952,7 @@
               <w:rPr>
                 <w:sz w:val="20"/>
               </w:rPr>
-              <w:t>Locally issued certificate carrying a fresh RSA-3072 public key. The KDC matches the linked key; a trusted user-certificate CA chain is unnecessary. KDC trust is still required.</w:t>
+              <w:t>Locally issued certificate carrying a fresh RSA public key (default 3072 bits). The KDC matches the linked key; a trusted user-certificate CA chain is unnecessary. KDC trust is still required.</w:t>
             </w:r>
           </w:p>
         </w:tc>
@@ -1075,7 +1075,7 @@
       </w:r>
     </w:p>
     <w:p>
-      <w:hyperlink r:id="rId32">
+      <w:hyperlink r:id="rId35">
         <w:r>
           <w:rPr>
             <w:color w:val="315DC0"/>
@@ -1087,7 +1087,7 @@
       <w:r>
         <w:t xml:space="preserve">  |  </w:t>
       </w:r>
-      <w:hyperlink r:id="rId33">
+      <w:hyperlink r:id="rId36">
         <w:r>
           <w:rPr>
             <w:color w:val="315DC0"/>
@@ -1098,13 +1098,9 @@
       </w:hyperlink>
     </w:p>
     <w:p>
-      <w:r>
-        <w:br w:type="page"/>
-      </w:r>
-    </w:p>
-    <w:p>
       <w:pPr>
         <w:pStyle w:val="Heading1"/>
+        <w:pageBreakBefore/>
       </w:pPr>
       <w:r>
         <w:t>Ticket lifetimes and everyday use</w:t>
@@ -1194,7 +1190,7 @@
       </w:r>
     </w:p>
     <w:p>
-      <w:hyperlink r:id="rId34">
+      <w:hyperlink r:id="rId41">
         <w:r>
           <w:rPr>
             <w:color w:val="315DC0"/>
@@ -1206,13 +1202,41 @@
       <w:r>
         <w:t xml:space="preserve">  |  </w:t>
       </w:r>
-      <w:hyperlink r:id="rId35">
+      <w:hyperlink r:id="rId42">
         <w:r>
           <w:rPr>
             <w:color w:val="315DC0"/>
             <w:u w:val="single"/>
           </w:rPr>
           <w:t>Credential timing diagram</w:t>
+        </w:r>
+      </w:hyperlink>
+    </w:p>
+    <w:p>
+      <w:r>
+        <w:t>All modes require a working host logging socket at /dev/log. Administrators maintain CRLs, review authorization scope and protect persistent credentials. Setting enabled=no stops fresh acquisition; stop active maintainers separately to end renewal. Issued tickets and service sessions remain subject to domain policy.</w:t>
+      </w:r>
+    </w:p>
+    <w:p>
+      <w:hyperlink r:id="rId43">
+        <w:r>
+          <w:rPr>
+            <w:color w:val="315DC0"/>
+            <w:u w:val="single"/>
+          </w:rPr>
+          <w:t>Audit and troubleshooting</w:t>
+        </w:r>
+      </w:hyperlink>
+      <w:r>
+        <w:t xml:space="preserve">  |  </w:t>
+      </w:r>
+      <w:hyperlink r:id="rId44">
+        <w:r>
+          <w:rPr>
+            <w:color w:val="315DC0"/>
+            <w:u w:val="single"/>
+          </w:rPr>
+          <w:t>Operational disable</w:t>
         </w:r>
       </w:hyperlink>
     </w:p>
@@ -1225,31 +1249,31 @@
       </w:r>
     </w:p>
     <w:p>
-      <w:hyperlink r:id="rId36">
+      <w:hyperlink r:id="rId45">
         <w:r>
           <w:rPr>
             <w:color w:val="315DC0"/>
             <w:u w:val="single"/>
           </w:rPr>
-          <w:t>Source and setup</w:t>
+          <w:t>Install and configure</w:t>
         </w:r>
       </w:hyperlink>
       <w:r>
         <w:t xml:space="preserve">  |  </w:t>
       </w:r>
-      <w:hyperlink r:id="rId41">
+      <w:hyperlink r:id="rId46">
         <w:r>
           <w:rPr>
             <w:color w:val="315DC0"/>
             <w:u w:val="single"/>
           </w:rPr>
-          <w:t>Security review</w:t>
+          <w:t>Security and operations</w:t>
         </w:r>
       </w:hyperlink>
       <w:r>
         <w:t xml:space="preserve">  |  </w:t>
       </w:r>
-      <w:hyperlink r:id="rId42">
+      <w:hyperlink r:id="rId47">
         <w:r>
           <w:rPr>
             <w:color w:val="315DC0"/>
@@ -1260,7 +1284,7 @@
       </w:hyperlink>
     </w:p>
     <w:p>
-      <w:hyperlink r:id="rId43">
+      <w:hyperlink r:id="rId48">
         <w:r>
           <w:rPr>
             <w:color w:val="315DC0"/>
@@ -1272,7 +1296,7 @@
       <w:r>
         <w:t xml:space="preserve">  |  </w:t>
       </w:r>
-      <w:hyperlink r:id="rId44">
+      <w:hyperlink r:id="rId49">
         <w:r>
           <w:rPr>
             <w:color w:val="315DC0"/>
@@ -1289,7 +1313,7 @@
       <w:r>
         <w:t xml:space="preserve">Source code, scripts, configuration examples and documentation are licensed under GNU GPL version 3 only (GPL-3.0-only). See </w:t>
       </w:r>
-      <w:hyperlink r:id="rId45">
+      <w:hyperlink r:id="rId50">
         <w:r>
           <w:rPr>
             <w:color w:val="315DC0"/>
@@ -1432,6 +1456,28 @@
 </w:ftr>
 </file>
 
+<file path=word/footer8.xml><?xml version="1.0" encoding="utf-8"?>
+<w:ftr xmlns:m="http://schemas.openxmlformats.org/officeDocument/2006/math" xmlns:mc="http://schemas.openxmlformats.org/markup-compatibility/2006" xmlns:mo="http://schemas.microsoft.com/office/mac/office/2008/main" xmlns:mv="urn:schemas-microsoft-com:mac:vml" xmlns:o="urn:schemas-microsoft-com:office:office" xmlns:r="http://schemas.openxmlformats.org/officeDocument/2006/relationships" xmlns:v="urn:schemas-microsoft-com:vml" xmlns:w10="urn:schemas-microsoft-com:office:word" xmlns:w14="http://schemas.microsoft.com/office/word/2010/wordml" xmlns:w="http://schemas.openxmlformats.org/wordprocessingml/2006/main" xmlns:wne="http://schemas.microsoft.com/office/word/2006/wordml" xmlns:wp14="http://schemas.microsoft.com/office/word/2010/wordprocessingDrawing" xmlns:wp="http://schemas.openxmlformats.org/drawingml/2006/wordprocessingDrawing" xmlns:wpc="http://schemas.microsoft.com/office/word/2010/wordprocessingCanvas" xmlns:wpg="http://schemas.microsoft.com/office/word/2010/wordprocessingGroup" xmlns:wpi="http://schemas.microsoft.com/office/word/2010/wordprocessingInk" xmlns:wps="http://schemas.microsoft.com/office/word/2010/wordprocessingShape" mc:Ignorable="w14 wp14">
+  <w:p>
+    <w:pPr>
+      <w:jc w:val="right"/>
+    </w:pPr>
+    <w:fldSimple w:instr="PAGE"/>
+  </w:p>
+</w:ftr>
+</file>
+
+<file path=word/footer9.xml><?xml version="1.0" encoding="utf-8"?>
+<w:ftr xmlns:m="http://schemas.openxmlformats.org/officeDocument/2006/math" xmlns:mc="http://schemas.openxmlformats.org/markup-compatibility/2006" xmlns:mo="http://schemas.microsoft.com/office/mac/office/2008/main" xmlns:mv="urn:schemas-microsoft-com:mac:vml" xmlns:o="urn:schemas-microsoft-com:office:office" xmlns:r="http://schemas.openxmlformats.org/officeDocument/2006/relationships" xmlns:v="urn:schemas-microsoft-com:vml" xmlns:w10="urn:schemas-microsoft-com:office:word" xmlns:w14="http://schemas.microsoft.com/office/word/2010/wordml" xmlns:w="http://schemas.openxmlformats.org/wordprocessingml/2006/main" xmlns:wne="http://schemas.microsoft.com/office/word/2006/wordml" xmlns:wp14="http://schemas.microsoft.com/office/word/2010/wordprocessingDrawing" xmlns:wp="http://schemas.openxmlformats.org/drawingml/2006/wordprocessingDrawing" xmlns:wpc="http://schemas.microsoft.com/office/word/2010/wordprocessingCanvas" xmlns:wpg="http://schemas.microsoft.com/office/word/2010/wordprocessingGroup" xmlns:wpi="http://schemas.microsoft.com/office/word/2010/wordprocessingInk" xmlns:wps="http://schemas.microsoft.com/office/word/2010/wordprocessingShape" mc:Ignorable="w14 wp14">
+  <w:p>
+    <w:pPr>
+      <w:jc w:val="right"/>
+    </w:pPr>
+    <w:fldSimple w:instr="PAGE"/>
+  </w:p>
+</w:ftr>
+</file>
+
 <file path=word/footnotes.xml><?xml version="1.0" encoding="utf-8"?>
 <w:footnotes xmlns:wpc="http://schemas.microsoft.com/office/word/2010/wordprocessingCanvas" xmlns:cx="http://schemas.microsoft.com/office/drawing/2014/chartex" xmlns:cx1="http://schemas.microsoft.com/office/drawing/2015/9/8/chartex" xmlns:cx2="http://schemas.microsoft.com/office/drawing/2015/10/21/chartex" xmlns:cx3="http://schemas.microsoft.com/office/drawing/2016/5/9/chartex" xmlns:cx4="http://schemas.microsoft.com/office/drawing/2016/5/10/chartex" xmlns:cx5="http://schemas.microsoft.com/office/drawing/2016/5/11/chartex" xmlns:cx6="http://schemas.microsoft.com/office/drawing/2016/5/12/chartex" xmlns:cx7="http://schemas.microsoft.com/office/drawing/2016/5/13/chartex" xmlns:cx8="http://schemas.microsoft.com/office/drawing/2016/5/14/chartex" xmlns:mc="http://schemas.openxmlformats.org/markup-compatibility/2006" xmlns:aink="http://schemas.microsoft.com/office/drawing/2016/ink" xmlns:am3d="http://schemas.microsoft.com/office/drawing/2017/model3d" xmlns:o="urn:schemas-microsoft-com:office:office" xmlns:oel="http://schemas.microsoft.com/office/2019/extlst" xmlns:r="http://schemas.openxmlformats.org/officeDocument/2006/relationships" xmlns:m="http://schemas.openxmlformats.org/officeDocument/2006/math" xmlns:v="urn:schemas-microsoft-com:vml" xmlns:wp14="http://schemas.microsoft.com/office/word/2010/wordprocessingDrawing" xmlns:wp="http://schemas.openxmlformats.org/drawingml/2006/wordprocessingDrawing" xmlns:w10="urn:schemas-microsoft-com:office:word" xmlns:w="http://schemas.openxmlformats.org/wordprocessingml/2006/main" xmlns:w14="http://schemas.microsoft.com/office/word/2010/wordml" xmlns:w15="http://schemas.microsoft.com/office/word/2012/wordml" xmlns:w16cex="http://schemas.microsoft.com/office/word/2018/wordml/cex" xmlns:w16cid="http://schemas.microsoft.com/office/word/2016/wordml/cid" xmlns:w16="http://schemas.microsoft.com/office/word/2018/wordml" xmlns:w16du="http://schemas.microsoft.com/office/word/2023/wordml/word16du" xmlns:w16sdtdh="http://schemas.microsoft.com/office/word/2020/wordml/sdtdatahash" xmlns:w16sdtfl="http://schemas.microsoft.com/office/word/2024/wordml/sdtformatlock" xmlns:w16se="http://schemas.microsoft.com/office/word/2015/wordml/symex" xmlns:wpg="http://schemas.microsoft.com/office/word/2010/wordprocessingGroup" xmlns:wpi="http://schemas.microsoft.com/office/word/2010/wordprocessingInk" xmlns:wne="http://schemas.microsoft.com/office/word/2006/wordml" xmlns:wps="http://schemas.microsoft.com/office/word/2010/wordprocessingShape" mc:Ignorable="w14 w15 w16se w16cid w16 w16cex w16sdtdh w16sdtfl w16du wp14">
   <w:footnote w:type="separator" w:id="-1">
@@ -1559,6 +1605,40 @@
 </file>
 
 <file path=word/header7.xml><?xml version="1.0" encoding="utf-8"?>
+<w:hdr xmlns:m="http://schemas.openxmlformats.org/officeDocument/2006/math" xmlns:mc="http://schemas.openxmlformats.org/markup-compatibility/2006" xmlns:mo="http://schemas.microsoft.com/office/mac/office/2008/main" xmlns:mv="urn:schemas-microsoft-com:mac:vml" xmlns:o="urn:schemas-microsoft-com:office:office" xmlns:r="http://schemas.openxmlformats.org/officeDocument/2006/relationships" xmlns:v="urn:schemas-microsoft-com:vml" xmlns:w10="urn:schemas-microsoft-com:office:word" xmlns:w14="http://schemas.microsoft.com/office/word/2010/wordml" xmlns:w="http://schemas.openxmlformats.org/wordprocessingml/2006/main" xmlns:wne="http://schemas.microsoft.com/office/word/2006/wordml" xmlns:wp14="http://schemas.microsoft.com/office/word/2010/wordprocessingDrawing" xmlns:wp="http://schemas.openxmlformats.org/drawingml/2006/wordprocessingDrawing" xmlns:wpc="http://schemas.microsoft.com/office/word/2010/wordprocessingCanvas" xmlns:wpg="http://schemas.microsoft.com/office/word/2010/wordprocessingGroup" xmlns:wpi="http://schemas.microsoft.com/office/word/2010/wordprocessingInk" xmlns:wps="http://schemas.microsoft.com/office/word/2010/wordprocessingShape" mc:Ignorable="w14 wp14">
+  <w:p>
+    <w:pPr>
+      <w:pStyle w:val="SmallNote"/>
+    </w:pPr>
+    <w:r>
+      <w:rPr>
+        <w:color w:val="000000"/>
+        <w:sz w:val="18"/>
+      </w:rPr>
+      <w:t>CRAFT | CRAFT Linux Operating Modes and Tickets</w:t>
+    </w:r>
+  </w:p>
+</w:hdr>
+</file>
+
+<file path=word/header8.xml><?xml version="1.0" encoding="utf-8"?>
+<w:hdr xmlns:m="http://schemas.openxmlformats.org/officeDocument/2006/math" xmlns:mc="http://schemas.openxmlformats.org/markup-compatibility/2006" xmlns:mo="http://schemas.microsoft.com/office/mac/office/2008/main" xmlns:mv="urn:schemas-microsoft-com:mac:vml" xmlns:o="urn:schemas-microsoft-com:office:office" xmlns:r="http://schemas.openxmlformats.org/officeDocument/2006/relationships" xmlns:v="urn:schemas-microsoft-com:vml" xmlns:w10="urn:schemas-microsoft-com:office:word" xmlns:w14="http://schemas.microsoft.com/office/word/2010/wordml" xmlns:w="http://schemas.openxmlformats.org/wordprocessingml/2006/main" xmlns:wne="http://schemas.microsoft.com/office/word/2006/wordml" xmlns:wp14="http://schemas.microsoft.com/office/word/2010/wordprocessingDrawing" xmlns:wp="http://schemas.openxmlformats.org/drawingml/2006/wordprocessingDrawing" xmlns:wpc="http://schemas.microsoft.com/office/word/2010/wordprocessingCanvas" xmlns:wpg="http://schemas.microsoft.com/office/word/2010/wordprocessingGroup" xmlns:wpi="http://schemas.microsoft.com/office/word/2010/wordprocessingInk" xmlns:wps="http://schemas.microsoft.com/office/word/2010/wordprocessingShape" mc:Ignorable="w14 wp14">
+  <w:p>
+    <w:pPr>
+      <w:pStyle w:val="SmallNote"/>
+    </w:pPr>
+    <w:r>
+      <w:rPr>
+        <w:color w:val="000000"/>
+        <w:sz w:val="18"/>
+      </w:rPr>
+      <w:t>CRAFT | CRAFT Linux Operating Modes and Tickets</w:t>
+    </w:r>
+  </w:p>
+</w:hdr>
+</file>
+
+<file path=word/header9.xml><?xml version="1.0" encoding="utf-8"?>
 <w:hdr xmlns:m="http://schemas.openxmlformats.org/officeDocument/2006/math" xmlns:mc="http://schemas.openxmlformats.org/markup-compatibility/2006" xmlns:mo="http://schemas.microsoft.com/office/mac/office/2008/main" xmlns:mv="urn:schemas-microsoft-com:mac:vml" xmlns:o="urn:schemas-microsoft-com:office:office" xmlns:r="http://schemas.openxmlformats.org/officeDocument/2006/relationships" xmlns:v="urn:schemas-microsoft-com:vml" xmlns:w10="urn:schemas-microsoft-com:office:word" xmlns:w14="http://schemas.microsoft.com/office/word/2010/wordml" xmlns:w="http://schemas.openxmlformats.org/wordprocessingml/2006/main" xmlns:wne="http://schemas.microsoft.com/office/word/2006/wordml" xmlns:wp14="http://schemas.microsoft.com/office/word/2010/wordprocessingDrawing" xmlns:wp="http://schemas.openxmlformats.org/drawingml/2006/wordprocessingDrawing" xmlns:wpc="http://schemas.microsoft.com/office/word/2010/wordprocessingCanvas" xmlns:wpg="http://schemas.microsoft.com/office/word/2010/wordprocessingGroup" xmlns:wpi="http://schemas.microsoft.com/office/word/2010/wordprocessingInk" xmlns:wps="http://schemas.microsoft.com/office/word/2010/wordprocessingShape" mc:Ignorable="w14 wp14">
   <w:p>
     <w:pPr>

</xml_diff>

<commit_message>
Add constrained delegation service-ticket mode
Introduces mode 4 using broker-account S4U2Self/S4U2Proxy to issue approved service tickets without exporting TGTs. Adds configuration, cache validation, maintenance refresh, security and deployment documentation, diagrams, and delegated-ticket tests.
</commit_message>
<xml_diff>
--- a/docs/01-CRAFT-Process-Overview.docx
+++ b/docs/01-CRAFT-Process-Overview.docx
@@ -20,7 +20,7 @@
     </w:p>
     <w:p>
       <w:r>
-        <w:t>CRAFT obtains a user's Kerberos ticket-granting ticket (TGT) through PKINIT from Linux, including hosts that are not domain-joined. It supports privileged enrollment through AD CS, privileged Key Trust credential linking, and unprivileged authentication with a supplied certificate exported from Windows. All three publish the user's cache for unattended applications without storing the user's AD password.</w:t>
+        <w:t>CRAFT obtains Kerberos credentials from Linux without storing the user's AD password. Modes 1-3 obtain a user TGT through PKINIT. Mode 4 uses broker constrained delegation to obtain only approved service tickets. Domain membership is not required.</w:t>
       </w:r>
     </w:p>
     <w:p>
@@ -202,7 +202,7 @@
             <w:pPr>
               <w:spacing w:after="40" w:before="40" w:line="252" w:lineRule="auto"/>
             </w:pPr>
-            <w:hyperlink r:id="rId24">
+            <w:hyperlink r:id="rId30">
               <w:r>
                 <w:rPr>
                   <w:color w:val="315DC0"/>
@@ -282,7 +282,7 @@
             <w:pPr>
               <w:spacing w:after="40" w:before="40" w:line="252" w:lineRule="auto"/>
             </w:pPr>
-            <w:hyperlink r:id="rId25">
+            <w:hyperlink r:id="rId31">
               <w:r>
                 <w:rPr>
                   <w:color w:val="315DC0"/>
@@ -362,13 +362,93 @@
             <w:pPr>
               <w:spacing w:after="40" w:before="40" w:line="252" w:lineRule="auto"/>
             </w:pPr>
-            <w:hyperlink r:id="rId26">
+            <w:hyperlink r:id="rId32">
               <w:r>
                 <w:rPr>
                   <w:color w:val="315DC0"/>
                   <w:u w:val="single"/>
                 </w:rPr>
                 <w:t>Mode 3 setup</w:t>
+              </w:r>
+            </w:hyperlink>
+          </w:p>
+        </w:tc>
+      </w:tr>
+      <w:tr>
+        <w:trPr>
+          <w:cantSplit/>
+        </w:trPr>
+        <w:tc>
+          <w:tcPr>
+            <w:tcW w:type="dxa" w:w="2376"/>
+            <w:vAlign w:val="center"/>
+            <w:tcMar>
+              <w:top w:w="100" w:type="dxa"/>
+              <w:left w:w="100" w:type="dxa"/>
+              <w:bottom w:w="100" w:type="dxa"/>
+              <w:right w:w="100" w:type="dxa"/>
+            </w:tcMar>
+            <w:shd w:fill="FFFFFF"/>
+          </w:tcPr>
+          <w:p>
+            <w:pPr>
+              <w:spacing w:after="40" w:before="40" w:line="252" w:lineRule="auto"/>
+            </w:pPr>
+            <w:r>
+              <w:rPr>
+                <w:sz w:val="20"/>
+              </w:rPr>
+              <w:t>4  Service tickets only</w:t>
+            </w:r>
+          </w:p>
+        </w:tc>
+        <w:tc>
+          <w:tcPr>
+            <w:tcW w:type="dxa" w:w="5976"/>
+            <w:vAlign w:val="center"/>
+            <w:tcMar>
+              <w:top w:w="100" w:type="dxa"/>
+              <w:left w:w="100" w:type="dxa"/>
+              <w:bottom w:w="100" w:type="dxa"/>
+              <w:right w:w="100" w:type="dxa"/>
+            </w:tcMar>
+            <w:shd w:fill="FFFFFF"/>
+          </w:tcPr>
+          <w:p>
+            <w:pPr>
+              <w:spacing w:after="40" w:before="40" w:line="252" w:lineRule="auto"/>
+            </w:pPr>
+            <w:r>
+              <w:rPr>
+                <w:sz w:val="20"/>
+              </w:rPr>
+              <w:t>A dedicated broker uses S4U2Self and S4U2Proxy. AD restricts the target services; the user receives no TGT or broker credentials.</w:t>
+            </w:r>
+          </w:p>
+        </w:tc>
+        <w:tc>
+          <w:tcPr>
+            <w:tcW w:type="dxa" w:w="1930"/>
+            <w:vAlign w:val="center"/>
+            <w:tcMar>
+              <w:top w:w="100" w:type="dxa"/>
+              <w:left w:w="100" w:type="dxa"/>
+              <w:bottom w:w="100" w:type="dxa"/>
+              <w:right w:w="100" w:type="dxa"/>
+            </w:tcMar>
+            <w:shd w:fill="FFFFFF"/>
+          </w:tcPr>
+          <w:p>
+            <w:pPr>
+              <w:spacing w:after="40" w:before="40" w:line="252" w:lineRule="auto"/>
+            </w:pPr>
+            <w:hyperlink r:id="rId33">
+              <w:r>
+                <w:rPr>
+                  <w:color w:val="315DC0"/>
+                  <w:u w:val="single"/>
+                </w:rPr>
+                <w:t>Mode 4 setup</w:t>
               </w:r>
             </w:hyperlink>
           </w:p>
@@ -390,28 +470,28 @@
     </w:p>
     <w:p>
       <w:r>
-        <w:t>A complete pair at the real caller's NSS-home ~/.config/craft/user.pem and user.key takes priority on every installation. Partial, unsafe, expired, revoked or invalid inputs fail and preserve the cache. Only when both files are absent does mechanism=enrollment select mode 1 or mechanism=key_trust select mode 2. A failed privileged mechanism never switches to the other one.</w:t>
+        <w:t>mechanism=constrained_delegation selects mode 4 and ignores home certificates. Otherwise a complete NSS-home ~/.config/craft/user.pem and user.key pair selects mode 3. Partial or invalid pairs fail. Only an absent pair selects enrollment or Key Trust from mechanism; failures never switch mechanisms.</w:t>
       </w:r>
     </w:p>
     <w:p>
       <w:r>
-        <w:t>Mode 3 uses ordinary executables. Modes 1 and 2 require the installed setuid launcher, dedicated craft service account, craft-users caller group and private /run/craft runtime directory. Users invoke craft directly as themselves, without sudo. Certificate and network processing run outside root, and cache publication runs as the caller.</w:t>
+        <w:t>Mode 3 uses ordinary executables. Modes 1, 2 and 4 require the setuid launcher, dedicated craft account, craft-users caller group and private /run/craft. Users run craft directly without sudo. Network work runs outside root; the caller publishes the cache. CRAFT does not perform an MFA challenge.</w:t>
       </w:r>
     </w:p>
     <w:p>
-      <w:hyperlink r:id="rId27">
+      <w:hyperlink r:id="rId34">
         <w:r>
           <w:rPr>
             <w:color w:val="315DC0"/>
             <w:u w:val="single"/>
           </w:rPr>
-          <w:t>Three-mode selection diagram</w:t>
+          <w:t>Mode selection diagram</w:t>
         </w:r>
       </w:hyperlink>
       <w:r>
         <w:t xml:space="preserve">  |  </w:t>
       </w:r>
-      <w:hyperlink r:id="rId28">
+      <w:hyperlink r:id="rId35">
         <w:r>
           <w:rPr>
             <w:color w:val="315DC0"/>
@@ -422,15 +502,10 @@
       </w:hyperlink>
     </w:p>
     <w:p>
-      <w:r>
-        <w:t>CRAFT supports automation alongside MFA-protected sign-in, but does not perform an MFA challenge or establish that one was completed. The next pages show each acquisition flow; the final pages explain identity, storage and the shared ticket lifecycle.</w:t>
-      </w:r>
-    </w:p>
-    <w:p>
       <w:pPr>
         <w:sectPr>
-          <w:headerReference w:type="default" r:id="rId22"/>
-          <w:footerReference w:type="default" r:id="rId23"/>
+          <w:headerReference w:type="default" r:id="rId28"/>
+          <w:footerReference w:type="default" r:id="rId29"/>
           <w:pgSz w:w="12240" w:h="15840"/>
           <w:pgMar w:top="893" w:right="979" w:bottom="893" w:left="979" w:header="360" w:footer="360" w:gutter="0"/>
           <w:cols w:space="720"/>
@@ -447,7 +522,7 @@
       </w:r>
     </w:p>
     <w:p>
-      <w:hyperlink r:id="rId24">
+      <w:hyperlink r:id="rId30">
         <w:r>
           <w:rPr>
             <w:color w:val="315DC0"/>
@@ -459,7 +534,7 @@
       <w:r>
         <w:t xml:space="preserve">  |  </w:t>
       </w:r>
-      <w:hyperlink r:id="rId29">
+      <w:hyperlink r:id="rId36">
         <w:r>
           <w:rPr>
             <w:color w:val="315DC0"/>
@@ -491,7 +566,7 @@
                     <pic:cNvPicPr/>
                   </pic:nvPicPr>
                   <pic:blipFill>
-                    <a:blip r:embed="rId30"/>
+                    <a:blip r:embed="rId41"/>
                     <a:stretch>
                       <a:fillRect/>
                     </a:stretch>
@@ -538,7 +613,7 @@
       </w:r>
     </w:p>
     <w:p>
-      <w:hyperlink r:id="rId25">
+      <w:hyperlink r:id="rId31">
         <w:r>
           <w:rPr>
             <w:color w:val="315DC0"/>
@@ -550,7 +625,7 @@
       <w:r>
         <w:t xml:space="preserve">  |  </w:t>
       </w:r>
-      <w:hyperlink r:id="rId31">
+      <w:hyperlink r:id="rId42">
         <w:r>
           <w:rPr>
             <w:color w:val="315DC0"/>
@@ -582,7 +657,7 @@
                     <pic:cNvPicPr/>
                   </pic:nvPicPr>
                   <pic:blipFill>
-                    <a:blip r:embed="rId32"/>
+                    <a:blip r:embed="rId43"/>
                     <a:stretch>
                       <a:fillRect/>
                     </a:stretch>
@@ -629,7 +704,7 @@
       </w:r>
     </w:p>
     <w:p>
-      <w:hyperlink r:id="rId26">
+      <w:hyperlink r:id="rId32">
         <w:r>
           <w:rPr>
             <w:color w:val="315DC0"/>
@@ -641,7 +716,7 @@
       <w:r>
         <w:t xml:space="preserve">  |  </w:t>
       </w:r>
-      <w:hyperlink r:id="rId33">
+      <w:hyperlink r:id="rId44">
         <w:r>
           <w:rPr>
             <w:color w:val="315DC0"/>
@@ -673,7 +748,7 @@
                     <pic:cNvPicPr/>
                   </pic:nvPicPr>
                   <pic:blipFill>
-                    <a:blip r:embed="rId34"/>
+                    <a:blip r:embed="rId45"/>
                     <a:stretch>
                       <a:fillRect/>
                     </a:stretch>
@@ -716,12 +791,103 @@
         <w:pStyle w:val="Heading1"/>
       </w:pPr>
       <w:r>
+        <w:t>Mode 4 service tickets through constrained delegation</w:t>
+      </w:r>
+    </w:p>
+    <w:p>
+      <w:hyperlink r:id="rId33">
+        <w:r>
+          <w:rPr>
+            <w:color w:val="315DC0"/>
+            <w:u w:val="single"/>
+          </w:rPr>
+          <w:t>Complete setup instructions</w:t>
+        </w:r>
+      </w:hyperlink>
+      <w:r>
+        <w:t xml:space="preserve">  |  </w:t>
+      </w:r>
+      <w:hyperlink r:id="rId46">
+        <w:r>
+          <w:rPr>
+            <w:color w:val="315DC0"/>
+            <w:u w:val="single"/>
+          </w:rPr>
+          <w:t>Editable flow diagram</w:t>
+        </w:r>
+      </w:hyperlink>
+    </w:p>
+    <w:p>
+      <w:pPr>
+        <w:keepNext/>
+        <w:spacing w:after="40"/>
+        <w:jc w:val="center"/>
+      </w:pPr>
+      <w:r>
+        <w:drawing>
+          <wp:inline xmlns:a="http://schemas.openxmlformats.org/drawingml/2006/main" xmlns:pic="http://schemas.openxmlformats.org/drawingml/2006/picture">
+            <wp:extent cx="8686800" cy="5429250"/>
+            <wp:docPr id="4" name="Picture 4" descr="A private broker TGT authorizes protocol transition and constrained delegation. Only validated tickets for every configured service are published. Home PEM files are ignored; there is no PKINIT or directory write."/>
+            <wp:cNvGraphicFramePr>
+              <a:graphicFrameLocks noChangeAspect="1"/>
+            </wp:cNvGraphicFramePr>
+            <a:graphic>
+              <a:graphicData uri="http://schemas.openxmlformats.org/drawingml/2006/picture">
+                <pic:pic>
+                  <pic:nvPicPr>
+                    <pic:cNvPr id="0" name="image.png"/>
+                    <pic:cNvPicPr/>
+                  </pic:nvPicPr>
+                  <pic:blipFill>
+                    <a:blip r:embed="rId47"/>
+                    <a:stretch>
+                      <a:fillRect/>
+                    </a:stretch>
+                  </pic:blipFill>
+                  <pic:spPr>
+                    <a:xfrm>
+                      <a:off x="0" y="0"/>
+                      <a:ext cx="8686800" cy="5429250"/>
+                    </a:xfrm>
+                    <a:prstGeom prst="rect"/>
+                  </pic:spPr>
+                </pic:pic>
+              </a:graphicData>
+            </a:graphic>
+          </wp:inline>
+        </w:drawing>
+      </w:r>
+    </w:p>
+    <w:p>
+      <w:pPr>
+        <w:pStyle w:val="Caption"/>
+        <w:spacing w:after="0"/>
+      </w:pPr>
+      <w:r>
+        <w:t>A private broker TGT authorizes protocol transition and constrained delegation. Only validated tickets for every configured service are published. Home PEM files are ignored; there is no PKINIT or directory write.</w:t>
+      </w:r>
+    </w:p>
+    <w:p>
+      <w:pPr>
+        <w:sectPr>
+          <w:pgSz w:w="15840" w:h="12240" w:orient="landscape"/>
+          <w:pgMar w:top="720" w:right="720" w:bottom="720" w:left="720" w:header="360" w:footer="360" w:gutter="0"/>
+          <w:cols w:space="720"/>
+          <w:docGrid w:linePitch="360"/>
+        </w:sectPr>
+      </w:pPr>
+    </w:p>
+    <w:p>
+      <w:pPr>
+        <w:pStyle w:val="Heading1"/>
+      </w:pPr>
+      <w:r>
         <w:t>Identity trust and credential storage</w:t>
       </w:r>
     </w:p>
     <w:p>
       <w:r>
-        <w:t>All modes request &lt;Linux username&gt;@&lt;configured realm&gt; and verify the returned TGT principal, flags, AES encryption and lifetimes. Linux names must match the intended AD sAMAccountName. Enrollment and credential linking resolve and check the directory UPN. The supplied-certificate path performs no LDAP lookup; the KDC must map that certificate to the fixed caller principal. The certificate CN cannot select another account.</w:t>
+        <w:t>All modes request &lt;Linux username&gt;@&lt;configured realm&gt; and verify the returned credential principals, flags, AES encryption and lifetimes. Linux names must match the intended AD sAMAccountName. Enrollment and credential linking resolve and check the directory UPN. The supplied-certificate path performs no LDAP lookup; the KDC must map that certificate to the fixed caller principal. The certificate CN cannot select another account.</w:t>
       </w:r>
     </w:p>
     <w:tbl>
@@ -1058,6 +1224,83 @@
           </w:p>
         </w:tc>
       </w:tr>
+      <w:tr>
+        <w:trPr>
+          <w:cantSplit/>
+        </w:trPr>
+        <w:tc>
+          <w:tcPr>
+            <w:tcW w:type="dxa" w:w="1584"/>
+            <w:vAlign w:val="center"/>
+            <w:tcMar>
+              <w:top w:w="100" w:type="dxa"/>
+              <w:left w:w="100" w:type="dxa"/>
+              <w:bottom w:w="100" w:type="dxa"/>
+              <w:right w:w="100" w:type="dxa"/>
+            </w:tcMar>
+            <w:shd w:fill="FFFFFF"/>
+          </w:tcPr>
+          <w:p>
+            <w:pPr>
+              <w:spacing w:after="40" w:before="40" w:line="252" w:lineRule="auto"/>
+            </w:pPr>
+            <w:r>
+              <w:rPr>
+                <w:sz w:val="20"/>
+              </w:rPr>
+              <w:t>4  Service tickets</w:t>
+            </w:r>
+          </w:p>
+        </w:tc>
+        <w:tc>
+          <w:tcPr>
+            <w:tcW w:type="dxa" w:w="4464"/>
+            <w:vAlign w:val="center"/>
+            <w:tcMar>
+              <w:top w:w="100" w:type="dxa"/>
+              <w:left w:w="100" w:type="dxa"/>
+              <w:bottom w:w="100" w:type="dxa"/>
+              <w:right w:w="100" w:type="dxa"/>
+            </w:tcMar>
+            <w:shd w:fill="FFFFFF"/>
+          </w:tcPr>
+          <w:p>
+            <w:pPr>
+              <w:spacing w:after="40" w:before="40" w:line="252" w:lineRule="auto"/>
+            </w:pPr>
+            <w:r>
+              <w:rPr>
+                <w:sz w:val="20"/>
+              </w:rPr>
+              <w:t>Broker AES keytab, protocol transition and explicit AD target SPNs. No certificate authentication or directory write.</w:t>
+            </w:r>
+          </w:p>
+        </w:tc>
+        <w:tc>
+          <w:tcPr>
+            <w:tcW w:type="dxa" w:w="4234"/>
+            <w:vAlign w:val="center"/>
+            <w:tcMar>
+              <w:top w:w="100" w:type="dxa"/>
+              <w:left w:w="100" w:type="dxa"/>
+              <w:bottom w:w="100" w:type="dxa"/>
+              <w:right w:w="100" w:type="dxa"/>
+            </w:tcMar>
+            <w:shd w:fill="FFFFFF"/>
+          </w:tcPr>
+          <w:p>
+            <w:pPr>
+              <w:spacing w:after="40" w:before="40" w:line="252" w:lineRule="auto"/>
+            </w:pPr>
+            <w:r>
+              <w:rPr>
+                <w:sz w:val="20"/>
+              </w:rPr>
+              <w:t>Broker keytab stays protected under /etc/craft. Only final user service tickets and their session keys persist in the user cache.</w:t>
+            </w:r>
+          </w:p>
+        </w:tc>
+      </w:tr>
     </w:tbl>
     <w:p>
       <w:pPr>
@@ -1066,7 +1309,7 @@
     </w:p>
     <w:p>
       <w:r>
-        <w:t>Every mode atomically publishes a caller-owned mode-0600 .krb5cc_craft in the NSS home. This persistent cache contains the TGT and session key, without the user's certificate or private key. Applications use it to request service tickets. Success replaces the cache; acquisition failure preserves it, and expiration does not delete it automatically.</w:t>
+        <w:t>Every mode atomically publishes a caller-owned mode-0600 .krb5cc_craft in the NSS home. It contains a user TGT in modes 1-3, or only selected service tickets in mode 4, with session keys but no certificate, private key or broker evidence. Modes 1-3 use it to request service tickets. Success replaces the cache; acquisition failure preserves it, and expiration does not delete it automatically.</w:t>
       </w:r>
     </w:p>
     <w:p>
@@ -1075,7 +1318,7 @@
       </w:r>
     </w:p>
     <w:p>
-      <w:hyperlink r:id="rId35">
+      <w:hyperlink r:id="rId48">
         <w:r>
           <w:rPr>
             <w:color w:val="315DC0"/>
@@ -1087,13 +1330,25 @@
       <w:r>
         <w:t xml:space="preserve">  |  </w:t>
       </w:r>
-      <w:hyperlink r:id="rId36">
+      <w:hyperlink r:id="rId49">
         <w:r>
           <w:rPr>
             <w:color w:val="315DC0"/>
             <w:u w:val="single"/>
           </w:rPr>
           <w:t>Key Trust delegation</w:t>
+        </w:r>
+      </w:hyperlink>
+      <w:r>
+        <w:t xml:space="preserve">  |  </w:t>
+      </w:r>
+      <w:hyperlink r:id="rId50">
+        <w:r>
+          <w:rPr>
+            <w:color w:val="315DC0"/>
+            <w:u w:val="single"/>
+          </w:rPr>
+          <w:t>Broker delegation</w:t>
         </w:r>
       </w:hyperlink>
     </w:p>
@@ -1108,7 +1363,7 @@
     </w:p>
     <w:p>
       <w:r>
-        <w:t>CRAFT requests a ten-hour initial TGT and a seven-day renewal window with AES256/AES128. The KDC controls the grant; certificate/key lifetime can constrain initial validity. A renewal window is the period during which an eligible TGT can be renewed. It does not make one ticket valid for seven days.</w:t>
+        <w:t>Modes 1-3 request a ten-hour initial TGT and a seven-day renewal window with AES256/AES128. The KDC controls the grant; certificate/key lifetime can constrain initial validity. A renewal window is the period during which an eligible TGT can be renewed. It does not make one ticket valid for seven days.</w:t>
       </w:r>
     </w:p>
     <w:p>
@@ -1165,12 +1420,12 @@
     </w:p>
     <w:p>
       <w:r>
-        <w:t>craft-maintain returns when credentials and detached maintenance are ready. Renewal uses the cached ticket and session key alone. Fresh authentication near the absolute renewal deadline invokes craft: reuse the supplied pair, or use the configured enrollment or credential-linking mode when both files are absent. Full ten-hour/seven-day grants normally renew near hour eight and authenticate afresh near day six; actual grants set the schedule.</w:t>
+        <w:t>craft-maintain returns when credentials and detached maintenance are ready. Modes 1-3 renew from the cached TGT and authenticate afresh near the renewal deadline. Mode 4 refreshes the complete service batch through its broker before the earliest expiry. Fresh authentication always uses the configured mode selection.</w:t>
       </w:r>
     </w:p>
     <w:p>
       <w:r>
-        <w:t>Install the maintainer without setuid/setgid on Linux with /proc and system Kerberos configuration matching the pinned realm/KDC and AES policy. Monitoring uses pidfds when available and /proc elsewhere. Home refresh works under no_new_privs; modes 1 and 2 require later setuid calls. The scheduler must retain background processes. Watch a shell or job controller that lasts for the job; optional --max-duration 21d adds a cutoff. Concurrent jobs for one UID share the cache and fresh-acquisition cooldown.</w:t>
+        <w:t>Install the maintainer without setuid/setgid. Protect system Kerberos configuration, and watch a shell or controller that lasts for the job. The scheduler must retain background processes. Modes 1, 2 and 4 need setuid access for fresh authentication; home refresh works under no_new_privs. --max-duration 21d adds a cutoff. Concurrent jobs for one UID share the cache and acquisition cooldown.</w:t>
       </w:r>
     </w:p>
     <w:p>
@@ -1190,7 +1445,7 @@
       </w:r>
     </w:p>
     <w:p>
-      <w:hyperlink r:id="rId41">
+      <w:hyperlink r:id="rId51">
         <w:r>
           <w:rPr>
             <w:color w:val="315DC0"/>
@@ -1202,7 +1457,7 @@
       <w:r>
         <w:t xml:space="preserve">  |  </w:t>
       </w:r>
-      <w:hyperlink r:id="rId42">
+      <w:hyperlink r:id="rId52">
         <w:r>
           <w:rPr>
             <w:color w:val="315DC0"/>
@@ -1213,12 +1468,36 @@
       </w:hyperlink>
     </w:p>
     <w:p>
+      <w:pPr>
+        <w:pStyle w:val="Heading1"/>
+        <w:pageBreakBefore/>
+      </w:pPr>
+      <w:r>
+        <w:t>Operation and authorization</w:t>
+      </w:r>
+    </w:p>
+    <w:p>
+      <w:r>
+        <w:t>Mode 4 uses a dedicated broker with protocol transition and account-based constrained delegation to an exact list of target SPNs. AD limits target services, not the users the broker can impersonate. Protect the keytab, restrict local craft-users membership and control Linux UID/name assignment. Exclude sensitive users through domain delegation policy and test denial against the deployed KDC.</w:t>
+      </w:r>
+    </w:p>
+    <w:p>
+      <w:r>
+        <w:t>Services sharing an AD account and key are not isolated by their SPN labels. Use separate target service identities where isolation matters. Applications must request the configured service names exactly; aliases or additional services need explicit configuration and AD authorization. A service-only cache cannot acquire arbitrary tickets.</w:t>
+      </w:r>
+    </w:p>
+    <w:p>
       <w:r>
         <w:t>All modes require a working host logging socket at /dev/log. Administrators maintain CRLs, review authorization scope and protect persistent credentials. Setting enabled=no stops fresh acquisition; stop active maintainers separately to end renewal. Issued tickets and service sessions remain subject to domain policy.</w:t>
       </w:r>
     </w:p>
     <w:p>
-      <w:hyperlink r:id="rId43">
+      <w:r>
+        <w:t>Mode 4 refreshes all service tickets through the broker before the earliest expiry. It has no cache-only renewal and needs the broker and KDC for each refresh. Status identifies ticket_kind and ticket_expires. Removing broker delegation blocks fresh acquisition but does not revoke already-issued tickets.</w:t>
+      </w:r>
+    </w:p>
+    <w:p>
+      <w:hyperlink r:id="rId53">
         <w:r>
           <w:rPr>
             <w:color w:val="315DC0"/>
@@ -1230,7 +1509,7 @@
       <w:r>
         <w:t xml:space="preserve">  |  </w:t>
       </w:r>
-      <w:hyperlink r:id="rId44">
+      <w:hyperlink r:id="rId54">
         <w:r>
           <w:rPr>
             <w:color w:val="315DC0"/>
@@ -1249,7 +1528,7 @@
       </w:r>
     </w:p>
     <w:p>
-      <w:hyperlink r:id="rId45">
+      <w:hyperlink r:id="rId55">
         <w:r>
           <w:rPr>
             <w:color w:val="315DC0"/>
@@ -1261,7 +1540,7 @@
       <w:r>
         <w:t xml:space="preserve">  |  </w:t>
       </w:r>
-      <w:hyperlink r:id="rId46">
+      <w:hyperlink r:id="rId56">
         <w:r>
           <w:rPr>
             <w:color w:val="315DC0"/>
@@ -1273,7 +1552,7 @@
       <w:r>
         <w:t xml:space="preserve">  |  </w:t>
       </w:r>
-      <w:hyperlink r:id="rId47">
+      <w:hyperlink r:id="rId57">
         <w:r>
           <w:rPr>
             <w:color w:val="315DC0"/>
@@ -1284,7 +1563,7 @@
       </w:hyperlink>
     </w:p>
     <w:p>
-      <w:hyperlink r:id="rId48">
+      <w:hyperlink r:id="rId58">
         <w:r>
           <w:rPr>
             <w:color w:val="315DC0"/>
@@ -1296,7 +1575,7 @@
       <w:r>
         <w:t xml:space="preserve">  |  </w:t>
       </w:r>
-      <w:hyperlink r:id="rId49">
+      <w:hyperlink r:id="rId59">
         <w:r>
           <w:rPr>
             <w:color w:val="315DC0"/>
@@ -1313,7 +1592,7 @@
       <w:r>
         <w:t xml:space="preserve">Source code, scripts, configuration examples and documentation are licensed under GNU GPL version 3 only (GPL-3.0-only). See </w:t>
       </w:r>
-      <w:hyperlink r:id="rId50">
+      <w:hyperlink r:id="rId60">
         <w:r>
           <w:rPr>
             <w:color w:val="315DC0"/>
@@ -1390,6 +1669,39 @@
 </w:ftr>
 </file>
 
+<file path=word/footer10.xml><?xml version="1.0" encoding="utf-8"?>
+<w:ftr xmlns:m="http://schemas.openxmlformats.org/officeDocument/2006/math" xmlns:mc="http://schemas.openxmlformats.org/markup-compatibility/2006" xmlns:mo="http://schemas.microsoft.com/office/mac/office/2008/main" xmlns:mv="urn:schemas-microsoft-com:mac:vml" xmlns:o="urn:schemas-microsoft-com:office:office" xmlns:r="http://schemas.openxmlformats.org/officeDocument/2006/relationships" xmlns:v="urn:schemas-microsoft-com:vml" xmlns:w10="urn:schemas-microsoft-com:office:word" xmlns:w14="http://schemas.microsoft.com/office/word/2010/wordml" xmlns:w="http://schemas.openxmlformats.org/wordprocessingml/2006/main" xmlns:wne="http://schemas.microsoft.com/office/word/2006/wordml" xmlns:wp14="http://schemas.microsoft.com/office/word/2010/wordprocessingDrawing" xmlns:wp="http://schemas.openxmlformats.org/drawingml/2006/wordprocessingDrawing" xmlns:wpc="http://schemas.microsoft.com/office/word/2010/wordprocessingCanvas" xmlns:wpg="http://schemas.microsoft.com/office/word/2010/wordprocessingGroup" xmlns:wpi="http://schemas.microsoft.com/office/word/2010/wordprocessingInk" xmlns:wps="http://schemas.microsoft.com/office/word/2010/wordprocessingShape" mc:Ignorable="w14 wp14">
+  <w:p>
+    <w:pPr>
+      <w:jc w:val="right"/>
+    </w:pPr>
+    <w:fldSimple w:instr="PAGE"/>
+  </w:p>
+</w:ftr>
+</file>
+
+<file path=word/footer11.xml><?xml version="1.0" encoding="utf-8"?>
+<w:ftr xmlns:m="http://schemas.openxmlformats.org/officeDocument/2006/math" xmlns:mc="http://schemas.openxmlformats.org/markup-compatibility/2006" xmlns:mo="http://schemas.microsoft.com/office/mac/office/2008/main" xmlns:mv="urn:schemas-microsoft-com:mac:vml" xmlns:o="urn:schemas-microsoft-com:office:office" xmlns:r="http://schemas.openxmlformats.org/officeDocument/2006/relationships" xmlns:v="urn:schemas-microsoft-com:vml" xmlns:w10="urn:schemas-microsoft-com:office:word" xmlns:w14="http://schemas.microsoft.com/office/word/2010/wordml" xmlns:w="http://schemas.openxmlformats.org/wordprocessingml/2006/main" xmlns:wne="http://schemas.microsoft.com/office/word/2006/wordml" xmlns:wp14="http://schemas.microsoft.com/office/word/2010/wordprocessingDrawing" xmlns:wp="http://schemas.openxmlformats.org/drawingml/2006/wordprocessingDrawing" xmlns:wpc="http://schemas.microsoft.com/office/word/2010/wordprocessingCanvas" xmlns:wpg="http://schemas.microsoft.com/office/word/2010/wordprocessingGroup" xmlns:wpi="http://schemas.microsoft.com/office/word/2010/wordprocessingInk" xmlns:wps="http://schemas.microsoft.com/office/word/2010/wordprocessingShape" mc:Ignorable="w14 wp14">
+  <w:p>
+    <w:pPr>
+      <w:jc w:val="right"/>
+    </w:pPr>
+    <w:fldSimple w:instr="PAGE"/>
+  </w:p>
+</w:ftr>
+</file>
+
+<file path=word/footer12.xml><?xml version="1.0" encoding="utf-8"?>
+<w:ftr xmlns:m="http://schemas.openxmlformats.org/officeDocument/2006/math" xmlns:mc="http://schemas.openxmlformats.org/markup-compatibility/2006" xmlns:mo="http://schemas.microsoft.com/office/mac/office/2008/main" xmlns:mv="urn:schemas-microsoft-com:mac:vml" xmlns:o="urn:schemas-microsoft-com:office:office" xmlns:r="http://schemas.openxmlformats.org/officeDocument/2006/relationships" xmlns:v="urn:schemas-microsoft-com:vml" xmlns:w10="urn:schemas-microsoft-com:office:word" xmlns:w14="http://schemas.microsoft.com/office/word/2010/wordml" xmlns:w="http://schemas.openxmlformats.org/wordprocessingml/2006/main" xmlns:wne="http://schemas.microsoft.com/office/word/2006/wordml" xmlns:wp14="http://schemas.microsoft.com/office/word/2010/wordprocessingDrawing" xmlns:wp="http://schemas.openxmlformats.org/drawingml/2006/wordprocessingDrawing" xmlns:wpc="http://schemas.microsoft.com/office/word/2010/wordprocessingCanvas" xmlns:wpg="http://schemas.microsoft.com/office/word/2010/wordprocessingGroup" xmlns:wpi="http://schemas.microsoft.com/office/word/2010/wordprocessingInk" xmlns:wps="http://schemas.microsoft.com/office/word/2010/wordprocessingShape" mc:Ignorable="w14 wp14">
+  <w:p>
+    <w:pPr>
+      <w:jc w:val="right"/>
+    </w:pPr>
+    <w:fldSimple w:instr="PAGE"/>
+  </w:p>
+</w:ftr>
+</file>
+
 <file path=word/footer2.xml><?xml version="1.0" encoding="utf-8"?>
 <w:ftr xmlns:m="http://schemas.openxmlformats.org/officeDocument/2006/math" xmlns:mc="http://schemas.openxmlformats.org/markup-compatibility/2006" xmlns:mo="http://schemas.microsoft.com/office/mac/office/2008/main" xmlns:mv="urn:schemas-microsoft-com:mac:vml" xmlns:o="urn:schemas-microsoft-com:office:office" xmlns:r="http://schemas.openxmlformats.org/officeDocument/2006/relationships" xmlns:v="urn:schemas-microsoft-com:vml" xmlns:w10="urn:schemas-microsoft-com:office:word" xmlns:w14="http://schemas.microsoft.com/office/word/2010/wordml" xmlns:w="http://schemas.openxmlformats.org/wordprocessingml/2006/main" xmlns:wne="http://schemas.microsoft.com/office/word/2006/wordml" xmlns:wp14="http://schemas.microsoft.com/office/word/2010/wordprocessingDrawing" xmlns:wp="http://schemas.openxmlformats.org/drawingml/2006/wordprocessingDrawing" xmlns:wpc="http://schemas.microsoft.com/office/word/2010/wordprocessingCanvas" xmlns:wpg="http://schemas.microsoft.com/office/word/2010/wordprocessingGroup" xmlns:wpi="http://schemas.microsoft.com/office/word/2010/wordprocessingInk" xmlns:wps="http://schemas.microsoft.com/office/word/2010/wordprocessingShape" mc:Ignorable="w14 wp14">
   <w:p>
@@ -1514,6 +1826,57 @@
         <w:color w:val="5B6770"/>
       </w:rPr>
       <w:t>CRAFT     •     01  /  Process Overview</w:t>
+    </w:r>
+  </w:p>
+</w:hdr>
+</file>
+
+<file path=word/header10.xml><?xml version="1.0" encoding="utf-8"?>
+<w:hdr xmlns:m="http://schemas.openxmlformats.org/officeDocument/2006/math" xmlns:mc="http://schemas.openxmlformats.org/markup-compatibility/2006" xmlns:mo="http://schemas.microsoft.com/office/mac/office/2008/main" xmlns:mv="urn:schemas-microsoft-com:mac:vml" xmlns:o="urn:schemas-microsoft-com:office:office" xmlns:r="http://schemas.openxmlformats.org/officeDocument/2006/relationships" xmlns:v="urn:schemas-microsoft-com:vml" xmlns:w10="urn:schemas-microsoft-com:office:word" xmlns:w14="http://schemas.microsoft.com/office/word/2010/wordml" xmlns:w="http://schemas.openxmlformats.org/wordprocessingml/2006/main" xmlns:wne="http://schemas.microsoft.com/office/word/2006/wordml" xmlns:wp14="http://schemas.microsoft.com/office/word/2010/wordprocessingDrawing" xmlns:wp="http://schemas.openxmlformats.org/drawingml/2006/wordprocessingDrawing" xmlns:wpc="http://schemas.microsoft.com/office/word/2010/wordprocessingCanvas" xmlns:wpg="http://schemas.microsoft.com/office/word/2010/wordprocessingGroup" xmlns:wpi="http://schemas.microsoft.com/office/word/2010/wordprocessingInk" xmlns:wps="http://schemas.microsoft.com/office/word/2010/wordprocessingShape" mc:Ignorable="w14 wp14">
+  <w:p>
+    <w:pPr>
+      <w:pStyle w:val="SmallNote"/>
+    </w:pPr>
+    <w:r>
+      <w:rPr>
+        <w:color w:val="000000"/>
+        <w:sz w:val="18"/>
+      </w:rPr>
+      <w:t>CRAFT | CRAFT Linux Operating Modes and Tickets</w:t>
+    </w:r>
+  </w:p>
+</w:hdr>
+</file>
+
+<file path=word/header11.xml><?xml version="1.0" encoding="utf-8"?>
+<w:hdr xmlns:m="http://schemas.openxmlformats.org/officeDocument/2006/math" xmlns:mc="http://schemas.openxmlformats.org/markup-compatibility/2006" xmlns:mo="http://schemas.microsoft.com/office/mac/office/2008/main" xmlns:mv="urn:schemas-microsoft-com:mac:vml" xmlns:o="urn:schemas-microsoft-com:office:office" xmlns:r="http://schemas.openxmlformats.org/officeDocument/2006/relationships" xmlns:v="urn:schemas-microsoft-com:vml" xmlns:w10="urn:schemas-microsoft-com:office:word" xmlns:w14="http://schemas.microsoft.com/office/word/2010/wordml" xmlns:w="http://schemas.openxmlformats.org/wordprocessingml/2006/main" xmlns:wne="http://schemas.microsoft.com/office/word/2006/wordml" xmlns:wp14="http://schemas.microsoft.com/office/word/2010/wordprocessingDrawing" xmlns:wp="http://schemas.openxmlformats.org/drawingml/2006/wordprocessingDrawing" xmlns:wpc="http://schemas.microsoft.com/office/word/2010/wordprocessingCanvas" xmlns:wpg="http://schemas.microsoft.com/office/word/2010/wordprocessingGroup" xmlns:wpi="http://schemas.microsoft.com/office/word/2010/wordprocessingInk" xmlns:wps="http://schemas.microsoft.com/office/word/2010/wordprocessingShape" mc:Ignorable="w14 wp14">
+  <w:p>
+    <w:pPr>
+      <w:pStyle w:val="SmallNote"/>
+    </w:pPr>
+    <w:r>
+      <w:rPr>
+        <w:color w:val="000000"/>
+        <w:sz w:val="18"/>
+      </w:rPr>
+      <w:t>CRAFT | CRAFT Linux Operating Modes and Tickets</w:t>
+    </w:r>
+  </w:p>
+</w:hdr>
+</file>
+
+<file path=word/header12.xml><?xml version="1.0" encoding="utf-8"?>
+<w:hdr xmlns:m="http://schemas.openxmlformats.org/officeDocument/2006/math" xmlns:mc="http://schemas.openxmlformats.org/markup-compatibility/2006" xmlns:mo="http://schemas.microsoft.com/office/mac/office/2008/main" xmlns:mv="urn:schemas-microsoft-com:mac:vml" xmlns:o="urn:schemas-microsoft-com:office:office" xmlns:r="http://schemas.openxmlformats.org/officeDocument/2006/relationships" xmlns:v="urn:schemas-microsoft-com:vml" xmlns:w10="urn:schemas-microsoft-com:office:word" xmlns:w14="http://schemas.microsoft.com/office/word/2010/wordml" xmlns:w="http://schemas.openxmlformats.org/wordprocessingml/2006/main" xmlns:wne="http://schemas.microsoft.com/office/word/2006/wordml" xmlns:wp14="http://schemas.microsoft.com/office/word/2010/wordprocessingDrawing" xmlns:wp="http://schemas.openxmlformats.org/drawingml/2006/wordprocessingDrawing" xmlns:wpc="http://schemas.microsoft.com/office/word/2010/wordprocessingCanvas" xmlns:wpg="http://schemas.microsoft.com/office/word/2010/wordprocessingGroup" xmlns:wpi="http://schemas.microsoft.com/office/word/2010/wordprocessingInk" xmlns:wps="http://schemas.microsoft.com/office/word/2010/wordprocessingShape" mc:Ignorable="w14 wp14">
+  <w:p>
+    <w:pPr>
+      <w:pStyle w:val="SmallNote"/>
+    </w:pPr>
+    <w:r>
+      <w:rPr>
+        <w:color w:val="000000"/>
+        <w:sz w:val="18"/>
+      </w:rPr>
+      <w:t>CRAFT | CRAFT Linux Operating Modes and Tickets</w:t>
     </w:r>
   </w:p>
 </w:hdr>

</xml_diff>

<commit_message>
Update four-mode deployment guidance and Hyper-V validation
</commit_message>
<xml_diff>
--- a/docs/01-CRAFT-Process-Overview.docx
+++ b/docs/01-CRAFT-Process-Overview.docx
@@ -202,7 +202,7 @@
             <w:pPr>
               <w:spacing w:after="40" w:before="40" w:line="252" w:lineRule="auto"/>
             </w:pPr>
-            <w:hyperlink r:id="rId30">
+            <w:hyperlink r:id="rId32">
               <w:r>
                 <w:rPr>
                   <w:color w:val="315DC0"/>
@@ -282,7 +282,7 @@
             <w:pPr>
               <w:spacing w:after="40" w:before="40" w:line="252" w:lineRule="auto"/>
             </w:pPr>
-            <w:hyperlink r:id="rId31">
+            <w:hyperlink r:id="rId33">
               <w:r>
                 <w:rPr>
                   <w:color w:val="315DC0"/>
@@ -362,7 +362,7 @@
             <w:pPr>
               <w:spacing w:after="40" w:before="40" w:line="252" w:lineRule="auto"/>
             </w:pPr>
-            <w:hyperlink r:id="rId32">
+            <w:hyperlink r:id="rId34">
               <w:r>
                 <w:rPr>
                   <w:color w:val="315DC0"/>
@@ -442,7 +442,7 @@
             <w:pPr>
               <w:spacing w:after="40" w:before="40" w:line="252" w:lineRule="auto"/>
             </w:pPr>
-            <w:hyperlink r:id="rId33">
+            <w:hyperlink r:id="rId35">
               <w:r>
                 <w:rPr>
                   <w:color w:val="315DC0"/>
@@ -479,7 +479,7 @@
       </w:r>
     </w:p>
     <w:p>
-      <w:hyperlink r:id="rId34">
+      <w:hyperlink r:id="rId36">
         <w:r>
           <w:rPr>
             <w:color w:val="315DC0"/>
@@ -491,7 +491,7 @@
       <w:r>
         <w:t xml:space="preserve">  |  </w:t>
       </w:r>
-      <w:hyperlink r:id="rId35">
+      <w:hyperlink r:id="rId41">
         <w:r>
           <w:rPr>
             <w:color w:val="315DC0"/>
@@ -504,8 +504,8 @@
     <w:p>
       <w:pPr>
         <w:sectPr>
-          <w:headerReference w:type="default" r:id="rId28"/>
-          <w:footerReference w:type="default" r:id="rId29"/>
+          <w:headerReference w:type="default" r:id="rId30"/>
+          <w:footerReference w:type="default" r:id="rId31"/>
           <w:pgSz w:w="12240" w:h="15840"/>
           <w:pgMar w:top="893" w:right="979" w:bottom="893" w:left="979" w:header="360" w:footer="360" w:gutter="0"/>
           <w:cols w:space="720"/>
@@ -522,7 +522,7 @@
       </w:r>
     </w:p>
     <w:p>
-      <w:hyperlink r:id="rId30">
+      <w:hyperlink r:id="rId32">
         <w:r>
           <w:rPr>
             <w:color w:val="315DC0"/>
@@ -534,7 +534,7 @@
       <w:r>
         <w:t xml:space="preserve">  |  </w:t>
       </w:r>
-      <w:hyperlink r:id="rId36">
+      <w:hyperlink r:id="rId42">
         <w:r>
           <w:rPr>
             <w:color w:val="315DC0"/>
@@ -566,7 +566,7 @@
                     <pic:cNvPicPr/>
                   </pic:nvPicPr>
                   <pic:blipFill>
-                    <a:blip r:embed="rId41"/>
+                    <a:blip r:embed="rId43"/>
                     <a:stretch>
                       <a:fillRect/>
                     </a:stretch>
@@ -613,7 +613,7 @@
       </w:r>
     </w:p>
     <w:p>
-      <w:hyperlink r:id="rId31">
+      <w:hyperlink r:id="rId33">
         <w:r>
           <w:rPr>
             <w:color w:val="315DC0"/>
@@ -625,7 +625,7 @@
       <w:r>
         <w:t xml:space="preserve">  |  </w:t>
       </w:r>
-      <w:hyperlink r:id="rId42">
+      <w:hyperlink r:id="rId44">
         <w:r>
           <w:rPr>
             <w:color w:val="315DC0"/>
@@ -657,7 +657,7 @@
                     <pic:cNvPicPr/>
                   </pic:nvPicPr>
                   <pic:blipFill>
-                    <a:blip r:embed="rId43"/>
+                    <a:blip r:embed="rId45"/>
                     <a:stretch>
                       <a:fillRect/>
                     </a:stretch>
@@ -704,7 +704,7 @@
       </w:r>
     </w:p>
     <w:p>
-      <w:hyperlink r:id="rId32">
+      <w:hyperlink r:id="rId34">
         <w:r>
           <w:rPr>
             <w:color w:val="315DC0"/>
@@ -716,7 +716,7 @@
       <w:r>
         <w:t xml:space="preserve">  |  </w:t>
       </w:r>
-      <w:hyperlink r:id="rId44">
+      <w:hyperlink r:id="rId46">
         <w:r>
           <w:rPr>
             <w:color w:val="315DC0"/>
@@ -748,7 +748,7 @@
                     <pic:cNvPicPr/>
                   </pic:nvPicPr>
                   <pic:blipFill>
-                    <a:blip r:embed="rId45"/>
+                    <a:blip r:embed="rId47"/>
                     <a:stretch>
                       <a:fillRect/>
                     </a:stretch>
@@ -795,7 +795,7 @@
       </w:r>
     </w:p>
     <w:p>
-      <w:hyperlink r:id="rId33">
+      <w:hyperlink r:id="rId35">
         <w:r>
           <w:rPr>
             <w:color w:val="315DC0"/>
@@ -807,7 +807,7 @@
       <w:r>
         <w:t xml:space="preserve">  |  </w:t>
       </w:r>
-      <w:hyperlink r:id="rId46">
+      <w:hyperlink r:id="rId48">
         <w:r>
           <w:rPr>
             <w:color w:val="315DC0"/>
@@ -839,7 +839,7 @@
                     <pic:cNvPicPr/>
                   </pic:nvPicPr>
                   <pic:blipFill>
-                    <a:blip r:embed="rId47"/>
+                    <a:blip r:embed="rId49"/>
                     <a:stretch>
                       <a:fillRect/>
                     </a:stretch>
@@ -1318,7 +1318,7 @@
       </w:r>
     </w:p>
     <w:p>
-      <w:hyperlink r:id="rId48">
+      <w:hyperlink r:id="rId50">
         <w:r>
           <w:rPr>
             <w:color w:val="315DC0"/>
@@ -1330,7 +1330,7 @@
       <w:r>
         <w:t xml:space="preserve">  |  </w:t>
       </w:r>
-      <w:hyperlink r:id="rId49">
+      <w:hyperlink r:id="rId51">
         <w:r>
           <w:rPr>
             <w:color w:val="315DC0"/>
@@ -1342,7 +1342,7 @@
       <w:r>
         <w:t xml:space="preserve">  |  </w:t>
       </w:r>
-      <w:hyperlink r:id="rId50">
+      <w:hyperlink r:id="rId52">
         <w:r>
           <w:rPr>
             <w:color w:val="315DC0"/>
@@ -1445,7 +1445,7 @@
       </w:r>
     </w:p>
     <w:p>
-      <w:hyperlink r:id="rId51">
+      <w:hyperlink r:id="rId53">
         <w:r>
           <w:rPr>
             <w:color w:val="315DC0"/>
@@ -1457,7 +1457,7 @@
       <w:r>
         <w:t xml:space="preserve">  |  </w:t>
       </w:r>
-      <w:hyperlink r:id="rId52">
+      <w:hyperlink r:id="rId54">
         <w:r>
           <w:rPr>
             <w:color w:val="315DC0"/>
@@ -1483,7 +1483,7 @@
     </w:p>
     <w:p>
       <w:r>
-        <w:t>Services sharing an AD account and key are not isolated by their SPN labels. Use separate target service identities where isolation matters. Applications must request the configured service names exactly; aliases or additional services need explicit configuration and AD authorization. A service-only cache cannot acquire arbitrary tickets.</w:t>
+        <w:t>Services sharing an AD account and key are not isolated by their SPN labels. Use separate target service identities where isolation matters. Applications must request the configured service names exactly, including case; aliases or additional services need explicit configuration and AD authorization. A service-only cache cannot acquire arbitrary tickets.</w:t>
       </w:r>
     </w:p>
     <w:p>
@@ -1497,7 +1497,7 @@
       </w:r>
     </w:p>
     <w:p>
-      <w:hyperlink r:id="rId53">
+      <w:hyperlink r:id="rId55">
         <w:r>
           <w:rPr>
             <w:color w:val="315DC0"/>
@@ -1509,7 +1509,7 @@
       <w:r>
         <w:t xml:space="preserve">  |  </w:t>
       </w:r>
-      <w:hyperlink r:id="rId54">
+      <w:hyperlink r:id="rId56">
         <w:r>
           <w:rPr>
             <w:color w:val="315DC0"/>
@@ -1528,7 +1528,7 @@
       </w:r>
     </w:p>
     <w:p>
-      <w:hyperlink r:id="rId55">
+      <w:hyperlink r:id="rId57">
         <w:r>
           <w:rPr>
             <w:color w:val="315DC0"/>
@@ -1540,7 +1540,7 @@
       <w:r>
         <w:t xml:space="preserve">  |  </w:t>
       </w:r>
-      <w:hyperlink r:id="rId56">
+      <w:hyperlink r:id="rId58">
         <w:r>
           <w:rPr>
             <w:color w:val="315DC0"/>
@@ -1552,7 +1552,7 @@
       <w:r>
         <w:t xml:space="preserve">  |  </w:t>
       </w:r>
-      <w:hyperlink r:id="rId57">
+      <w:hyperlink r:id="rId59">
         <w:r>
           <w:rPr>
             <w:color w:val="315DC0"/>
@@ -1563,7 +1563,7 @@
       </w:hyperlink>
     </w:p>
     <w:p>
-      <w:hyperlink r:id="rId58">
+      <w:hyperlink r:id="rId60">
         <w:r>
           <w:rPr>
             <w:color w:val="315DC0"/>
@@ -1575,7 +1575,7 @@
       <w:r>
         <w:t xml:space="preserve">  |  </w:t>
       </w:r>
-      <w:hyperlink r:id="rId59">
+      <w:hyperlink r:id="rId61">
         <w:r>
           <w:rPr>
             <w:color w:val="315DC0"/>
@@ -1592,7 +1592,7 @@
       <w:r>
         <w:t xml:space="preserve">Source code, scripts, configuration examples and documentation are licensed under GNU GPL version 3 only (GPL-3.0-only). See </w:t>
       </w:r>
-      <w:hyperlink r:id="rId60">
+      <w:hyperlink r:id="rId62">
         <w:r>
           <w:rPr>
             <w:color w:val="315DC0"/>
@@ -1702,6 +1702,17 @@
 </w:ftr>
 </file>
 
+<file path=word/footer13.xml><?xml version="1.0" encoding="utf-8"?>
+<w:ftr xmlns:m="http://schemas.openxmlformats.org/officeDocument/2006/math" xmlns:mc="http://schemas.openxmlformats.org/markup-compatibility/2006" xmlns:mo="http://schemas.microsoft.com/office/mac/office/2008/main" xmlns:mv="urn:schemas-microsoft-com:mac:vml" xmlns:o="urn:schemas-microsoft-com:office:office" xmlns:r="http://schemas.openxmlformats.org/officeDocument/2006/relationships" xmlns:v="urn:schemas-microsoft-com:vml" xmlns:w10="urn:schemas-microsoft-com:office:word" xmlns:w14="http://schemas.microsoft.com/office/word/2010/wordml" xmlns:w="http://schemas.openxmlformats.org/wordprocessingml/2006/main" xmlns:wne="http://schemas.microsoft.com/office/word/2006/wordml" xmlns:wp14="http://schemas.microsoft.com/office/word/2010/wordprocessingDrawing" xmlns:wp="http://schemas.openxmlformats.org/drawingml/2006/wordprocessingDrawing" xmlns:wpc="http://schemas.microsoft.com/office/word/2010/wordprocessingCanvas" xmlns:wpg="http://schemas.microsoft.com/office/word/2010/wordprocessingGroup" xmlns:wpi="http://schemas.microsoft.com/office/word/2010/wordprocessingInk" xmlns:wps="http://schemas.microsoft.com/office/word/2010/wordprocessingShape" mc:Ignorable="w14 wp14">
+  <w:p>
+    <w:pPr>
+      <w:jc w:val="right"/>
+    </w:pPr>
+    <w:fldSimple w:instr="PAGE"/>
+  </w:p>
+</w:ftr>
+</file>
+
 <file path=word/footer2.xml><?xml version="1.0" encoding="utf-8"?>
 <w:ftr xmlns:m="http://schemas.openxmlformats.org/officeDocument/2006/math" xmlns:mc="http://schemas.openxmlformats.org/markup-compatibility/2006" xmlns:mo="http://schemas.microsoft.com/office/mac/office/2008/main" xmlns:mv="urn:schemas-microsoft-com:mac:vml" xmlns:o="urn:schemas-microsoft-com:office:office" xmlns:r="http://schemas.openxmlformats.org/officeDocument/2006/relationships" xmlns:v="urn:schemas-microsoft-com:vml" xmlns:w10="urn:schemas-microsoft-com:office:word" xmlns:w14="http://schemas.microsoft.com/office/word/2010/wordml" xmlns:w="http://schemas.openxmlformats.org/wordprocessingml/2006/main" xmlns:wne="http://schemas.microsoft.com/office/word/2006/wordml" xmlns:wp14="http://schemas.microsoft.com/office/word/2010/wordprocessingDrawing" xmlns:wp="http://schemas.openxmlformats.org/drawingml/2006/wordprocessingDrawing" xmlns:wpc="http://schemas.microsoft.com/office/word/2010/wordprocessingCanvas" xmlns:wpg="http://schemas.microsoft.com/office/word/2010/wordprocessingGroup" xmlns:wpi="http://schemas.microsoft.com/office/word/2010/wordprocessingInk" xmlns:wps="http://schemas.microsoft.com/office/word/2010/wordprocessingShape" mc:Ignorable="w14 wp14">
   <w:p>
@@ -1866,6 +1877,23 @@
 </file>
 
 <file path=word/header12.xml><?xml version="1.0" encoding="utf-8"?>
+<w:hdr xmlns:m="http://schemas.openxmlformats.org/officeDocument/2006/math" xmlns:mc="http://schemas.openxmlformats.org/markup-compatibility/2006" xmlns:mo="http://schemas.microsoft.com/office/mac/office/2008/main" xmlns:mv="urn:schemas-microsoft-com:mac:vml" xmlns:o="urn:schemas-microsoft-com:office:office" xmlns:r="http://schemas.openxmlformats.org/officeDocument/2006/relationships" xmlns:v="urn:schemas-microsoft-com:vml" xmlns:w10="urn:schemas-microsoft-com:office:word" xmlns:w14="http://schemas.microsoft.com/office/word/2010/wordml" xmlns:w="http://schemas.openxmlformats.org/wordprocessingml/2006/main" xmlns:wne="http://schemas.microsoft.com/office/word/2006/wordml" xmlns:wp14="http://schemas.microsoft.com/office/word/2010/wordprocessingDrawing" xmlns:wp="http://schemas.openxmlformats.org/drawingml/2006/wordprocessingDrawing" xmlns:wpc="http://schemas.microsoft.com/office/word/2010/wordprocessingCanvas" xmlns:wpg="http://schemas.microsoft.com/office/word/2010/wordprocessingGroup" xmlns:wpi="http://schemas.microsoft.com/office/word/2010/wordprocessingInk" xmlns:wps="http://schemas.microsoft.com/office/word/2010/wordprocessingShape" mc:Ignorable="w14 wp14">
+  <w:p>
+    <w:pPr>
+      <w:pStyle w:val="SmallNote"/>
+    </w:pPr>
+    <w:r>
+      <w:rPr>
+        <w:color w:val="000000"/>
+        <w:sz w:val="18"/>
+      </w:rPr>
+      <w:t>CRAFT | CRAFT Linux Operating Modes and Tickets</w:t>
+    </w:r>
+  </w:p>
+</w:hdr>
+</file>
+
+<file path=word/header13.xml><?xml version="1.0" encoding="utf-8"?>
 <w:hdr xmlns:m="http://schemas.openxmlformats.org/officeDocument/2006/math" xmlns:mc="http://schemas.openxmlformats.org/markup-compatibility/2006" xmlns:mo="http://schemas.microsoft.com/office/mac/office/2008/main" xmlns:mv="urn:schemas-microsoft-com:mac:vml" xmlns:o="urn:schemas-microsoft-com:office:office" xmlns:r="http://schemas.openxmlformats.org/officeDocument/2006/relationships" xmlns:v="urn:schemas-microsoft-com:vml" xmlns:w10="urn:schemas-microsoft-com:office:word" xmlns:w14="http://schemas.microsoft.com/office/word/2010/wordml" xmlns:w="http://schemas.openxmlformats.org/wordprocessingml/2006/main" xmlns:wne="http://schemas.microsoft.com/office/word/2006/wordml" xmlns:wp14="http://schemas.microsoft.com/office/word/2010/wordprocessingDrawing" xmlns:wp="http://schemas.openxmlformats.org/drawingml/2006/wordprocessingDrawing" xmlns:wpc="http://schemas.microsoft.com/office/word/2010/wordprocessingCanvas" xmlns:wpg="http://schemas.microsoft.com/office/word/2010/wordprocessingGroup" xmlns:wpi="http://schemas.microsoft.com/office/word/2010/wordprocessingInk" xmlns:wps="http://schemas.microsoft.com/office/word/2010/wordprocessingShape" mc:Ignorable="w14 wp14">
   <w:p>
     <w:pPr>

</xml_diff>

<commit_message>
Configure ordered acquisition modes with validated fallback
</commit_message>
<xml_diff>
--- a/docs/01-CRAFT-Process-Overview.docx
+++ b/docs/01-CRAFT-Process-Overview.docx
@@ -20,7 +20,7 @@
     </w:p>
     <w:p>
       <w:r>
-        <w:t>CRAFT obtains Kerberos credentials from Linux without storing the user's AD password. Modes 1-3 obtain a user TGT through PKINIT. Mode 4 uses broker constrained delegation to obtain only approved service tickets. Domain membership is not required.</w:t>
+        <w:t>Administrators select and order CRAFT modes to fit their environment's capabilities and needs. CRAFT obtains Kerberos credentials from Linux without storing the user's AD password. Modes 1-3 obtain a user TGT through PKINIT. Mode 4 uses broker constrained delegation to obtain only approved service tickets. Domain membership is not required.</w:t>
       </w:r>
     </w:p>
     <w:p>
@@ -28,7 +28,7 @@
         <w:pStyle w:val="Heading1"/>
       </w:pPr>
       <w:r>
-        <w:t>Choose an operating mode</w:t>
+        <w:t>Choose operating modes</w:t>
       </w:r>
     </w:p>
     <w:tbl>
@@ -202,7 +202,7 @@
             <w:pPr>
               <w:spacing w:after="40" w:before="40" w:line="252" w:lineRule="auto"/>
             </w:pPr>
-            <w:hyperlink r:id="rId32">
+            <w:hyperlink r:id="rId34">
               <w:r>
                 <w:rPr>
                   <w:color w:val="315DC0"/>
@@ -282,7 +282,7 @@
             <w:pPr>
               <w:spacing w:after="40" w:before="40" w:line="252" w:lineRule="auto"/>
             </w:pPr>
-            <w:hyperlink r:id="rId33">
+            <w:hyperlink r:id="rId35">
               <w:r>
                 <w:rPr>
                   <w:color w:val="315DC0"/>
@@ -362,7 +362,7 @@
             <w:pPr>
               <w:spacing w:after="40" w:before="40" w:line="252" w:lineRule="auto"/>
             </w:pPr>
-            <w:hyperlink r:id="rId34">
+            <w:hyperlink r:id="rId36">
               <w:r>
                 <w:rPr>
                   <w:color w:val="315DC0"/>
@@ -442,7 +442,7 @@
             <w:pPr>
               <w:spacing w:after="40" w:before="40" w:line="252" w:lineRule="auto"/>
             </w:pPr>
-            <w:hyperlink r:id="rId35">
+            <w:hyperlink r:id="rId41">
               <w:r>
                 <w:rPr>
                   <w:color w:val="315DC0"/>
@@ -470,7 +470,7 @@
     </w:p>
     <w:p>
       <w:r>
-        <w:t>mechanism=constrained_delegation selects mode 4 and ignores home certificates. Otherwise a complete NSS-home ~/.config/craft/user.pem and user.key pair selects mode 3. Partial or invalid pairs fail. Only an absent pair selects enrollment or Key Trust from mechanism; failures never switch mechanisms.</w:t>
+        <w:t>The ordered modes list enables one or more workflows. For example, modes=home enrollment tries the caller PEM pair, then enrollment after acquisition failure. The first success supplies the cache. Invalid policy, worker interruption, failed key cleanup and publication errors stop the request. Use modes=constrained_delegation alone to require service tickets without a TGT.</w:t>
       </w:r>
     </w:p>
     <w:p>
@@ -479,7 +479,7 @@
       </w:r>
     </w:p>
     <w:p>
-      <w:hyperlink r:id="rId36">
+      <w:hyperlink r:id="rId42">
         <w:r>
           <w:rPr>
             <w:color w:val="315DC0"/>
@@ -491,7 +491,7 @@
       <w:r>
         <w:t xml:space="preserve">  |  </w:t>
       </w:r>
-      <w:hyperlink r:id="rId41">
+      <w:hyperlink r:id="rId43">
         <w:r>
           <w:rPr>
             <w:color w:val="315DC0"/>
@@ -504,8 +504,8 @@
     <w:p>
       <w:pPr>
         <w:sectPr>
-          <w:headerReference w:type="default" r:id="rId30"/>
-          <w:footerReference w:type="default" r:id="rId31"/>
+          <w:headerReference w:type="default" r:id="rId32"/>
+          <w:footerReference w:type="default" r:id="rId33"/>
           <w:pgSz w:w="12240" w:h="15840"/>
           <w:pgMar w:top="893" w:right="979" w:bottom="893" w:left="979" w:header="360" w:footer="360" w:gutter="0"/>
           <w:cols w:space="720"/>
@@ -522,7 +522,7 @@
       </w:r>
     </w:p>
     <w:p>
-      <w:hyperlink r:id="rId32">
+      <w:hyperlink r:id="rId34">
         <w:r>
           <w:rPr>
             <w:color w:val="315DC0"/>
@@ -534,7 +534,7 @@
       <w:r>
         <w:t xml:space="preserve">  |  </w:t>
       </w:r>
-      <w:hyperlink r:id="rId42">
+      <w:hyperlink r:id="rId44">
         <w:r>
           <w:rPr>
             <w:color w:val="315DC0"/>
@@ -566,7 +566,7 @@
                     <pic:cNvPicPr/>
                   </pic:nvPicPr>
                   <pic:blipFill>
-                    <a:blip r:embed="rId43"/>
+                    <a:blip r:embed="rId45"/>
                     <a:stretch>
                       <a:fillRect/>
                     </a:stretch>
@@ -613,7 +613,7 @@
       </w:r>
     </w:p>
     <w:p>
-      <w:hyperlink r:id="rId33">
+      <w:hyperlink r:id="rId35">
         <w:r>
           <w:rPr>
             <w:color w:val="315DC0"/>
@@ -625,7 +625,7 @@
       <w:r>
         <w:t xml:space="preserve">  |  </w:t>
       </w:r>
-      <w:hyperlink r:id="rId44">
+      <w:hyperlink r:id="rId46">
         <w:r>
           <w:rPr>
             <w:color w:val="315DC0"/>
@@ -657,7 +657,7 @@
                     <pic:cNvPicPr/>
                   </pic:nvPicPr>
                   <pic:blipFill>
-                    <a:blip r:embed="rId45"/>
+                    <a:blip r:embed="rId47"/>
                     <a:stretch>
                       <a:fillRect/>
                     </a:stretch>
@@ -704,7 +704,7 @@
       </w:r>
     </w:p>
     <w:p>
-      <w:hyperlink r:id="rId34">
+      <w:hyperlink r:id="rId36">
         <w:r>
           <w:rPr>
             <w:color w:val="315DC0"/>
@@ -716,7 +716,7 @@
       <w:r>
         <w:t xml:space="preserve">  |  </w:t>
       </w:r>
-      <w:hyperlink r:id="rId46">
+      <w:hyperlink r:id="rId48">
         <w:r>
           <w:rPr>
             <w:color w:val="315DC0"/>
@@ -748,7 +748,7 @@
                     <pic:cNvPicPr/>
                   </pic:nvPicPr>
                   <pic:blipFill>
-                    <a:blip r:embed="rId47"/>
+                    <a:blip r:embed="rId49"/>
                     <a:stretch>
                       <a:fillRect/>
                     </a:stretch>
@@ -795,7 +795,7 @@
       </w:r>
     </w:p>
     <w:p>
-      <w:hyperlink r:id="rId35">
+      <w:hyperlink r:id="rId41">
         <w:r>
           <w:rPr>
             <w:color w:val="315DC0"/>
@@ -807,7 +807,7 @@
       <w:r>
         <w:t xml:space="preserve">  |  </w:t>
       </w:r>
-      <w:hyperlink r:id="rId48">
+      <w:hyperlink r:id="rId50">
         <w:r>
           <w:rPr>
             <w:color w:val="315DC0"/>
@@ -839,7 +839,7 @@
                     <pic:cNvPicPr/>
                   </pic:nvPicPr>
                   <pic:blipFill>
-                    <a:blip r:embed="rId49"/>
+                    <a:blip r:embed="rId51"/>
                     <a:stretch>
                       <a:fillRect/>
                     </a:stretch>
@@ -1318,7 +1318,7 @@
       </w:r>
     </w:p>
     <w:p>
-      <w:hyperlink r:id="rId50">
+      <w:hyperlink r:id="rId52">
         <w:r>
           <w:rPr>
             <w:color w:val="315DC0"/>
@@ -1330,7 +1330,7 @@
       <w:r>
         <w:t xml:space="preserve">  |  </w:t>
       </w:r>
-      <w:hyperlink r:id="rId51">
+      <w:hyperlink r:id="rId53">
         <w:r>
           <w:rPr>
             <w:color w:val="315DC0"/>
@@ -1342,7 +1342,7 @@
       <w:r>
         <w:t xml:space="preserve">  |  </w:t>
       </w:r>
-      <w:hyperlink r:id="rId52">
+      <w:hyperlink r:id="rId54">
         <w:r>
           <w:rPr>
             <w:color w:val="315DC0"/>
@@ -1445,7 +1445,7 @@
       </w:r>
     </w:p>
     <w:p>
-      <w:hyperlink r:id="rId53">
+      <w:hyperlink r:id="rId55">
         <w:r>
           <w:rPr>
             <w:color w:val="315DC0"/>
@@ -1457,7 +1457,7 @@
       <w:r>
         <w:t xml:space="preserve">  |  </w:t>
       </w:r>
-      <w:hyperlink r:id="rId54">
+      <w:hyperlink r:id="rId56">
         <w:r>
           <w:rPr>
             <w:color w:val="315DC0"/>
@@ -1497,7 +1497,7 @@
       </w:r>
     </w:p>
     <w:p>
-      <w:hyperlink r:id="rId55">
+      <w:hyperlink r:id="rId57">
         <w:r>
           <w:rPr>
             <w:color w:val="315DC0"/>
@@ -1509,7 +1509,7 @@
       <w:r>
         <w:t xml:space="preserve">  |  </w:t>
       </w:r>
-      <w:hyperlink r:id="rId56">
+      <w:hyperlink r:id="rId58">
         <w:r>
           <w:rPr>
             <w:color w:val="315DC0"/>
@@ -1528,7 +1528,7 @@
       </w:r>
     </w:p>
     <w:p>
-      <w:hyperlink r:id="rId57">
+      <w:hyperlink r:id="rId59">
         <w:r>
           <w:rPr>
             <w:color w:val="315DC0"/>
@@ -1540,7 +1540,7 @@
       <w:r>
         <w:t xml:space="preserve">  |  </w:t>
       </w:r>
-      <w:hyperlink r:id="rId58">
+      <w:hyperlink r:id="rId60">
         <w:r>
           <w:rPr>
             <w:color w:val="315DC0"/>
@@ -1552,7 +1552,7 @@
       <w:r>
         <w:t xml:space="preserve">  |  </w:t>
       </w:r>
-      <w:hyperlink r:id="rId59">
+      <w:hyperlink r:id="rId61">
         <w:r>
           <w:rPr>
             <w:color w:val="315DC0"/>
@@ -1563,7 +1563,7 @@
       </w:hyperlink>
     </w:p>
     <w:p>
-      <w:hyperlink r:id="rId60">
+      <w:hyperlink r:id="rId62">
         <w:r>
           <w:rPr>
             <w:color w:val="315DC0"/>
@@ -1575,7 +1575,7 @@
       <w:r>
         <w:t xml:space="preserve">  |  </w:t>
       </w:r>
-      <w:hyperlink r:id="rId61">
+      <w:hyperlink r:id="rId63">
         <w:r>
           <w:rPr>
             <w:color w:val="315DC0"/>
@@ -1592,7 +1592,7 @@
       <w:r>
         <w:t xml:space="preserve">Source code, scripts, configuration examples and documentation are licensed under GNU GPL version 3 only (GPL-3.0-only). See </w:t>
       </w:r>
-      <w:hyperlink r:id="rId62">
+      <w:hyperlink r:id="rId64">
         <w:r>
           <w:rPr>
             <w:color w:val="315DC0"/>
@@ -1713,6 +1713,17 @@
 </w:ftr>
 </file>
 
+<file path=word/footer14.xml><?xml version="1.0" encoding="utf-8"?>
+<w:ftr xmlns:m="http://schemas.openxmlformats.org/officeDocument/2006/math" xmlns:mc="http://schemas.openxmlformats.org/markup-compatibility/2006" xmlns:mo="http://schemas.microsoft.com/office/mac/office/2008/main" xmlns:mv="urn:schemas-microsoft-com:mac:vml" xmlns:o="urn:schemas-microsoft-com:office:office" xmlns:r="http://schemas.openxmlformats.org/officeDocument/2006/relationships" xmlns:v="urn:schemas-microsoft-com:vml" xmlns:w10="urn:schemas-microsoft-com:office:word" xmlns:w14="http://schemas.microsoft.com/office/word/2010/wordml" xmlns:w="http://schemas.openxmlformats.org/wordprocessingml/2006/main" xmlns:wne="http://schemas.microsoft.com/office/word/2006/wordml" xmlns:wp14="http://schemas.microsoft.com/office/word/2010/wordprocessingDrawing" xmlns:wp="http://schemas.openxmlformats.org/drawingml/2006/wordprocessingDrawing" xmlns:wpc="http://schemas.microsoft.com/office/word/2010/wordprocessingCanvas" xmlns:wpg="http://schemas.microsoft.com/office/word/2010/wordprocessingGroup" xmlns:wpi="http://schemas.microsoft.com/office/word/2010/wordprocessingInk" xmlns:wps="http://schemas.microsoft.com/office/word/2010/wordprocessingShape" mc:Ignorable="w14 wp14">
+  <w:p>
+    <w:pPr>
+      <w:jc w:val="right"/>
+    </w:pPr>
+    <w:fldSimple w:instr="PAGE"/>
+  </w:p>
+</w:ftr>
+</file>
+
 <file path=word/footer2.xml><?xml version="1.0" encoding="utf-8"?>
 <w:ftr xmlns:m="http://schemas.openxmlformats.org/officeDocument/2006/math" xmlns:mc="http://schemas.openxmlformats.org/markup-compatibility/2006" xmlns:mo="http://schemas.microsoft.com/office/mac/office/2008/main" xmlns:mv="urn:schemas-microsoft-com:mac:vml" xmlns:o="urn:schemas-microsoft-com:office:office" xmlns:r="http://schemas.openxmlformats.org/officeDocument/2006/relationships" xmlns:v="urn:schemas-microsoft-com:vml" xmlns:w10="urn:schemas-microsoft-com:office:word" xmlns:w14="http://schemas.microsoft.com/office/word/2010/wordml" xmlns:w="http://schemas.openxmlformats.org/wordprocessingml/2006/main" xmlns:wne="http://schemas.microsoft.com/office/word/2006/wordml" xmlns:wp14="http://schemas.microsoft.com/office/word/2010/wordprocessingDrawing" xmlns:wp="http://schemas.openxmlformats.org/drawingml/2006/wordprocessingDrawing" xmlns:wpc="http://schemas.microsoft.com/office/word/2010/wordprocessingCanvas" xmlns:wpg="http://schemas.microsoft.com/office/word/2010/wordprocessingGroup" xmlns:wpi="http://schemas.microsoft.com/office/word/2010/wordprocessingInk" xmlns:wps="http://schemas.microsoft.com/office/word/2010/wordprocessingShape" mc:Ignorable="w14 wp14">
   <w:p>
@@ -1894,6 +1905,23 @@
 </file>
 
 <file path=word/header13.xml><?xml version="1.0" encoding="utf-8"?>
+<w:hdr xmlns:m="http://schemas.openxmlformats.org/officeDocument/2006/math" xmlns:mc="http://schemas.openxmlformats.org/markup-compatibility/2006" xmlns:mo="http://schemas.microsoft.com/office/mac/office/2008/main" xmlns:mv="urn:schemas-microsoft-com:mac:vml" xmlns:o="urn:schemas-microsoft-com:office:office" xmlns:r="http://schemas.openxmlformats.org/officeDocument/2006/relationships" xmlns:v="urn:schemas-microsoft-com:vml" xmlns:w10="urn:schemas-microsoft-com:office:word" xmlns:w14="http://schemas.microsoft.com/office/word/2010/wordml" xmlns:w="http://schemas.openxmlformats.org/wordprocessingml/2006/main" xmlns:wne="http://schemas.microsoft.com/office/word/2006/wordml" xmlns:wp14="http://schemas.microsoft.com/office/word/2010/wordprocessingDrawing" xmlns:wp="http://schemas.openxmlformats.org/drawingml/2006/wordprocessingDrawing" xmlns:wpc="http://schemas.microsoft.com/office/word/2010/wordprocessingCanvas" xmlns:wpg="http://schemas.microsoft.com/office/word/2010/wordprocessingGroup" xmlns:wpi="http://schemas.microsoft.com/office/word/2010/wordprocessingInk" xmlns:wps="http://schemas.microsoft.com/office/word/2010/wordprocessingShape" mc:Ignorable="w14 wp14">
+  <w:p>
+    <w:pPr>
+      <w:pStyle w:val="SmallNote"/>
+    </w:pPr>
+    <w:r>
+      <w:rPr>
+        <w:color w:val="000000"/>
+        <w:sz w:val="18"/>
+      </w:rPr>
+      <w:t>CRAFT | CRAFT Linux Operating Modes and Tickets</w:t>
+    </w:r>
+  </w:p>
+</w:hdr>
+</file>
+
+<file path=word/header14.xml><?xml version="1.0" encoding="utf-8"?>
 <w:hdr xmlns:m="http://schemas.openxmlformats.org/officeDocument/2006/math" xmlns:mc="http://schemas.openxmlformats.org/markup-compatibility/2006" xmlns:mo="http://schemas.microsoft.com/office/mac/office/2008/main" xmlns:mv="urn:schemas-microsoft-com:mac:vml" xmlns:o="urn:schemas-microsoft-com:office:office" xmlns:r="http://schemas.openxmlformats.org/officeDocument/2006/relationships" xmlns:v="urn:schemas-microsoft-com:vml" xmlns:w10="urn:schemas-microsoft-com:office:word" xmlns:w14="http://schemas.microsoft.com/office/word/2010/wordml" xmlns:w="http://schemas.openxmlformats.org/wordprocessingml/2006/main" xmlns:wne="http://schemas.microsoft.com/office/word/2006/wordml" xmlns:wp14="http://schemas.microsoft.com/office/word/2010/wordprocessingDrawing" xmlns:wp="http://schemas.openxmlformats.org/drawingml/2006/wordprocessingDrawing" xmlns:wpc="http://schemas.microsoft.com/office/word/2010/wordprocessingCanvas" xmlns:wpg="http://schemas.microsoft.com/office/word/2010/wordprocessingGroup" xmlns:wpi="http://schemas.microsoft.com/office/word/2010/wordprocessingInk" xmlns:wps="http://schemas.microsoft.com/office/word/2010/wordprocessingShape" mc:Ignorable="w14 wp14">
   <w:p>
     <w:pPr>

</xml_diff>

<commit_message>
Add GSS-Proxy and SELinux integration
Adds optional GSS-Proxy application access with an isolated wrapper, configuration example, SELinux cache-label policy, and disposable MIT KDC integration tests. Updates build configuration, security guidance, validation procedures, and generated documentation to use named acquisition modes and document proxy deployment boundaries.
</commit_message>
<xml_diff>
--- a/docs/01-CRAFT-Process-Overview.docx
+++ b/docs/01-CRAFT-Process-Overview.docx
@@ -20,7 +20,7 @@
     </w:p>
     <w:p>
       <w:r>
-        <w:t>Administrators select and order CRAFT modes to fit their environment's capabilities and needs. CRAFT obtains Kerberos credentials from Linux without storing the user's AD password. Modes 1-3 obtain a user TGT through PKINIT. Mode 4 uses broker constrained delegation to obtain only approved service tickets. Domain membership is not required.</w:t>
+        <w:t>Administrators select and order CRAFT modes to fit their environment's capabilities and needs. CRAFT obtains Kerberos credentials from Linux without storing the user's AD password. Enrollment Agent, Key Trust and BYOC obtain a user TGT through PKINIT. Constrained Delegation uses a broker to obtain only approved service tickets. Domain membership is not required.</w:t>
       </w:r>
     </w:p>
     <w:p>
@@ -33,17 +33,17 @@
     </w:p>
     <w:tbl>
       <w:tblPr>
-        <w:tblW w:type="auto" w:w="0"/>
+        <w:tblW w:w="0" w:type="auto"/>
+        <w:tblBorders>
+          <w:top w:val="single" w:sz="4" w:space="0" w:color="D9D9D9"/>
+          <w:left w:val="single" w:sz="4" w:space="0" w:color="D9D9D9"/>
+          <w:bottom w:val="single" w:sz="4" w:space="0" w:color="D9D9D9"/>
+          <w:right w:val="single" w:sz="4" w:space="0" w:color="D9D9D9"/>
+          <w:insideH w:val="single" w:sz="4" w:space="0" w:color="D9D9D9"/>
+          <w:insideV w:val="single" w:sz="4" w:space="0" w:color="D9D9D9"/>
+        </w:tblBorders>
         <w:tblLayout w:type="fixed"/>
-        <w:tblLook w:firstColumn="1" w:firstRow="1" w:lastColumn="0" w:lastRow="0" w:noHBand="0" w:noVBand="1" w:val="04A0"/>
-        <w:tblBorders>
-          <w:top w:val="single" w:sz="4" w:color="D9D9D9"/>
-          <w:left w:val="single" w:sz="4" w:color="D9D9D9"/>
-          <w:bottom w:val="single" w:sz="4" w:color="D9D9D9"/>
-          <w:right w:val="single" w:sz="4" w:color="D9D9D9"/>
-          <w:insideH w:val="single" w:sz="4" w:color="D9D9D9"/>
-          <w:insideV w:val="single" w:sz="4" w:color="D9D9D9"/>
-        </w:tblBorders>
+        <w:tblLook w:val="04A0" w:firstRow="1" w:lastRow="0" w:firstColumn="1" w:lastColumn="0" w:noHBand="0" w:noVBand="1"/>
       </w:tblPr>
       <w:tblGrid>
         <w:gridCol w:w="2376"/>
@@ -52,24 +52,24 @@
       </w:tblGrid>
       <w:tr>
         <w:trPr>
+          <w:cantSplit/>
           <w:tblHeader/>
-          <w:cantSplit/>
         </w:trPr>
         <w:tc>
           <w:tcPr>
-            <w:tcW w:type="dxa" w:w="2376"/>
-            <w:vAlign w:val="center"/>
+            <w:tcW w:w="2376" w:type="dxa"/>
+            <w:shd w:val="clear" w:color="auto" w:fill="18334A"/>
             <w:tcMar>
               <w:top w:w="100" w:type="dxa"/>
               <w:left w:w="100" w:type="dxa"/>
               <w:bottom w:w="100" w:type="dxa"/>
               <w:right w:w="100" w:type="dxa"/>
             </w:tcMar>
-            <w:shd w:fill="18334A"/>
+            <w:vAlign w:val="center"/>
           </w:tcPr>
           <w:p>
             <w:pPr>
-              <w:spacing w:after="40" w:before="40" w:line="252" w:lineRule="auto"/>
+              <w:spacing w:before="40" w:after="40" w:line="252" w:lineRule="auto"/>
             </w:pPr>
             <w:r>
               <w:rPr>
@@ -83,19 +83,19 @@
         </w:tc>
         <w:tc>
           <w:tcPr>
-            <w:tcW w:type="dxa" w:w="5976"/>
-            <w:vAlign w:val="center"/>
+            <w:tcW w:w="5976" w:type="dxa"/>
+            <w:shd w:val="clear" w:color="auto" w:fill="18334A"/>
             <w:tcMar>
               <w:top w:w="100" w:type="dxa"/>
               <w:left w:w="100" w:type="dxa"/>
               <w:bottom w:w="100" w:type="dxa"/>
               <w:right w:w="100" w:type="dxa"/>
             </w:tcMar>
-            <w:shd w:fill="18334A"/>
+            <w:vAlign w:val="center"/>
           </w:tcPr>
           <w:p>
             <w:pPr>
-              <w:spacing w:after="40" w:before="40" w:line="252" w:lineRule="auto"/>
+              <w:spacing w:before="40" w:after="40" w:line="252" w:lineRule="auto"/>
             </w:pPr>
             <w:r>
               <w:rPr>
@@ -109,19 +109,19 @@
         </w:tc>
         <w:tc>
           <w:tcPr>
-            <w:tcW w:type="dxa" w:w="1930"/>
-            <w:vAlign w:val="center"/>
+            <w:tcW w:w="1930" w:type="dxa"/>
+            <w:shd w:val="clear" w:color="auto" w:fill="18334A"/>
             <w:tcMar>
               <w:top w:w="100" w:type="dxa"/>
               <w:left w:w="100" w:type="dxa"/>
               <w:bottom w:w="100" w:type="dxa"/>
               <w:right w:w="100" w:type="dxa"/>
             </w:tcMar>
-            <w:shd w:fill="18334A"/>
+            <w:vAlign w:val="center"/>
           </w:tcPr>
           <w:p>
             <w:pPr>
-              <w:spacing w:after="40" w:before="40" w:line="252" w:lineRule="auto"/>
+              <w:spacing w:before="40" w:after="40" w:line="252" w:lineRule="auto"/>
             </w:pPr>
             <w:r>
               <w:rPr>
@@ -140,43 +140,43 @@
         </w:trPr>
         <w:tc>
           <w:tcPr>
-            <w:tcW w:type="dxa" w:w="2376"/>
-            <w:vAlign w:val="center"/>
+            <w:tcW w:w="2376" w:type="dxa"/>
+            <w:shd w:val="clear" w:color="auto" w:fill="F3F6FA"/>
             <w:tcMar>
               <w:top w:w="100" w:type="dxa"/>
               <w:left w:w="100" w:type="dxa"/>
               <w:bottom w:w="100" w:type="dxa"/>
               <w:right w:w="100" w:type="dxa"/>
             </w:tcMar>
-            <w:shd w:fill="F3F6FA"/>
+            <w:vAlign w:val="center"/>
           </w:tcPr>
           <w:p>
             <w:pPr>
-              <w:spacing w:after="40" w:before="40" w:line="252" w:lineRule="auto"/>
+              <w:spacing w:before="40" w:after="40" w:line="252" w:lineRule="auto"/>
             </w:pPr>
             <w:r>
               <w:rPr>
                 <w:sz w:val="20"/>
               </w:rPr>
-              <w:t>1  Privileged enrollment</w:t>
+              <w:t>Enrollment Agent</w:t>
             </w:r>
           </w:p>
         </w:tc>
         <w:tc>
           <w:tcPr>
-            <w:tcW w:type="dxa" w:w="5976"/>
-            <w:vAlign w:val="center"/>
+            <w:tcW w:w="5976" w:type="dxa"/>
+            <w:shd w:val="clear" w:color="auto" w:fill="F3F6FA"/>
             <w:tcMar>
               <w:top w:w="100" w:type="dxa"/>
               <w:left w:w="100" w:type="dxa"/>
               <w:bottom w:w="100" w:type="dxa"/>
               <w:right w:w="100" w:type="dxa"/>
             </w:tcMar>
-            <w:shd w:fill="F3F6FA"/>
+            <w:vAlign w:val="center"/>
           </w:tcPr>
           <w:p>
             <w:pPr>
-              <w:spacing w:after="40" w:before="40" w:line="252" w:lineRule="auto"/>
+              <w:spacing w:before="40" w:after="40" w:line="252" w:lineRule="auto"/>
             </w:pPr>
             <w:r>
               <w:rPr>
@@ -188,27 +188,27 @@
         </w:tc>
         <w:tc>
           <w:tcPr>
-            <w:tcW w:type="dxa" w:w="1930"/>
-            <w:vAlign w:val="center"/>
+            <w:tcW w:w="1930" w:type="dxa"/>
+            <w:shd w:val="clear" w:color="auto" w:fill="F3F6FA"/>
             <w:tcMar>
               <w:top w:w="100" w:type="dxa"/>
               <w:left w:w="100" w:type="dxa"/>
               <w:bottom w:w="100" w:type="dxa"/>
               <w:right w:w="100" w:type="dxa"/>
             </w:tcMar>
-            <w:shd w:fill="F3F6FA"/>
+            <w:vAlign w:val="center"/>
           </w:tcPr>
           <w:p>
             <w:pPr>
-              <w:spacing w:after="40" w:before="40" w:line="252" w:lineRule="auto"/>
+              <w:spacing w:before="40" w:after="40" w:line="252" w:lineRule="auto"/>
             </w:pPr>
-            <w:hyperlink r:id="rId34">
+            <w:hyperlink r:id="rId8" w:anchor="enrollment-agent-setup">
               <w:r>
                 <w:rPr>
                   <w:color w:val="315DC0"/>
                   <w:u w:val="single"/>
                 </w:rPr>
-                <w:t>Mode 1 setup</w:t>
+                <w:t>Setup</w:t>
               </w:r>
             </w:hyperlink>
           </w:p>
@@ -220,43 +220,43 @@
         </w:trPr>
         <w:tc>
           <w:tcPr>
-            <w:tcW w:type="dxa" w:w="2376"/>
-            <w:vAlign w:val="center"/>
+            <w:tcW w:w="2376" w:type="dxa"/>
+            <w:shd w:val="clear" w:color="auto" w:fill="FFFFFF"/>
             <w:tcMar>
               <w:top w:w="100" w:type="dxa"/>
               <w:left w:w="100" w:type="dxa"/>
               <w:bottom w:w="100" w:type="dxa"/>
               <w:right w:w="100" w:type="dxa"/>
             </w:tcMar>
-            <w:shd w:fill="FFFFFF"/>
+            <w:vAlign w:val="center"/>
           </w:tcPr>
           <w:p>
             <w:pPr>
-              <w:spacing w:after="40" w:before="40" w:line="252" w:lineRule="auto"/>
+              <w:spacing w:before="40" w:after="40" w:line="252" w:lineRule="auto"/>
             </w:pPr>
             <w:r>
               <w:rPr>
                 <w:sz w:val="20"/>
               </w:rPr>
-              <w:t>2  Privileged credential linking</w:t>
+              <w:t>Key Trust</w:t>
             </w:r>
           </w:p>
         </w:tc>
         <w:tc>
           <w:tcPr>
-            <w:tcW w:type="dxa" w:w="5976"/>
-            <w:vAlign w:val="center"/>
+            <w:tcW w:w="5976" w:type="dxa"/>
+            <w:shd w:val="clear" w:color="auto" w:fill="FFFFFF"/>
             <w:tcMar>
               <w:top w:w="100" w:type="dxa"/>
               <w:left w:w="100" w:type="dxa"/>
               <w:bottom w:w="100" w:type="dxa"/>
               <w:right w:w="100" w:type="dxa"/>
             </w:tcMar>
-            <w:shd w:fill="FFFFFF"/>
+            <w:vAlign w:val="center"/>
           </w:tcPr>
           <w:p>
             <w:pPr>
-              <w:spacing w:after="40" w:before="40" w:line="252" w:lineRule="auto"/>
+              <w:spacing w:before="40" w:after="40" w:line="252" w:lineRule="auto"/>
             </w:pPr>
             <w:r>
               <w:rPr>
@@ -268,27 +268,27 @@
         </w:tc>
         <w:tc>
           <w:tcPr>
-            <w:tcW w:type="dxa" w:w="1930"/>
-            <w:vAlign w:val="center"/>
+            <w:tcW w:w="1930" w:type="dxa"/>
+            <w:shd w:val="clear" w:color="auto" w:fill="FFFFFF"/>
             <w:tcMar>
               <w:top w:w="100" w:type="dxa"/>
               <w:left w:w="100" w:type="dxa"/>
               <w:bottom w:w="100" w:type="dxa"/>
               <w:right w:w="100" w:type="dxa"/>
             </w:tcMar>
-            <w:shd w:fill="FFFFFF"/>
+            <w:vAlign w:val="center"/>
           </w:tcPr>
           <w:p>
             <w:pPr>
-              <w:spacing w:after="40" w:before="40" w:line="252" w:lineRule="auto"/>
+              <w:spacing w:before="40" w:after="40" w:line="252" w:lineRule="auto"/>
             </w:pPr>
-            <w:hyperlink r:id="rId35">
+            <w:hyperlink r:id="rId9" w:anchor="key-trust-setup">
               <w:r>
                 <w:rPr>
                   <w:color w:val="315DC0"/>
                   <w:u w:val="single"/>
                 </w:rPr>
-                <w:t>Mode 2 setup</w:t>
+                <w:t>Setup</w:t>
               </w:r>
             </w:hyperlink>
           </w:p>
@@ -300,75 +300,75 @@
         </w:trPr>
         <w:tc>
           <w:tcPr>
-            <w:tcW w:type="dxa" w:w="2376"/>
-            <w:vAlign w:val="center"/>
+            <w:tcW w:w="2376" w:type="dxa"/>
+            <w:shd w:val="clear" w:color="auto" w:fill="F3F6FA"/>
             <w:tcMar>
               <w:top w:w="100" w:type="dxa"/>
               <w:left w:w="100" w:type="dxa"/>
               <w:bottom w:w="100" w:type="dxa"/>
               <w:right w:w="100" w:type="dxa"/>
             </w:tcMar>
-            <w:shd w:fill="F3F6FA"/>
+            <w:vAlign w:val="center"/>
           </w:tcPr>
           <w:p>
             <w:pPr>
-              <w:spacing w:after="40" w:before="40" w:line="252" w:lineRule="auto"/>
+              <w:spacing w:before="40" w:after="40" w:line="252" w:lineRule="auto"/>
             </w:pPr>
             <w:r>
               <w:rPr>
                 <w:sz w:val="20"/>
               </w:rPr>
-              <w:t>3  Unprivileged Windows export</w:t>
+              <w:t>BYOC</w:t>
             </w:r>
           </w:p>
         </w:tc>
         <w:tc>
           <w:tcPr>
-            <w:tcW w:type="dxa" w:w="5976"/>
-            <w:vAlign w:val="center"/>
+            <w:tcW w:w="5976" w:type="dxa"/>
+            <w:shd w:val="clear" w:color="auto" w:fill="F3F6FA"/>
             <w:tcMar>
               <w:top w:w="100" w:type="dxa"/>
               <w:left w:w="100" w:type="dxa"/>
               <w:bottom w:w="100" w:type="dxa"/>
               <w:right w:w="100" w:type="dxa"/>
             </w:tcMar>
-            <w:shd w:fill="F3F6FA"/>
+            <w:vAlign w:val="center"/>
           </w:tcPr>
           <w:p>
             <w:pPr>
-              <w:spacing w:after="40" w:before="40" w:line="252" w:lineRule="auto"/>
+              <w:spacing w:before="40" w:after="40" w:line="252" w:lineRule="auto"/>
             </w:pPr>
             <w:r>
               <w:rPr>
                 <w:sz w:val="20"/>
               </w:rPr>
-              <w:t>Windows enrolls and exports a certificate and matching private key. Linux uses the securely transferred PEM pair under the caller's UID.</w:t>
+              <w:t>Bring Your Own Cert. Windows enrolls and exports a certificate and matching private key. Linux uses the securely transferred PEM pair under the caller's UID.</w:t>
             </w:r>
           </w:p>
         </w:tc>
         <w:tc>
           <w:tcPr>
-            <w:tcW w:type="dxa" w:w="1930"/>
-            <w:vAlign w:val="center"/>
+            <w:tcW w:w="1930" w:type="dxa"/>
+            <w:shd w:val="clear" w:color="auto" w:fill="F3F6FA"/>
             <w:tcMar>
               <w:top w:w="100" w:type="dxa"/>
               <w:left w:w="100" w:type="dxa"/>
               <w:bottom w:w="100" w:type="dxa"/>
               <w:right w:w="100" w:type="dxa"/>
             </w:tcMar>
-            <w:shd w:fill="F3F6FA"/>
+            <w:vAlign w:val="center"/>
           </w:tcPr>
           <w:p>
             <w:pPr>
-              <w:spacing w:after="40" w:before="40" w:line="252" w:lineRule="auto"/>
+              <w:spacing w:before="40" w:after="40" w:line="252" w:lineRule="auto"/>
             </w:pPr>
-            <w:hyperlink r:id="rId36">
+            <w:hyperlink r:id="rId10" w:anchor="byoc-setup">
               <w:r>
                 <w:rPr>
                   <w:color w:val="315DC0"/>
                   <w:u w:val="single"/>
                 </w:rPr>
-                <w:t>Mode 3 setup</w:t>
+                <w:t>Setup</w:t>
               </w:r>
             </w:hyperlink>
           </w:p>
@@ -380,43 +380,43 @@
         </w:trPr>
         <w:tc>
           <w:tcPr>
-            <w:tcW w:type="dxa" w:w="2376"/>
-            <w:vAlign w:val="center"/>
+            <w:tcW w:w="2376" w:type="dxa"/>
+            <w:shd w:val="clear" w:color="auto" w:fill="FFFFFF"/>
             <w:tcMar>
               <w:top w:w="100" w:type="dxa"/>
               <w:left w:w="100" w:type="dxa"/>
               <w:bottom w:w="100" w:type="dxa"/>
               <w:right w:w="100" w:type="dxa"/>
             </w:tcMar>
-            <w:shd w:fill="FFFFFF"/>
+            <w:vAlign w:val="center"/>
           </w:tcPr>
           <w:p>
             <w:pPr>
-              <w:spacing w:after="40" w:before="40" w:line="252" w:lineRule="auto"/>
+              <w:spacing w:before="40" w:after="40" w:line="252" w:lineRule="auto"/>
             </w:pPr>
             <w:r>
               <w:rPr>
                 <w:sz w:val="20"/>
               </w:rPr>
-              <w:t>4  Service tickets only</w:t>
+              <w:t>Constrained Delegation</w:t>
             </w:r>
           </w:p>
         </w:tc>
         <w:tc>
           <w:tcPr>
-            <w:tcW w:type="dxa" w:w="5976"/>
-            <w:vAlign w:val="center"/>
+            <w:tcW w:w="5976" w:type="dxa"/>
+            <w:shd w:val="clear" w:color="auto" w:fill="FFFFFF"/>
             <w:tcMar>
               <w:top w:w="100" w:type="dxa"/>
               <w:left w:w="100" w:type="dxa"/>
               <w:bottom w:w="100" w:type="dxa"/>
               <w:right w:w="100" w:type="dxa"/>
             </w:tcMar>
-            <w:shd w:fill="FFFFFF"/>
+            <w:vAlign w:val="center"/>
           </w:tcPr>
           <w:p>
             <w:pPr>
-              <w:spacing w:after="40" w:before="40" w:line="252" w:lineRule="auto"/>
+              <w:spacing w:before="40" w:after="40" w:line="252" w:lineRule="auto"/>
             </w:pPr>
             <w:r>
               <w:rPr>
@@ -428,27 +428,27 @@
         </w:tc>
         <w:tc>
           <w:tcPr>
-            <w:tcW w:type="dxa" w:w="1930"/>
-            <w:vAlign w:val="center"/>
+            <w:tcW w:w="1930" w:type="dxa"/>
+            <w:shd w:val="clear" w:color="auto" w:fill="FFFFFF"/>
             <w:tcMar>
               <w:top w:w="100" w:type="dxa"/>
               <w:left w:w="100" w:type="dxa"/>
               <w:bottom w:w="100" w:type="dxa"/>
               <w:right w:w="100" w:type="dxa"/>
             </w:tcMar>
-            <w:shd w:fill="FFFFFF"/>
+            <w:vAlign w:val="center"/>
           </w:tcPr>
           <w:p>
             <w:pPr>
-              <w:spacing w:after="40" w:before="40" w:line="252" w:lineRule="auto"/>
+              <w:spacing w:before="40" w:after="40" w:line="252" w:lineRule="auto"/>
             </w:pPr>
-            <w:hyperlink r:id="rId41">
+            <w:hyperlink r:id="rId11" w:anchor="constrained-delegation-setup">
               <w:r>
                 <w:rPr>
                   <w:color w:val="315DC0"/>
                   <w:u w:val="single"/>
                 </w:rPr>
-                <w:t>Mode 4 setup</w:t>
+                <w:t>Setup</w:t>
               </w:r>
             </w:hyperlink>
           </w:p>
@@ -470,16 +470,16 @@
     </w:p>
     <w:p>
       <w:r>
-        <w:t>The ordered modes list enables one or more workflows. For example, modes=home enrollment tries the caller PEM pair, then enrollment after acquisition failure. The first success supplies the cache. Invalid policy, worker interruption, failed key cleanup and publication errors stop the request. Use modes=constrained_delegation alone to require service tickets without a TGT.</w:t>
+        <w:t>Configure Enrollment Agent as enrollment, Key Trust as key_trust, BYOC as home, and Constrained Delegation as constrained_delegation. The ordered modes list enables the workflows. For example, modes=home enrollment tries the caller PEM pair, then enrollment after acquisition failure. The first success supplies the cache. Invalid policy, worker interruption, failed key cleanup and publication errors stop the request. Use modes=constrained_delegation alone to require service tickets without a TGT.</w:t>
       </w:r>
     </w:p>
     <w:p>
       <w:r>
-        <w:t>Mode 3 uses ordinary executables. Modes 1, 2 and 4 require the setuid launcher, dedicated craft account, craft-users caller group and private /run/craft. Users run craft directly without sudo. Network work runs outside root; the caller publishes the cache. CRAFT does not perform an MFA challenge.</w:t>
+        <w:t>BYOC uses ordinary executables. The other three modes use a broker and require the setuid launcher, dedicated craft account, craft-users caller group and private /run/craft. Users run craft directly without sudo. Network work runs outside root; the caller publishes the cache. CRAFT does not perform an MFA challenge.</w:t>
       </w:r>
     </w:p>
     <w:p>
-      <w:hyperlink r:id="rId42">
+      <w:hyperlink r:id="rId12">
         <w:r>
           <w:rPr>
             <w:color w:val="315DC0"/>
@@ -491,7 +491,7 @@
       <w:r>
         <w:t xml:space="preserve">  |  </w:t>
       </w:r>
-      <w:hyperlink r:id="rId43">
+      <w:hyperlink r:id="rId13" w:anchor="build">
         <w:r>
           <w:rPr>
             <w:color w:val="315DC0"/>
@@ -504,8 +504,8 @@
     <w:p>
       <w:pPr>
         <w:sectPr>
-          <w:headerReference w:type="default" r:id="rId32"/>
-          <w:footerReference w:type="default" r:id="rId33"/>
+          <w:headerReference w:type="default" r:id="rId14"/>
+          <w:footerReference w:type="default" r:id="rId15"/>
           <w:pgSz w:w="12240" w:h="15840"/>
           <w:pgMar w:top="893" w:right="979" w:bottom="893" w:left="979" w:header="360" w:footer="360" w:gutter="0"/>
           <w:cols w:space="720"/>
@@ -518,11 +518,12 @@
         <w:pStyle w:val="Heading1"/>
       </w:pPr>
       <w:r>
-        <w:t>Mode 1 privileged certificate enrollment</w:t>
+        <w:lastRenderedPageBreak/>
+        <w:t>Enrollment Agent</w:t>
       </w:r>
     </w:p>
     <w:p>
-      <w:hyperlink r:id="rId34">
+      <w:hyperlink r:id="rId16" w:anchor="enrollment-agent-setup">
         <w:r>
           <w:rPr>
             <w:color w:val="315DC0"/>
@@ -534,7 +535,7 @@
       <w:r>
         <w:t xml:space="preserve">  |  </w:t>
       </w:r>
-      <w:hyperlink r:id="rId44">
+      <w:hyperlink r:id="rId17">
         <w:r>
           <w:rPr>
             <w:color w:val="315DC0"/>
@@ -551,22 +552,26 @@
         <w:jc w:val="center"/>
       </w:pPr>
       <w:r>
+        <w:rPr>
+          <w:noProof/>
+        </w:rPr>
         <w:drawing>
-          <wp:inline xmlns:a="http://schemas.openxmlformats.org/drawingml/2006/main" xmlns:pic="http://schemas.openxmlformats.org/drawingml/2006/picture">
+          <wp:inline distT="0" distB="0" distL="0" distR="0" wp14:anchorId="0BC9E0C3" wp14:editId="5AC03F20">
             <wp:extent cx="8686800" cy="5429250"/>
+            <wp:effectExtent l="0" t="0" r="0" b="0"/>
             <wp:docPr id="1" name="Picture 1" descr="Linux resolves the user, enrolls a restricted certificate through CES and AD CS, then obtains the user's TGT through PKINIT. The generated user pair is temporary; CA records remain."/>
             <wp:cNvGraphicFramePr>
-              <a:graphicFrameLocks noChangeAspect="1"/>
+              <a:graphicFrameLocks xmlns:a="http://schemas.openxmlformats.org/drawingml/2006/main" noChangeAspect="1"/>
             </wp:cNvGraphicFramePr>
-            <a:graphic>
+            <a:graphic xmlns:a="http://schemas.openxmlformats.org/drawingml/2006/main">
               <a:graphicData uri="http://schemas.openxmlformats.org/drawingml/2006/picture">
-                <pic:pic>
+                <pic:pic xmlns:pic="http://schemas.openxmlformats.org/drawingml/2006/picture">
                   <pic:nvPicPr>
                     <pic:cNvPr id="0" name="image.png"/>
                     <pic:cNvPicPr/>
                   </pic:nvPicPr>
                   <pic:blipFill>
-                    <a:blip r:embed="rId45"/>
+                    <a:blip r:embed="rId18"/>
                     <a:stretch>
                       <a:fillRect/>
                     </a:stretch>
@@ -576,7 +581,9 @@
                       <a:off x="0" y="0"/>
                       <a:ext cx="8686800" cy="5429250"/>
                     </a:xfrm>
-                    <a:prstGeom prst="rect"/>
+                    <a:prstGeom prst="rect">
+                      <a:avLst/>
+                    </a:prstGeom>
                   </pic:spPr>
                 </pic:pic>
               </a:graphicData>
@@ -609,11 +616,12 @@
         <w:pStyle w:val="Heading1"/>
       </w:pPr>
       <w:r>
-        <w:t>Mode 2 privileged credential linking</w:t>
+        <w:lastRenderedPageBreak/>
+        <w:t>Key Trust</w:t>
       </w:r>
     </w:p>
     <w:p>
-      <w:hyperlink r:id="rId35">
+      <w:hyperlink r:id="rId19" w:anchor="key-trust-setup">
         <w:r>
           <w:rPr>
             <w:color w:val="315DC0"/>
@@ -625,7 +633,7 @@
       <w:r>
         <w:t xml:space="preserve">  |  </w:t>
       </w:r>
-      <w:hyperlink r:id="rId46">
+      <w:hyperlink r:id="rId20">
         <w:r>
           <w:rPr>
             <w:color w:val="315DC0"/>
@@ -642,22 +650,26 @@
         <w:jc w:val="center"/>
       </w:pPr>
       <w:r>
+        <w:rPr>
+          <w:noProof/>
+        </w:rPr>
         <w:drawing>
-          <wp:inline xmlns:a="http://schemas.openxmlformats.org/drawingml/2006/main" xmlns:pic="http://schemas.openxmlformats.org/drawingml/2006/picture">
+          <wp:inline distT="0" distB="0" distL="0" distR="0" wp14:anchorId="1C42A7DD" wp14:editId="442E78B7">
             <wp:extent cx="8686800" cy="5429250"/>
+            <wp:effectExtent l="0" t="0" r="0" b="0"/>
             <wp:docPr id="2" name="Picture 2" descr="Linux uses a delegated directory write and Key Trust PKINIT against the same writable DC. Cleanup must succeed before cache publication. A residual key after an outage needs administrator removal."/>
             <wp:cNvGraphicFramePr>
-              <a:graphicFrameLocks noChangeAspect="1"/>
+              <a:graphicFrameLocks xmlns:a="http://schemas.openxmlformats.org/drawingml/2006/main" noChangeAspect="1"/>
             </wp:cNvGraphicFramePr>
-            <a:graphic>
+            <a:graphic xmlns:a="http://schemas.openxmlformats.org/drawingml/2006/main">
               <a:graphicData uri="http://schemas.openxmlformats.org/drawingml/2006/picture">
-                <pic:pic>
+                <pic:pic xmlns:pic="http://schemas.openxmlformats.org/drawingml/2006/picture">
                   <pic:nvPicPr>
                     <pic:cNvPr id="0" name="image.png"/>
                     <pic:cNvPicPr/>
                   </pic:nvPicPr>
                   <pic:blipFill>
-                    <a:blip r:embed="rId47"/>
+                    <a:blip r:embed="rId21"/>
                     <a:stretch>
                       <a:fillRect/>
                     </a:stretch>
@@ -667,7 +679,9 @@
                       <a:off x="0" y="0"/>
                       <a:ext cx="8686800" cy="5429250"/>
                     </a:xfrm>
-                    <a:prstGeom prst="rect"/>
+                    <a:prstGeom prst="rect">
+                      <a:avLst/>
+                    </a:prstGeom>
                   </pic:spPr>
                 </pic:pic>
               </a:graphicData>
@@ -700,11 +714,12 @@
         <w:pStyle w:val="Heading1"/>
       </w:pPr>
       <w:r>
-        <w:t>Mode 3 unprivileged Windows exported certificate</w:t>
+        <w:lastRenderedPageBreak/>
+        <w:t>BYOC Bring Your Own Cert</w:t>
       </w:r>
     </w:p>
     <w:p>
-      <w:hyperlink r:id="rId36">
+      <w:hyperlink r:id="rId22" w:anchor="byoc-setup">
         <w:r>
           <w:rPr>
             <w:color w:val="315DC0"/>
@@ -716,7 +731,7 @@
       <w:r>
         <w:t xml:space="preserve">  |  </w:t>
       </w:r>
-      <w:hyperlink r:id="rId48">
+      <w:hyperlink r:id="rId23">
         <w:r>
           <w:rPr>
             <w:color w:val="315DC0"/>
@@ -733,22 +748,26 @@
         <w:jc w:val="center"/>
       </w:pPr>
       <w:r>
+        <w:rPr>
+          <w:noProof/>
+        </w:rPr>
         <w:drawing>
-          <wp:inline xmlns:a="http://schemas.openxmlformats.org/drawingml/2006/main" xmlns:pic="http://schemas.openxmlformats.org/drawingml/2006/picture">
+          <wp:inline distT="0" distB="0" distL="0" distR="0" wp14:anchorId="45D9DD7F" wp14:editId="521322E2">
             <wp:extent cx="8686800" cy="5429250"/>
+            <wp:effectExtent l="0" t="0" r="0" b="0"/>
             <wp:docPr id="3" name="Picture 3" descr="Windows enrollment and export precede secure PEM transfer. Linux validates the supplied pair and obtains the user's TGT as the caller. The PEM pair remains and must be replaced before expiry."/>
             <wp:cNvGraphicFramePr>
-              <a:graphicFrameLocks noChangeAspect="1"/>
+              <a:graphicFrameLocks xmlns:a="http://schemas.openxmlformats.org/drawingml/2006/main" noChangeAspect="1"/>
             </wp:cNvGraphicFramePr>
-            <a:graphic>
+            <a:graphic xmlns:a="http://schemas.openxmlformats.org/drawingml/2006/main">
               <a:graphicData uri="http://schemas.openxmlformats.org/drawingml/2006/picture">
-                <pic:pic>
+                <pic:pic xmlns:pic="http://schemas.openxmlformats.org/drawingml/2006/picture">
                   <pic:nvPicPr>
                     <pic:cNvPr id="0" name="image.png"/>
                     <pic:cNvPicPr/>
                   </pic:nvPicPr>
                   <pic:blipFill>
-                    <a:blip r:embed="rId49"/>
+                    <a:blip r:embed="rId24"/>
                     <a:stretch>
                       <a:fillRect/>
                     </a:stretch>
@@ -758,7 +777,9 @@
                       <a:off x="0" y="0"/>
                       <a:ext cx="8686800" cy="5429250"/>
                     </a:xfrm>
-                    <a:prstGeom prst="rect"/>
+                    <a:prstGeom prst="rect">
+                      <a:avLst/>
+                    </a:prstGeom>
                   </pic:spPr>
                 </pic:pic>
               </a:graphicData>
@@ -791,11 +812,12 @@
         <w:pStyle w:val="Heading1"/>
       </w:pPr>
       <w:r>
-        <w:t>Mode 4 service tickets through constrained delegation</w:t>
+        <w:lastRenderedPageBreak/>
+        <w:t>Constrained Delegation</w:t>
       </w:r>
     </w:p>
     <w:p>
-      <w:hyperlink r:id="rId41">
+      <w:hyperlink r:id="rId25" w:anchor="constrained-delegation-setup">
         <w:r>
           <w:rPr>
             <w:color w:val="315DC0"/>
@@ -807,7 +829,7 @@
       <w:r>
         <w:t xml:space="preserve">  |  </w:t>
       </w:r>
-      <w:hyperlink r:id="rId50">
+      <w:hyperlink r:id="rId26">
         <w:r>
           <w:rPr>
             <w:color w:val="315DC0"/>
@@ -824,22 +846,26 @@
         <w:jc w:val="center"/>
       </w:pPr>
       <w:r>
+        <w:rPr>
+          <w:noProof/>
+        </w:rPr>
         <w:drawing>
-          <wp:inline xmlns:a="http://schemas.openxmlformats.org/drawingml/2006/main" xmlns:pic="http://schemas.openxmlformats.org/drawingml/2006/picture">
+          <wp:inline distT="0" distB="0" distL="0" distR="0" wp14:anchorId="432E1876" wp14:editId="5A6D30F8">
             <wp:extent cx="8686800" cy="5429250"/>
+            <wp:effectExtent l="0" t="0" r="0" b="0"/>
             <wp:docPr id="4" name="Picture 4" descr="A private broker TGT authorizes protocol transition and constrained delegation. Only validated tickets for every configured service are published. Home PEM files are ignored; there is no PKINIT or directory write."/>
             <wp:cNvGraphicFramePr>
-              <a:graphicFrameLocks noChangeAspect="1"/>
+              <a:graphicFrameLocks xmlns:a="http://schemas.openxmlformats.org/drawingml/2006/main" noChangeAspect="1"/>
             </wp:cNvGraphicFramePr>
-            <a:graphic>
+            <a:graphic xmlns:a="http://schemas.openxmlformats.org/drawingml/2006/main">
               <a:graphicData uri="http://schemas.openxmlformats.org/drawingml/2006/picture">
-                <pic:pic>
+                <pic:pic xmlns:pic="http://schemas.openxmlformats.org/drawingml/2006/picture">
                   <pic:nvPicPr>
                     <pic:cNvPr id="0" name="image.png"/>
                     <pic:cNvPicPr/>
                   </pic:nvPicPr>
                   <pic:blipFill>
-                    <a:blip r:embed="rId51"/>
+                    <a:blip r:embed="rId27"/>
                     <a:stretch>
                       <a:fillRect/>
                     </a:stretch>
@@ -849,7 +875,9 @@
                       <a:off x="0" y="0"/>
                       <a:ext cx="8686800" cy="5429250"/>
                     </a:xfrm>
-                    <a:prstGeom prst="rect"/>
+                    <a:prstGeom prst="rect">
+                      <a:avLst/>
+                    </a:prstGeom>
                   </pic:spPr>
                 </pic:pic>
               </a:graphicData>
@@ -882,6 +910,7 @@
         <w:pStyle w:val="Heading1"/>
       </w:pPr>
       <w:r>
+        <w:lastRenderedPageBreak/>
         <w:t>Identity trust and credential storage</w:t>
       </w:r>
     </w:p>
@@ -892,17 +921,17 @@
     </w:p>
     <w:tbl>
       <w:tblPr>
-        <w:tblW w:type="auto" w:w="0"/>
+        <w:tblW w:w="0" w:type="auto"/>
+        <w:tblBorders>
+          <w:top w:val="single" w:sz="4" w:space="0" w:color="D9D9D9"/>
+          <w:left w:val="single" w:sz="4" w:space="0" w:color="D9D9D9"/>
+          <w:bottom w:val="single" w:sz="4" w:space="0" w:color="D9D9D9"/>
+          <w:right w:val="single" w:sz="4" w:space="0" w:color="D9D9D9"/>
+          <w:insideH w:val="single" w:sz="4" w:space="0" w:color="D9D9D9"/>
+          <w:insideV w:val="single" w:sz="4" w:space="0" w:color="D9D9D9"/>
+        </w:tblBorders>
         <w:tblLayout w:type="fixed"/>
-        <w:tblLook w:firstColumn="1" w:firstRow="1" w:lastColumn="0" w:lastRow="0" w:noHBand="0" w:noVBand="1" w:val="04A0"/>
-        <w:tblBorders>
-          <w:top w:val="single" w:sz="4" w:color="D9D9D9"/>
-          <w:left w:val="single" w:sz="4" w:color="D9D9D9"/>
-          <w:bottom w:val="single" w:sz="4" w:color="D9D9D9"/>
-          <w:right w:val="single" w:sz="4" w:color="D9D9D9"/>
-          <w:insideH w:val="single" w:sz="4" w:color="D9D9D9"/>
-          <w:insideV w:val="single" w:sz="4" w:color="D9D9D9"/>
-        </w:tblBorders>
+        <w:tblLook w:val="04A0" w:firstRow="1" w:lastRow="0" w:firstColumn="1" w:lastColumn="0" w:noHBand="0" w:noVBand="1"/>
       </w:tblPr>
       <w:tblGrid>
         <w:gridCol w:w="1584"/>
@@ -911,24 +940,24 @@
       </w:tblGrid>
       <w:tr>
         <w:trPr>
+          <w:cantSplit/>
           <w:tblHeader/>
-          <w:cantSplit/>
         </w:trPr>
         <w:tc>
           <w:tcPr>
-            <w:tcW w:type="dxa" w:w="1584"/>
-            <w:vAlign w:val="center"/>
+            <w:tcW w:w="1584" w:type="dxa"/>
+            <w:shd w:val="clear" w:color="auto" w:fill="18334A"/>
             <w:tcMar>
               <w:top w:w="100" w:type="dxa"/>
               <w:left w:w="100" w:type="dxa"/>
               <w:bottom w:w="100" w:type="dxa"/>
               <w:right w:w="100" w:type="dxa"/>
             </w:tcMar>
-            <w:shd w:fill="18334A"/>
+            <w:vAlign w:val="center"/>
           </w:tcPr>
           <w:p>
             <w:pPr>
-              <w:spacing w:after="40" w:before="40" w:line="252" w:lineRule="auto"/>
+              <w:spacing w:before="40" w:after="40" w:line="252" w:lineRule="auto"/>
             </w:pPr>
             <w:r>
               <w:rPr>
@@ -942,19 +971,19 @@
         </w:tc>
         <w:tc>
           <w:tcPr>
-            <w:tcW w:type="dxa" w:w="4464"/>
-            <w:vAlign w:val="center"/>
+            <w:tcW w:w="4464" w:type="dxa"/>
+            <w:shd w:val="clear" w:color="auto" w:fill="18334A"/>
             <w:tcMar>
               <w:top w:w="100" w:type="dxa"/>
               <w:left w:w="100" w:type="dxa"/>
               <w:bottom w:w="100" w:type="dxa"/>
               <w:right w:w="100" w:type="dxa"/>
             </w:tcMar>
-            <w:shd w:fill="18334A"/>
+            <w:vAlign w:val="center"/>
           </w:tcPr>
           <w:p>
             <w:pPr>
-              <w:spacing w:after="40" w:before="40" w:line="252" w:lineRule="auto"/>
+              <w:spacing w:before="40" w:after="40" w:line="252" w:lineRule="auto"/>
             </w:pPr>
             <w:r>
               <w:rPr>
@@ -968,19 +997,19 @@
         </w:tc>
         <w:tc>
           <w:tcPr>
-            <w:tcW w:type="dxa" w:w="4234"/>
-            <w:vAlign w:val="center"/>
+            <w:tcW w:w="4234" w:type="dxa"/>
+            <w:shd w:val="clear" w:color="auto" w:fill="18334A"/>
             <w:tcMar>
               <w:top w:w="100" w:type="dxa"/>
               <w:left w:w="100" w:type="dxa"/>
               <w:bottom w:w="100" w:type="dxa"/>
               <w:right w:w="100" w:type="dxa"/>
             </w:tcMar>
-            <w:shd w:fill="18334A"/>
+            <w:vAlign w:val="center"/>
           </w:tcPr>
           <w:p>
             <w:pPr>
-              <w:spacing w:after="40" w:before="40" w:line="252" w:lineRule="auto"/>
+              <w:spacing w:before="40" w:after="40" w:line="252" w:lineRule="auto"/>
             </w:pPr>
             <w:r>
               <w:rPr>
@@ -999,43 +1028,43 @@
         </w:trPr>
         <w:tc>
           <w:tcPr>
-            <w:tcW w:type="dxa" w:w="1584"/>
-            <w:vAlign w:val="center"/>
+            <w:tcW w:w="1584" w:type="dxa"/>
+            <w:shd w:val="clear" w:color="auto" w:fill="F3F6FA"/>
             <w:tcMar>
               <w:top w:w="100" w:type="dxa"/>
               <w:left w:w="100" w:type="dxa"/>
               <w:bottom w:w="100" w:type="dxa"/>
               <w:right w:w="100" w:type="dxa"/>
             </w:tcMar>
-            <w:shd w:fill="F3F6FA"/>
+            <w:vAlign w:val="center"/>
           </w:tcPr>
           <w:p>
             <w:pPr>
-              <w:spacing w:after="40" w:before="40" w:line="252" w:lineRule="auto"/>
+              <w:spacing w:before="40" w:after="40" w:line="252" w:lineRule="auto"/>
             </w:pPr>
             <w:r>
               <w:rPr>
                 <w:sz w:val="20"/>
               </w:rPr>
-              <w:t>1  Enrollment</w:t>
+              <w:t>Enrollment Agent</w:t>
             </w:r>
           </w:p>
         </w:tc>
         <w:tc>
           <w:tcPr>
-            <w:tcW w:type="dxa" w:w="4464"/>
-            <w:vAlign w:val="center"/>
+            <w:tcW w:w="4464" w:type="dxa"/>
+            <w:shd w:val="clear" w:color="auto" w:fill="F3F6FA"/>
             <w:tcMar>
               <w:top w:w="100" w:type="dxa"/>
               <w:left w:w="100" w:type="dxa"/>
               <w:bottom w:w="100" w:type="dxa"/>
               <w:right w:w="100" w:type="dxa"/>
             </w:tcMar>
-            <w:shd w:fill="F3F6FA"/>
+            <w:vAlign w:val="center"/>
           </w:tcPr>
           <w:p>
             <w:pPr>
-              <w:spacing w:after="40" w:before="40" w:line="252" w:lineRule="auto"/>
+              <w:spacing w:before="40" w:after="40" w:line="252" w:lineRule="auto"/>
             </w:pPr>
             <w:r>
               <w:rPr>
@@ -1047,19 +1076,19 @@
         </w:tc>
         <w:tc>
           <w:tcPr>
-            <w:tcW w:type="dxa" w:w="4234"/>
-            <w:vAlign w:val="center"/>
+            <w:tcW w:w="4234" w:type="dxa"/>
+            <w:shd w:val="clear" w:color="auto" w:fill="F3F6FA"/>
             <w:tcMar>
               <w:top w:w="100" w:type="dxa"/>
               <w:left w:w="100" w:type="dxa"/>
               <w:bottom w:w="100" w:type="dxa"/>
               <w:right w:w="100" w:type="dxa"/>
             </w:tcMar>
-            <w:shd w:fill="F3F6FA"/>
+            <w:vAlign w:val="center"/>
           </w:tcPr>
           <w:p>
             <w:pPr>
-              <w:spacing w:after="40" w:before="40" w:line="252" w:lineRule="auto"/>
+              <w:spacing w:before="40" w:after="40" w:line="252" w:lineRule="auto"/>
             </w:pPr>
             <w:r>
               <w:rPr>
@@ -1076,43 +1105,43 @@
         </w:trPr>
         <w:tc>
           <w:tcPr>
-            <w:tcW w:type="dxa" w:w="1584"/>
-            <w:vAlign w:val="center"/>
+            <w:tcW w:w="1584" w:type="dxa"/>
+            <w:shd w:val="clear" w:color="auto" w:fill="FFFFFF"/>
             <w:tcMar>
               <w:top w:w="100" w:type="dxa"/>
               <w:left w:w="100" w:type="dxa"/>
               <w:bottom w:w="100" w:type="dxa"/>
               <w:right w:w="100" w:type="dxa"/>
             </w:tcMar>
-            <w:shd w:fill="FFFFFF"/>
+            <w:vAlign w:val="center"/>
           </w:tcPr>
           <w:p>
             <w:pPr>
-              <w:spacing w:after="40" w:before="40" w:line="252" w:lineRule="auto"/>
+              <w:spacing w:before="40" w:after="40" w:line="252" w:lineRule="auto"/>
             </w:pPr>
             <w:r>
               <w:rPr>
                 <w:sz w:val="20"/>
               </w:rPr>
-              <w:t>2  Credential linking</w:t>
+              <w:t>Key Trust</w:t>
             </w:r>
           </w:p>
         </w:tc>
         <w:tc>
           <w:tcPr>
-            <w:tcW w:type="dxa" w:w="4464"/>
-            <w:vAlign w:val="center"/>
+            <w:tcW w:w="4464" w:type="dxa"/>
+            <w:shd w:val="clear" w:color="auto" w:fill="FFFFFF"/>
             <w:tcMar>
               <w:top w:w="100" w:type="dxa"/>
               <w:left w:w="100" w:type="dxa"/>
               <w:bottom w:w="100" w:type="dxa"/>
               <w:right w:w="100" w:type="dxa"/>
             </w:tcMar>
-            <w:shd w:fill="FFFFFF"/>
+            <w:vAlign w:val="center"/>
           </w:tcPr>
           <w:p>
             <w:pPr>
-              <w:spacing w:after="40" w:before="40" w:line="252" w:lineRule="auto"/>
+              <w:spacing w:before="40" w:after="40" w:line="252" w:lineRule="auto"/>
             </w:pPr>
             <w:r>
               <w:rPr>
@@ -1124,19 +1153,19 @@
         </w:tc>
         <w:tc>
           <w:tcPr>
-            <w:tcW w:type="dxa" w:w="4234"/>
-            <w:vAlign w:val="center"/>
+            <w:tcW w:w="4234" w:type="dxa"/>
+            <w:shd w:val="clear" w:color="auto" w:fill="FFFFFF"/>
             <w:tcMar>
               <w:top w:w="100" w:type="dxa"/>
               <w:left w:w="100" w:type="dxa"/>
               <w:bottom w:w="100" w:type="dxa"/>
               <w:right w:w="100" w:type="dxa"/>
             </w:tcMar>
-            <w:shd w:fill="FFFFFF"/>
+            <w:vAlign w:val="center"/>
           </w:tcPr>
           <w:p>
             <w:pPr>
-              <w:spacing w:after="40" w:before="40" w:line="252" w:lineRule="auto"/>
+              <w:spacing w:before="40" w:after="40" w:line="252" w:lineRule="auto"/>
             </w:pPr>
             <w:r>
               <w:rPr>
@@ -1153,43 +1182,43 @@
         </w:trPr>
         <w:tc>
           <w:tcPr>
-            <w:tcW w:type="dxa" w:w="1584"/>
-            <w:vAlign w:val="center"/>
+            <w:tcW w:w="1584" w:type="dxa"/>
+            <w:shd w:val="clear" w:color="auto" w:fill="F3F6FA"/>
             <w:tcMar>
               <w:top w:w="100" w:type="dxa"/>
               <w:left w:w="100" w:type="dxa"/>
               <w:bottom w:w="100" w:type="dxa"/>
               <w:right w:w="100" w:type="dxa"/>
             </w:tcMar>
-            <w:shd w:fill="F3F6FA"/>
+            <w:vAlign w:val="center"/>
           </w:tcPr>
           <w:p>
             <w:pPr>
-              <w:spacing w:after="40" w:before="40" w:line="252" w:lineRule="auto"/>
+              <w:spacing w:before="40" w:after="40" w:line="252" w:lineRule="auto"/>
             </w:pPr>
             <w:r>
               <w:rPr>
                 <w:sz w:val="20"/>
               </w:rPr>
-              <w:t>3  Supplied certificate</w:t>
+              <w:t>BYOC</w:t>
             </w:r>
           </w:p>
         </w:tc>
         <w:tc>
           <w:tcPr>
-            <w:tcW w:type="dxa" w:w="4464"/>
-            <w:vAlign w:val="center"/>
+            <w:tcW w:w="4464" w:type="dxa"/>
+            <w:shd w:val="clear" w:color="auto" w:fill="F3F6FA"/>
             <w:tcMar>
               <w:top w:w="100" w:type="dxa"/>
               <w:left w:w="100" w:type="dxa"/>
               <w:bottom w:w="100" w:type="dxa"/>
               <w:right w:w="100" w:type="dxa"/>
             </w:tcMar>
-            <w:shd w:fill="F3F6FA"/>
+            <w:vAlign w:val="center"/>
           </w:tcPr>
           <w:p>
             <w:pPr>
-              <w:spacing w:after="40" w:before="40" w:line="252" w:lineRule="auto"/>
+              <w:spacing w:before="40" w:after="40" w:line="252" w:lineRule="auto"/>
             </w:pPr>
             <w:r>
               <w:rPr>
@@ -1201,19 +1230,19 @@
         </w:tc>
         <w:tc>
           <w:tcPr>
-            <w:tcW w:type="dxa" w:w="4234"/>
-            <w:vAlign w:val="center"/>
+            <w:tcW w:w="4234" w:type="dxa"/>
+            <w:shd w:val="clear" w:color="auto" w:fill="F3F6FA"/>
             <w:tcMar>
               <w:top w:w="100" w:type="dxa"/>
               <w:left w:w="100" w:type="dxa"/>
               <w:bottom w:w="100" w:type="dxa"/>
               <w:right w:w="100" w:type="dxa"/>
             </w:tcMar>
-            <w:shd w:fill="F3F6FA"/>
+            <w:vAlign w:val="center"/>
           </w:tcPr>
           <w:p>
             <w:pPr>
-              <w:spacing w:after="40" w:before="40" w:line="252" w:lineRule="auto"/>
+              <w:spacing w:before="40" w:after="40" w:line="252" w:lineRule="auto"/>
             </w:pPr>
             <w:r>
               <w:rPr>
@@ -1230,43 +1259,43 @@
         </w:trPr>
         <w:tc>
           <w:tcPr>
-            <w:tcW w:type="dxa" w:w="1584"/>
-            <w:vAlign w:val="center"/>
+            <w:tcW w:w="1584" w:type="dxa"/>
+            <w:shd w:val="clear" w:color="auto" w:fill="FFFFFF"/>
             <w:tcMar>
               <w:top w:w="100" w:type="dxa"/>
               <w:left w:w="100" w:type="dxa"/>
               <w:bottom w:w="100" w:type="dxa"/>
               <w:right w:w="100" w:type="dxa"/>
             </w:tcMar>
-            <w:shd w:fill="FFFFFF"/>
+            <w:vAlign w:val="center"/>
           </w:tcPr>
           <w:p>
             <w:pPr>
-              <w:spacing w:after="40" w:before="40" w:line="252" w:lineRule="auto"/>
+              <w:spacing w:before="40" w:after="40" w:line="252" w:lineRule="auto"/>
             </w:pPr>
             <w:r>
               <w:rPr>
                 <w:sz w:val="20"/>
               </w:rPr>
-              <w:t>4  Service tickets</w:t>
+              <w:t>Constrained Delegation</w:t>
             </w:r>
           </w:p>
         </w:tc>
         <w:tc>
           <w:tcPr>
-            <w:tcW w:type="dxa" w:w="4464"/>
-            <w:vAlign w:val="center"/>
+            <w:tcW w:w="4464" w:type="dxa"/>
+            <w:shd w:val="clear" w:color="auto" w:fill="FFFFFF"/>
             <w:tcMar>
               <w:top w:w="100" w:type="dxa"/>
               <w:left w:w="100" w:type="dxa"/>
               <w:bottom w:w="100" w:type="dxa"/>
               <w:right w:w="100" w:type="dxa"/>
             </w:tcMar>
-            <w:shd w:fill="FFFFFF"/>
+            <w:vAlign w:val="center"/>
           </w:tcPr>
           <w:p>
             <w:pPr>
-              <w:spacing w:after="40" w:before="40" w:line="252" w:lineRule="auto"/>
+              <w:spacing w:before="40" w:after="40" w:line="252" w:lineRule="auto"/>
             </w:pPr>
             <w:r>
               <w:rPr>
@@ -1278,19 +1307,19 @@
         </w:tc>
         <w:tc>
           <w:tcPr>
-            <w:tcW w:type="dxa" w:w="4234"/>
-            <w:vAlign w:val="center"/>
+            <w:tcW w:w="4234" w:type="dxa"/>
+            <w:shd w:val="clear" w:color="auto" w:fill="FFFFFF"/>
             <w:tcMar>
               <w:top w:w="100" w:type="dxa"/>
               <w:left w:w="100" w:type="dxa"/>
               <w:bottom w:w="100" w:type="dxa"/>
               <w:right w:w="100" w:type="dxa"/>
             </w:tcMar>
-            <w:shd w:fill="FFFFFF"/>
+            <w:vAlign w:val="center"/>
           </w:tcPr>
           <w:p>
             <w:pPr>
-              <w:spacing w:after="40" w:before="40" w:line="252" w:lineRule="auto"/>
+              <w:spacing w:before="40" w:after="40" w:line="252" w:lineRule="auto"/>
             </w:pPr>
             <w:r>
               <w:rPr>
@@ -1309,7 +1338,7 @@
     </w:p>
     <w:p>
       <w:r>
-        <w:t>Every mode atomically publishes a caller-owned mode-0600 .krb5cc_craft in the NSS home. It contains a user TGT in modes 1-3, or only selected service tickets in mode 4, with session keys but no certificate, private key or broker evidence. Modes 1-3 use it to request service tickets. Success replaces the cache; acquisition failure preserves it, and expiration does not delete it automatically.</w:t>
+        <w:t>Every mode atomically publishes a caller-owned mode-0600 .krb5cc_craft in the NSS home. It contains a user TGT in certificate modes, or only selected service tickets in Constrained Delegation, with session keys but no certificate, private key or broker evidence. Certificate modes use it to request service tickets. Success replaces the cache; acquisition failure preserves it, and expiration does not delete it automatically.</w:t>
       </w:r>
     </w:p>
     <w:p>
@@ -1318,7 +1347,7 @@
       </w:r>
     </w:p>
     <w:p>
-      <w:hyperlink r:id="rId52">
+      <w:hyperlink r:id="rId28">
         <w:r>
           <w:rPr>
             <w:color w:val="315DC0"/>
@@ -1330,7 +1359,7 @@
       <w:r>
         <w:t xml:space="preserve">  |  </w:t>
       </w:r>
-      <w:hyperlink r:id="rId53">
+      <w:hyperlink r:id="rId29">
         <w:r>
           <w:rPr>
             <w:color w:val="315DC0"/>
@@ -1342,7 +1371,7 @@
       <w:r>
         <w:t xml:space="preserve">  |  </w:t>
       </w:r>
-      <w:hyperlink r:id="rId54">
+      <w:hyperlink r:id="rId30">
         <w:r>
           <w:rPr>
             <w:color w:val="315DC0"/>
@@ -1358,17 +1387,18 @@
         <w:pageBreakBefore/>
       </w:pPr>
       <w:r>
+        <w:lastRenderedPageBreak/>
         <w:t>Ticket lifetimes and everyday use</w:t>
       </w:r>
     </w:p>
     <w:p>
       <w:r>
-        <w:t>Modes 1-3 request a ten-hour initial TGT and a seven-day renewal window with AES256/AES128. The KDC controls the grant; certificate/key lifetime can constrain initial validity. A renewal window is the period during which an eligible TGT can be renewed. It does not make one ticket valid for seven days.</w:t>
+        <w:t>Certificate modes request a ten-hour initial TGT and a seven-day renewal window with AES256/AES128. The KDC controls the grant; certificate/key lifetime can constrain initial validity. A renewal window is the period during which an eligible TGT can be renewed. It does not make one ticket valid for seven days.</w:t>
       </w:r>
     </w:p>
     <w:p>
       <w:r>
-        <w:t>require_full_tgt_lifetime=yes rejects shortened initial or renewal grants without replacing the cache. Administrators can set no to accept shorter grants with a warning. Returned ticket times are never rewritten. Enrollment certificate caps default to ten hours total, including backdating; they do not cap mode 3's supplied certificate or mode 2's local identity.</w:t>
+        <w:t>require_full_tgt_lifetime=yes rejects shortened initial or renewal grants without replacing the cache. Administrators can set no to accept shorter grants with a warning. Returned ticket times are never rewritten. Enrollment certificate caps default to ten hours total, including backdating; they do not cap BYOC's supplied certificate or Key Trust's local identity.</w:t>
       </w:r>
     </w:p>
     <w:p>
@@ -1386,8 +1416,12 @@
       </w:pPr>
       <w:r>
         <w:t>cache=$(/usr/local/bin/craft) || exit "$?"</w:t>
+      </w:r>
+      <w:r>
         <w:br/>
         <w:t>export KRB5CCNAME="$cache"</w:t>
+      </w:r>
+      <w:r>
         <w:br/>
         <w:t>klist -ef -c "$KRB5CCNAME"</w:t>
       </w:r>
@@ -1412,20 +1446,24 @@
       </w:pPr>
       <w:r>
         <w:t>job_pid=$$</w:t>
+      </w:r>
+      <w:r>
         <w:br/>
         <w:t>cache=$(/usr/local/bin/craft-maintain --watch-pid "$job_pid") || exit "$?"</w:t>
+      </w:r>
+      <w:r>
         <w:br/>
         <w:t>export KRB5CCNAME="$cache"</w:t>
       </w:r>
     </w:p>
     <w:p>
       <w:r>
-        <w:t>craft-maintain returns when credentials and detached maintenance are ready. Modes 1-3 renew from the cached TGT and authenticate afresh near the renewal deadline. Mode 4 refreshes the complete service batch through its broker before the earliest expiry. Fresh authentication always uses the configured mode selection.</w:t>
+        <w:t>craft-maintain returns when credentials and detached maintenance are ready. Certificate modes renew from the cached TGT and authenticate afresh near the renewal deadline. Constrained Delegation refreshes the complete service batch through its broker before the earliest expiry. Fresh authentication always uses the configured mode selection.</w:t>
       </w:r>
     </w:p>
     <w:p>
       <w:r>
-        <w:t>Install the maintainer without setuid/setgid. Protect system Kerberos configuration, and watch a shell or controller that lasts for the job. The scheduler must retain background processes. Modes 1, 2 and 4 need setuid access for fresh authentication; home refresh works under no_new_privs. --max-duration 21d adds a cutoff. Concurrent jobs for one UID share the cache and acquisition cooldown.</w:t>
+        <w:t>Install the maintainer without setuid/setgid. Protect system Kerberos configuration, and watch a shell or controller that lasts for the job. The scheduler must retain background processes. Broker modes need setuid access for fresh authentication; home refresh works under no_new_privs. --max-duration 21d adds a cutoff. Concurrent jobs for one UID share the cache and acquisition cooldown.</w:t>
       </w:r>
     </w:p>
     <w:p>
@@ -1435,6 +1473,8 @@
       </w:pPr>
       <w:r>
         <w:t>/usr/local/bin/craft-maintain --status --watch-pid "$job_pid"</w:t>
+      </w:r>
+      <w:r>
         <w:br/>
         <w:t>klist -ef -c "$KRB5CCNAME"</w:t>
       </w:r>
@@ -1445,7 +1485,7 @@
       </w:r>
     </w:p>
     <w:p>
-      <w:hyperlink r:id="rId55">
+      <w:hyperlink r:id="rId31" w:anchor="long-running-jobs">
         <w:r>
           <w:rPr>
             <w:color w:val="315DC0"/>
@@ -1457,7 +1497,7 @@
       <w:r>
         <w:t xml:space="preserve">  |  </w:t>
       </w:r>
-      <w:hyperlink r:id="rId56">
+      <w:hyperlink r:id="rId32">
         <w:r>
           <w:rPr>
             <w:color w:val="315DC0"/>
@@ -1473,12 +1513,13 @@
         <w:pageBreakBefore/>
       </w:pPr>
       <w:r>
+        <w:lastRenderedPageBreak/>
         <w:t>Operation and authorization</w:t>
       </w:r>
     </w:p>
     <w:p>
       <w:r>
-        <w:t>Mode 4 uses a dedicated broker with protocol transition and account-based constrained delegation to an exact list of target SPNs. AD limits target services, not the users the broker can impersonate. Protect the keytab, restrict local craft-users membership and control Linux UID/name assignment. Exclude sensitive users through domain delegation policy and test denial against the deployed KDC.</w:t>
+        <w:t>Constrained Delegation uses a dedicated broker with protocol transition and account-based constrained delegation to an exact list of target SPNs. AD limits target services, not the users the broker can impersonate. Protect the keytab, restrict local craft-users membership and control Linux UID/name assignment. Exclude sensitive users through domain delegation policy and test denial against the deployed KDC.</w:t>
       </w:r>
     </w:p>
     <w:p>
@@ -1493,11 +1534,11 @@
     </w:p>
     <w:p>
       <w:r>
-        <w:t>Mode 4 refreshes all service tickets through the broker before the earliest expiry. It has no cache-only renewal and needs the broker and KDC for each refresh. Status identifies ticket_kind and ticket_expires. Removing broker delegation blocks fresh acquisition but does not revoke already-issued tickets.</w:t>
+        <w:t>Constrained Delegation refreshes all service tickets through the broker before the earliest expiry. It has no cache-only renewal and needs the broker and KDC for each refresh. Status identifies ticket_kind and ticket_expires. Removing broker delegation blocks fresh acquisition but does not revoke already-issued tickets.</w:t>
       </w:r>
     </w:p>
     <w:p>
-      <w:hyperlink r:id="rId57">
+      <w:hyperlink r:id="rId33" w:anchor="audit-records-and-diagnostics">
         <w:r>
           <w:rPr>
             <w:color w:val="315DC0"/>
@@ -1509,7 +1550,7 @@
       <w:r>
         <w:t xml:space="preserve">  |  </w:t>
       </w:r>
-      <w:hyperlink r:id="rId58">
+      <w:hyperlink r:id="rId34" w:anchor="immediate-disable">
         <w:r>
           <w:rPr>
             <w:color w:val="315DC0"/>
@@ -1528,7 +1569,7 @@
       </w:r>
     </w:p>
     <w:p>
-      <w:hyperlink r:id="rId59">
+      <w:hyperlink r:id="rId35">
         <w:r>
           <w:rPr>
             <w:color w:val="315DC0"/>
@@ -1540,7 +1581,7 @@
       <w:r>
         <w:t xml:space="preserve">  |  </w:t>
       </w:r>
-      <w:hyperlink r:id="rId60">
+      <w:hyperlink r:id="rId36">
         <w:r>
           <w:rPr>
             <w:color w:val="315DC0"/>
@@ -1552,7 +1593,7 @@
       <w:r>
         <w:t xml:space="preserve">  |  </w:t>
       </w:r>
-      <w:hyperlink r:id="rId61">
+      <w:hyperlink r:id="rId37">
         <w:r>
           <w:rPr>
             <w:color w:val="315DC0"/>
@@ -1563,7 +1604,7 @@
       </w:hyperlink>
     </w:p>
     <w:p>
-      <w:hyperlink r:id="rId62">
+      <w:hyperlink r:id="rId38">
         <w:r>
           <w:rPr>
             <w:color w:val="315DC0"/>
@@ -1575,7 +1616,7 @@
       <w:r>
         <w:t xml:space="preserve">  |  </w:t>
       </w:r>
-      <w:hyperlink r:id="rId63">
+      <w:hyperlink r:id="rId39">
         <w:r>
           <w:rPr>
             <w:color w:val="315DC0"/>
@@ -1592,7 +1633,7 @@
       <w:r>
         <w:t xml:space="preserve">Source code, scripts, configuration examples and documentation are licensed under GNU GPL version 3 only (GPL-3.0-only). See </w:t>
       </w:r>
-      <w:hyperlink r:id="rId64">
+      <w:hyperlink r:id="rId40">
         <w:r>
           <w:rPr>
             <w:color w:val="315DC0"/>
@@ -1644,7 +1685,6 @@
 <w:ftr xmlns:wpc="http://schemas.microsoft.com/office/word/2010/wordprocessingCanvas" xmlns:cx="http://schemas.microsoft.com/office/drawing/2014/chartex" xmlns:cx1="http://schemas.microsoft.com/office/drawing/2015/9/8/chartex" xmlns:cx2="http://schemas.microsoft.com/office/drawing/2015/10/21/chartex" xmlns:cx3="http://schemas.microsoft.com/office/drawing/2016/5/9/chartex" xmlns:cx4="http://schemas.microsoft.com/office/drawing/2016/5/10/chartex" xmlns:cx5="http://schemas.microsoft.com/office/drawing/2016/5/11/chartex" xmlns:cx6="http://schemas.microsoft.com/office/drawing/2016/5/12/chartex" xmlns:cx7="http://schemas.microsoft.com/office/drawing/2016/5/13/chartex" xmlns:cx8="http://schemas.microsoft.com/office/drawing/2016/5/14/chartex" xmlns:mc="http://schemas.openxmlformats.org/markup-compatibility/2006" xmlns:aink="http://schemas.microsoft.com/office/drawing/2016/ink" xmlns:am3d="http://schemas.microsoft.com/office/drawing/2017/model3d" xmlns:o="urn:schemas-microsoft-com:office:office" xmlns:oel="http://schemas.microsoft.com/office/2019/extlst" xmlns:r="http://schemas.openxmlformats.org/officeDocument/2006/relationships" xmlns:m="http://schemas.openxmlformats.org/officeDocument/2006/math" xmlns:v="urn:schemas-microsoft-com:vml" xmlns:wp14="http://schemas.microsoft.com/office/word/2010/wordprocessingDrawing" xmlns:wp="http://schemas.openxmlformats.org/drawingml/2006/wordprocessingDrawing" xmlns:w10="urn:schemas-microsoft-com:office:word" xmlns:w="http://schemas.openxmlformats.org/wordprocessingml/2006/main" xmlns:w14="http://schemas.microsoft.com/office/word/2010/wordml" xmlns:w15="http://schemas.microsoft.com/office/word/2012/wordml" xmlns:w16cex="http://schemas.microsoft.com/office/word/2018/wordml/cex" xmlns:w16cid="http://schemas.microsoft.com/office/word/2016/wordml/cid" xmlns:w16="http://schemas.microsoft.com/office/word/2018/wordml" xmlns:w16du="http://schemas.microsoft.com/office/word/2023/wordml/word16du" xmlns:w16sdtdh="http://schemas.microsoft.com/office/word/2020/wordml/sdtdatahash" xmlns:w16sdtfl="http://schemas.microsoft.com/office/word/2024/wordml/sdtformatlock" xmlns:w16se="http://schemas.microsoft.com/office/word/2015/wordml/symex" xmlns:wpg="http://schemas.microsoft.com/office/word/2010/wordprocessingGroup" xmlns:wpi="http://schemas.microsoft.com/office/word/2010/wordprocessingInk" xmlns:wne="http://schemas.microsoft.com/office/word/2006/wordml" xmlns:wps="http://schemas.microsoft.com/office/word/2010/wordprocessingShape" mc:Ignorable="w14 w15 w16se w16cid w16 w16cex w16sdtdh w16sdtfl w16du wp14">
   <w:p>
     <w:pPr>
-      <w:pStyle w:val="SmallNote"/>
       <w:jc w:val="right"/>
     </w:pPr>
     <w:r>
@@ -1665,149 +1705,6 @@
     <w:r>
       <w:fldChar w:fldCharType="end"/>
     </w:r>
-  </w:p>
-</w:ftr>
-</file>
-
-<file path=word/footer10.xml><?xml version="1.0" encoding="utf-8"?>
-<w:ftr xmlns:m="http://schemas.openxmlformats.org/officeDocument/2006/math" xmlns:mc="http://schemas.openxmlformats.org/markup-compatibility/2006" xmlns:mo="http://schemas.microsoft.com/office/mac/office/2008/main" xmlns:mv="urn:schemas-microsoft-com:mac:vml" xmlns:o="urn:schemas-microsoft-com:office:office" xmlns:r="http://schemas.openxmlformats.org/officeDocument/2006/relationships" xmlns:v="urn:schemas-microsoft-com:vml" xmlns:w10="urn:schemas-microsoft-com:office:word" xmlns:w14="http://schemas.microsoft.com/office/word/2010/wordml" xmlns:w="http://schemas.openxmlformats.org/wordprocessingml/2006/main" xmlns:wne="http://schemas.microsoft.com/office/word/2006/wordml" xmlns:wp14="http://schemas.microsoft.com/office/word/2010/wordprocessingDrawing" xmlns:wp="http://schemas.openxmlformats.org/drawingml/2006/wordprocessingDrawing" xmlns:wpc="http://schemas.microsoft.com/office/word/2010/wordprocessingCanvas" xmlns:wpg="http://schemas.microsoft.com/office/word/2010/wordprocessingGroup" xmlns:wpi="http://schemas.microsoft.com/office/word/2010/wordprocessingInk" xmlns:wps="http://schemas.microsoft.com/office/word/2010/wordprocessingShape" mc:Ignorable="w14 wp14">
-  <w:p>
-    <w:pPr>
-      <w:jc w:val="right"/>
-    </w:pPr>
-    <w:fldSimple w:instr="PAGE"/>
-  </w:p>
-</w:ftr>
-</file>
-
-<file path=word/footer11.xml><?xml version="1.0" encoding="utf-8"?>
-<w:ftr xmlns:m="http://schemas.openxmlformats.org/officeDocument/2006/math" xmlns:mc="http://schemas.openxmlformats.org/markup-compatibility/2006" xmlns:mo="http://schemas.microsoft.com/office/mac/office/2008/main" xmlns:mv="urn:schemas-microsoft-com:mac:vml" xmlns:o="urn:schemas-microsoft-com:office:office" xmlns:r="http://schemas.openxmlformats.org/officeDocument/2006/relationships" xmlns:v="urn:schemas-microsoft-com:vml" xmlns:w10="urn:schemas-microsoft-com:office:word" xmlns:w14="http://schemas.microsoft.com/office/word/2010/wordml" xmlns:w="http://schemas.openxmlformats.org/wordprocessingml/2006/main" xmlns:wne="http://schemas.microsoft.com/office/word/2006/wordml" xmlns:wp14="http://schemas.microsoft.com/office/word/2010/wordprocessingDrawing" xmlns:wp="http://schemas.openxmlformats.org/drawingml/2006/wordprocessingDrawing" xmlns:wpc="http://schemas.microsoft.com/office/word/2010/wordprocessingCanvas" xmlns:wpg="http://schemas.microsoft.com/office/word/2010/wordprocessingGroup" xmlns:wpi="http://schemas.microsoft.com/office/word/2010/wordprocessingInk" xmlns:wps="http://schemas.microsoft.com/office/word/2010/wordprocessingShape" mc:Ignorable="w14 wp14">
-  <w:p>
-    <w:pPr>
-      <w:jc w:val="right"/>
-    </w:pPr>
-    <w:fldSimple w:instr="PAGE"/>
-  </w:p>
-</w:ftr>
-</file>
-
-<file path=word/footer12.xml><?xml version="1.0" encoding="utf-8"?>
-<w:ftr xmlns:m="http://schemas.openxmlformats.org/officeDocument/2006/math" xmlns:mc="http://schemas.openxmlformats.org/markup-compatibility/2006" xmlns:mo="http://schemas.microsoft.com/office/mac/office/2008/main" xmlns:mv="urn:schemas-microsoft-com:mac:vml" xmlns:o="urn:schemas-microsoft-com:office:office" xmlns:r="http://schemas.openxmlformats.org/officeDocument/2006/relationships" xmlns:v="urn:schemas-microsoft-com:vml" xmlns:w10="urn:schemas-microsoft-com:office:word" xmlns:w14="http://schemas.microsoft.com/office/word/2010/wordml" xmlns:w="http://schemas.openxmlformats.org/wordprocessingml/2006/main" xmlns:wne="http://schemas.microsoft.com/office/word/2006/wordml" xmlns:wp14="http://schemas.microsoft.com/office/word/2010/wordprocessingDrawing" xmlns:wp="http://schemas.openxmlformats.org/drawingml/2006/wordprocessingDrawing" xmlns:wpc="http://schemas.microsoft.com/office/word/2010/wordprocessingCanvas" xmlns:wpg="http://schemas.microsoft.com/office/word/2010/wordprocessingGroup" xmlns:wpi="http://schemas.microsoft.com/office/word/2010/wordprocessingInk" xmlns:wps="http://schemas.microsoft.com/office/word/2010/wordprocessingShape" mc:Ignorable="w14 wp14">
-  <w:p>
-    <w:pPr>
-      <w:jc w:val="right"/>
-    </w:pPr>
-    <w:fldSimple w:instr="PAGE"/>
-  </w:p>
-</w:ftr>
-</file>
-
-<file path=word/footer13.xml><?xml version="1.0" encoding="utf-8"?>
-<w:ftr xmlns:m="http://schemas.openxmlformats.org/officeDocument/2006/math" xmlns:mc="http://schemas.openxmlformats.org/markup-compatibility/2006" xmlns:mo="http://schemas.microsoft.com/office/mac/office/2008/main" xmlns:mv="urn:schemas-microsoft-com:mac:vml" xmlns:o="urn:schemas-microsoft-com:office:office" xmlns:r="http://schemas.openxmlformats.org/officeDocument/2006/relationships" xmlns:v="urn:schemas-microsoft-com:vml" xmlns:w10="urn:schemas-microsoft-com:office:word" xmlns:w14="http://schemas.microsoft.com/office/word/2010/wordml" xmlns:w="http://schemas.openxmlformats.org/wordprocessingml/2006/main" xmlns:wne="http://schemas.microsoft.com/office/word/2006/wordml" xmlns:wp14="http://schemas.microsoft.com/office/word/2010/wordprocessingDrawing" xmlns:wp="http://schemas.openxmlformats.org/drawingml/2006/wordprocessingDrawing" xmlns:wpc="http://schemas.microsoft.com/office/word/2010/wordprocessingCanvas" xmlns:wpg="http://schemas.microsoft.com/office/word/2010/wordprocessingGroup" xmlns:wpi="http://schemas.microsoft.com/office/word/2010/wordprocessingInk" xmlns:wps="http://schemas.microsoft.com/office/word/2010/wordprocessingShape" mc:Ignorable="w14 wp14">
-  <w:p>
-    <w:pPr>
-      <w:jc w:val="right"/>
-    </w:pPr>
-    <w:fldSimple w:instr="PAGE"/>
-  </w:p>
-</w:ftr>
-</file>
-
-<file path=word/footer14.xml><?xml version="1.0" encoding="utf-8"?>
-<w:ftr xmlns:m="http://schemas.openxmlformats.org/officeDocument/2006/math" xmlns:mc="http://schemas.openxmlformats.org/markup-compatibility/2006" xmlns:mo="http://schemas.microsoft.com/office/mac/office/2008/main" xmlns:mv="urn:schemas-microsoft-com:mac:vml" xmlns:o="urn:schemas-microsoft-com:office:office" xmlns:r="http://schemas.openxmlformats.org/officeDocument/2006/relationships" xmlns:v="urn:schemas-microsoft-com:vml" xmlns:w10="urn:schemas-microsoft-com:office:word" xmlns:w14="http://schemas.microsoft.com/office/word/2010/wordml" xmlns:w="http://schemas.openxmlformats.org/wordprocessingml/2006/main" xmlns:wne="http://schemas.microsoft.com/office/word/2006/wordml" xmlns:wp14="http://schemas.microsoft.com/office/word/2010/wordprocessingDrawing" xmlns:wp="http://schemas.openxmlformats.org/drawingml/2006/wordprocessingDrawing" xmlns:wpc="http://schemas.microsoft.com/office/word/2010/wordprocessingCanvas" xmlns:wpg="http://schemas.microsoft.com/office/word/2010/wordprocessingGroup" xmlns:wpi="http://schemas.microsoft.com/office/word/2010/wordprocessingInk" xmlns:wps="http://schemas.microsoft.com/office/word/2010/wordprocessingShape" mc:Ignorable="w14 wp14">
-  <w:p>
-    <w:pPr>
-      <w:jc w:val="right"/>
-    </w:pPr>
-    <w:fldSimple w:instr="PAGE"/>
-  </w:p>
-</w:ftr>
-</file>
-
-<file path=word/footer2.xml><?xml version="1.0" encoding="utf-8"?>
-<w:ftr xmlns:m="http://schemas.openxmlformats.org/officeDocument/2006/math" xmlns:mc="http://schemas.openxmlformats.org/markup-compatibility/2006" xmlns:mo="http://schemas.microsoft.com/office/mac/office/2008/main" xmlns:mv="urn:schemas-microsoft-com:mac:vml" xmlns:o="urn:schemas-microsoft-com:office:office" xmlns:r="http://schemas.openxmlformats.org/officeDocument/2006/relationships" xmlns:v="urn:schemas-microsoft-com:vml" xmlns:w10="urn:schemas-microsoft-com:office:word" xmlns:w14="http://schemas.microsoft.com/office/word/2010/wordml" xmlns:w="http://schemas.openxmlformats.org/wordprocessingml/2006/main" xmlns:wne="http://schemas.microsoft.com/office/word/2006/wordml" xmlns:wp14="http://schemas.microsoft.com/office/word/2010/wordprocessingDrawing" xmlns:wp="http://schemas.openxmlformats.org/drawingml/2006/wordprocessingDrawing" xmlns:wpc="http://schemas.microsoft.com/office/word/2010/wordprocessingCanvas" xmlns:wpg="http://schemas.microsoft.com/office/word/2010/wordprocessingGroup" xmlns:wpi="http://schemas.microsoft.com/office/word/2010/wordprocessingInk" xmlns:wps="http://schemas.microsoft.com/office/word/2010/wordprocessingShape" mc:Ignorable="w14 wp14">
-  <w:p>
-    <w:pPr>
-      <w:jc w:val="right"/>
-    </w:pPr>
-    <w:fldSimple w:instr="PAGE"/>
-  </w:p>
-</w:ftr>
-</file>
-
-<file path=word/footer3.xml><?xml version="1.0" encoding="utf-8"?>
-<w:ftr xmlns:m="http://schemas.openxmlformats.org/officeDocument/2006/math" xmlns:mc="http://schemas.openxmlformats.org/markup-compatibility/2006" xmlns:mo="http://schemas.microsoft.com/office/mac/office/2008/main" xmlns:mv="urn:schemas-microsoft-com:mac:vml" xmlns:o="urn:schemas-microsoft-com:office:office" xmlns:r="http://schemas.openxmlformats.org/officeDocument/2006/relationships" xmlns:v="urn:schemas-microsoft-com:vml" xmlns:w10="urn:schemas-microsoft-com:office:word" xmlns:w14="http://schemas.microsoft.com/office/word/2010/wordml" xmlns:w="http://schemas.openxmlformats.org/wordprocessingml/2006/main" xmlns:wne="http://schemas.microsoft.com/office/word/2006/wordml" xmlns:wp14="http://schemas.microsoft.com/office/word/2010/wordprocessingDrawing" xmlns:wp="http://schemas.openxmlformats.org/drawingml/2006/wordprocessingDrawing" xmlns:wpc="http://schemas.microsoft.com/office/word/2010/wordprocessingCanvas" xmlns:wpg="http://schemas.microsoft.com/office/word/2010/wordprocessingGroup" xmlns:wpi="http://schemas.microsoft.com/office/word/2010/wordprocessingInk" xmlns:wps="http://schemas.microsoft.com/office/word/2010/wordprocessingShape" mc:Ignorable="w14 wp14">
-  <w:p>
-    <w:pPr>
-      <w:jc w:val="right"/>
-    </w:pPr>
-    <w:fldSimple w:instr="PAGE"/>
-  </w:p>
-</w:ftr>
-</file>
-
-<file path=word/footer4.xml><?xml version="1.0" encoding="utf-8"?>
-<w:ftr xmlns:m="http://schemas.openxmlformats.org/officeDocument/2006/math" xmlns:mc="http://schemas.openxmlformats.org/markup-compatibility/2006" xmlns:mo="http://schemas.microsoft.com/office/mac/office/2008/main" xmlns:mv="urn:schemas-microsoft-com:mac:vml" xmlns:o="urn:schemas-microsoft-com:office:office" xmlns:r="http://schemas.openxmlformats.org/officeDocument/2006/relationships" xmlns:v="urn:schemas-microsoft-com:vml" xmlns:w10="urn:schemas-microsoft-com:office:word" xmlns:w14="http://schemas.microsoft.com/office/word/2010/wordml" xmlns:w="http://schemas.openxmlformats.org/wordprocessingml/2006/main" xmlns:wne="http://schemas.microsoft.com/office/word/2006/wordml" xmlns:wp14="http://schemas.microsoft.com/office/word/2010/wordprocessingDrawing" xmlns:wp="http://schemas.openxmlformats.org/drawingml/2006/wordprocessingDrawing" xmlns:wpc="http://schemas.microsoft.com/office/word/2010/wordprocessingCanvas" xmlns:wpg="http://schemas.microsoft.com/office/word/2010/wordprocessingGroup" xmlns:wpi="http://schemas.microsoft.com/office/word/2010/wordprocessingInk" xmlns:wps="http://schemas.microsoft.com/office/word/2010/wordprocessingShape" mc:Ignorable="w14 wp14">
-  <w:p>
-    <w:pPr>
-      <w:jc w:val="right"/>
-    </w:pPr>
-    <w:fldSimple w:instr="PAGE"/>
-  </w:p>
-</w:ftr>
-</file>
-
-<file path=word/footer5.xml><?xml version="1.0" encoding="utf-8"?>
-<w:ftr xmlns:m="http://schemas.openxmlformats.org/officeDocument/2006/math" xmlns:mc="http://schemas.openxmlformats.org/markup-compatibility/2006" xmlns:mo="http://schemas.microsoft.com/office/mac/office/2008/main" xmlns:mv="urn:schemas-microsoft-com:mac:vml" xmlns:o="urn:schemas-microsoft-com:office:office" xmlns:r="http://schemas.openxmlformats.org/officeDocument/2006/relationships" xmlns:v="urn:schemas-microsoft-com:vml" xmlns:w10="urn:schemas-microsoft-com:office:word" xmlns:w14="http://schemas.microsoft.com/office/word/2010/wordml" xmlns:w="http://schemas.openxmlformats.org/wordprocessingml/2006/main" xmlns:wne="http://schemas.microsoft.com/office/word/2006/wordml" xmlns:wp14="http://schemas.microsoft.com/office/word/2010/wordprocessingDrawing" xmlns:wp="http://schemas.openxmlformats.org/drawingml/2006/wordprocessingDrawing" xmlns:wpc="http://schemas.microsoft.com/office/word/2010/wordprocessingCanvas" xmlns:wpg="http://schemas.microsoft.com/office/word/2010/wordprocessingGroup" xmlns:wpi="http://schemas.microsoft.com/office/word/2010/wordprocessingInk" xmlns:wps="http://schemas.microsoft.com/office/word/2010/wordprocessingShape" mc:Ignorable="w14 wp14">
-  <w:p>
-    <w:pPr>
-      <w:jc w:val="right"/>
-    </w:pPr>
-    <w:fldSimple w:instr="PAGE"/>
-  </w:p>
-</w:ftr>
-</file>
-
-<file path=word/footer6.xml><?xml version="1.0" encoding="utf-8"?>
-<w:ftr xmlns:m="http://schemas.openxmlformats.org/officeDocument/2006/math" xmlns:mc="http://schemas.openxmlformats.org/markup-compatibility/2006" xmlns:mo="http://schemas.microsoft.com/office/mac/office/2008/main" xmlns:mv="urn:schemas-microsoft-com:mac:vml" xmlns:o="urn:schemas-microsoft-com:office:office" xmlns:r="http://schemas.openxmlformats.org/officeDocument/2006/relationships" xmlns:v="urn:schemas-microsoft-com:vml" xmlns:w10="urn:schemas-microsoft-com:office:word" xmlns:w14="http://schemas.microsoft.com/office/word/2010/wordml" xmlns:w="http://schemas.openxmlformats.org/wordprocessingml/2006/main" xmlns:wne="http://schemas.microsoft.com/office/word/2006/wordml" xmlns:wp14="http://schemas.microsoft.com/office/word/2010/wordprocessingDrawing" xmlns:wp="http://schemas.openxmlformats.org/drawingml/2006/wordprocessingDrawing" xmlns:wpc="http://schemas.microsoft.com/office/word/2010/wordprocessingCanvas" xmlns:wpg="http://schemas.microsoft.com/office/word/2010/wordprocessingGroup" xmlns:wpi="http://schemas.microsoft.com/office/word/2010/wordprocessingInk" xmlns:wps="http://schemas.microsoft.com/office/word/2010/wordprocessingShape" mc:Ignorable="w14 wp14">
-  <w:p>
-    <w:pPr>
-      <w:jc w:val="right"/>
-    </w:pPr>
-    <w:fldSimple w:instr="PAGE"/>
-  </w:p>
-</w:ftr>
-</file>
-
-<file path=word/footer7.xml><?xml version="1.0" encoding="utf-8"?>
-<w:ftr xmlns:m="http://schemas.openxmlformats.org/officeDocument/2006/math" xmlns:mc="http://schemas.openxmlformats.org/markup-compatibility/2006" xmlns:mo="http://schemas.microsoft.com/office/mac/office/2008/main" xmlns:mv="urn:schemas-microsoft-com:mac:vml" xmlns:o="urn:schemas-microsoft-com:office:office" xmlns:r="http://schemas.openxmlformats.org/officeDocument/2006/relationships" xmlns:v="urn:schemas-microsoft-com:vml" xmlns:w10="urn:schemas-microsoft-com:office:word" xmlns:w14="http://schemas.microsoft.com/office/word/2010/wordml" xmlns:w="http://schemas.openxmlformats.org/wordprocessingml/2006/main" xmlns:wne="http://schemas.microsoft.com/office/word/2006/wordml" xmlns:wp14="http://schemas.microsoft.com/office/word/2010/wordprocessingDrawing" xmlns:wp="http://schemas.openxmlformats.org/drawingml/2006/wordprocessingDrawing" xmlns:wpc="http://schemas.microsoft.com/office/word/2010/wordprocessingCanvas" xmlns:wpg="http://schemas.microsoft.com/office/word/2010/wordprocessingGroup" xmlns:wpi="http://schemas.microsoft.com/office/word/2010/wordprocessingInk" xmlns:wps="http://schemas.microsoft.com/office/word/2010/wordprocessingShape" mc:Ignorable="w14 wp14">
-  <w:p>
-    <w:pPr>
-      <w:jc w:val="right"/>
-    </w:pPr>
-    <w:fldSimple w:instr="PAGE"/>
-  </w:p>
-</w:ftr>
-</file>
-
-<file path=word/footer8.xml><?xml version="1.0" encoding="utf-8"?>
-<w:ftr xmlns:m="http://schemas.openxmlformats.org/officeDocument/2006/math" xmlns:mc="http://schemas.openxmlformats.org/markup-compatibility/2006" xmlns:mo="http://schemas.microsoft.com/office/mac/office/2008/main" xmlns:mv="urn:schemas-microsoft-com:mac:vml" xmlns:o="urn:schemas-microsoft-com:office:office" xmlns:r="http://schemas.openxmlformats.org/officeDocument/2006/relationships" xmlns:v="urn:schemas-microsoft-com:vml" xmlns:w10="urn:schemas-microsoft-com:office:word" xmlns:w14="http://schemas.microsoft.com/office/word/2010/wordml" xmlns:w="http://schemas.openxmlformats.org/wordprocessingml/2006/main" xmlns:wne="http://schemas.microsoft.com/office/word/2006/wordml" xmlns:wp14="http://schemas.microsoft.com/office/word/2010/wordprocessingDrawing" xmlns:wp="http://schemas.openxmlformats.org/drawingml/2006/wordprocessingDrawing" xmlns:wpc="http://schemas.microsoft.com/office/word/2010/wordprocessingCanvas" xmlns:wpg="http://schemas.microsoft.com/office/word/2010/wordprocessingGroup" xmlns:wpi="http://schemas.microsoft.com/office/word/2010/wordprocessingInk" xmlns:wps="http://schemas.microsoft.com/office/word/2010/wordprocessingShape" mc:Ignorable="w14 wp14">
-  <w:p>
-    <w:pPr>
-      <w:jc w:val="right"/>
-    </w:pPr>
-    <w:fldSimple w:instr="PAGE"/>
-  </w:p>
-</w:ftr>
-</file>
-
-<file path=word/footer9.xml><?xml version="1.0" encoding="utf-8"?>
-<w:ftr xmlns:m="http://schemas.openxmlformats.org/officeDocument/2006/math" xmlns:mc="http://schemas.openxmlformats.org/markup-compatibility/2006" xmlns:mo="http://schemas.microsoft.com/office/mac/office/2008/main" xmlns:mv="urn:schemas-microsoft-com:mac:vml" xmlns:o="urn:schemas-microsoft-com:office:office" xmlns:r="http://schemas.openxmlformats.org/officeDocument/2006/relationships" xmlns:v="urn:schemas-microsoft-com:vml" xmlns:w10="urn:schemas-microsoft-com:office:word" xmlns:w14="http://schemas.microsoft.com/office/word/2010/wordml" xmlns:w="http://schemas.openxmlformats.org/wordprocessingml/2006/main" xmlns:wne="http://schemas.microsoft.com/office/word/2006/wordml" xmlns:wp14="http://schemas.microsoft.com/office/word/2010/wordprocessingDrawing" xmlns:wp="http://schemas.openxmlformats.org/drawingml/2006/wordprocessingDrawing" xmlns:wpc="http://schemas.microsoft.com/office/word/2010/wordprocessingCanvas" xmlns:wpg="http://schemas.microsoft.com/office/word/2010/wordprocessingGroup" xmlns:wpi="http://schemas.microsoft.com/office/word/2010/wordprocessingInk" xmlns:wps="http://schemas.microsoft.com/office/word/2010/wordprocessingShape" mc:Ignorable="w14 wp14">
-  <w:p>
-    <w:pPr>
-      <w:jc w:val="right"/>
-    </w:pPr>
-    <w:fldSimple w:instr="PAGE"/>
   </w:p>
 </w:ftr>
 </file>
@@ -1845,227 +1742,6 @@
     </w:pPr>
     <w:r>
       <w:rPr>
-        <w:color w:val="5B6770"/>
-      </w:rPr>
-      <w:t>CRAFT     •     01  /  Process Overview</w:t>
-    </w:r>
-  </w:p>
-</w:hdr>
-</file>
-
-<file path=word/header10.xml><?xml version="1.0" encoding="utf-8"?>
-<w:hdr xmlns:m="http://schemas.openxmlformats.org/officeDocument/2006/math" xmlns:mc="http://schemas.openxmlformats.org/markup-compatibility/2006" xmlns:mo="http://schemas.microsoft.com/office/mac/office/2008/main" xmlns:mv="urn:schemas-microsoft-com:mac:vml" xmlns:o="urn:schemas-microsoft-com:office:office" xmlns:r="http://schemas.openxmlformats.org/officeDocument/2006/relationships" xmlns:v="urn:schemas-microsoft-com:vml" xmlns:w10="urn:schemas-microsoft-com:office:word" xmlns:w14="http://schemas.microsoft.com/office/word/2010/wordml" xmlns:w="http://schemas.openxmlformats.org/wordprocessingml/2006/main" xmlns:wne="http://schemas.microsoft.com/office/word/2006/wordml" xmlns:wp14="http://schemas.microsoft.com/office/word/2010/wordprocessingDrawing" xmlns:wp="http://schemas.openxmlformats.org/drawingml/2006/wordprocessingDrawing" xmlns:wpc="http://schemas.microsoft.com/office/word/2010/wordprocessingCanvas" xmlns:wpg="http://schemas.microsoft.com/office/word/2010/wordprocessingGroup" xmlns:wpi="http://schemas.microsoft.com/office/word/2010/wordprocessingInk" xmlns:wps="http://schemas.microsoft.com/office/word/2010/wordprocessingShape" mc:Ignorable="w14 wp14">
-  <w:p>
-    <w:pPr>
-      <w:pStyle w:val="SmallNote"/>
-    </w:pPr>
-    <w:r>
-      <w:rPr>
-        <w:color w:val="000000"/>
-        <w:sz w:val="18"/>
-      </w:rPr>
-      <w:t>CRAFT | CRAFT Linux Operating Modes and Tickets</w:t>
-    </w:r>
-  </w:p>
-</w:hdr>
-</file>
-
-<file path=word/header11.xml><?xml version="1.0" encoding="utf-8"?>
-<w:hdr xmlns:m="http://schemas.openxmlformats.org/officeDocument/2006/math" xmlns:mc="http://schemas.openxmlformats.org/markup-compatibility/2006" xmlns:mo="http://schemas.microsoft.com/office/mac/office/2008/main" xmlns:mv="urn:schemas-microsoft-com:mac:vml" xmlns:o="urn:schemas-microsoft-com:office:office" xmlns:r="http://schemas.openxmlformats.org/officeDocument/2006/relationships" xmlns:v="urn:schemas-microsoft-com:vml" xmlns:w10="urn:schemas-microsoft-com:office:word" xmlns:w14="http://schemas.microsoft.com/office/word/2010/wordml" xmlns:w="http://schemas.openxmlformats.org/wordprocessingml/2006/main" xmlns:wne="http://schemas.microsoft.com/office/word/2006/wordml" xmlns:wp14="http://schemas.microsoft.com/office/word/2010/wordprocessingDrawing" xmlns:wp="http://schemas.openxmlformats.org/drawingml/2006/wordprocessingDrawing" xmlns:wpc="http://schemas.microsoft.com/office/word/2010/wordprocessingCanvas" xmlns:wpg="http://schemas.microsoft.com/office/word/2010/wordprocessingGroup" xmlns:wpi="http://schemas.microsoft.com/office/word/2010/wordprocessingInk" xmlns:wps="http://schemas.microsoft.com/office/word/2010/wordprocessingShape" mc:Ignorable="w14 wp14">
-  <w:p>
-    <w:pPr>
-      <w:pStyle w:val="SmallNote"/>
-    </w:pPr>
-    <w:r>
-      <w:rPr>
-        <w:color w:val="000000"/>
-        <w:sz w:val="18"/>
-      </w:rPr>
-      <w:t>CRAFT | CRAFT Linux Operating Modes and Tickets</w:t>
-    </w:r>
-  </w:p>
-</w:hdr>
-</file>
-
-<file path=word/header12.xml><?xml version="1.0" encoding="utf-8"?>
-<w:hdr xmlns:m="http://schemas.openxmlformats.org/officeDocument/2006/math" xmlns:mc="http://schemas.openxmlformats.org/markup-compatibility/2006" xmlns:mo="http://schemas.microsoft.com/office/mac/office/2008/main" xmlns:mv="urn:schemas-microsoft-com:mac:vml" xmlns:o="urn:schemas-microsoft-com:office:office" xmlns:r="http://schemas.openxmlformats.org/officeDocument/2006/relationships" xmlns:v="urn:schemas-microsoft-com:vml" xmlns:w10="urn:schemas-microsoft-com:office:word" xmlns:w14="http://schemas.microsoft.com/office/word/2010/wordml" xmlns:w="http://schemas.openxmlformats.org/wordprocessingml/2006/main" xmlns:wne="http://schemas.microsoft.com/office/word/2006/wordml" xmlns:wp14="http://schemas.microsoft.com/office/word/2010/wordprocessingDrawing" xmlns:wp="http://schemas.openxmlformats.org/drawingml/2006/wordprocessingDrawing" xmlns:wpc="http://schemas.microsoft.com/office/word/2010/wordprocessingCanvas" xmlns:wpg="http://schemas.microsoft.com/office/word/2010/wordprocessingGroup" xmlns:wpi="http://schemas.microsoft.com/office/word/2010/wordprocessingInk" xmlns:wps="http://schemas.microsoft.com/office/word/2010/wordprocessingShape" mc:Ignorable="w14 wp14">
-  <w:p>
-    <w:pPr>
-      <w:pStyle w:val="SmallNote"/>
-    </w:pPr>
-    <w:r>
-      <w:rPr>
-        <w:color w:val="000000"/>
-        <w:sz w:val="18"/>
-      </w:rPr>
-      <w:t>CRAFT | CRAFT Linux Operating Modes and Tickets</w:t>
-    </w:r>
-  </w:p>
-</w:hdr>
-</file>
-
-<file path=word/header13.xml><?xml version="1.0" encoding="utf-8"?>
-<w:hdr xmlns:m="http://schemas.openxmlformats.org/officeDocument/2006/math" xmlns:mc="http://schemas.openxmlformats.org/markup-compatibility/2006" xmlns:mo="http://schemas.microsoft.com/office/mac/office/2008/main" xmlns:mv="urn:schemas-microsoft-com:mac:vml" xmlns:o="urn:schemas-microsoft-com:office:office" xmlns:r="http://schemas.openxmlformats.org/officeDocument/2006/relationships" xmlns:v="urn:schemas-microsoft-com:vml" xmlns:w10="urn:schemas-microsoft-com:office:word" xmlns:w14="http://schemas.microsoft.com/office/word/2010/wordml" xmlns:w="http://schemas.openxmlformats.org/wordprocessingml/2006/main" xmlns:wne="http://schemas.microsoft.com/office/word/2006/wordml" xmlns:wp14="http://schemas.microsoft.com/office/word/2010/wordprocessingDrawing" xmlns:wp="http://schemas.openxmlformats.org/drawingml/2006/wordprocessingDrawing" xmlns:wpc="http://schemas.microsoft.com/office/word/2010/wordprocessingCanvas" xmlns:wpg="http://schemas.microsoft.com/office/word/2010/wordprocessingGroup" xmlns:wpi="http://schemas.microsoft.com/office/word/2010/wordprocessingInk" xmlns:wps="http://schemas.microsoft.com/office/word/2010/wordprocessingShape" mc:Ignorable="w14 wp14">
-  <w:p>
-    <w:pPr>
-      <w:pStyle w:val="SmallNote"/>
-    </w:pPr>
-    <w:r>
-      <w:rPr>
-        <w:color w:val="000000"/>
-        <w:sz w:val="18"/>
-      </w:rPr>
-      <w:t>CRAFT | CRAFT Linux Operating Modes and Tickets</w:t>
-    </w:r>
-  </w:p>
-</w:hdr>
-</file>
-
-<file path=word/header14.xml><?xml version="1.0" encoding="utf-8"?>
-<w:hdr xmlns:m="http://schemas.openxmlformats.org/officeDocument/2006/math" xmlns:mc="http://schemas.openxmlformats.org/markup-compatibility/2006" xmlns:mo="http://schemas.microsoft.com/office/mac/office/2008/main" xmlns:mv="urn:schemas-microsoft-com:mac:vml" xmlns:o="urn:schemas-microsoft-com:office:office" xmlns:r="http://schemas.openxmlformats.org/officeDocument/2006/relationships" xmlns:v="urn:schemas-microsoft-com:vml" xmlns:w10="urn:schemas-microsoft-com:office:word" xmlns:w14="http://schemas.microsoft.com/office/word/2010/wordml" xmlns:w="http://schemas.openxmlformats.org/wordprocessingml/2006/main" xmlns:wne="http://schemas.microsoft.com/office/word/2006/wordml" xmlns:wp14="http://schemas.microsoft.com/office/word/2010/wordprocessingDrawing" xmlns:wp="http://schemas.openxmlformats.org/drawingml/2006/wordprocessingDrawing" xmlns:wpc="http://schemas.microsoft.com/office/word/2010/wordprocessingCanvas" xmlns:wpg="http://schemas.microsoft.com/office/word/2010/wordprocessingGroup" xmlns:wpi="http://schemas.microsoft.com/office/word/2010/wordprocessingInk" xmlns:wps="http://schemas.microsoft.com/office/word/2010/wordprocessingShape" mc:Ignorable="w14 wp14">
-  <w:p>
-    <w:pPr>
-      <w:pStyle w:val="SmallNote"/>
-    </w:pPr>
-    <w:r>
-      <w:rPr>
-        <w:color w:val="000000"/>
-        <w:sz w:val="18"/>
-      </w:rPr>
-      <w:t>CRAFT | CRAFT Linux Operating Modes and Tickets</w:t>
-    </w:r>
-  </w:p>
-</w:hdr>
-</file>
-
-<file path=word/header2.xml><?xml version="1.0" encoding="utf-8"?>
-<w:hdr xmlns:m="http://schemas.openxmlformats.org/officeDocument/2006/math" xmlns:mc="http://schemas.openxmlformats.org/markup-compatibility/2006" xmlns:mo="http://schemas.microsoft.com/office/mac/office/2008/main" xmlns:mv="urn:schemas-microsoft-com:mac:vml" xmlns:o="urn:schemas-microsoft-com:office:office" xmlns:r="http://schemas.openxmlformats.org/officeDocument/2006/relationships" xmlns:v="urn:schemas-microsoft-com:vml" xmlns:w10="urn:schemas-microsoft-com:office:word" xmlns:w14="http://schemas.microsoft.com/office/word/2010/wordml" xmlns:w="http://schemas.openxmlformats.org/wordprocessingml/2006/main" xmlns:wne="http://schemas.microsoft.com/office/word/2006/wordml" xmlns:wp14="http://schemas.microsoft.com/office/word/2010/wordprocessingDrawing" xmlns:wp="http://schemas.openxmlformats.org/drawingml/2006/wordprocessingDrawing" xmlns:wpc="http://schemas.microsoft.com/office/word/2010/wordprocessingCanvas" xmlns:wpg="http://schemas.microsoft.com/office/word/2010/wordprocessingGroup" xmlns:wpi="http://schemas.microsoft.com/office/word/2010/wordprocessingInk" xmlns:wps="http://schemas.microsoft.com/office/word/2010/wordprocessingShape" mc:Ignorable="w14 wp14">
-  <w:p>
-    <w:pPr>
-      <w:pStyle w:val="SmallNote"/>
-    </w:pPr>
-    <w:r>
-      <w:rPr>
-        <w:color w:val="000000"/>
-        <w:sz w:val="18"/>
-      </w:rPr>
-      <w:t>CRAFT | CRAFT Linux Operating Modes and Tickets</w:t>
-    </w:r>
-  </w:p>
-</w:hdr>
-</file>
-
-<file path=word/header3.xml><?xml version="1.0" encoding="utf-8"?>
-<w:hdr xmlns:m="http://schemas.openxmlformats.org/officeDocument/2006/math" xmlns:mc="http://schemas.openxmlformats.org/markup-compatibility/2006" xmlns:mo="http://schemas.microsoft.com/office/mac/office/2008/main" xmlns:mv="urn:schemas-microsoft-com:mac:vml" xmlns:o="urn:schemas-microsoft-com:office:office" xmlns:r="http://schemas.openxmlformats.org/officeDocument/2006/relationships" xmlns:v="urn:schemas-microsoft-com:vml" xmlns:w10="urn:schemas-microsoft-com:office:word" xmlns:w14="http://schemas.microsoft.com/office/word/2010/wordml" xmlns:w="http://schemas.openxmlformats.org/wordprocessingml/2006/main" xmlns:wne="http://schemas.microsoft.com/office/word/2006/wordml" xmlns:wp14="http://schemas.microsoft.com/office/word/2010/wordprocessingDrawing" xmlns:wp="http://schemas.openxmlformats.org/drawingml/2006/wordprocessingDrawing" xmlns:wpc="http://schemas.microsoft.com/office/word/2010/wordprocessingCanvas" xmlns:wpg="http://schemas.microsoft.com/office/word/2010/wordprocessingGroup" xmlns:wpi="http://schemas.microsoft.com/office/word/2010/wordprocessingInk" xmlns:wps="http://schemas.microsoft.com/office/word/2010/wordprocessingShape" mc:Ignorable="w14 wp14">
-  <w:p>
-    <w:pPr>
-      <w:pStyle w:val="SmallNote"/>
-    </w:pPr>
-    <w:r>
-      <w:rPr>
-        <w:color w:val="000000"/>
-        <w:sz w:val="18"/>
-      </w:rPr>
-      <w:t>CRAFT | CRAFT Linux Operating Modes and Tickets</w:t>
-    </w:r>
-  </w:p>
-</w:hdr>
-</file>
-
-<file path=word/header4.xml><?xml version="1.0" encoding="utf-8"?>
-<w:hdr xmlns:m="http://schemas.openxmlformats.org/officeDocument/2006/math" xmlns:mc="http://schemas.openxmlformats.org/markup-compatibility/2006" xmlns:mo="http://schemas.microsoft.com/office/mac/office/2008/main" xmlns:mv="urn:schemas-microsoft-com:mac:vml" xmlns:o="urn:schemas-microsoft-com:office:office" xmlns:r="http://schemas.openxmlformats.org/officeDocument/2006/relationships" xmlns:v="urn:schemas-microsoft-com:vml" xmlns:w10="urn:schemas-microsoft-com:office:word" xmlns:w14="http://schemas.microsoft.com/office/word/2010/wordml" xmlns:w="http://schemas.openxmlformats.org/wordprocessingml/2006/main" xmlns:wne="http://schemas.microsoft.com/office/word/2006/wordml" xmlns:wp14="http://schemas.microsoft.com/office/word/2010/wordprocessingDrawing" xmlns:wp="http://schemas.openxmlformats.org/drawingml/2006/wordprocessingDrawing" xmlns:wpc="http://schemas.microsoft.com/office/word/2010/wordprocessingCanvas" xmlns:wpg="http://schemas.microsoft.com/office/word/2010/wordprocessingGroup" xmlns:wpi="http://schemas.microsoft.com/office/word/2010/wordprocessingInk" xmlns:wps="http://schemas.microsoft.com/office/word/2010/wordprocessingShape" mc:Ignorable="w14 wp14">
-  <w:p>
-    <w:pPr>
-      <w:pStyle w:val="SmallNote"/>
-    </w:pPr>
-    <w:r>
-      <w:rPr>
-        <w:color w:val="000000"/>
-        <w:sz w:val="18"/>
-      </w:rPr>
-      <w:t>CRAFT | CRAFT Linux Operating Modes and Tickets</w:t>
-    </w:r>
-  </w:p>
-</w:hdr>
-</file>
-
-<file path=word/header5.xml><?xml version="1.0" encoding="utf-8"?>
-<w:hdr xmlns:m="http://schemas.openxmlformats.org/officeDocument/2006/math" xmlns:mc="http://schemas.openxmlformats.org/markup-compatibility/2006" xmlns:mo="http://schemas.microsoft.com/office/mac/office/2008/main" xmlns:mv="urn:schemas-microsoft-com:mac:vml" xmlns:o="urn:schemas-microsoft-com:office:office" xmlns:r="http://schemas.openxmlformats.org/officeDocument/2006/relationships" xmlns:v="urn:schemas-microsoft-com:vml" xmlns:w10="urn:schemas-microsoft-com:office:word" xmlns:w14="http://schemas.microsoft.com/office/word/2010/wordml" xmlns:w="http://schemas.openxmlformats.org/wordprocessingml/2006/main" xmlns:wne="http://schemas.microsoft.com/office/word/2006/wordml" xmlns:wp14="http://schemas.microsoft.com/office/word/2010/wordprocessingDrawing" xmlns:wp="http://schemas.openxmlformats.org/drawingml/2006/wordprocessingDrawing" xmlns:wpc="http://schemas.microsoft.com/office/word/2010/wordprocessingCanvas" xmlns:wpg="http://schemas.microsoft.com/office/word/2010/wordprocessingGroup" xmlns:wpi="http://schemas.microsoft.com/office/word/2010/wordprocessingInk" xmlns:wps="http://schemas.microsoft.com/office/word/2010/wordprocessingShape" mc:Ignorable="w14 wp14">
-  <w:p>
-    <w:pPr>
-      <w:pStyle w:val="SmallNote"/>
-    </w:pPr>
-    <w:r>
-      <w:rPr>
-        <w:color w:val="000000"/>
-        <w:sz w:val="18"/>
-      </w:rPr>
-      <w:t>CRAFT | CRAFT Linux Operating Modes and Tickets</w:t>
-    </w:r>
-  </w:p>
-</w:hdr>
-</file>
-
-<file path=word/header6.xml><?xml version="1.0" encoding="utf-8"?>
-<w:hdr xmlns:m="http://schemas.openxmlformats.org/officeDocument/2006/math" xmlns:mc="http://schemas.openxmlformats.org/markup-compatibility/2006" xmlns:mo="http://schemas.microsoft.com/office/mac/office/2008/main" xmlns:mv="urn:schemas-microsoft-com:mac:vml" xmlns:o="urn:schemas-microsoft-com:office:office" xmlns:r="http://schemas.openxmlformats.org/officeDocument/2006/relationships" xmlns:v="urn:schemas-microsoft-com:vml" xmlns:w10="urn:schemas-microsoft-com:office:word" xmlns:w14="http://schemas.microsoft.com/office/word/2010/wordml" xmlns:w="http://schemas.openxmlformats.org/wordprocessingml/2006/main" xmlns:wne="http://schemas.microsoft.com/office/word/2006/wordml" xmlns:wp14="http://schemas.microsoft.com/office/word/2010/wordprocessingDrawing" xmlns:wp="http://schemas.openxmlformats.org/drawingml/2006/wordprocessingDrawing" xmlns:wpc="http://schemas.microsoft.com/office/word/2010/wordprocessingCanvas" xmlns:wpg="http://schemas.microsoft.com/office/word/2010/wordprocessingGroup" xmlns:wpi="http://schemas.microsoft.com/office/word/2010/wordprocessingInk" xmlns:wps="http://schemas.microsoft.com/office/word/2010/wordprocessingShape" mc:Ignorable="w14 wp14">
-  <w:p>
-    <w:pPr>
-      <w:pStyle w:val="SmallNote"/>
-    </w:pPr>
-    <w:r>
-      <w:rPr>
-        <w:color w:val="000000"/>
-        <w:sz w:val="18"/>
-      </w:rPr>
-      <w:t>CRAFT | CRAFT Linux Operating Modes and Tickets</w:t>
-    </w:r>
-  </w:p>
-</w:hdr>
-</file>
-
-<file path=word/header7.xml><?xml version="1.0" encoding="utf-8"?>
-<w:hdr xmlns:m="http://schemas.openxmlformats.org/officeDocument/2006/math" xmlns:mc="http://schemas.openxmlformats.org/markup-compatibility/2006" xmlns:mo="http://schemas.microsoft.com/office/mac/office/2008/main" xmlns:mv="urn:schemas-microsoft-com:mac:vml" xmlns:o="urn:schemas-microsoft-com:office:office" xmlns:r="http://schemas.openxmlformats.org/officeDocument/2006/relationships" xmlns:v="urn:schemas-microsoft-com:vml" xmlns:w10="urn:schemas-microsoft-com:office:word" xmlns:w14="http://schemas.microsoft.com/office/word/2010/wordml" xmlns:w="http://schemas.openxmlformats.org/wordprocessingml/2006/main" xmlns:wne="http://schemas.microsoft.com/office/word/2006/wordml" xmlns:wp14="http://schemas.microsoft.com/office/word/2010/wordprocessingDrawing" xmlns:wp="http://schemas.openxmlformats.org/drawingml/2006/wordprocessingDrawing" xmlns:wpc="http://schemas.microsoft.com/office/word/2010/wordprocessingCanvas" xmlns:wpg="http://schemas.microsoft.com/office/word/2010/wordprocessingGroup" xmlns:wpi="http://schemas.microsoft.com/office/word/2010/wordprocessingInk" xmlns:wps="http://schemas.microsoft.com/office/word/2010/wordprocessingShape" mc:Ignorable="w14 wp14">
-  <w:p>
-    <w:pPr>
-      <w:pStyle w:val="SmallNote"/>
-    </w:pPr>
-    <w:r>
-      <w:rPr>
-        <w:color w:val="000000"/>
-        <w:sz w:val="18"/>
-      </w:rPr>
-      <w:t>CRAFT | CRAFT Linux Operating Modes and Tickets</w:t>
-    </w:r>
-  </w:p>
-</w:hdr>
-</file>
-
-<file path=word/header8.xml><?xml version="1.0" encoding="utf-8"?>
-<w:hdr xmlns:m="http://schemas.openxmlformats.org/officeDocument/2006/math" xmlns:mc="http://schemas.openxmlformats.org/markup-compatibility/2006" xmlns:mo="http://schemas.microsoft.com/office/mac/office/2008/main" xmlns:mv="urn:schemas-microsoft-com:mac:vml" xmlns:o="urn:schemas-microsoft-com:office:office" xmlns:r="http://schemas.openxmlformats.org/officeDocument/2006/relationships" xmlns:v="urn:schemas-microsoft-com:vml" xmlns:w10="urn:schemas-microsoft-com:office:word" xmlns:w14="http://schemas.microsoft.com/office/word/2010/wordml" xmlns:w="http://schemas.openxmlformats.org/wordprocessingml/2006/main" xmlns:wne="http://schemas.microsoft.com/office/word/2006/wordml" xmlns:wp14="http://schemas.microsoft.com/office/word/2010/wordprocessingDrawing" xmlns:wp="http://schemas.openxmlformats.org/drawingml/2006/wordprocessingDrawing" xmlns:wpc="http://schemas.microsoft.com/office/word/2010/wordprocessingCanvas" xmlns:wpg="http://schemas.microsoft.com/office/word/2010/wordprocessingGroup" xmlns:wpi="http://schemas.microsoft.com/office/word/2010/wordprocessingInk" xmlns:wps="http://schemas.microsoft.com/office/word/2010/wordprocessingShape" mc:Ignorable="w14 wp14">
-  <w:p>
-    <w:pPr>
-      <w:pStyle w:val="SmallNote"/>
-    </w:pPr>
-    <w:r>
-      <w:rPr>
-        <w:color w:val="000000"/>
-        <w:sz w:val="18"/>
-      </w:rPr>
-      <w:t>CRAFT | CRAFT Linux Operating Modes and Tickets</w:t>
-    </w:r>
-  </w:p>
-</w:hdr>
-</file>
-
-<file path=word/header9.xml><?xml version="1.0" encoding="utf-8"?>
-<w:hdr xmlns:m="http://schemas.openxmlformats.org/officeDocument/2006/math" xmlns:mc="http://schemas.openxmlformats.org/markup-compatibility/2006" xmlns:mo="http://schemas.microsoft.com/office/mac/office/2008/main" xmlns:mv="urn:schemas-microsoft-com:mac:vml" xmlns:o="urn:schemas-microsoft-com:office:office" xmlns:r="http://schemas.openxmlformats.org/officeDocument/2006/relationships" xmlns:v="urn:schemas-microsoft-com:vml" xmlns:w10="urn:schemas-microsoft-com:office:word" xmlns:w14="http://schemas.microsoft.com/office/word/2010/wordml" xmlns:w="http://schemas.openxmlformats.org/wordprocessingml/2006/main" xmlns:wne="http://schemas.microsoft.com/office/word/2006/wordml" xmlns:wp14="http://schemas.microsoft.com/office/word/2010/wordprocessingDrawing" xmlns:wp="http://schemas.openxmlformats.org/drawingml/2006/wordprocessingDrawing" xmlns:wpc="http://schemas.microsoft.com/office/word/2010/wordprocessingCanvas" xmlns:wpg="http://schemas.microsoft.com/office/word/2010/wordprocessingGroup" xmlns:wpi="http://schemas.microsoft.com/office/word/2010/wordprocessingInk" xmlns:wps="http://schemas.microsoft.com/office/word/2010/wordprocessingShape" mc:Ignorable="w14 wp14">
-  <w:p>
-    <w:pPr>
-      <w:pStyle w:val="SmallNote"/>
-    </w:pPr>
-    <w:r>
-      <w:rPr>
-        <w:color w:val="000000"/>
         <w:sz w:val="18"/>
       </w:rPr>
       <w:t>CRAFT | CRAFT Linux Operating Modes and Tickets</w:t>
@@ -2691,10 +2367,9 @@
       <w:outlineLvl w:val="0"/>
     </w:pPr>
     <w:rPr>
-      <w:rFonts w:asciiTheme="majorHAnsi" w:eastAsiaTheme="majorEastAsia" w:hAnsiTheme="majorHAnsi" w:cstheme="majorBidi" w:ascii="Calibri" w:hAnsi="Calibri"/>
+      <w:rFonts w:asciiTheme="majorHAnsi" w:eastAsiaTheme="majorEastAsia" w:hAnsiTheme="majorHAnsi" w:cstheme="majorBidi"/>
       <w:b/>
       <w:bCs/>
-      <w:color w:val="000000"/>
       <w:sz w:val="32"/>
       <w:szCs w:val="28"/>
     </w:rPr>
@@ -2715,10 +2390,9 @@
       <w:outlineLvl w:val="1"/>
     </w:pPr>
     <w:rPr>
-      <w:rFonts w:asciiTheme="majorHAnsi" w:eastAsiaTheme="majorEastAsia" w:hAnsiTheme="majorHAnsi" w:cstheme="majorBidi" w:ascii="Calibri" w:hAnsi="Calibri"/>
+      <w:rFonts w:asciiTheme="majorHAnsi" w:eastAsiaTheme="majorEastAsia" w:hAnsiTheme="majorHAnsi" w:cstheme="majorBidi"/>
       <w:b/>
       <w:bCs/>
-      <w:color w:val="000000"/>
       <w:sz w:val="24"/>
       <w:szCs w:val="26"/>
     </w:rPr>
@@ -2742,7 +2416,6 @@
       <w:rFonts w:asciiTheme="majorHAnsi" w:eastAsiaTheme="majorEastAsia" w:hAnsiTheme="majorHAnsi" w:cstheme="majorBidi"/>
       <w:b/>
       <w:bCs/>
-      <w:color w:val="000000"/>
     </w:rPr>
   </w:style>
   <w:style w:type="paragraph" w:styleId="Heading4">
@@ -2767,7 +2440,6 @@
       <w:bCs/>
       <w:i/>
       <w:iCs/>
-      <w:color w:val="000000"/>
     </w:rPr>
   </w:style>
   <w:style w:type="paragraph" w:styleId="Heading5">
@@ -2788,7 +2460,6 @@
     </w:pPr>
     <w:rPr>
       <w:rFonts w:asciiTheme="majorHAnsi" w:eastAsiaTheme="majorEastAsia" w:hAnsiTheme="majorHAnsi" w:cstheme="majorBidi"/>
-      <w:color w:val="000000"/>
     </w:rPr>
   </w:style>
   <w:style w:type="paragraph" w:styleId="Heading6">
@@ -2811,7 +2482,6 @@
       <w:rFonts w:asciiTheme="majorHAnsi" w:eastAsiaTheme="majorEastAsia" w:hAnsiTheme="majorHAnsi" w:cstheme="majorBidi"/>
       <w:i/>
       <w:iCs/>
-      <w:color w:val="000000"/>
     </w:rPr>
   </w:style>
   <w:style w:type="paragraph" w:styleId="Heading7">
@@ -2834,7 +2504,6 @@
       <w:rFonts w:asciiTheme="majorHAnsi" w:eastAsiaTheme="majorEastAsia" w:hAnsiTheme="majorHAnsi" w:cstheme="majorBidi"/>
       <w:i/>
       <w:iCs/>
-      <w:color w:val="000000"/>
     </w:rPr>
   </w:style>
   <w:style w:type="paragraph" w:styleId="Heading8">
@@ -2855,7 +2524,6 @@
     </w:pPr>
     <w:rPr>
       <w:rFonts w:asciiTheme="majorHAnsi" w:eastAsiaTheme="majorEastAsia" w:hAnsiTheme="majorHAnsi" w:cstheme="majorBidi"/>
-      <w:color w:val="000000"/>
       <w:sz w:val="20"/>
       <w:szCs w:val="20"/>
     </w:rPr>
@@ -2880,7 +2548,6 @@
       <w:rFonts w:asciiTheme="majorHAnsi" w:eastAsiaTheme="majorEastAsia" w:hAnsiTheme="majorHAnsi" w:cstheme="majorBidi"/>
       <w:i/>
       <w:iCs/>
-      <w:color w:val="000000"/>
       <w:sz w:val="20"/>
       <w:szCs w:val="20"/>
     </w:rPr>
@@ -2926,9 +2593,6 @@
       </w:tabs>
       <w:spacing w:after="0" w:line="240" w:lineRule="auto"/>
     </w:pPr>
-    <w:rPr>
-      <w:color w:val="000000"/>
-    </w:rPr>
   </w:style>
   <w:style w:type="character" w:customStyle="1" w:styleId="HeaderChar">
     <w:name w:val="Header Char"/>
@@ -3021,12 +2685,11 @@
     <w:rsid w:val="00FC693F"/>
     <w:pPr>
       <w:keepNext/>
-      <w:spacing w:line="240" w:lineRule="auto" w:after="140"/>
+      <w:spacing w:line="240" w:lineRule="auto"/>
       <w:contextualSpacing/>
     </w:pPr>
     <w:rPr>
-      <w:rFonts w:asciiTheme="majorHAnsi" w:eastAsiaTheme="majorEastAsia" w:hAnsiTheme="majorHAnsi" w:cstheme="majorBidi" w:ascii="Calibri" w:hAnsi="Calibri"/>
-      <w:color w:val="000000"/>
+      <w:rFonts w:asciiTheme="majorHAnsi" w:eastAsiaTheme="majorEastAsia" w:hAnsiTheme="majorHAnsi" w:cstheme="majorBidi"/>
       <w:spacing w:val="5"/>
       <w:kern w:val="28"/>
       <w:sz w:val="50"/>
@@ -3062,10 +2725,9 @@
       </w:numPr>
     </w:pPr>
     <w:rPr>
-      <w:rFonts w:asciiTheme="majorHAnsi" w:eastAsiaTheme="majorEastAsia" w:hAnsiTheme="majorHAnsi" w:cstheme="majorBidi" w:ascii="Calibri" w:hAnsi="Calibri"/>
+      <w:rFonts w:asciiTheme="majorHAnsi" w:eastAsiaTheme="majorEastAsia" w:hAnsiTheme="majorHAnsi" w:cstheme="majorBidi"/>
       <w:i/>
       <w:iCs/>
-      <w:color w:val="000000"/>
       <w:spacing w:val="15"/>
       <w:sz w:val="24"/>
       <w:szCs w:val="24"/>
@@ -3458,10 +3120,8 @@
       <w:spacing w:line="240" w:lineRule="auto"/>
     </w:pPr>
     <w:rPr>
-      <w:rFonts w:ascii="Calibri" w:hAnsi="Calibri"/>
       <w:b/>
       <w:bCs/>
-      <w:color w:val="000000"/>
       <w:sz w:val="17"/>
       <w:szCs w:val="18"/>
     </w:rPr>

</xml_diff>